<commit_message>
fix: proposal docx terbaru (garansi 3 bulan)
</commit_message>
<xml_diff>
--- a/proposal/Proposal_Website_SD_Muhammadiyah_Pakel.docx
+++ b/proposal/Proposal_Website_SD_Muhammadiyah_Pakel.docx
@@ -3678,7 +3678,7 @@
                   <w:sz w:val="19"/>
                   <w:szCs w:val="19"/>
                 </w:rPr>
-                <w:t xml:space="preserve">10 halaman statis, desain responsive, kontak &amp; maps, 1 tahun hosting+domain</w:t>
+                <w:t xml:space="preserve">12 halaman, desain responsive &amp; mobile-first, kontak + Maps + WA, 1 tahun hosting+domain, garansi 3 bulan</w:t>
               </w:r>
             </w:p>
           </w:tc>
@@ -3717,7 +3717,7 @@
                   <w:sz w:val="20"/>
                   <w:szCs w:val="20"/>
                 </w:rPr>
-                <w:t xml:space="preserve">Rp 3.500.000</w:t>
+                <w:t xml:space="preserve">Rp 4.500.000</w:t>
               </w:r>
             </w:p>
           </w:tc>
@@ -3796,7 +3796,7 @@
                   <w:sz w:val="19"/>
                   <w:szCs w:val="19"/>
                 </w:rPr>
-                <w:t xml:space="preserve">12 halaman + panel admin + customizer tampilan + berita + PPDB online + backup 1 tahun</w:t>
+                <w:t xml:space="preserve">15 halaman + panel admin + customizer tampilan + PPDB online + notifikasi + backup otomatis + garansi &amp; pelatihan admin 3 bulan</w:t>
               </w:r>
             </w:p>
           </w:tc>
@@ -3835,7 +3835,7 @@
                   <w:sz w:val="20"/>
                   <w:szCs w:val="20"/>
                 </w:rPr>
-                <w:t xml:space="preserve">Rp 5.500.000</w:t>
+                <w:t xml:space="preserve">Rp 7.500.000</w:t>
               </w:r>
             </w:p>
           </w:tc>
@@ -3913,7 +3913,7 @@
                   <w:sz w:val="19"/>
                   <w:szCs w:val="19"/>
                 </w:rPr>
-                <w:t xml:space="preserve">15+ halaman, semua fitur standar + multi-admin + prioritas dukungan + pelatihan 2 sesi</w:t>
+                <w:t xml:space="preserve">20+ halaman premium, semua fitur Standar + multi-admin &amp; hak akses + dukungan prioritas + pelatihan 3 sesi + update konten 3 bulan</w:t>
               </w:r>
             </w:p>
           </w:tc>
@@ -3952,7 +3952,7 @@
                   <w:sz w:val="20"/>
                   <w:szCs w:val="20"/>
                 </w:rPr>
-                <w:t xml:space="preserve">Rp 7.500.000</w:t>
+                <w:t xml:space="preserve">Rp 11.500.000</w:t>
               </w:r>
             </w:p>
           </w:tc>
@@ -3986,7 +3986,7 @@
           <w:sz w:val="19"/>
           <w:szCs w:val="19"/>
         </w:rPr>
-        <w:t xml:space="preserve"> Harga sudah termasuk desain, pembangunan, pengisian konten awal, pelatihan admin, dan dukungan 1 tahun. Biaya domain &amp; hosting tahun pertama sudah termasuk dalam paket.</w:t>
+        <w:t xml:space="preserve"> Harga sudah termasuk desain, pembangunan, pengisian konten awal, pelatihan admin, dan dukungan 3 bulan. Biaya domain &amp; hosting tahun pertama sudah termasuk dalam paket.</w:t>
       </w:r>
     </w:p>
     <w:p>
@@ -4511,7 +4511,7 @@
                   <w:sz w:val="20"/>
                   <w:szCs w:val="20"/>
                 </w:rPr>
-                <w:t xml:space="preserve">Gratis 1 tahun: perawatan, update konten minor, perbaikan bug</w:t>
+                <w:t xml:space="preserve">Gratis 3 bulan: perawatan, update konten minor, perbaikan bug</w:t>
               </w:r>
             </w:p>
           </w:tc>
@@ -5609,7 +5609,7 @@
           <w:sz w:val="22"/>
           <w:szCs w:val="22"/>
         </w:rPr>
-        <w:t xml:space="preserve">Dukungan responsif &amp; garansi 1 tahun</w:t>
+        <w:t xml:space="preserve">Dukungan responsif &amp; garansi 3 bulan</w:t>
       </w:r>
     </w:p>
     <w:p>

</xml_diff>

<commit_message>
feat: decoy pricing 4.5jt/6.5jt/12jt
</commit_message>
<xml_diff>
--- a/proposal/Proposal_Website_SD_Muhammadiyah_Pakel.docx
+++ b/proposal/Proposal_Website_SD_Muhammadiyah_Pakel.docx
@@ -3835,7 +3835,7 @@
                   <w:sz w:val="20"/>
                   <w:szCs w:val="20"/>
                 </w:rPr>
-                <w:t xml:space="preserve">Rp 7.500.000</w:t>
+                <w:t xml:space="preserve">Rp 6.500.000</w:t>
               </w:r>
             </w:p>
           </w:tc>
@@ -3952,7 +3952,7 @@
                   <w:sz w:val="20"/>
                   <w:szCs w:val="20"/>
                 </w:rPr>
-                <w:t xml:space="preserve">Rp 11.500.000</w:t>
+                <w:t xml:space="preserve">Rp 12.000.000</w:t>
               </w:r>
             </w:p>
           </w:tc>

</xml_diff>

<commit_message>
feat: target Lengkap 9.5jt (decoy ke Lengkap)
</commit_message>
<xml_diff>
--- a/proposal/Proposal_Website_SD_Muhammadiyah_Pakel.docx
+++ b/proposal/Proposal_Website_SD_Muhammadiyah_Pakel.docx
@@ -3758,8 +3758,7 @@
                   <w:sz w:val="20"/>
                   <w:szCs w:val="20"/>
                 </w:rPr>
-                <w:t xml:space="preserve">Paket Standar
-(Rekomendasi)</w:t>
+                <w:t xml:space="preserve">Paket Standar</w:t>
               </w:r>
             </w:p>
           </w:tc>
@@ -3835,7 +3834,7 @@
                   <w:sz w:val="20"/>
                   <w:szCs w:val="20"/>
                 </w:rPr>
-                <w:t xml:space="preserve">Rp 6.500.000</w:t>
+                <w:t xml:space="preserve">Rp 7.500.000</w:t>
               </w:r>
             </w:p>
           </w:tc>
@@ -3876,7 +3875,8 @@
                   <w:sz w:val="20"/>
                   <w:szCs w:val="20"/>
                 </w:rPr>
-                <w:t xml:space="preserve">Paket Lengkap</w:t>
+                <w:t xml:space="preserve">Paket Lengkap
+(Rekomendasi)</w:t>
               </w:r>
             </w:p>
           </w:tc>
@@ -3952,7 +3952,7 @@
                   <w:sz w:val="20"/>
                   <w:szCs w:val="20"/>
                 </w:rPr>
-                <w:t xml:space="preserve">Rp 12.000.000</w:t>
+                <w:t xml:space="preserve">Rp 9.500.000</w:t>
               </w:r>
             </w:p>
           </w:tc>

</xml_diff>

<commit_message>
deploy: target Lengkap 9.5jt
</commit_message>
<xml_diff>
--- a/proposal/Proposal_Website_SD_Muhammadiyah_Pakel.docx
+++ b/proposal/Proposal_Website_SD_Muhammadiyah_Pakel.docx
@@ -3758,8 +3758,7 @@
                   <w:sz w:val="20"/>
                   <w:szCs w:val="20"/>
                 </w:rPr>
-                <w:t xml:space="preserve">Paket Standar
-(Rekomendasi)</w:t>
+                <w:t xml:space="preserve">Paket Standar</w:t>
               </w:r>
             </w:p>
           </w:tc>
@@ -3835,7 +3834,7 @@
                   <w:sz w:val="20"/>
                   <w:szCs w:val="20"/>
                 </w:rPr>
-                <w:t xml:space="preserve">Rp 6.500.000</w:t>
+                <w:t xml:space="preserve">Rp 7.500.000</w:t>
               </w:r>
             </w:p>
           </w:tc>
@@ -3876,7 +3875,8 @@
                   <w:sz w:val="20"/>
                   <w:szCs w:val="20"/>
                 </w:rPr>
-                <w:t xml:space="preserve">Paket Lengkap</w:t>
+                <w:t xml:space="preserve">Paket Lengkap
+(Rekomendasi)</w:t>
               </w:r>
             </w:p>
           </w:tc>
@@ -3952,7 +3952,7 @@
                   <w:sz w:val="20"/>
                   <w:szCs w:val="20"/>
                 </w:rPr>
-                <w:t xml:space="preserve">Rp 12.000.000</w:t>
+                <w:t xml:space="preserve">Rp 9.500.000</w:t>
               </w:r>
             </w:p>
           </w:tc>

</xml_diff>

<commit_message>
fix: hapus jumlah halaman, fokus fitur
</commit_message>
<xml_diff>
--- a/proposal/Proposal_Website_SD_Muhammadiyah_Pakel.docx
+++ b/proposal/Proposal_Website_SD_Muhammadiyah_Pakel.docx
@@ -3678,7 +3678,7 @@
                   <w:sz w:val="19"/>
                   <w:szCs w:val="19"/>
                 </w:rPr>
-                <w:t xml:space="preserve">12 halaman, desain responsive &amp; mobile-first, kontak + Maps + WA, 1 tahun hosting+domain, garansi 3 bulan</w:t>
+                <w:t xml:space="preserve">Website profil sekolah, responsive &amp; mobile-first, kontak + Maps + WA, 1 tahun hosting+domain, garansi 3 bulan</w:t>
               </w:r>
             </w:p>
           </w:tc>
@@ -3795,7 +3795,7 @@
                   <w:sz w:val="19"/>
                   <w:szCs w:val="19"/>
                 </w:rPr>
-                <w:t xml:space="preserve">15 halaman + panel admin + customizer tampilan + PPDB online + notifikasi + backup otomatis + garansi &amp; pelatihan admin 3 bulan</w:t>
+                <w:t xml:space="preserve">Panel admin lengkap + customizer tampilan + PPDB online + notifikasi + backup otomatis + garansi &amp; pelatihan admin 3 bulan</w:t>
               </w:r>
             </w:p>
           </w:tc>
@@ -3913,7 +3913,7 @@
                   <w:sz w:val="19"/>
                   <w:szCs w:val="19"/>
                 </w:rPr>
-                <w:t xml:space="preserve">20+ halaman premium, semua fitur Standar + multi-admin &amp; hak akses + dukungan prioritas + pelatihan 3 sesi + update konten 3 bulan</w:t>
+                <w:t xml:space="preserve">Semua fitur Standar + multi-admin &amp; hak akses + dukungan prioritas + pelatihan 3 sesi + update konten 3 bulan + SEO &amp; sitemap</w:t>
               </w:r>
             </w:p>
           </w:tc>

</xml_diff>

<commit_message>
fix: hapus tanggal, durasi 55 hari, teknologi Next.js/Vercel/Supabase
</commit_message>
<xml_diff>
--- a/proposal/Proposal_Website_SD_Muhammadiyah_Pakel.docx
+++ b/proposal/Proposal_Website_SD_Muhammadiyah_Pakel.docx
@@ -128,7 +128,7 @@
           <w:sz w:val="20"/>
           <w:szCs w:val="20"/>
         </w:rPr>
-        <w:t xml:space="preserve">Yogyakarta, 6 Agustus 2026</w:t>
+        <w:t xml:space="preserve">Yogyakarta</w:t>
       </w:r>
     </w:p>
     <w:p>
@@ -2980,7 +2980,7 @@
                   <w:sz w:val="20"/>
                   <w:szCs w:val="20"/>
                 </w:rPr>
-                <w:t xml:space="preserve">HTML5, CSS3, JavaScript modern — cepat dimuat, mudah dirawat</w:t>
+                <w:t xml:space="preserve">Next.js (React modern, SEO-friendly) + Vercel (hosting global CDN, SSL otomatis) + Supabase (PostgreSQL, auth, storage)</w:t>
               </w:r>
             </w:p>
           </w:tc>
@@ -4199,7 +4199,7 @@
                   <w:sz w:val="20"/>
                   <w:szCs w:val="20"/>
                 </w:rPr>
-                <w:t xml:space="preserve">14–21 hari kerja sejak DP &amp; konten awal diterima</w:t>
+                <w:t xml:space="preserve">55 hari kerja sejak DP &amp; konten awal diterima</w:t>
               </w:r>
             </w:p>
           </w:tc>

</xml_diff>

<commit_message>
feat: tarif edit, paket maintenance, Supabase vs VPS
</commit_message>
<xml_diff>
--- a/proposal/Proposal_Website_SD_Muhammadiyah_Pakel.docx
+++ b/proposal/Proposal_Website_SD_Muhammadiyah_Pakel.docx
@@ -386,7 +386,7 @@
           <w:sz w:val="22"/>
           <w:szCs w:val="22"/>
         </w:rPr>
-        <w:t xml:space="preserve">Ketentuan Layanan</w:t>
+        <w:t xml:space="preserve">Layanan Pasca-Launch</w:t>
       </w:r>
       <w:r>
         <w:rPr>
@@ -419,7 +419,7 @@
           <w:sz w:val="22"/>
           <w:szCs w:val="22"/>
         </w:rPr>
-        <w:t xml:space="preserve">Tahapan Pekerjaan</w:t>
+        <w:t xml:space="preserve">Pilihan Infrastruktur (Supabase vs VPS)</w:t>
       </w:r>
       <w:r>
         <w:rPr>
@@ -452,7 +452,7 @@
           <w:sz w:val="22"/>
           <w:szCs w:val="22"/>
         </w:rPr>
-        <w:t xml:space="preserve">Mengapa Memilih Kami</w:t>
+        <w:t xml:space="preserve">Ketentuan Layanan</w:t>
       </w:r>
       <w:r>
         <w:rPr>
@@ -485,6 +485,72 @@
           <w:sz w:val="22"/>
           <w:szCs w:val="22"/>
         </w:rPr>
+        <w:t xml:space="preserve">Tahapan Pekerjaan</w:t>
+      </w:r>
+      <w:r>
+        <w:rPr>
+          <w:sz w:val="22"/>
+          <w:szCs w:val="22"/>
+        </w:rPr>
+        <w:t xml:space="preserve">	</w:t>
+      </w:r>
+      <w:r>
+        <w:rPr>
+          <w:rFonts w:ascii="Plus Jakarta Sans" w:cs="Plus Jakarta Sans" w:eastAsia="Plus Jakarta Sans" w:hAnsi="Plus Jakarta Sans"/>
+          <w:color w:val="5B6B82"/>
+          <w:sz w:val="22"/>
+          <w:szCs w:val="22"/>
+        </w:rPr>
+        <w:t xml:space="preserve">11</w:t>
+      </w:r>
+    </w:p>
+    <w:p>
+      <w:pPr>
+        <w:tabs>
+          <w:tab w:val="right" w:pos="9070" w:leader="1"/>
+        </w:tabs>
+        <w:spacing w:after="140"/>
+      </w:pPr>
+      <w:r>
+        <w:rPr>
+          <w:rFonts w:ascii="Plus Jakarta Sans" w:cs="Plus Jakarta Sans" w:eastAsia="Plus Jakarta Sans" w:hAnsi="Plus Jakarta Sans"/>
+          <w:color w:val="1F2937"/>
+          <w:sz w:val="22"/>
+          <w:szCs w:val="22"/>
+        </w:rPr>
+        <w:t xml:space="preserve">Mengapa Memilih Kami</w:t>
+      </w:r>
+      <w:r>
+        <w:rPr>
+          <w:sz w:val="22"/>
+          <w:szCs w:val="22"/>
+        </w:rPr>
+        <w:t xml:space="preserve">	</w:t>
+      </w:r>
+      <w:r>
+        <w:rPr>
+          <w:rFonts w:ascii="Plus Jakarta Sans" w:cs="Plus Jakarta Sans" w:eastAsia="Plus Jakarta Sans" w:hAnsi="Plus Jakarta Sans"/>
+          <w:color w:val="5B6B82"/>
+          <w:sz w:val="22"/>
+          <w:szCs w:val="22"/>
+        </w:rPr>
+        <w:t xml:space="preserve">12</w:t>
+      </w:r>
+    </w:p>
+    <w:p>
+      <w:pPr>
+        <w:tabs>
+          <w:tab w:val="right" w:pos="9070" w:leader="1"/>
+        </w:tabs>
+        <w:spacing w:after="140"/>
+      </w:pPr>
+      <w:r>
+        <w:rPr>
+          <w:rFonts w:ascii="Plus Jakarta Sans" w:cs="Plus Jakarta Sans" w:eastAsia="Plus Jakarta Sans" w:hAnsi="Plus Jakarta Sans"/>
+          <w:color w:val="1F2937"/>
+          <w:sz w:val="22"/>
+          <w:szCs w:val="22"/>
+        </w:rPr>
         <w:t xml:space="preserve">Penutup</w:t>
       </w:r>
       <w:r>
@@ -501,7 +567,7 @@
           <w:sz w:val="22"/>
           <w:szCs w:val="22"/>
         </w:rPr>
-        <w:t xml:space="preserve">11</w:t>
+        <w:t xml:space="preserve">13</w:t>
       </w:r>
     </w:p>
     <w:p>
@@ -5453,25 +5519,434 @@
           <w:sz w:val="30"/>
           <w:szCs w:val="30"/>
         </w:rPr>
-        <w:t xml:space="preserve">9. Mengapa Memilih Kami</w:t>
-      </w:r>
-    </w:p>
-    <w:p>
-      <w:pPr>
-        <w:spacing w:after="80"/>
-        <w:ind w:left="360"/>
+        <w:t xml:space="preserve">8. Layanan Pasca-Launch</w:t>
+      </w:r>
+    </w:p>
+    <w:p>
+      <w:pPr>
+        <w:spacing w:after="120" w:before="0"/>
+      </w:pPr>
+      <w:r>
+        <w:rPr>
+          <w:rFonts w:ascii="Plus Jakarta Sans" w:cs="Plus Jakarta Sans" w:eastAsia="Plus Jakarta Sans" w:hAnsi="Plus Jakarta Sans"/>
+          <w:color w:val="1F2937"/>
+          <w:sz w:val="22"/>
+          <w:szCs w:val="22"/>
+        </w:rPr>
+        <w:t xml:space="preserve">Setelah masa garansi 3 bulan, sekolah dapat memilih layanan per-edit atau paket maintenance bulanan:</w:t>
+      </w:r>
+    </w:p>
+    <w:p>
+      <w:pPr>
+        <w:pStyle w:val="Heading3"/>
+        <w:spacing w:after="160" w:before="200"/>
       </w:pPr>
       <w:r>
         <w:rPr>
           <w:rFonts w:ascii="Plus Jakarta Sans" w:cs="Plus Jakarta Sans" w:eastAsia="Plus Jakarta Sans" w:hAnsi="Plus Jakarta Sans"/>
           <w:b/>
           <w:bCs/>
-          <w:color w:val="C9A227"/>
-          <w:sz w:val="22"/>
-          <w:szCs w:val="22"/>
-        </w:rPr>
-        <w:t xml:space="preserve">✓  </w:t>
-      </w:r>
+          <w:color w:val="082B66"/>
+          <w:sz w:val="23"/>
+          <w:szCs w:val="23"/>
+        </w:rPr>
+        <w:t xml:space="preserve">Tarif Per Edit</w:t>
+      </w:r>
+    </w:p>
+    <w:tbl>
+      <w:tblPr>
+        <w:tblW w:type="dxa" w:w="9100"/>
+        <w:tblBorders>
+          <w:top w:val="single" w:color="E2E8F0" w:sz="4"/>
+          <w:left w:val="single" w:color="E2E8F0" w:sz="4"/>
+          <w:bottom w:val="single" w:color="E2E8F0" w:sz="4"/>
+          <w:right w:val="single" w:color="E2E8F0" w:sz="4"/>
+          <w:insideH w:val="single" w:color="E2E8F0" w:sz="4"/>
+          <w:insideV w:val="single" w:color="E2E8F0" w:sz="4"/>
+        </w:tblBorders>
+      </w:tblPr>
+      <w:tblGrid>
+        <w:gridCol w:w="5200"/>
+        <w:gridCol w:w="3900"/>
+      </w:tblGrid>
+      <w:tr>
+        <w:trPr>
+          <w:tblHeader/>
+        </w:trPr>
+        <w:tc>
+          <w:tcPr>
+            <w:shd w:fill="0B3D91" w:color="auto" w:val="clear"/>
+            <w:tcMar>
+              <w:top w:type="dxa" w:w="90"/>
+              <w:left w:type="dxa" w:w="130"/>
+              <w:bottom w:type="dxa" w:w="90"/>
+              <w:right w:type="dxa" w:w="130"/>
+            </w:tcMar>
+            <w:vAlign w:val="center"/>
+          </w:tcPr>
+          <w:p>
+            <w:pPr>
+              <w:spacing w:after="0" w:before="0"/>
+            </w:pPr>
+            <w:r>
+              <w:rPr>
+                <w:rFonts w:ascii="Plus Jakarta Sans" w:cs="Plus Jakarta Sans" w:eastAsia="Plus Jakarta Sans" w:hAnsi="Plus Jakarta Sans"/>
+                <w:b/>
+                <w:bCs/>
+                <w:color w:val="FFFFFF"/>
+                <w:sz w:val="20"/>
+                <w:szCs w:val="20"/>
+              </w:rPr>
+              <w:t xml:space="preserve">Layanan</w:t>
+            </w:r>
+          </w:p>
+        </w:tc>
+        <w:tc>
+          <w:tcPr>
+            <w:shd w:fill="0B3D91" w:color="auto" w:val="clear"/>
+            <w:tcMar>
+              <w:top w:type="dxa" w:w="90"/>
+              <w:left w:type="dxa" w:w="130"/>
+              <w:bottom w:type="dxa" w:w="90"/>
+              <w:right w:type="dxa" w:w="130"/>
+            </w:tcMar>
+            <w:vAlign w:val="center"/>
+          </w:tcPr>
+          <w:p>
+            <w:pPr>
+              <w:spacing w:after="0" w:before="0"/>
+            </w:pPr>
+            <w:r>
+              <w:rPr>
+                <w:rFonts w:ascii="Plus Jakarta Sans" w:cs="Plus Jakarta Sans" w:eastAsia="Plus Jakarta Sans" w:hAnsi="Plus Jakarta Sans"/>
+                <w:b/>
+                <w:bCs/>
+                <w:color w:val="FFFFFF"/>
+                <w:sz w:val="20"/>
+                <w:szCs w:val="20"/>
+              </w:rPr>
+              <w:t xml:space="preserve">Harga</w:t>
+            </w:r>
+          </w:p>
+        </w:tc>
+      </w:tr>
+      <w:tr>
+        <w:tc>
+          <w:tcPr>
+            <w:tcMar>
+              <w:top w:type="dxa" w:w="90"/>
+              <w:left w:type="dxa" w:w="130"/>
+              <w:bottom w:type="dxa" w:w="90"/>
+              <w:right w:type="dxa" w:w="130"/>
+            </w:tcMar>
+            <w:vAlign w:val="center"/>
+          </w:tcPr>
+          <w:tc>
+            <w:tcPr>
+              <w:tcMar>
+                <w:top w:type="dxa" w:w="90"/>
+                <w:left w:type="dxa" w:w="130"/>
+                <w:bottom w:type="dxa" w:w="90"/>
+                <w:right w:type="dxa" w:w="130"/>
+              </w:tcMar>
+              <w:vAlign w:val="center"/>
+            </w:tcPr>
+            <w:p>
+              <w:pPr>
+                <w:spacing w:after="0" w:before="0"/>
+              </w:pPr>
+              <w:r>
+                <w:rPr>
+                  <w:rFonts w:ascii="Plus Jakarta Sans" w:cs="Plus Jakarta Sans" w:eastAsia="Plus Jakarta Sans" w:hAnsi="Plus Jakarta Sans"/>
+                  <w:color w:val="1F2937"/>
+                  <w:sz w:val="20"/>
+                  <w:szCs w:val="20"/>
+                </w:rPr>
+                <w:t xml:space="preserve">Edit teks / gambar / foto (per item)</w:t>
+              </w:r>
+            </w:p>
+          </w:tc>
+          <w:p/>
+        </w:tc>
+        <w:tc>
+          <w:tcPr>
+            <w:tcMar>
+              <w:top w:type="dxa" w:w="90"/>
+              <w:left w:type="dxa" w:w="130"/>
+              <w:bottom w:type="dxa" w:w="90"/>
+              <w:right w:type="dxa" w:w="130"/>
+            </w:tcMar>
+            <w:vAlign w:val="center"/>
+          </w:tcPr>
+          <w:tc>
+            <w:tcPr>
+              <w:tcMar>
+                <w:top w:type="dxa" w:w="90"/>
+                <w:left w:type="dxa" w:w="130"/>
+                <w:bottom w:type="dxa" w:w="90"/>
+                <w:right w:type="dxa" w:w="130"/>
+              </w:tcMar>
+              <w:vAlign w:val="center"/>
+            </w:tcPr>
+            <w:p>
+              <w:pPr>
+                <w:spacing w:after="0" w:before="0"/>
+                <w:jc w:val="right"/>
+              </w:pPr>
+              <w:r>
+                <w:rPr>
+                  <w:rFonts w:ascii="Plus Jakarta Sans" w:cs="Plus Jakarta Sans" w:eastAsia="Plus Jakarta Sans" w:hAnsi="Plus Jakarta Sans"/>
+                  <w:color w:val="1F2937"/>
+                  <w:sz w:val="20"/>
+                  <w:szCs w:val="20"/>
+                </w:rPr>
+                <w:t xml:space="preserve">Rp 50.000</w:t>
+              </w:r>
+            </w:p>
+          </w:tc>
+          <w:p/>
+        </w:tc>
+      </w:tr>
+      <w:tr>
+        <w:tc>
+          <w:tcPr>
+            <w:tcMar>
+              <w:top w:type="dxa" w:w="90"/>
+              <w:left w:type="dxa" w:w="130"/>
+              <w:bottom w:type="dxa" w:w="90"/>
+              <w:right w:type="dxa" w:w="130"/>
+            </w:tcMar>
+            <w:vAlign w:val="center"/>
+          </w:tcPr>
+          <w:tc>
+            <w:tcPr>
+              <w:tcMar>
+                <w:top w:type="dxa" w:w="90"/>
+                <w:left w:type="dxa" w:w="130"/>
+                <w:bottom w:type="dxa" w:w="90"/>
+                <w:right w:type="dxa" w:w="130"/>
+              </w:tcMar>
+              <w:vAlign w:val="center"/>
+            </w:tcPr>
+            <w:p>
+              <w:pPr>
+                <w:spacing w:after="0" w:before="0"/>
+              </w:pPr>
+              <w:r>
+                <w:rPr>
+                  <w:rFonts w:ascii="Plus Jakarta Sans" w:cs="Plus Jakarta Sans" w:eastAsia="Plus Jakarta Sans" w:hAnsi="Plus Jakarta Sans"/>
+                  <w:color w:val="1F2937"/>
+                  <w:sz w:val="20"/>
+                  <w:szCs w:val="20"/>
+                </w:rPr>
+                <w:t xml:space="preserve">Edit tampilan / desain (per item)</w:t>
+              </w:r>
+            </w:p>
+          </w:tc>
+          <w:p/>
+        </w:tc>
+        <w:tc>
+          <w:tcPr>
+            <w:tcMar>
+              <w:top w:type="dxa" w:w="90"/>
+              <w:left w:type="dxa" w:w="130"/>
+              <w:bottom w:type="dxa" w:w="90"/>
+              <w:right w:type="dxa" w:w="130"/>
+            </w:tcMar>
+            <w:vAlign w:val="center"/>
+          </w:tcPr>
+          <w:tc>
+            <w:tcPr>
+              <w:tcMar>
+                <w:top w:type="dxa" w:w="90"/>
+                <w:left w:type="dxa" w:w="130"/>
+                <w:bottom w:type="dxa" w:w="90"/>
+                <w:right w:type="dxa" w:w="130"/>
+              </w:tcMar>
+              <w:vAlign w:val="center"/>
+            </w:tcPr>
+            <w:p>
+              <w:pPr>
+                <w:spacing w:after="0" w:before="0"/>
+                <w:jc w:val="right"/>
+              </w:pPr>
+              <w:r>
+                <w:rPr>
+                  <w:rFonts w:ascii="Plus Jakarta Sans" w:cs="Plus Jakarta Sans" w:eastAsia="Plus Jakarta Sans" w:hAnsi="Plus Jakarta Sans"/>
+                  <w:color w:val="1F2937"/>
+                  <w:sz w:val="20"/>
+                  <w:szCs w:val="20"/>
+                </w:rPr>
+                <w:t xml:space="preserve">Rp 150.000</w:t>
+              </w:r>
+            </w:p>
+          </w:tc>
+          <w:p/>
+        </w:tc>
+      </w:tr>
+      <w:tr>
+        <w:tc>
+          <w:tcPr>
+            <w:tcMar>
+              <w:top w:type="dxa" w:w="90"/>
+              <w:left w:type="dxa" w:w="130"/>
+              <w:bottom w:type="dxa" w:w="90"/>
+              <w:right w:type="dxa" w:w="130"/>
+            </w:tcMar>
+            <w:vAlign w:val="center"/>
+          </w:tcPr>
+          <w:tc>
+            <w:tcPr>
+              <w:tcMar>
+                <w:top w:type="dxa" w:w="90"/>
+                <w:left w:type="dxa" w:w="130"/>
+                <w:bottom w:type="dxa" w:w="90"/>
+                <w:right w:type="dxa" w:w="130"/>
+              </w:tcMar>
+              <w:vAlign w:val="center"/>
+            </w:tcPr>
+            <w:p>
+              <w:pPr>
+                <w:spacing w:after="0" w:before="0"/>
+              </w:pPr>
+              <w:r>
+                <w:rPr>
+                  <w:rFonts w:ascii="Plus Jakarta Sans" w:cs="Plus Jakarta Sans" w:eastAsia="Plus Jakarta Sans" w:hAnsi="Plus Jakarta Sans"/>
+                  <w:color w:val="1F2937"/>
+                  <w:sz w:val="20"/>
+                  <w:szCs w:val="20"/>
+                </w:rPr>
+                <w:t xml:space="preserve">Tambah halaman / modul baru (per item)</w:t>
+              </w:r>
+            </w:p>
+          </w:tc>
+          <w:p/>
+        </w:tc>
+        <w:tc>
+          <w:tcPr>
+            <w:tcMar>
+              <w:top w:type="dxa" w:w="90"/>
+              <w:left w:type="dxa" w:w="130"/>
+              <w:bottom w:type="dxa" w:w="90"/>
+              <w:right w:type="dxa" w:w="130"/>
+            </w:tcMar>
+            <w:vAlign w:val="center"/>
+          </w:tcPr>
+          <w:tc>
+            <w:tcPr>
+              <w:tcMar>
+                <w:top w:type="dxa" w:w="90"/>
+                <w:left w:type="dxa" w:w="130"/>
+                <w:bottom w:type="dxa" w:w="90"/>
+                <w:right w:type="dxa" w:w="130"/>
+              </w:tcMar>
+              <w:vAlign w:val="center"/>
+            </w:tcPr>
+            <w:p>
+              <w:pPr>
+                <w:spacing w:after="0" w:before="0"/>
+                <w:jc w:val="right"/>
+              </w:pPr>
+              <w:r>
+                <w:rPr>
+                  <w:rFonts w:ascii="Plus Jakarta Sans" w:cs="Plus Jakarta Sans" w:eastAsia="Plus Jakarta Sans" w:hAnsi="Plus Jakarta Sans"/>
+                  <w:color w:val="1F2937"/>
+                  <w:sz w:val="20"/>
+                  <w:szCs w:val="20"/>
+                </w:rPr>
+                <w:t xml:space="preserve">Rp 350.000</w:t>
+              </w:r>
+            </w:p>
+          </w:tc>
+          <w:p/>
+        </w:tc>
+      </w:tr>
+      <w:tr>
+        <w:tc>
+          <w:tcPr>
+            <w:tcMar>
+              <w:top w:type="dxa" w:w="90"/>
+              <w:left w:type="dxa" w:w="130"/>
+              <w:bottom w:type="dxa" w:w="90"/>
+              <w:right w:type="dxa" w:w="130"/>
+            </w:tcMar>
+            <w:vAlign w:val="center"/>
+          </w:tcPr>
+          <w:tc>
+            <w:tcPr>
+              <w:tcMar>
+                <w:top w:type="dxa" w:w="90"/>
+                <w:left w:type="dxa" w:w="130"/>
+                <w:bottom w:type="dxa" w:w="90"/>
+                <w:right w:type="dxa" w:w="130"/>
+              </w:tcMar>
+              <w:vAlign w:val="center"/>
+            </w:tcPr>
+            <w:p>
+              <w:pPr>
+                <w:spacing w:after="0" w:before="0"/>
+              </w:pPr>
+              <w:r>
+                <w:rPr>
+                  <w:rFonts w:ascii="Plus Jakarta Sans" w:cs="Plus Jakarta Sans" w:eastAsia="Plus Jakarta Sans" w:hAnsi="Plus Jakarta Sans"/>
+                  <w:b/>
+                  <w:bCs/>
+                  <w:color w:val="1F2937"/>
+                  <w:sz w:val="20"/>
+                  <w:szCs w:val="20"/>
+                </w:rPr>
+                <w:t xml:space="preserve">Paket 10 edit konten</w:t>
+              </w:r>
+            </w:p>
+          </w:tc>
+          <w:p/>
+        </w:tc>
+        <w:tc>
+          <w:tcPr>
+            <w:tcMar>
+              <w:top w:type="dxa" w:w="90"/>
+              <w:left w:type="dxa" w:w="130"/>
+              <w:bottom w:type="dxa" w:w="90"/>
+              <w:right w:type="dxa" w:w="130"/>
+            </w:tcMar>
+            <w:vAlign w:val="center"/>
+          </w:tcPr>
+          <w:tc>
+            <w:tcPr>
+              <w:tcMar>
+                <w:top w:type="dxa" w:w="90"/>
+                <w:left w:type="dxa" w:w="130"/>
+                <w:bottom w:type="dxa" w:w="90"/>
+                <w:right w:type="dxa" w:w="130"/>
+              </w:tcMar>
+              <w:vAlign w:val="center"/>
+            </w:tcPr>
+            <w:p>
+              <w:pPr>
+                <w:spacing w:after="0" w:before="0"/>
+                <w:jc w:val="right"/>
+              </w:pPr>
+              <w:r>
+                <w:rPr>
+                  <w:rFonts w:ascii="Plus Jakarta Sans" w:cs="Plus Jakarta Sans" w:eastAsia="Plus Jakarta Sans" w:hAnsi="Plus Jakarta Sans"/>
+                  <w:b/>
+                  <w:bCs/>
+                  <w:color w:val="0B3D91"/>
+                  <w:sz w:val="20"/>
+                  <w:szCs w:val="20"/>
+                </w:rPr>
+                <w:t xml:space="preserve">Rp 400.000 (hemat Rp 100.000)</w:t>
+              </w:r>
+            </w:p>
+          </w:tc>
+          <w:p/>
+        </w:tc>
+      </w:tr>
+    </w:tbl>
+    <w:p>
+      <w:pPr>
+        <w:spacing w:after="0" w:before="0"/>
+      </w:pPr>
       <w:r>
         <w:rPr>
           <w:rFonts w:ascii="Plus Jakarta Sans" w:cs="Plus Jakarta Sans" w:eastAsia="Plus Jakarta Sans" w:hAnsi="Plus Jakarta Sans"/>
@@ -5479,25 +5954,489 @@
           <w:sz w:val="22"/>
           <w:szCs w:val="22"/>
         </w:rPr>
-        <w:t xml:space="preserve">Berpengalaman membangun website profil sekolah &amp; instansi pendidikan</w:t>
-      </w:r>
-    </w:p>
-    <w:p>
-      <w:pPr>
-        <w:spacing w:after="80"/>
-        <w:ind w:left="360"/>
+        <w:t xml:space="preserve"> </w:t>
+      </w:r>
+    </w:p>
+    <w:p>
+      <w:pPr>
+        <w:pStyle w:val="Heading3"/>
+        <w:spacing w:after="160" w:before="200"/>
       </w:pPr>
       <w:r>
         <w:rPr>
           <w:rFonts w:ascii="Plus Jakarta Sans" w:cs="Plus Jakarta Sans" w:eastAsia="Plus Jakarta Sans" w:hAnsi="Plus Jakarta Sans"/>
           <w:b/>
           <w:bCs/>
-          <w:color w:val="C9A227"/>
-          <w:sz w:val="22"/>
-          <w:szCs w:val="22"/>
-        </w:rPr>
-        <w:t xml:space="preserve">✓  </w:t>
-      </w:r>
+          <w:color w:val="082B66"/>
+          <w:sz w:val="23"/>
+          <w:szCs w:val="23"/>
+        </w:rPr>
+        <w:t xml:space="preserve">Paket Maintenance Bulanan</w:t>
+      </w:r>
+    </w:p>
+    <w:tbl>
+      <w:tblPr>
+        <w:tblW w:type="dxa" w:w="9100"/>
+        <w:tblBorders>
+          <w:top w:val="single" w:color="E2E8F0" w:sz="4"/>
+          <w:left w:val="single" w:color="E2E8F0" w:sz="4"/>
+          <w:bottom w:val="single" w:color="E2E8F0" w:sz="4"/>
+          <w:right w:val="single" w:color="E2E8F0" w:sz="4"/>
+          <w:insideH w:val="single" w:color="E2E8F0" w:sz="4"/>
+          <w:insideV w:val="single" w:color="E2E8F0" w:sz="4"/>
+        </w:tblBorders>
+      </w:tblPr>
+      <w:tblGrid>
+        <w:gridCol w:w="1900"/>
+        <w:gridCol w:w="5000"/>
+        <w:gridCol w:w="2200"/>
+      </w:tblGrid>
+      <w:tr>
+        <w:trPr>
+          <w:tblHeader/>
+        </w:trPr>
+        <w:tc>
+          <w:tcPr>
+            <w:shd w:fill="0B3D91" w:color="auto" w:val="clear"/>
+            <w:tcMar>
+              <w:top w:type="dxa" w:w="90"/>
+              <w:left w:type="dxa" w:w="130"/>
+              <w:bottom w:type="dxa" w:w="90"/>
+              <w:right w:type="dxa" w:w="130"/>
+            </w:tcMar>
+            <w:vAlign w:val="center"/>
+          </w:tcPr>
+          <w:p>
+            <w:pPr>
+              <w:spacing w:after="0" w:before="0"/>
+            </w:pPr>
+            <w:r>
+              <w:rPr>
+                <w:rFonts w:ascii="Plus Jakarta Sans" w:cs="Plus Jakarta Sans" w:eastAsia="Plus Jakarta Sans" w:hAnsi="Plus Jakarta Sans"/>
+                <w:b/>
+                <w:bCs/>
+                <w:color w:val="FFFFFF"/>
+                <w:sz w:val="20"/>
+                <w:szCs w:val="20"/>
+              </w:rPr>
+              <w:t xml:space="preserve">Paket</w:t>
+            </w:r>
+          </w:p>
+        </w:tc>
+        <w:tc>
+          <w:tcPr>
+            <w:shd w:fill="0B3D91" w:color="auto" w:val="clear"/>
+            <w:tcMar>
+              <w:top w:type="dxa" w:w="90"/>
+              <w:left w:type="dxa" w:w="130"/>
+              <w:bottom w:type="dxa" w:w="90"/>
+              <w:right w:type="dxa" w:w="130"/>
+            </w:tcMar>
+            <w:vAlign w:val="center"/>
+          </w:tcPr>
+          <w:p>
+            <w:pPr>
+              <w:spacing w:after="0" w:before="0"/>
+            </w:pPr>
+            <w:r>
+              <w:rPr>
+                <w:rFonts w:ascii="Plus Jakarta Sans" w:cs="Plus Jakarta Sans" w:eastAsia="Plus Jakarta Sans" w:hAnsi="Plus Jakarta Sans"/>
+                <w:b/>
+                <w:bCs/>
+                <w:color w:val="FFFFFF"/>
+                <w:sz w:val="20"/>
+                <w:szCs w:val="20"/>
+              </w:rPr>
+              <w:t xml:space="preserve">Fitur</w:t>
+            </w:r>
+          </w:p>
+        </w:tc>
+        <w:tc>
+          <w:tcPr>
+            <w:shd w:fill="0B3D91" w:color="auto" w:val="clear"/>
+            <w:tcMar>
+              <w:top w:type="dxa" w:w="90"/>
+              <w:left w:type="dxa" w:w="130"/>
+              <w:bottom w:type="dxa" w:w="90"/>
+              <w:right w:type="dxa" w:w="130"/>
+            </w:tcMar>
+            <w:vAlign w:val="center"/>
+          </w:tcPr>
+          <w:p>
+            <w:pPr>
+              <w:spacing w:after="0" w:before="0"/>
+            </w:pPr>
+            <w:r>
+              <w:rPr>
+                <w:rFonts w:ascii="Plus Jakarta Sans" w:cs="Plus Jakarta Sans" w:eastAsia="Plus Jakarta Sans" w:hAnsi="Plus Jakarta Sans"/>
+                <w:b/>
+                <w:bCs/>
+                <w:color w:val="FFFFFF"/>
+                <w:sz w:val="20"/>
+                <w:szCs w:val="20"/>
+              </w:rPr>
+              <w:t xml:space="preserve">Harga</w:t>
+            </w:r>
+          </w:p>
+        </w:tc>
+      </w:tr>
+      <w:tr>
+        <w:tc>
+          <w:tcPr>
+            <w:tcMar>
+              <w:top w:type="dxa" w:w="90"/>
+              <w:left w:type="dxa" w:w="130"/>
+              <w:bottom w:type="dxa" w:w="90"/>
+              <w:right w:type="dxa" w:w="130"/>
+            </w:tcMar>
+            <w:vAlign w:val="center"/>
+          </w:tcPr>
+          <w:tc>
+            <w:tcPr>
+              <w:tcMar>
+                <w:top w:type="dxa" w:w="90"/>
+                <w:left w:type="dxa" w:w="130"/>
+                <w:bottom w:type="dxa" w:w="90"/>
+                <w:right w:type="dxa" w:w="130"/>
+              </w:tcMar>
+              <w:vAlign w:val="center"/>
+            </w:tcPr>
+            <w:p>
+              <w:pPr>
+                <w:spacing w:after="0" w:before="0"/>
+              </w:pPr>
+              <w:r>
+                <w:rPr>
+                  <w:rFonts w:ascii="Plus Jakarta Sans" w:cs="Plus Jakarta Sans" w:eastAsia="Plus Jakarta Sans" w:hAnsi="Plus Jakarta Sans"/>
+                  <w:b/>
+                  <w:bCs/>
+                  <w:color w:val="1F2937"/>
+                  <w:sz w:val="20"/>
+                  <w:szCs w:val="20"/>
+                </w:rPr>
+                <w:t xml:space="preserve">Basic</w:t>
+              </w:r>
+            </w:p>
+          </w:tc>
+          <w:p/>
+        </w:tc>
+        <w:tc>
+          <w:tcPr>
+            <w:tcMar>
+              <w:top w:type="dxa" w:w="90"/>
+              <w:left w:type="dxa" w:w="130"/>
+              <w:bottom w:type="dxa" w:w="90"/>
+              <w:right w:type="dxa" w:w="130"/>
+            </w:tcMar>
+            <w:vAlign w:val="center"/>
+          </w:tcPr>
+          <w:tc>
+            <w:tcPr>
+              <w:tcMar>
+                <w:top w:type="dxa" w:w="90"/>
+                <w:left w:type="dxa" w:w="130"/>
+                <w:bottom w:type="dxa" w:w="90"/>
+                <w:right w:type="dxa" w:w="130"/>
+              </w:tcMar>
+              <w:vAlign w:val="center"/>
+            </w:tcPr>
+            <w:p>
+              <w:pPr>
+                <w:spacing w:after="0" w:before="0"/>
+              </w:pPr>
+              <w:r>
+                <w:rPr>
+                  <w:rFonts w:ascii="Plus Jakarta Sans" w:cs="Plus Jakarta Sans" w:eastAsia="Plus Jakarta Sans" w:hAnsi="Plus Jakarta Sans"/>
+                  <w:color w:val="1F2937"/>
+                  <w:sz w:val="19"/>
+                  <w:szCs w:val="19"/>
+                </w:rPr>
+                <w:t xml:space="preserve">Backup &amp; monitoring, update keamanan, 5 edit konten, respon 2×24 jam</w:t>
+              </w:r>
+            </w:p>
+          </w:tc>
+          <w:p/>
+        </w:tc>
+        <w:tc>
+          <w:tcPr>
+            <w:tcMar>
+              <w:top w:type="dxa" w:w="90"/>
+              <w:left w:type="dxa" w:w="130"/>
+              <w:bottom w:type="dxa" w:w="90"/>
+              <w:right w:type="dxa" w:w="130"/>
+            </w:tcMar>
+            <w:vAlign w:val="center"/>
+          </w:tcPr>
+          <w:tc>
+            <w:tcPr>
+              <w:tcMar>
+                <w:top w:type="dxa" w:w="90"/>
+                <w:left w:type="dxa" w:w="130"/>
+                <w:bottom w:type="dxa" w:w="90"/>
+                <w:right w:type="dxa" w:w="130"/>
+              </w:tcMar>
+              <w:vAlign w:val="center"/>
+            </w:tcPr>
+            <w:p>
+              <w:pPr>
+                <w:spacing w:after="0" w:before="0"/>
+              </w:pPr>
+              <w:r>
+                <w:rPr>
+                  <w:rFonts w:ascii="Plus Jakarta Sans" w:cs="Plus Jakarta Sans" w:eastAsia="Plus Jakarta Sans" w:hAnsi="Plus Jakarta Sans"/>
+                  <w:b/>
+                  <w:bCs/>
+                  <w:color w:val="0B3D91"/>
+                  <w:sz w:val="20"/>
+                  <w:szCs w:val="20"/>
+                </w:rPr>
+                <w:t xml:space="preserve">Rp 250.000/bln</w:t>
+              </w:r>
+            </w:p>
+          </w:tc>
+          <w:p/>
+        </w:tc>
+      </w:tr>
+      <w:tr>
+        <w:tc>
+          <w:tcPr>
+            <w:tcMar>
+              <w:top w:type="dxa" w:w="90"/>
+              <w:left w:type="dxa" w:w="130"/>
+              <w:bottom w:type="dxa" w:w="90"/>
+              <w:right w:type="dxa" w:w="130"/>
+            </w:tcMar>
+            <w:vAlign w:val="center"/>
+          </w:tcPr>
+          <w:tc>
+            <w:tcPr>
+              <w:tcMar>
+                <w:top w:type="dxa" w:w="90"/>
+                <w:left w:type="dxa" w:w="130"/>
+                <w:bottom w:type="dxa" w:w="90"/>
+                <w:right w:type="dxa" w:w="130"/>
+              </w:tcMar>
+              <w:vAlign w:val="center"/>
+            </w:tcPr>
+            <w:p>
+              <w:pPr>
+                <w:spacing w:after="0" w:before="0"/>
+              </w:pPr>
+              <w:r>
+                <w:rPr>
+                  <w:rFonts w:ascii="Plus Jakarta Sans" w:cs="Plus Jakarta Sans" w:eastAsia="Plus Jakarta Sans" w:hAnsi="Plus Jakarta Sans"/>
+                  <w:b/>
+                  <w:bCs/>
+                  <w:color w:val="1F2937"/>
+                  <w:sz w:val="20"/>
+                  <w:szCs w:val="20"/>
+                </w:rPr>
+                <w:t xml:space="preserve">Standar
+(Rekomendasi)</w:t>
+              </w:r>
+            </w:p>
+          </w:tc>
+          <w:p/>
+        </w:tc>
+        <w:tc>
+          <w:tcPr>
+            <w:tcMar>
+              <w:top w:type="dxa" w:w="90"/>
+              <w:left w:type="dxa" w:w="130"/>
+              <w:bottom w:type="dxa" w:w="90"/>
+              <w:right w:type="dxa" w:w="130"/>
+            </w:tcMar>
+            <w:vAlign w:val="center"/>
+          </w:tcPr>
+          <w:tc>
+            <w:tcPr>
+              <w:tcMar>
+                <w:top w:type="dxa" w:w="90"/>
+                <w:left w:type="dxa" w:w="130"/>
+                <w:bottom w:type="dxa" w:w="90"/>
+                <w:right w:type="dxa" w:w="130"/>
+              </w:tcMar>
+              <w:vAlign w:val="center"/>
+            </w:tcPr>
+            <w:p>
+              <w:pPr>
+                <w:spacing w:after="0" w:before="0"/>
+              </w:pPr>
+              <w:r>
+                <w:rPr>
+                  <w:rFonts w:ascii="Plus Jakarta Sans" w:cs="Plus Jakarta Sans" w:eastAsia="Plus Jakarta Sans" w:hAnsi="Plus Jakarta Sans"/>
+                  <w:color w:val="1F2937"/>
+                  <w:sz w:val="19"/>
+                  <w:szCs w:val="19"/>
+                </w:rPr>
+                <w:t xml:space="preserve">Semua Basic + 15 edit konten, bug prioritas, laporan bulanan</w:t>
+              </w:r>
+            </w:p>
+          </w:tc>
+          <w:p/>
+        </w:tc>
+        <w:tc>
+          <w:tcPr>
+            <w:tcMar>
+              <w:top w:type="dxa" w:w="90"/>
+              <w:left w:type="dxa" w:w="130"/>
+              <w:bottom w:type="dxa" w:w="90"/>
+              <w:right w:type="dxa" w:w="130"/>
+            </w:tcMar>
+            <w:vAlign w:val="center"/>
+          </w:tcPr>
+          <w:tc>
+            <w:tcPr>
+              <w:tcMar>
+                <w:top w:type="dxa" w:w="90"/>
+                <w:left w:type="dxa" w:w="130"/>
+                <w:bottom w:type="dxa" w:w="90"/>
+                <w:right w:type="dxa" w:w="130"/>
+              </w:tcMar>
+              <w:vAlign w:val="center"/>
+            </w:tcPr>
+            <w:p>
+              <w:pPr>
+                <w:spacing w:after="0" w:before="0"/>
+              </w:pPr>
+              <w:r>
+                <w:rPr>
+                  <w:rFonts w:ascii="Plus Jakarta Sans" w:cs="Plus Jakarta Sans" w:eastAsia="Plus Jakarta Sans" w:hAnsi="Plus Jakarta Sans"/>
+                  <w:b/>
+                  <w:bCs/>
+                  <w:color w:val="0B3D91"/>
+                  <w:sz w:val="20"/>
+                  <w:szCs w:val="20"/>
+                </w:rPr>
+                <w:t xml:space="preserve">Rp 450.000/bln</w:t>
+              </w:r>
+            </w:p>
+          </w:tc>
+          <w:p/>
+        </w:tc>
+      </w:tr>
+      <w:tr>
+        <w:tc>
+          <w:tcPr>
+            <w:tcMar>
+              <w:top w:type="dxa" w:w="90"/>
+              <w:left w:type="dxa" w:w="130"/>
+              <w:bottom w:type="dxa" w:w="90"/>
+              <w:right w:type="dxa" w:w="130"/>
+            </w:tcMar>
+            <w:vAlign w:val="center"/>
+          </w:tcPr>
+          <w:tc>
+            <w:tcPr>
+              <w:tcMar>
+                <w:top w:type="dxa" w:w="90"/>
+                <w:left w:type="dxa" w:w="130"/>
+                <w:bottom w:type="dxa" w:w="90"/>
+                <w:right w:type="dxa" w:w="130"/>
+              </w:tcMar>
+              <w:vAlign w:val="center"/>
+            </w:tcPr>
+            <w:p>
+              <w:pPr>
+                <w:spacing w:after="0" w:before="0"/>
+              </w:pPr>
+              <w:r>
+                <w:rPr>
+                  <w:rFonts w:ascii="Plus Jakarta Sans" w:cs="Plus Jakarta Sans" w:eastAsia="Plus Jakarta Sans" w:hAnsi="Plus Jakarta Sans"/>
+                  <w:b/>
+                  <w:bCs/>
+                  <w:color w:val="1F2937"/>
+                  <w:sz w:val="20"/>
+                  <w:szCs w:val="20"/>
+                </w:rPr>
+                <w:t xml:space="preserve">Premium</w:t>
+              </w:r>
+            </w:p>
+          </w:tc>
+          <w:p/>
+        </w:tc>
+        <w:tc>
+          <w:tcPr>
+            <w:tcMar>
+              <w:top w:type="dxa" w:w="90"/>
+              <w:left w:type="dxa" w:w="130"/>
+              <w:bottom w:type="dxa" w:w="90"/>
+              <w:right w:type="dxa" w:w="130"/>
+            </w:tcMar>
+            <w:vAlign w:val="center"/>
+          </w:tcPr>
+          <w:tc>
+            <w:tcPr>
+              <w:tcMar>
+                <w:top w:type="dxa" w:w="90"/>
+                <w:left w:type="dxa" w:w="130"/>
+                <w:bottom w:type="dxa" w:w="90"/>
+                <w:right w:type="dxa" w:w="130"/>
+              </w:tcMar>
+              <w:vAlign w:val="center"/>
+            </w:tcPr>
+            <w:p>
+              <w:pPr>
+                <w:spacing w:after="0" w:before="0"/>
+              </w:pPr>
+              <w:r>
+                <w:rPr>
+                  <w:rFonts w:ascii="Plus Jakarta Sans" w:cs="Plus Jakarta Sans" w:eastAsia="Plus Jakarta Sans" w:hAnsi="Plus Jakarta Sans"/>
+                  <w:color w:val="1F2937"/>
+                  <w:sz w:val="19"/>
+                  <w:szCs w:val="19"/>
+                </w:rPr>
+                <w:t xml:space="preserve">Semua Standar + edit tanpa batas, prioritas WA, SEO review</w:t>
+              </w:r>
+            </w:p>
+          </w:tc>
+          <w:p/>
+        </w:tc>
+        <w:tc>
+          <w:tcPr>
+            <w:tcMar>
+              <w:top w:type="dxa" w:w="90"/>
+              <w:left w:type="dxa" w:w="130"/>
+              <w:bottom w:type="dxa" w:w="90"/>
+              <w:right w:type="dxa" w:w="130"/>
+            </w:tcMar>
+            <w:vAlign w:val="center"/>
+          </w:tcPr>
+          <w:tc>
+            <w:tcPr>
+              <w:tcMar>
+                <w:top w:type="dxa" w:w="90"/>
+                <w:left w:type="dxa" w:w="130"/>
+                <w:bottom w:type="dxa" w:w="90"/>
+                <w:right w:type="dxa" w:w="130"/>
+              </w:tcMar>
+              <w:vAlign w:val="center"/>
+            </w:tcPr>
+            <w:p>
+              <w:pPr>
+                <w:spacing w:after="0" w:before="0"/>
+              </w:pPr>
+              <w:r>
+                <w:rPr>
+                  <w:rFonts w:ascii="Plus Jakarta Sans" w:cs="Plus Jakarta Sans" w:eastAsia="Plus Jakarta Sans" w:hAnsi="Plus Jakarta Sans"/>
+                  <w:b/>
+                  <w:bCs/>
+                  <w:color w:val="0B3D91"/>
+                  <w:sz w:val="20"/>
+                  <w:szCs w:val="20"/>
+                </w:rPr>
+                <w:t xml:space="preserve">Rp 700.000/bln</w:t>
+              </w:r>
+            </w:p>
+          </w:tc>
+          <w:p/>
+        </w:tc>
+      </w:tr>
+    </w:tbl>
+    <w:p>
+      <w:pPr>
+        <w:spacing w:after="0" w:before="0"/>
+      </w:pPr>
       <w:r>
         <w:rPr>
           <w:rFonts w:ascii="Plus Jakarta Sans" w:cs="Plus Jakarta Sans" w:eastAsia="Plus Jakarta Sans" w:hAnsi="Plus Jakarta Sans"/>
@@ -5505,137 +6444,36 @@
           <w:sz w:val="22"/>
           <w:szCs w:val="22"/>
         </w:rPr>
-        <w:t xml:space="preserve">Desain modern, mobile-first, dan sesuai identitas sekolah</w:t>
-      </w:r>
-    </w:p>
-    <w:p>
-      <w:pPr>
-        <w:spacing w:after="80"/>
-        <w:ind w:left="360"/>
+        <w:t xml:space="preserve"> </w:t>
+      </w:r>
+    </w:p>
+    <w:p>
+      <w:pPr>
+        <w:spacing w:after="0" w:before="0"/>
       </w:pPr>
       <w:r>
         <w:rPr>
           <w:rFonts w:ascii="Plus Jakarta Sans" w:cs="Plus Jakarta Sans" w:eastAsia="Plus Jakarta Sans" w:hAnsi="Plus Jakarta Sans"/>
           <w:b/>
           <w:bCs/>
-          <w:color w:val="C9A227"/>
-          <w:sz w:val="22"/>
-          <w:szCs w:val="22"/>
-        </w:rPr>
-        <w:t xml:space="preserve">✓  </w:t>
-      </w:r>
-      <w:r>
-        <w:rPr>
-          <w:rFonts w:ascii="Plus Jakarta Sans" w:cs="Plus Jakarta Sans" w:eastAsia="Plus Jakarta Sans" w:hAnsi="Plus Jakarta Sans"/>
+          <w:i/>
+          <w:iCs/>
           <w:color w:val="1F2937"/>
           <w:sz w:val="22"/>
           <w:szCs w:val="22"/>
         </w:rPr>
-        <w:t xml:space="preserve">Panel admin mudah digunakan — staf sekolah bisa update sendiri</w:t>
-      </w:r>
-    </w:p>
-    <w:p>
-      <w:pPr>
-        <w:spacing w:after="80"/>
-        <w:ind w:left="360"/>
-      </w:pPr>
-      <w:r>
-        <w:rPr>
-          <w:rFonts w:ascii="Plus Jakarta Sans" w:cs="Plus Jakarta Sans" w:eastAsia="Plus Jakarta Sans" w:hAnsi="Plus Jakarta Sans"/>
-          <w:b/>
-          <w:bCs/>
-          <w:color w:val="C9A227"/>
-          <w:sz w:val="22"/>
-          <w:szCs w:val="22"/>
-        </w:rPr>
-        <w:t xml:space="preserve">✓  </w:t>
-      </w:r>
-      <w:r>
-        <w:rPr>
-          <w:rFonts w:ascii="Plus Jakarta Sans" w:cs="Plus Jakarta Sans" w:eastAsia="Plus Jakarta Sans" w:hAnsi="Plus Jakarta Sans"/>
-          <w:color w:val="1F2937"/>
-          <w:sz w:val="22"/>
-          <w:szCs w:val="22"/>
-        </w:rPr>
-        <w:t xml:space="preserve">Customizer tampilan: ganti warna &amp; teks tanpa perlu developer</w:t>
-      </w:r>
-    </w:p>
-    <w:p>
-      <w:pPr>
-        <w:spacing w:after="80"/>
-        <w:ind w:left="360"/>
-      </w:pPr>
-      <w:r>
-        <w:rPr>
-          <w:rFonts w:ascii="Plus Jakarta Sans" w:cs="Plus Jakarta Sans" w:eastAsia="Plus Jakarta Sans" w:hAnsi="Plus Jakarta Sans"/>
-          <w:b/>
-          <w:bCs/>
-          <w:color w:val="C9A227"/>
-          <w:sz w:val="22"/>
-          <w:szCs w:val="22"/>
-        </w:rPr>
-        <w:t xml:space="preserve">✓  </w:t>
-      </w:r>
-      <w:r>
-        <w:rPr>
-          <w:rFonts w:ascii="Plus Jakarta Sans" w:cs="Plus Jakarta Sans" w:eastAsia="Plus Jakarta Sans" w:hAnsi="Plus Jakarta Sans"/>
-          <w:color w:val="1F2937"/>
-          <w:sz w:val="22"/>
-          <w:szCs w:val="22"/>
-        </w:rPr>
-        <w:t xml:space="preserve">Harga transparan, tanpa biaya tersembunyi</w:t>
-      </w:r>
-    </w:p>
-    <w:p>
-      <w:pPr>
-        <w:spacing w:after="80"/>
-        <w:ind w:left="360"/>
-      </w:pPr>
-      <w:r>
-        <w:rPr>
-          <w:rFonts w:ascii="Plus Jakarta Sans" w:cs="Plus Jakarta Sans" w:eastAsia="Plus Jakarta Sans" w:hAnsi="Plus Jakarta Sans"/>
-          <w:b/>
-          <w:bCs/>
-          <w:color w:val="C9A227"/>
-          <w:sz w:val="22"/>
-          <w:szCs w:val="22"/>
-        </w:rPr>
-        <w:t xml:space="preserve">✓  </w:t>
-      </w:r>
-      <w:r>
-        <w:rPr>
-          <w:rFonts w:ascii="Plus Jakarta Sans" w:cs="Plus Jakarta Sans" w:eastAsia="Plus Jakarta Sans" w:hAnsi="Plus Jakarta Sans"/>
-          <w:color w:val="1F2937"/>
-          <w:sz w:val="22"/>
-          <w:szCs w:val="22"/>
-        </w:rPr>
-        <w:t xml:space="preserve">Dukungan responsif &amp; garansi 3 bulan</w:t>
-      </w:r>
-    </w:p>
-    <w:p>
-      <w:pPr>
-        <w:spacing w:after="80"/>
-        <w:ind w:left="360"/>
-      </w:pPr>
-      <w:r>
-        <w:rPr>
-          <w:rFonts w:ascii="Plus Jakarta Sans" w:cs="Plus Jakarta Sans" w:eastAsia="Plus Jakarta Sans" w:hAnsi="Plus Jakarta Sans"/>
-          <w:b/>
-          <w:bCs/>
-          <w:color w:val="C9A227"/>
-          <w:sz w:val="22"/>
-          <w:szCs w:val="22"/>
-        </w:rPr>
-        <w:t xml:space="preserve">✓  </w:t>
-      </w:r>
-      <w:r>
-        <w:rPr>
-          <w:rFonts w:ascii="Plus Jakarta Sans" w:cs="Plus Jakarta Sans" w:eastAsia="Plus Jakarta Sans" w:hAnsi="Plus Jakarta Sans"/>
-          <w:color w:val="1F2937"/>
-          <w:sz w:val="22"/>
-          <w:szCs w:val="22"/>
-        </w:rPr>
-        <w:t xml:space="preserve">Demo live dapat dilihat &amp; dicoba langsung sebelum memutuskan</w:t>
+        <w:t xml:space="preserve">Catatan: </w:t>
+      </w:r>
+      <w:r>
+        <w:rPr>
+          <w:rFonts w:ascii="Plus Jakarta Sans" w:cs="Plus Jakarta Sans" w:eastAsia="Plus Jakarta Sans" w:hAnsi="Plus Jakarta Sans"/>
+          <w:i/>
+          <w:iCs/>
+          <w:color w:val="5B6B82"/>
+          <w:sz w:val="19"/>
+          <w:szCs w:val="19"/>
+        </w:rPr>
+        <w:t xml:space="preserve">Langganan tahunan = bayar 10 bulan, gratis 2 bulan.</w:t>
       </w:r>
     </w:p>
     <w:p>
@@ -5652,7 +6490,843 @@
           <w:sz w:val="30"/>
           <w:szCs w:val="30"/>
         </w:rPr>
-        <w:t xml:space="preserve">10. Penutup</w:t>
+        <w:t xml:space="preserve">9. Pilihan Infrastruktur: Supabase vs VPS</w:t>
+      </w:r>
+    </w:p>
+    <w:p>
+      <w:pPr>
+        <w:spacing w:after="120" w:before="0"/>
+      </w:pPr>
+      <w:r>
+        <w:rPr>
+          <w:rFonts w:ascii="Plus Jakarta Sans" w:cs="Plus Jakarta Sans" w:eastAsia="Plus Jakarta Sans" w:hAnsi="Plus Jakarta Sans"/>
+          <w:color w:val="1F2937"/>
+          <w:sz w:val="22"/>
+          <w:szCs w:val="22"/>
+        </w:rPr>
+        <w:t xml:space="preserve">Kedua opsi sudah termasuk database, autentikasi, dan penyimpanan. Pilih sesuai kebutuhan sekolah:</w:t>
+      </w:r>
+    </w:p>
+    <w:tbl>
+      <w:tblPr>
+        <w:tblW w:type="dxa" w:w="9100"/>
+        <w:tblBorders>
+          <w:top w:val="single" w:color="E2E8F0" w:sz="4"/>
+          <w:left w:val="single" w:color="E2E8F0" w:sz="4"/>
+          <w:bottom w:val="single" w:color="E2E8F0" w:sz="4"/>
+          <w:right w:val="single" w:color="E2E8F0" w:sz="4"/>
+          <w:insideH w:val="single" w:color="E2E8F0" w:sz="4"/>
+          <w:insideV w:val="single" w:color="E2E8F0" w:sz="4"/>
+        </w:tblBorders>
+      </w:tblPr>
+      <w:tblGrid>
+        <w:gridCol w:w="1700"/>
+        <w:gridCol w:w="3800"/>
+        <w:gridCol w:w="3600"/>
+      </w:tblGrid>
+      <w:tr>
+        <w:trPr>
+          <w:tblHeader/>
+        </w:trPr>
+        <w:tc>
+          <w:tcPr>
+            <w:shd w:fill="0B3D91" w:color="auto" w:val="clear"/>
+            <w:tcMar>
+              <w:top w:type="dxa" w:w="90"/>
+              <w:left w:type="dxa" w:w="130"/>
+              <w:bottom w:type="dxa" w:w="90"/>
+              <w:right w:type="dxa" w:w="130"/>
+            </w:tcMar>
+            <w:vAlign w:val="center"/>
+          </w:tcPr>
+          <w:p>
+            <w:pPr>
+              <w:spacing w:after="0" w:before="0"/>
+            </w:pPr>
+            <w:r>
+              <w:rPr>
+                <w:rFonts w:ascii="Plus Jakarta Sans" w:cs="Plus Jakarta Sans" w:eastAsia="Plus Jakarta Sans" w:hAnsi="Plus Jakarta Sans"/>
+                <w:b/>
+                <w:bCs/>
+                <w:color w:val="FFFFFF"/>
+                <w:sz w:val="20"/>
+                <w:szCs w:val="20"/>
+              </w:rPr>
+              <w:t xml:space="preserve">Aspek</w:t>
+            </w:r>
+          </w:p>
+        </w:tc>
+        <w:tc>
+          <w:tcPr>
+            <w:shd w:fill="0B3D91" w:color="auto" w:val="clear"/>
+            <w:tcMar>
+              <w:top w:type="dxa" w:w="90"/>
+              <w:left w:type="dxa" w:w="130"/>
+              <w:bottom w:type="dxa" w:w="90"/>
+              <w:right w:type="dxa" w:w="130"/>
+            </w:tcMar>
+            <w:vAlign w:val="center"/>
+          </w:tcPr>
+          <w:p>
+            <w:pPr>
+              <w:spacing w:after="0" w:before="0"/>
+            </w:pPr>
+            <w:r>
+              <w:rPr>
+                <w:rFonts w:ascii="Plus Jakarta Sans" w:cs="Plus Jakarta Sans" w:eastAsia="Plus Jakarta Sans" w:hAnsi="Plus Jakarta Sans"/>
+                <w:b/>
+                <w:bCs/>
+                <w:color w:val="FFFFFF"/>
+                <w:sz w:val="20"/>
+                <w:szCs w:val="20"/>
+              </w:rPr>
+              <w:t xml:space="preserve">Supabase (default)</w:t>
+            </w:r>
+          </w:p>
+        </w:tc>
+        <w:tc>
+          <w:tcPr>
+            <w:shd w:fill="0B3D91" w:color="auto" w:val="clear"/>
+            <w:tcMar>
+              <w:top w:type="dxa" w:w="90"/>
+              <w:left w:type="dxa" w:w="130"/>
+              <w:bottom w:type="dxa" w:w="90"/>
+              <w:right w:type="dxa" w:w="130"/>
+            </w:tcMar>
+            <w:vAlign w:val="center"/>
+          </w:tcPr>
+          <w:p>
+            <w:pPr>
+              <w:spacing w:after="0" w:before="0"/>
+            </w:pPr>
+            <w:r>
+              <w:rPr>
+                <w:rFonts w:ascii="Plus Jakarta Sans" w:cs="Plus Jakarta Sans" w:eastAsia="Plus Jakarta Sans" w:hAnsi="Plus Jakarta Sans"/>
+                <w:b/>
+                <w:bCs/>
+                <w:color w:val="FFFFFF"/>
+                <w:sz w:val="20"/>
+                <w:szCs w:val="20"/>
+              </w:rPr>
+              <w:t xml:space="preserve">VPS (add-on)</w:t>
+            </w:r>
+          </w:p>
+        </w:tc>
+      </w:tr>
+      <w:tr>
+        <w:tc>
+          <w:tcPr>
+            <w:tcMar>
+              <w:top w:type="dxa" w:w="90"/>
+              <w:left w:type="dxa" w:w="130"/>
+              <w:bottom w:type="dxa" w:w="90"/>
+              <w:right w:type="dxa" w:w="130"/>
+            </w:tcMar>
+            <w:vAlign w:val="center"/>
+          </w:tcPr>
+          <w:tc>
+            <w:tcPr>
+              <w:tcMar>
+                <w:top w:type="dxa" w:w="90"/>
+                <w:left w:type="dxa" w:w="130"/>
+                <w:bottom w:type="dxa" w:w="90"/>
+                <w:right w:type="dxa" w:w="130"/>
+              </w:tcMar>
+              <w:vAlign w:val="center"/>
+            </w:tcPr>
+            <w:p>
+              <w:pPr>
+                <w:spacing w:after="0" w:before="0"/>
+              </w:pPr>
+              <w:r>
+                <w:rPr>
+                  <w:rFonts w:ascii="Plus Jakarta Sans" w:cs="Plus Jakarta Sans" w:eastAsia="Plus Jakarta Sans" w:hAnsi="Plus Jakarta Sans"/>
+                  <w:b/>
+                  <w:bCs/>
+                  <w:color w:val="1F2937"/>
+                  <w:sz w:val="20"/>
+                  <w:szCs w:val="20"/>
+                </w:rPr>
+                <w:t xml:space="preserve">Kelebihan</w:t>
+              </w:r>
+            </w:p>
+          </w:tc>
+          <w:p/>
+        </w:tc>
+        <w:tc>
+          <w:tcPr>
+            <w:tcMar>
+              <w:top w:type="dxa" w:w="90"/>
+              <w:left w:type="dxa" w:w="130"/>
+              <w:bottom w:type="dxa" w:w="90"/>
+              <w:right w:type="dxa" w:w="130"/>
+            </w:tcMar>
+            <w:vAlign w:val="center"/>
+          </w:tcPr>
+          <w:tc>
+            <w:tcPr>
+              <w:tcMar>
+                <w:top w:type="dxa" w:w="90"/>
+                <w:left w:type="dxa" w:w="130"/>
+                <w:bottom w:type="dxa" w:w="90"/>
+                <w:right w:type="dxa" w:w="130"/>
+              </w:tcMar>
+              <w:vAlign w:val="center"/>
+            </w:tcPr>
+            <w:p>
+              <w:pPr>
+                <w:spacing w:after="0" w:before="0"/>
+              </w:pPr>
+              <w:r>
+                <w:rPr>
+                  <w:rFonts w:ascii="Plus Jakarta Sans" w:cs="Plus Jakarta Sans" w:eastAsia="Plus Jakarta Sans" w:hAnsi="Plus Jakarta Sans"/>
+                  <w:color w:val="1F2937"/>
+                  <w:sz w:val="19"/>
+                  <w:szCs w:val="19"/>
+                </w:rPr>
+                <w:t xml:space="preserve">Managed, auto backup, tanpa urus server. Cukup untuk profil + PPDB</w:t>
+              </w:r>
+            </w:p>
+          </w:tc>
+          <w:p/>
+        </w:tc>
+        <w:tc>
+          <w:tcPr>
+            <w:tcMar>
+              <w:top w:type="dxa" w:w="90"/>
+              <w:left w:type="dxa" w:w="130"/>
+              <w:bottom w:type="dxa" w:w="90"/>
+              <w:right w:type="dxa" w:w="130"/>
+            </w:tcMar>
+            <w:vAlign w:val="center"/>
+          </w:tcPr>
+          <w:tc>
+            <w:tcPr>
+              <w:tcMar>
+                <w:top w:type="dxa" w:w="90"/>
+                <w:left w:type="dxa" w:w="130"/>
+                <w:bottom w:type="dxa" w:w="90"/>
+                <w:right w:type="dxa" w:w="130"/>
+              </w:tcMar>
+              <w:vAlign w:val="center"/>
+            </w:tcPr>
+            <w:p>
+              <w:pPr>
+                <w:spacing w:after="0" w:before="0"/>
+              </w:pPr>
+              <w:r>
+                <w:rPr>
+                  <w:rFonts w:ascii="Plus Jakarta Sans" w:cs="Plus Jakarta Sans" w:eastAsia="Plus Jakarta Sans" w:hAnsi="Plus Jakarta Sans"/>
+                  <w:color w:val="1F2937"/>
+                  <w:sz w:val="19"/>
+                  <w:szCs w:val="19"/>
+                </w:rPr>
+                <w:t xml:space="preserve">Full kontrol, email kustom, multi-aplikasi, resource besar</w:t>
+              </w:r>
+            </w:p>
+          </w:tc>
+          <w:p/>
+        </w:tc>
+      </w:tr>
+      <w:tr>
+        <w:tc>
+          <w:tcPr>
+            <w:tcMar>
+              <w:top w:type="dxa" w:w="90"/>
+              <w:left w:type="dxa" w:w="130"/>
+              <w:bottom w:type="dxa" w:w="90"/>
+              <w:right w:type="dxa" w:w="130"/>
+            </w:tcMar>
+            <w:vAlign w:val="center"/>
+          </w:tcPr>
+          <w:tc>
+            <w:tcPr>
+              <w:tcMar>
+                <w:top w:type="dxa" w:w="90"/>
+                <w:left w:type="dxa" w:w="130"/>
+                <w:bottom w:type="dxa" w:w="90"/>
+                <w:right w:type="dxa" w:w="130"/>
+              </w:tcMar>
+              <w:vAlign w:val="center"/>
+            </w:tcPr>
+            <w:p>
+              <w:pPr>
+                <w:spacing w:after="0" w:before="0"/>
+              </w:pPr>
+              <w:r>
+                <w:rPr>
+                  <w:rFonts w:ascii="Plus Jakarta Sans" w:cs="Plus Jakarta Sans" w:eastAsia="Plus Jakarta Sans" w:hAnsi="Plus Jakarta Sans"/>
+                  <w:b/>
+                  <w:bCs/>
+                  <w:color w:val="1F2937"/>
+                  <w:sz w:val="20"/>
+                  <w:szCs w:val="20"/>
+                </w:rPr>
+                <w:t xml:space="preserve">Biaya Setup</w:t>
+              </w:r>
+            </w:p>
+          </w:tc>
+          <w:p/>
+        </w:tc>
+        <w:tc>
+          <w:tcPr>
+            <w:tcMar>
+              <w:top w:type="dxa" w:w="90"/>
+              <w:left w:type="dxa" w:w="130"/>
+              <w:bottom w:type="dxa" w:w="90"/>
+              <w:right w:type="dxa" w:w="130"/>
+            </w:tcMar>
+            <w:vAlign w:val="center"/>
+          </w:tcPr>
+          <w:tc>
+            <w:tcPr>
+              <w:tcMar>
+                <w:top w:type="dxa" w:w="90"/>
+                <w:left w:type="dxa" w:w="130"/>
+                <w:bottom w:type="dxa" w:w="90"/>
+                <w:right w:type="dxa" w:w="130"/>
+              </w:tcMar>
+              <w:vAlign w:val="center"/>
+            </w:tcPr>
+            <w:p>
+              <w:pPr>
+                <w:spacing w:after="0" w:before="0"/>
+              </w:pPr>
+              <w:r>
+                <w:rPr>
+                  <w:rFonts w:ascii="Plus Jakarta Sans" w:cs="Plus Jakarta Sans" w:eastAsia="Plus Jakarta Sans" w:hAnsi="Plus Jakarta Sans"/>
+                  <w:color w:val="1F2937"/>
+                  <w:sz w:val="19"/>
+                  <w:szCs w:val="19"/>
+                </w:rPr>
+                <w:t xml:space="preserve">Rp 0 — sudah termasuk paket</w:t>
+              </w:r>
+            </w:p>
+          </w:tc>
+          <w:p/>
+        </w:tc>
+        <w:tc>
+          <w:tcPr>
+            <w:tcMar>
+              <w:top w:type="dxa" w:w="90"/>
+              <w:left w:type="dxa" w:w="130"/>
+              <w:bottom w:type="dxa" w:w="90"/>
+              <w:right w:type="dxa" w:w="130"/>
+            </w:tcMar>
+            <w:vAlign w:val="center"/>
+          </w:tcPr>
+          <w:tc>
+            <w:tcPr>
+              <w:tcMar>
+                <w:top w:type="dxa" w:w="90"/>
+                <w:left w:type="dxa" w:w="130"/>
+                <w:bottom w:type="dxa" w:w="90"/>
+                <w:right w:type="dxa" w:w="130"/>
+              </w:tcMar>
+              <w:vAlign w:val="center"/>
+            </w:tcPr>
+            <w:p>
+              <w:pPr>
+                <w:spacing w:after="0" w:before="0"/>
+              </w:pPr>
+              <w:r>
+                <w:rPr>
+                  <w:rFonts w:ascii="Plus Jakarta Sans" w:cs="Plus Jakarta Sans" w:eastAsia="Plus Jakarta Sans" w:hAnsi="Plus Jakarta Sans"/>
+                  <w:color w:val="1F2937"/>
+                  <w:sz w:val="19"/>
+                  <w:szCs w:val="19"/>
+                </w:rPr>
+                <w:t xml:space="preserve">+Rp 1.500.000 sekali (setting &amp; migrasi)</w:t>
+              </w:r>
+            </w:p>
+          </w:tc>
+          <w:p/>
+        </w:tc>
+      </w:tr>
+      <w:tr>
+        <w:tc>
+          <w:tcPr>
+            <w:tcMar>
+              <w:top w:type="dxa" w:w="90"/>
+              <w:left w:type="dxa" w:w="130"/>
+              <w:bottom w:type="dxa" w:w="90"/>
+              <w:right w:type="dxa" w:w="130"/>
+            </w:tcMar>
+            <w:vAlign w:val="center"/>
+          </w:tcPr>
+          <w:tc>
+            <w:tcPr>
+              <w:tcMar>
+                <w:top w:type="dxa" w:w="90"/>
+                <w:left w:type="dxa" w:w="130"/>
+                <w:bottom w:type="dxa" w:w="90"/>
+                <w:right w:type="dxa" w:w="130"/>
+              </w:tcMar>
+              <w:vAlign w:val="center"/>
+            </w:tcPr>
+            <w:p>
+              <w:pPr>
+                <w:spacing w:after="0" w:before="0"/>
+              </w:pPr>
+              <w:r>
+                <w:rPr>
+                  <w:rFonts w:ascii="Plus Jakarta Sans" w:cs="Plus Jakarta Sans" w:eastAsia="Plus Jakarta Sans" w:hAnsi="Plus Jakarta Sans"/>
+                  <w:b/>
+                  <w:bCs/>
+                  <w:color w:val="1F2937"/>
+                  <w:sz w:val="20"/>
+                  <w:szCs w:val="20"/>
+                </w:rPr>
+                <w:t xml:space="preserve">Biaya Server</w:t>
+              </w:r>
+            </w:p>
+          </w:tc>
+          <w:p/>
+        </w:tc>
+        <w:tc>
+          <w:tcPr>
+            <w:tcMar>
+              <w:top w:type="dxa" w:w="90"/>
+              <w:left w:type="dxa" w:w="130"/>
+              <w:bottom w:type="dxa" w:w="90"/>
+              <w:right w:type="dxa" w:w="130"/>
+            </w:tcMar>
+            <w:vAlign w:val="center"/>
+          </w:tcPr>
+          <w:tc>
+            <w:tcPr>
+              <w:tcMar>
+                <w:top w:type="dxa" w:w="90"/>
+                <w:left w:type="dxa" w:w="130"/>
+                <w:bottom w:type="dxa" w:w="90"/>
+                <w:right w:type="dxa" w:w="130"/>
+              </w:tcMar>
+              <w:vAlign w:val="center"/>
+            </w:tcPr>
+            <w:p>
+              <w:pPr>
+                <w:spacing w:after="0" w:before="0"/>
+              </w:pPr>
+              <w:r>
+                <w:rPr>
+                  <w:rFonts w:ascii="Plus Jakarta Sans" w:cs="Plus Jakarta Sans" w:eastAsia="Plus Jakarta Sans" w:hAnsi="Plus Jakarta Sans"/>
+                  <w:color w:val="1F2937"/>
+                  <w:sz w:val="19"/>
+                  <w:szCs w:val="19"/>
+                </w:rPr>
+                <w:t xml:space="preserve">Rp 0 — kuota project termasuk</w:t>
+              </w:r>
+            </w:p>
+          </w:tc>
+          <w:p/>
+        </w:tc>
+        <w:tc>
+          <w:tcPr>
+            <w:tcMar>
+              <w:top w:type="dxa" w:w="90"/>
+              <w:left w:type="dxa" w:w="130"/>
+              <w:bottom w:type="dxa" w:w="90"/>
+              <w:right w:type="dxa" w:w="130"/>
+            </w:tcMar>
+            <w:vAlign w:val="center"/>
+          </w:tcPr>
+          <w:tc>
+            <w:tcPr>
+              <w:tcMar>
+                <w:top w:type="dxa" w:w="90"/>
+                <w:left w:type="dxa" w:w="130"/>
+                <w:bottom w:type="dxa" w:w="90"/>
+                <w:right w:type="dxa" w:w="130"/>
+              </w:tcMar>
+              <w:vAlign w:val="center"/>
+            </w:tcPr>
+            <w:p>
+              <w:pPr>
+                <w:spacing w:after="0" w:before="0"/>
+              </w:pPr>
+              <w:r>
+                <w:rPr>
+                  <w:rFonts w:ascii="Plus Jakarta Sans" w:cs="Plus Jakarta Sans" w:eastAsia="Plus Jakarta Sans" w:hAnsi="Plus Jakarta Sans"/>
+                  <w:color w:val="1F2937"/>
+                  <w:sz w:val="19"/>
+                  <w:szCs w:val="19"/>
+                </w:rPr>
+                <w:t xml:space="preserve">+Rp 300.000/bulan</w:t>
+              </w:r>
+            </w:p>
+          </w:tc>
+          <w:p/>
+        </w:tc>
+      </w:tr>
+      <w:tr>
+        <w:tc>
+          <w:tcPr>
+            <w:tcMar>
+              <w:top w:type="dxa" w:w="90"/>
+              <w:left w:type="dxa" w:w="130"/>
+              <w:bottom w:type="dxa" w:w="90"/>
+              <w:right w:type="dxa" w:w="130"/>
+            </w:tcMar>
+            <w:vAlign w:val="center"/>
+          </w:tcPr>
+          <w:tc>
+            <w:tcPr>
+              <w:tcMar>
+                <w:top w:type="dxa" w:w="90"/>
+                <w:left w:type="dxa" w:w="130"/>
+                <w:bottom w:type="dxa" w:w="90"/>
+                <w:right w:type="dxa" w:w="130"/>
+              </w:tcMar>
+              <w:vAlign w:val="center"/>
+            </w:tcPr>
+            <w:p>
+              <w:pPr>
+                <w:spacing w:after="0" w:before="0"/>
+              </w:pPr>
+              <w:r>
+                <w:rPr>
+                  <w:rFonts w:ascii="Plus Jakarta Sans" w:cs="Plus Jakarta Sans" w:eastAsia="Plus Jakarta Sans" w:hAnsi="Plus Jakarta Sans"/>
+                  <w:b/>
+                  <w:bCs/>
+                  <w:color w:val="1F2937"/>
+                  <w:sz w:val="20"/>
+                  <w:szCs w:val="20"/>
+                </w:rPr>
+                <w:t xml:space="preserve">Cocok Untuk</w:t>
+              </w:r>
+            </w:p>
+          </w:tc>
+          <w:p/>
+        </w:tc>
+        <w:tc>
+          <w:tcPr>
+            <w:tcMar>
+              <w:top w:type="dxa" w:w="90"/>
+              <w:left w:type="dxa" w:w="130"/>
+              <w:bottom w:type="dxa" w:w="90"/>
+              <w:right w:type="dxa" w:w="130"/>
+            </w:tcMar>
+            <w:vAlign w:val="center"/>
+          </w:tcPr>
+          <w:tc>
+            <w:tcPr>
+              <w:tcMar>
+                <w:top w:type="dxa" w:w="90"/>
+                <w:left w:type="dxa" w:w="130"/>
+                <w:bottom w:type="dxa" w:w="90"/>
+                <w:right w:type="dxa" w:w="130"/>
+              </w:tcMar>
+              <w:vAlign w:val="center"/>
+            </w:tcPr>
+            <w:p>
+              <w:pPr>
+                <w:spacing w:after="0" w:before="0"/>
+              </w:pPr>
+              <w:r>
+                <w:rPr>
+                  <w:rFonts w:ascii="Plus Jakarta Sans" w:cs="Plus Jakarta Sans" w:eastAsia="Plus Jakarta Sans" w:hAnsi="Plus Jakarta Sans"/>
+                  <w:color w:val="1F2937"/>
+                  <w:sz w:val="19"/>
+                  <w:szCs w:val="19"/>
+                </w:rPr>
+                <w:t xml:space="preserve">Website profil, berita, PPDB reguler</w:t>
+              </w:r>
+            </w:p>
+          </w:tc>
+          <w:p/>
+        </w:tc>
+        <w:tc>
+          <w:tcPr>
+            <w:tcMar>
+              <w:top w:type="dxa" w:w="90"/>
+              <w:left w:type="dxa" w:w="130"/>
+              <w:bottom w:type="dxa" w:w="90"/>
+              <w:right w:type="dxa" w:w="130"/>
+            </w:tcMar>
+            <w:vAlign w:val="center"/>
+          </w:tcPr>
+          <w:tc>
+            <w:tcPr>
+              <w:tcMar>
+                <w:top w:type="dxa" w:w="90"/>
+                <w:left w:type="dxa" w:w="130"/>
+                <w:bottom w:type="dxa" w:w="90"/>
+                <w:right w:type="dxa" w:w="130"/>
+              </w:tcMar>
+              <w:vAlign w:val="center"/>
+            </w:tcPr>
+            <w:p>
+              <w:pPr>
+                <w:spacing w:after="0" w:before="0"/>
+              </w:pPr>
+              <w:r>
+                <w:rPr>
+                  <w:rFonts w:ascii="Plus Jakarta Sans" w:cs="Plus Jakarta Sans" w:eastAsia="Plus Jakarta Sans" w:hAnsi="Plus Jakarta Sans"/>
+                  <w:color w:val="1F2937"/>
+                  <w:sz w:val="19"/>
+                  <w:szCs w:val="19"/>
+                </w:rPr>
+                <w:t xml:space="preserve">PPDB volume besar, sistem akademik, multi-admin berat</w:t>
+              </w:r>
+            </w:p>
+          </w:tc>
+          <w:p/>
+        </w:tc>
+      </w:tr>
+    </w:tbl>
+    <w:p>
+      <w:pPr>
+        <w:spacing w:after="0" w:before="0"/>
+      </w:pPr>
+      <w:r>
+        <w:rPr>
+          <w:rFonts w:ascii="Plus Jakarta Sans" w:cs="Plus Jakarta Sans" w:eastAsia="Plus Jakarta Sans" w:hAnsi="Plus Jakarta Sans"/>
+          <w:color w:val="1F2937"/>
+          <w:sz w:val="22"/>
+          <w:szCs w:val="22"/>
+        </w:rPr>
+        <w:t xml:space="preserve"> </w:t>
+      </w:r>
+    </w:p>
+    <w:p>
+      <w:pPr>
+        <w:spacing w:after="0" w:before="0"/>
+      </w:pPr>
+      <w:r>
+        <w:rPr>
+          <w:rFonts w:ascii="Plus Jakarta Sans" w:cs="Plus Jakarta Sans" w:eastAsia="Plus Jakarta Sans" w:hAnsi="Plus Jakarta Sans"/>
+          <w:b/>
+          <w:bCs/>
+          <w:color w:val="1F2937"/>
+          <w:sz w:val="22"/>
+          <w:szCs w:val="22"/>
+        </w:rPr>
+        <w:t xml:space="preserve">Add-on Supabase Pro: </w:t>
+      </w:r>
+      <w:r>
+        <w:rPr>
+          <w:rFonts w:ascii="Plus Jakarta Sans" w:cs="Plus Jakarta Sans" w:eastAsia="Plus Jakarta Sans" w:hAnsi="Plus Jakarta Sans"/>
+          <w:color w:val="1F2937"/>
+          <w:sz w:val="22"/>
+          <w:szCs w:val="22"/>
+        </w:rPr>
+        <w:t xml:space="preserve">+Rp 350.000/bulan untuk PPDB volume besar, backup point-in-time (PITR), bandwidth &amp; storage lebih besar.</w:t>
+      </w:r>
+    </w:p>
+    <w:p>
+      <w:pPr>
+        <w:pStyle w:val="Heading1"/>
+        <w:spacing w:after="160" w:before="400"/>
+      </w:pPr>
+      <w:r>
+        <w:rPr>
+          <w:rFonts w:ascii="Plus Jakarta Sans" w:cs="Plus Jakarta Sans" w:eastAsia="Plus Jakarta Sans" w:hAnsi="Plus Jakarta Sans"/>
+          <w:b/>
+          <w:bCs/>
+          <w:color w:val="082B66"/>
+          <w:sz w:val="30"/>
+          <w:szCs w:val="30"/>
+        </w:rPr>
+        <w:t xml:space="preserve">10. Mengapa Memilih Kami</w:t>
+      </w:r>
+    </w:p>
+    <w:p>
+      <w:pPr>
+        <w:spacing w:after="80"/>
+        <w:ind w:left="360"/>
+      </w:pPr>
+      <w:r>
+        <w:rPr>
+          <w:rFonts w:ascii="Plus Jakarta Sans" w:cs="Plus Jakarta Sans" w:eastAsia="Plus Jakarta Sans" w:hAnsi="Plus Jakarta Sans"/>
+          <w:b/>
+          <w:bCs/>
+          <w:color w:val="C9A227"/>
+          <w:sz w:val="22"/>
+          <w:szCs w:val="22"/>
+        </w:rPr>
+        <w:t xml:space="preserve">✓  </w:t>
+      </w:r>
+      <w:r>
+        <w:rPr>
+          <w:rFonts w:ascii="Plus Jakarta Sans" w:cs="Plus Jakarta Sans" w:eastAsia="Plus Jakarta Sans" w:hAnsi="Plus Jakarta Sans"/>
+          <w:color w:val="1F2937"/>
+          <w:sz w:val="22"/>
+          <w:szCs w:val="22"/>
+        </w:rPr>
+        <w:t xml:space="preserve">Berpengalaman membangun website profil sekolah &amp; instansi pendidikan</w:t>
+      </w:r>
+    </w:p>
+    <w:p>
+      <w:pPr>
+        <w:spacing w:after="80"/>
+        <w:ind w:left="360"/>
+      </w:pPr>
+      <w:r>
+        <w:rPr>
+          <w:rFonts w:ascii="Plus Jakarta Sans" w:cs="Plus Jakarta Sans" w:eastAsia="Plus Jakarta Sans" w:hAnsi="Plus Jakarta Sans"/>
+          <w:b/>
+          <w:bCs/>
+          <w:color w:val="C9A227"/>
+          <w:sz w:val="22"/>
+          <w:szCs w:val="22"/>
+        </w:rPr>
+        <w:t xml:space="preserve">✓  </w:t>
+      </w:r>
+      <w:r>
+        <w:rPr>
+          <w:rFonts w:ascii="Plus Jakarta Sans" w:cs="Plus Jakarta Sans" w:eastAsia="Plus Jakarta Sans" w:hAnsi="Plus Jakarta Sans"/>
+          <w:color w:val="1F2937"/>
+          <w:sz w:val="22"/>
+          <w:szCs w:val="22"/>
+        </w:rPr>
+        <w:t xml:space="preserve">Desain modern, mobile-first, dan sesuai identitas sekolah</w:t>
+      </w:r>
+    </w:p>
+    <w:p>
+      <w:pPr>
+        <w:spacing w:after="80"/>
+        <w:ind w:left="360"/>
+      </w:pPr>
+      <w:r>
+        <w:rPr>
+          <w:rFonts w:ascii="Plus Jakarta Sans" w:cs="Plus Jakarta Sans" w:eastAsia="Plus Jakarta Sans" w:hAnsi="Plus Jakarta Sans"/>
+          <w:b/>
+          <w:bCs/>
+          <w:color w:val="C9A227"/>
+          <w:sz w:val="22"/>
+          <w:szCs w:val="22"/>
+        </w:rPr>
+        <w:t xml:space="preserve">✓  </w:t>
+      </w:r>
+      <w:r>
+        <w:rPr>
+          <w:rFonts w:ascii="Plus Jakarta Sans" w:cs="Plus Jakarta Sans" w:eastAsia="Plus Jakarta Sans" w:hAnsi="Plus Jakarta Sans"/>
+          <w:color w:val="1F2937"/>
+          <w:sz w:val="22"/>
+          <w:szCs w:val="22"/>
+        </w:rPr>
+        <w:t xml:space="preserve">Panel admin mudah digunakan — staf sekolah bisa update sendiri</w:t>
+      </w:r>
+    </w:p>
+    <w:p>
+      <w:pPr>
+        <w:spacing w:after="80"/>
+        <w:ind w:left="360"/>
+      </w:pPr>
+      <w:r>
+        <w:rPr>
+          <w:rFonts w:ascii="Plus Jakarta Sans" w:cs="Plus Jakarta Sans" w:eastAsia="Plus Jakarta Sans" w:hAnsi="Plus Jakarta Sans"/>
+          <w:b/>
+          <w:bCs/>
+          <w:color w:val="C9A227"/>
+          <w:sz w:val="22"/>
+          <w:szCs w:val="22"/>
+        </w:rPr>
+        <w:t xml:space="preserve">✓  </w:t>
+      </w:r>
+      <w:r>
+        <w:rPr>
+          <w:rFonts w:ascii="Plus Jakarta Sans" w:cs="Plus Jakarta Sans" w:eastAsia="Plus Jakarta Sans" w:hAnsi="Plus Jakarta Sans"/>
+          <w:color w:val="1F2937"/>
+          <w:sz w:val="22"/>
+          <w:szCs w:val="22"/>
+        </w:rPr>
+        <w:t xml:space="preserve">Customizer tampilan: ganti warna &amp; teks tanpa perlu developer</w:t>
+      </w:r>
+    </w:p>
+    <w:p>
+      <w:pPr>
+        <w:spacing w:after="80"/>
+        <w:ind w:left="360"/>
+      </w:pPr>
+      <w:r>
+        <w:rPr>
+          <w:rFonts w:ascii="Plus Jakarta Sans" w:cs="Plus Jakarta Sans" w:eastAsia="Plus Jakarta Sans" w:hAnsi="Plus Jakarta Sans"/>
+          <w:b/>
+          <w:bCs/>
+          <w:color w:val="C9A227"/>
+          <w:sz w:val="22"/>
+          <w:szCs w:val="22"/>
+        </w:rPr>
+        <w:t xml:space="preserve">✓  </w:t>
+      </w:r>
+      <w:r>
+        <w:rPr>
+          <w:rFonts w:ascii="Plus Jakarta Sans" w:cs="Plus Jakarta Sans" w:eastAsia="Plus Jakarta Sans" w:hAnsi="Plus Jakarta Sans"/>
+          <w:color w:val="1F2937"/>
+          <w:sz w:val="22"/>
+          <w:szCs w:val="22"/>
+        </w:rPr>
+        <w:t xml:space="preserve">Harga transparan, tanpa biaya tersembunyi</w:t>
+      </w:r>
+    </w:p>
+    <w:p>
+      <w:pPr>
+        <w:spacing w:after="80"/>
+        <w:ind w:left="360"/>
+      </w:pPr>
+      <w:r>
+        <w:rPr>
+          <w:rFonts w:ascii="Plus Jakarta Sans" w:cs="Plus Jakarta Sans" w:eastAsia="Plus Jakarta Sans" w:hAnsi="Plus Jakarta Sans"/>
+          <w:b/>
+          <w:bCs/>
+          <w:color w:val="C9A227"/>
+          <w:sz w:val="22"/>
+          <w:szCs w:val="22"/>
+        </w:rPr>
+        <w:t xml:space="preserve">✓  </w:t>
+      </w:r>
+      <w:r>
+        <w:rPr>
+          <w:rFonts w:ascii="Plus Jakarta Sans" w:cs="Plus Jakarta Sans" w:eastAsia="Plus Jakarta Sans" w:hAnsi="Plus Jakarta Sans"/>
+          <w:color w:val="1F2937"/>
+          <w:sz w:val="22"/>
+          <w:szCs w:val="22"/>
+        </w:rPr>
+        <w:t xml:space="preserve">Dukungan responsif &amp; garansi 3 bulan</w:t>
+      </w:r>
+    </w:p>
+    <w:p>
+      <w:pPr>
+        <w:spacing w:after="80"/>
+        <w:ind w:left="360"/>
+      </w:pPr>
+      <w:r>
+        <w:rPr>
+          <w:rFonts w:ascii="Plus Jakarta Sans" w:cs="Plus Jakarta Sans" w:eastAsia="Plus Jakarta Sans" w:hAnsi="Plus Jakarta Sans"/>
+          <w:b/>
+          <w:bCs/>
+          <w:color w:val="C9A227"/>
+          <w:sz w:val="22"/>
+          <w:szCs w:val="22"/>
+        </w:rPr>
+        <w:t xml:space="preserve">✓  </w:t>
+      </w:r>
+      <w:r>
+        <w:rPr>
+          <w:rFonts w:ascii="Plus Jakarta Sans" w:cs="Plus Jakarta Sans" w:eastAsia="Plus Jakarta Sans" w:hAnsi="Plus Jakarta Sans"/>
+          <w:color w:val="1F2937"/>
+          <w:sz w:val="22"/>
+          <w:szCs w:val="22"/>
+        </w:rPr>
+        <w:t xml:space="preserve">Demo live dapat dilihat &amp; dicoba langsung sebelum memutuskan</w:t>
+      </w:r>
+    </w:p>
+    <w:p>
+      <w:pPr>
+        <w:pStyle w:val="Heading1"/>
+        <w:spacing w:after="160" w:before="400"/>
+      </w:pPr>
+      <w:r>
+        <w:rPr>
+          <w:rFonts w:ascii="Plus Jakarta Sans" w:cs="Plus Jakarta Sans" w:eastAsia="Plus Jakarta Sans" w:hAnsi="Plus Jakarta Sans"/>
+          <w:b/>
+          <w:bCs/>
+          <w:color w:val="082B66"/>
+          <w:sz w:val="30"/>
+          <w:szCs w:val="30"/>
+        </w:rPr>
+        <w:t xml:space="preserve">11. Penutup</w:t>
       </w:r>
     </w:p>
     <w:p>

</xml_diff>

<commit_message>
deploy: maintenance & infrastruktur
</commit_message>
<xml_diff>
--- a/proposal/Proposal_Website_SD_Muhammadiyah_Pakel.docx
+++ b/proposal/Proposal_Website_SD_Muhammadiyah_Pakel.docx
@@ -386,7 +386,7 @@
           <w:sz w:val="22"/>
           <w:szCs w:val="22"/>
         </w:rPr>
-        <w:t xml:space="preserve">Ketentuan Layanan</w:t>
+        <w:t xml:space="preserve">Layanan Pasca-Launch</w:t>
       </w:r>
       <w:r>
         <w:rPr>
@@ -419,7 +419,7 @@
           <w:sz w:val="22"/>
           <w:szCs w:val="22"/>
         </w:rPr>
-        <w:t xml:space="preserve">Tahapan Pekerjaan</w:t>
+        <w:t xml:space="preserve">Pilihan Infrastruktur (Supabase vs VPS)</w:t>
       </w:r>
       <w:r>
         <w:rPr>
@@ -452,7 +452,7 @@
           <w:sz w:val="22"/>
           <w:szCs w:val="22"/>
         </w:rPr>
-        <w:t xml:space="preserve">Mengapa Memilih Kami</w:t>
+        <w:t xml:space="preserve">Ketentuan Layanan</w:t>
       </w:r>
       <w:r>
         <w:rPr>
@@ -485,6 +485,72 @@
           <w:sz w:val="22"/>
           <w:szCs w:val="22"/>
         </w:rPr>
+        <w:t xml:space="preserve">Tahapan Pekerjaan</w:t>
+      </w:r>
+      <w:r>
+        <w:rPr>
+          <w:sz w:val="22"/>
+          <w:szCs w:val="22"/>
+        </w:rPr>
+        <w:t xml:space="preserve">	</w:t>
+      </w:r>
+      <w:r>
+        <w:rPr>
+          <w:rFonts w:ascii="Plus Jakarta Sans" w:cs="Plus Jakarta Sans" w:eastAsia="Plus Jakarta Sans" w:hAnsi="Plus Jakarta Sans"/>
+          <w:color w:val="5B6B82"/>
+          <w:sz w:val="22"/>
+          <w:szCs w:val="22"/>
+        </w:rPr>
+        <w:t xml:space="preserve">11</w:t>
+      </w:r>
+    </w:p>
+    <w:p>
+      <w:pPr>
+        <w:tabs>
+          <w:tab w:val="right" w:pos="9070" w:leader="1"/>
+        </w:tabs>
+        <w:spacing w:after="140"/>
+      </w:pPr>
+      <w:r>
+        <w:rPr>
+          <w:rFonts w:ascii="Plus Jakarta Sans" w:cs="Plus Jakarta Sans" w:eastAsia="Plus Jakarta Sans" w:hAnsi="Plus Jakarta Sans"/>
+          <w:color w:val="1F2937"/>
+          <w:sz w:val="22"/>
+          <w:szCs w:val="22"/>
+        </w:rPr>
+        <w:t xml:space="preserve">Mengapa Memilih Kami</w:t>
+      </w:r>
+      <w:r>
+        <w:rPr>
+          <w:sz w:val="22"/>
+          <w:szCs w:val="22"/>
+        </w:rPr>
+        <w:t xml:space="preserve">	</w:t>
+      </w:r>
+      <w:r>
+        <w:rPr>
+          <w:rFonts w:ascii="Plus Jakarta Sans" w:cs="Plus Jakarta Sans" w:eastAsia="Plus Jakarta Sans" w:hAnsi="Plus Jakarta Sans"/>
+          <w:color w:val="5B6B82"/>
+          <w:sz w:val="22"/>
+          <w:szCs w:val="22"/>
+        </w:rPr>
+        <w:t xml:space="preserve">12</w:t>
+      </w:r>
+    </w:p>
+    <w:p>
+      <w:pPr>
+        <w:tabs>
+          <w:tab w:val="right" w:pos="9070" w:leader="1"/>
+        </w:tabs>
+        <w:spacing w:after="140"/>
+      </w:pPr>
+      <w:r>
+        <w:rPr>
+          <w:rFonts w:ascii="Plus Jakarta Sans" w:cs="Plus Jakarta Sans" w:eastAsia="Plus Jakarta Sans" w:hAnsi="Plus Jakarta Sans"/>
+          <w:color w:val="1F2937"/>
+          <w:sz w:val="22"/>
+          <w:szCs w:val="22"/>
+        </w:rPr>
         <w:t xml:space="preserve">Penutup</w:t>
       </w:r>
       <w:r>
@@ -501,7 +567,7 @@
           <w:sz w:val="22"/>
           <w:szCs w:val="22"/>
         </w:rPr>
-        <w:t xml:space="preserve">11</w:t>
+        <w:t xml:space="preserve">13</w:t>
       </w:r>
     </w:p>
     <w:p>
@@ -5453,25 +5519,434 @@
           <w:sz w:val="30"/>
           <w:szCs w:val="30"/>
         </w:rPr>
-        <w:t xml:space="preserve">9. Mengapa Memilih Kami</w:t>
-      </w:r>
-    </w:p>
-    <w:p>
-      <w:pPr>
-        <w:spacing w:after="80"/>
-        <w:ind w:left="360"/>
+        <w:t xml:space="preserve">8. Layanan Pasca-Launch</w:t>
+      </w:r>
+    </w:p>
+    <w:p>
+      <w:pPr>
+        <w:spacing w:after="120" w:before="0"/>
+      </w:pPr>
+      <w:r>
+        <w:rPr>
+          <w:rFonts w:ascii="Plus Jakarta Sans" w:cs="Plus Jakarta Sans" w:eastAsia="Plus Jakarta Sans" w:hAnsi="Plus Jakarta Sans"/>
+          <w:color w:val="1F2937"/>
+          <w:sz w:val="22"/>
+          <w:szCs w:val="22"/>
+        </w:rPr>
+        <w:t xml:space="preserve">Setelah masa garansi 3 bulan, sekolah dapat memilih layanan per-edit atau paket maintenance bulanan:</w:t>
+      </w:r>
+    </w:p>
+    <w:p>
+      <w:pPr>
+        <w:pStyle w:val="Heading3"/>
+        <w:spacing w:after="160" w:before="200"/>
       </w:pPr>
       <w:r>
         <w:rPr>
           <w:rFonts w:ascii="Plus Jakarta Sans" w:cs="Plus Jakarta Sans" w:eastAsia="Plus Jakarta Sans" w:hAnsi="Plus Jakarta Sans"/>
           <w:b/>
           <w:bCs/>
-          <w:color w:val="C9A227"/>
-          <w:sz w:val="22"/>
-          <w:szCs w:val="22"/>
-        </w:rPr>
-        <w:t xml:space="preserve">✓  </w:t>
-      </w:r>
+          <w:color w:val="082B66"/>
+          <w:sz w:val="23"/>
+          <w:szCs w:val="23"/>
+        </w:rPr>
+        <w:t xml:space="preserve">Tarif Per Edit</w:t>
+      </w:r>
+    </w:p>
+    <w:tbl>
+      <w:tblPr>
+        <w:tblW w:type="dxa" w:w="9100"/>
+        <w:tblBorders>
+          <w:top w:val="single" w:color="E2E8F0" w:sz="4"/>
+          <w:left w:val="single" w:color="E2E8F0" w:sz="4"/>
+          <w:bottom w:val="single" w:color="E2E8F0" w:sz="4"/>
+          <w:right w:val="single" w:color="E2E8F0" w:sz="4"/>
+          <w:insideH w:val="single" w:color="E2E8F0" w:sz="4"/>
+          <w:insideV w:val="single" w:color="E2E8F0" w:sz="4"/>
+        </w:tblBorders>
+      </w:tblPr>
+      <w:tblGrid>
+        <w:gridCol w:w="5200"/>
+        <w:gridCol w:w="3900"/>
+      </w:tblGrid>
+      <w:tr>
+        <w:trPr>
+          <w:tblHeader/>
+        </w:trPr>
+        <w:tc>
+          <w:tcPr>
+            <w:shd w:fill="0B3D91" w:color="auto" w:val="clear"/>
+            <w:tcMar>
+              <w:top w:type="dxa" w:w="90"/>
+              <w:left w:type="dxa" w:w="130"/>
+              <w:bottom w:type="dxa" w:w="90"/>
+              <w:right w:type="dxa" w:w="130"/>
+            </w:tcMar>
+            <w:vAlign w:val="center"/>
+          </w:tcPr>
+          <w:p>
+            <w:pPr>
+              <w:spacing w:after="0" w:before="0"/>
+            </w:pPr>
+            <w:r>
+              <w:rPr>
+                <w:rFonts w:ascii="Plus Jakarta Sans" w:cs="Plus Jakarta Sans" w:eastAsia="Plus Jakarta Sans" w:hAnsi="Plus Jakarta Sans"/>
+                <w:b/>
+                <w:bCs/>
+                <w:color w:val="FFFFFF"/>
+                <w:sz w:val="20"/>
+                <w:szCs w:val="20"/>
+              </w:rPr>
+              <w:t xml:space="preserve">Layanan</w:t>
+            </w:r>
+          </w:p>
+        </w:tc>
+        <w:tc>
+          <w:tcPr>
+            <w:shd w:fill="0B3D91" w:color="auto" w:val="clear"/>
+            <w:tcMar>
+              <w:top w:type="dxa" w:w="90"/>
+              <w:left w:type="dxa" w:w="130"/>
+              <w:bottom w:type="dxa" w:w="90"/>
+              <w:right w:type="dxa" w:w="130"/>
+            </w:tcMar>
+            <w:vAlign w:val="center"/>
+          </w:tcPr>
+          <w:p>
+            <w:pPr>
+              <w:spacing w:after="0" w:before="0"/>
+            </w:pPr>
+            <w:r>
+              <w:rPr>
+                <w:rFonts w:ascii="Plus Jakarta Sans" w:cs="Plus Jakarta Sans" w:eastAsia="Plus Jakarta Sans" w:hAnsi="Plus Jakarta Sans"/>
+                <w:b/>
+                <w:bCs/>
+                <w:color w:val="FFFFFF"/>
+                <w:sz w:val="20"/>
+                <w:szCs w:val="20"/>
+              </w:rPr>
+              <w:t xml:space="preserve">Harga</w:t>
+            </w:r>
+          </w:p>
+        </w:tc>
+      </w:tr>
+      <w:tr>
+        <w:tc>
+          <w:tcPr>
+            <w:tcMar>
+              <w:top w:type="dxa" w:w="90"/>
+              <w:left w:type="dxa" w:w="130"/>
+              <w:bottom w:type="dxa" w:w="90"/>
+              <w:right w:type="dxa" w:w="130"/>
+            </w:tcMar>
+            <w:vAlign w:val="center"/>
+          </w:tcPr>
+          <w:tc>
+            <w:tcPr>
+              <w:tcMar>
+                <w:top w:type="dxa" w:w="90"/>
+                <w:left w:type="dxa" w:w="130"/>
+                <w:bottom w:type="dxa" w:w="90"/>
+                <w:right w:type="dxa" w:w="130"/>
+              </w:tcMar>
+              <w:vAlign w:val="center"/>
+            </w:tcPr>
+            <w:p>
+              <w:pPr>
+                <w:spacing w:after="0" w:before="0"/>
+              </w:pPr>
+              <w:r>
+                <w:rPr>
+                  <w:rFonts w:ascii="Plus Jakarta Sans" w:cs="Plus Jakarta Sans" w:eastAsia="Plus Jakarta Sans" w:hAnsi="Plus Jakarta Sans"/>
+                  <w:color w:val="1F2937"/>
+                  <w:sz w:val="20"/>
+                  <w:szCs w:val="20"/>
+                </w:rPr>
+                <w:t xml:space="preserve">Edit teks / gambar / foto (per item)</w:t>
+              </w:r>
+            </w:p>
+          </w:tc>
+          <w:p/>
+        </w:tc>
+        <w:tc>
+          <w:tcPr>
+            <w:tcMar>
+              <w:top w:type="dxa" w:w="90"/>
+              <w:left w:type="dxa" w:w="130"/>
+              <w:bottom w:type="dxa" w:w="90"/>
+              <w:right w:type="dxa" w:w="130"/>
+            </w:tcMar>
+            <w:vAlign w:val="center"/>
+          </w:tcPr>
+          <w:tc>
+            <w:tcPr>
+              <w:tcMar>
+                <w:top w:type="dxa" w:w="90"/>
+                <w:left w:type="dxa" w:w="130"/>
+                <w:bottom w:type="dxa" w:w="90"/>
+                <w:right w:type="dxa" w:w="130"/>
+              </w:tcMar>
+              <w:vAlign w:val="center"/>
+            </w:tcPr>
+            <w:p>
+              <w:pPr>
+                <w:spacing w:after="0" w:before="0"/>
+                <w:jc w:val="right"/>
+              </w:pPr>
+              <w:r>
+                <w:rPr>
+                  <w:rFonts w:ascii="Plus Jakarta Sans" w:cs="Plus Jakarta Sans" w:eastAsia="Plus Jakarta Sans" w:hAnsi="Plus Jakarta Sans"/>
+                  <w:color w:val="1F2937"/>
+                  <w:sz w:val="20"/>
+                  <w:szCs w:val="20"/>
+                </w:rPr>
+                <w:t xml:space="preserve">Rp 50.000</w:t>
+              </w:r>
+            </w:p>
+          </w:tc>
+          <w:p/>
+        </w:tc>
+      </w:tr>
+      <w:tr>
+        <w:tc>
+          <w:tcPr>
+            <w:tcMar>
+              <w:top w:type="dxa" w:w="90"/>
+              <w:left w:type="dxa" w:w="130"/>
+              <w:bottom w:type="dxa" w:w="90"/>
+              <w:right w:type="dxa" w:w="130"/>
+            </w:tcMar>
+            <w:vAlign w:val="center"/>
+          </w:tcPr>
+          <w:tc>
+            <w:tcPr>
+              <w:tcMar>
+                <w:top w:type="dxa" w:w="90"/>
+                <w:left w:type="dxa" w:w="130"/>
+                <w:bottom w:type="dxa" w:w="90"/>
+                <w:right w:type="dxa" w:w="130"/>
+              </w:tcMar>
+              <w:vAlign w:val="center"/>
+            </w:tcPr>
+            <w:p>
+              <w:pPr>
+                <w:spacing w:after="0" w:before="0"/>
+              </w:pPr>
+              <w:r>
+                <w:rPr>
+                  <w:rFonts w:ascii="Plus Jakarta Sans" w:cs="Plus Jakarta Sans" w:eastAsia="Plus Jakarta Sans" w:hAnsi="Plus Jakarta Sans"/>
+                  <w:color w:val="1F2937"/>
+                  <w:sz w:val="20"/>
+                  <w:szCs w:val="20"/>
+                </w:rPr>
+                <w:t xml:space="preserve">Edit tampilan / desain (per item)</w:t>
+              </w:r>
+            </w:p>
+          </w:tc>
+          <w:p/>
+        </w:tc>
+        <w:tc>
+          <w:tcPr>
+            <w:tcMar>
+              <w:top w:type="dxa" w:w="90"/>
+              <w:left w:type="dxa" w:w="130"/>
+              <w:bottom w:type="dxa" w:w="90"/>
+              <w:right w:type="dxa" w:w="130"/>
+            </w:tcMar>
+            <w:vAlign w:val="center"/>
+          </w:tcPr>
+          <w:tc>
+            <w:tcPr>
+              <w:tcMar>
+                <w:top w:type="dxa" w:w="90"/>
+                <w:left w:type="dxa" w:w="130"/>
+                <w:bottom w:type="dxa" w:w="90"/>
+                <w:right w:type="dxa" w:w="130"/>
+              </w:tcMar>
+              <w:vAlign w:val="center"/>
+            </w:tcPr>
+            <w:p>
+              <w:pPr>
+                <w:spacing w:after="0" w:before="0"/>
+                <w:jc w:val="right"/>
+              </w:pPr>
+              <w:r>
+                <w:rPr>
+                  <w:rFonts w:ascii="Plus Jakarta Sans" w:cs="Plus Jakarta Sans" w:eastAsia="Plus Jakarta Sans" w:hAnsi="Plus Jakarta Sans"/>
+                  <w:color w:val="1F2937"/>
+                  <w:sz w:val="20"/>
+                  <w:szCs w:val="20"/>
+                </w:rPr>
+                <w:t xml:space="preserve">Rp 150.000</w:t>
+              </w:r>
+            </w:p>
+          </w:tc>
+          <w:p/>
+        </w:tc>
+      </w:tr>
+      <w:tr>
+        <w:tc>
+          <w:tcPr>
+            <w:tcMar>
+              <w:top w:type="dxa" w:w="90"/>
+              <w:left w:type="dxa" w:w="130"/>
+              <w:bottom w:type="dxa" w:w="90"/>
+              <w:right w:type="dxa" w:w="130"/>
+            </w:tcMar>
+            <w:vAlign w:val="center"/>
+          </w:tcPr>
+          <w:tc>
+            <w:tcPr>
+              <w:tcMar>
+                <w:top w:type="dxa" w:w="90"/>
+                <w:left w:type="dxa" w:w="130"/>
+                <w:bottom w:type="dxa" w:w="90"/>
+                <w:right w:type="dxa" w:w="130"/>
+              </w:tcMar>
+              <w:vAlign w:val="center"/>
+            </w:tcPr>
+            <w:p>
+              <w:pPr>
+                <w:spacing w:after="0" w:before="0"/>
+              </w:pPr>
+              <w:r>
+                <w:rPr>
+                  <w:rFonts w:ascii="Plus Jakarta Sans" w:cs="Plus Jakarta Sans" w:eastAsia="Plus Jakarta Sans" w:hAnsi="Plus Jakarta Sans"/>
+                  <w:color w:val="1F2937"/>
+                  <w:sz w:val="20"/>
+                  <w:szCs w:val="20"/>
+                </w:rPr>
+                <w:t xml:space="preserve">Tambah halaman / modul baru (per item)</w:t>
+              </w:r>
+            </w:p>
+          </w:tc>
+          <w:p/>
+        </w:tc>
+        <w:tc>
+          <w:tcPr>
+            <w:tcMar>
+              <w:top w:type="dxa" w:w="90"/>
+              <w:left w:type="dxa" w:w="130"/>
+              <w:bottom w:type="dxa" w:w="90"/>
+              <w:right w:type="dxa" w:w="130"/>
+            </w:tcMar>
+            <w:vAlign w:val="center"/>
+          </w:tcPr>
+          <w:tc>
+            <w:tcPr>
+              <w:tcMar>
+                <w:top w:type="dxa" w:w="90"/>
+                <w:left w:type="dxa" w:w="130"/>
+                <w:bottom w:type="dxa" w:w="90"/>
+                <w:right w:type="dxa" w:w="130"/>
+              </w:tcMar>
+              <w:vAlign w:val="center"/>
+            </w:tcPr>
+            <w:p>
+              <w:pPr>
+                <w:spacing w:after="0" w:before="0"/>
+                <w:jc w:val="right"/>
+              </w:pPr>
+              <w:r>
+                <w:rPr>
+                  <w:rFonts w:ascii="Plus Jakarta Sans" w:cs="Plus Jakarta Sans" w:eastAsia="Plus Jakarta Sans" w:hAnsi="Plus Jakarta Sans"/>
+                  <w:color w:val="1F2937"/>
+                  <w:sz w:val="20"/>
+                  <w:szCs w:val="20"/>
+                </w:rPr>
+                <w:t xml:space="preserve">Rp 350.000</w:t>
+              </w:r>
+            </w:p>
+          </w:tc>
+          <w:p/>
+        </w:tc>
+      </w:tr>
+      <w:tr>
+        <w:tc>
+          <w:tcPr>
+            <w:tcMar>
+              <w:top w:type="dxa" w:w="90"/>
+              <w:left w:type="dxa" w:w="130"/>
+              <w:bottom w:type="dxa" w:w="90"/>
+              <w:right w:type="dxa" w:w="130"/>
+            </w:tcMar>
+            <w:vAlign w:val="center"/>
+          </w:tcPr>
+          <w:tc>
+            <w:tcPr>
+              <w:tcMar>
+                <w:top w:type="dxa" w:w="90"/>
+                <w:left w:type="dxa" w:w="130"/>
+                <w:bottom w:type="dxa" w:w="90"/>
+                <w:right w:type="dxa" w:w="130"/>
+              </w:tcMar>
+              <w:vAlign w:val="center"/>
+            </w:tcPr>
+            <w:p>
+              <w:pPr>
+                <w:spacing w:after="0" w:before="0"/>
+              </w:pPr>
+              <w:r>
+                <w:rPr>
+                  <w:rFonts w:ascii="Plus Jakarta Sans" w:cs="Plus Jakarta Sans" w:eastAsia="Plus Jakarta Sans" w:hAnsi="Plus Jakarta Sans"/>
+                  <w:b/>
+                  <w:bCs/>
+                  <w:color w:val="1F2937"/>
+                  <w:sz w:val="20"/>
+                  <w:szCs w:val="20"/>
+                </w:rPr>
+                <w:t xml:space="preserve">Paket 10 edit konten</w:t>
+              </w:r>
+            </w:p>
+          </w:tc>
+          <w:p/>
+        </w:tc>
+        <w:tc>
+          <w:tcPr>
+            <w:tcMar>
+              <w:top w:type="dxa" w:w="90"/>
+              <w:left w:type="dxa" w:w="130"/>
+              <w:bottom w:type="dxa" w:w="90"/>
+              <w:right w:type="dxa" w:w="130"/>
+            </w:tcMar>
+            <w:vAlign w:val="center"/>
+          </w:tcPr>
+          <w:tc>
+            <w:tcPr>
+              <w:tcMar>
+                <w:top w:type="dxa" w:w="90"/>
+                <w:left w:type="dxa" w:w="130"/>
+                <w:bottom w:type="dxa" w:w="90"/>
+                <w:right w:type="dxa" w:w="130"/>
+              </w:tcMar>
+              <w:vAlign w:val="center"/>
+            </w:tcPr>
+            <w:p>
+              <w:pPr>
+                <w:spacing w:after="0" w:before="0"/>
+                <w:jc w:val="right"/>
+              </w:pPr>
+              <w:r>
+                <w:rPr>
+                  <w:rFonts w:ascii="Plus Jakarta Sans" w:cs="Plus Jakarta Sans" w:eastAsia="Plus Jakarta Sans" w:hAnsi="Plus Jakarta Sans"/>
+                  <w:b/>
+                  <w:bCs/>
+                  <w:color w:val="0B3D91"/>
+                  <w:sz w:val="20"/>
+                  <w:szCs w:val="20"/>
+                </w:rPr>
+                <w:t xml:space="preserve">Rp 400.000 (hemat Rp 100.000)</w:t>
+              </w:r>
+            </w:p>
+          </w:tc>
+          <w:p/>
+        </w:tc>
+      </w:tr>
+    </w:tbl>
+    <w:p>
+      <w:pPr>
+        <w:spacing w:after="0" w:before="0"/>
+      </w:pPr>
       <w:r>
         <w:rPr>
           <w:rFonts w:ascii="Plus Jakarta Sans" w:cs="Plus Jakarta Sans" w:eastAsia="Plus Jakarta Sans" w:hAnsi="Plus Jakarta Sans"/>
@@ -5479,25 +5954,489 @@
           <w:sz w:val="22"/>
           <w:szCs w:val="22"/>
         </w:rPr>
-        <w:t xml:space="preserve">Berpengalaman membangun website profil sekolah &amp; instansi pendidikan</w:t>
-      </w:r>
-    </w:p>
-    <w:p>
-      <w:pPr>
-        <w:spacing w:after="80"/>
-        <w:ind w:left="360"/>
+        <w:t xml:space="preserve"> </w:t>
+      </w:r>
+    </w:p>
+    <w:p>
+      <w:pPr>
+        <w:pStyle w:val="Heading3"/>
+        <w:spacing w:after="160" w:before="200"/>
       </w:pPr>
       <w:r>
         <w:rPr>
           <w:rFonts w:ascii="Plus Jakarta Sans" w:cs="Plus Jakarta Sans" w:eastAsia="Plus Jakarta Sans" w:hAnsi="Plus Jakarta Sans"/>
           <w:b/>
           <w:bCs/>
-          <w:color w:val="C9A227"/>
-          <w:sz w:val="22"/>
-          <w:szCs w:val="22"/>
-        </w:rPr>
-        <w:t xml:space="preserve">✓  </w:t>
-      </w:r>
+          <w:color w:val="082B66"/>
+          <w:sz w:val="23"/>
+          <w:szCs w:val="23"/>
+        </w:rPr>
+        <w:t xml:space="preserve">Paket Maintenance Bulanan</w:t>
+      </w:r>
+    </w:p>
+    <w:tbl>
+      <w:tblPr>
+        <w:tblW w:type="dxa" w:w="9100"/>
+        <w:tblBorders>
+          <w:top w:val="single" w:color="E2E8F0" w:sz="4"/>
+          <w:left w:val="single" w:color="E2E8F0" w:sz="4"/>
+          <w:bottom w:val="single" w:color="E2E8F0" w:sz="4"/>
+          <w:right w:val="single" w:color="E2E8F0" w:sz="4"/>
+          <w:insideH w:val="single" w:color="E2E8F0" w:sz="4"/>
+          <w:insideV w:val="single" w:color="E2E8F0" w:sz="4"/>
+        </w:tblBorders>
+      </w:tblPr>
+      <w:tblGrid>
+        <w:gridCol w:w="1900"/>
+        <w:gridCol w:w="5000"/>
+        <w:gridCol w:w="2200"/>
+      </w:tblGrid>
+      <w:tr>
+        <w:trPr>
+          <w:tblHeader/>
+        </w:trPr>
+        <w:tc>
+          <w:tcPr>
+            <w:shd w:fill="0B3D91" w:color="auto" w:val="clear"/>
+            <w:tcMar>
+              <w:top w:type="dxa" w:w="90"/>
+              <w:left w:type="dxa" w:w="130"/>
+              <w:bottom w:type="dxa" w:w="90"/>
+              <w:right w:type="dxa" w:w="130"/>
+            </w:tcMar>
+            <w:vAlign w:val="center"/>
+          </w:tcPr>
+          <w:p>
+            <w:pPr>
+              <w:spacing w:after="0" w:before="0"/>
+            </w:pPr>
+            <w:r>
+              <w:rPr>
+                <w:rFonts w:ascii="Plus Jakarta Sans" w:cs="Plus Jakarta Sans" w:eastAsia="Plus Jakarta Sans" w:hAnsi="Plus Jakarta Sans"/>
+                <w:b/>
+                <w:bCs/>
+                <w:color w:val="FFFFFF"/>
+                <w:sz w:val="20"/>
+                <w:szCs w:val="20"/>
+              </w:rPr>
+              <w:t xml:space="preserve">Paket</w:t>
+            </w:r>
+          </w:p>
+        </w:tc>
+        <w:tc>
+          <w:tcPr>
+            <w:shd w:fill="0B3D91" w:color="auto" w:val="clear"/>
+            <w:tcMar>
+              <w:top w:type="dxa" w:w="90"/>
+              <w:left w:type="dxa" w:w="130"/>
+              <w:bottom w:type="dxa" w:w="90"/>
+              <w:right w:type="dxa" w:w="130"/>
+            </w:tcMar>
+            <w:vAlign w:val="center"/>
+          </w:tcPr>
+          <w:p>
+            <w:pPr>
+              <w:spacing w:after="0" w:before="0"/>
+            </w:pPr>
+            <w:r>
+              <w:rPr>
+                <w:rFonts w:ascii="Plus Jakarta Sans" w:cs="Plus Jakarta Sans" w:eastAsia="Plus Jakarta Sans" w:hAnsi="Plus Jakarta Sans"/>
+                <w:b/>
+                <w:bCs/>
+                <w:color w:val="FFFFFF"/>
+                <w:sz w:val="20"/>
+                <w:szCs w:val="20"/>
+              </w:rPr>
+              <w:t xml:space="preserve">Fitur</w:t>
+            </w:r>
+          </w:p>
+        </w:tc>
+        <w:tc>
+          <w:tcPr>
+            <w:shd w:fill="0B3D91" w:color="auto" w:val="clear"/>
+            <w:tcMar>
+              <w:top w:type="dxa" w:w="90"/>
+              <w:left w:type="dxa" w:w="130"/>
+              <w:bottom w:type="dxa" w:w="90"/>
+              <w:right w:type="dxa" w:w="130"/>
+            </w:tcMar>
+            <w:vAlign w:val="center"/>
+          </w:tcPr>
+          <w:p>
+            <w:pPr>
+              <w:spacing w:after="0" w:before="0"/>
+            </w:pPr>
+            <w:r>
+              <w:rPr>
+                <w:rFonts w:ascii="Plus Jakarta Sans" w:cs="Plus Jakarta Sans" w:eastAsia="Plus Jakarta Sans" w:hAnsi="Plus Jakarta Sans"/>
+                <w:b/>
+                <w:bCs/>
+                <w:color w:val="FFFFFF"/>
+                <w:sz w:val="20"/>
+                <w:szCs w:val="20"/>
+              </w:rPr>
+              <w:t xml:space="preserve">Harga</w:t>
+            </w:r>
+          </w:p>
+        </w:tc>
+      </w:tr>
+      <w:tr>
+        <w:tc>
+          <w:tcPr>
+            <w:tcMar>
+              <w:top w:type="dxa" w:w="90"/>
+              <w:left w:type="dxa" w:w="130"/>
+              <w:bottom w:type="dxa" w:w="90"/>
+              <w:right w:type="dxa" w:w="130"/>
+            </w:tcMar>
+            <w:vAlign w:val="center"/>
+          </w:tcPr>
+          <w:tc>
+            <w:tcPr>
+              <w:tcMar>
+                <w:top w:type="dxa" w:w="90"/>
+                <w:left w:type="dxa" w:w="130"/>
+                <w:bottom w:type="dxa" w:w="90"/>
+                <w:right w:type="dxa" w:w="130"/>
+              </w:tcMar>
+              <w:vAlign w:val="center"/>
+            </w:tcPr>
+            <w:p>
+              <w:pPr>
+                <w:spacing w:after="0" w:before="0"/>
+              </w:pPr>
+              <w:r>
+                <w:rPr>
+                  <w:rFonts w:ascii="Plus Jakarta Sans" w:cs="Plus Jakarta Sans" w:eastAsia="Plus Jakarta Sans" w:hAnsi="Plus Jakarta Sans"/>
+                  <w:b/>
+                  <w:bCs/>
+                  <w:color w:val="1F2937"/>
+                  <w:sz w:val="20"/>
+                  <w:szCs w:val="20"/>
+                </w:rPr>
+                <w:t xml:space="preserve">Basic</w:t>
+              </w:r>
+            </w:p>
+          </w:tc>
+          <w:p/>
+        </w:tc>
+        <w:tc>
+          <w:tcPr>
+            <w:tcMar>
+              <w:top w:type="dxa" w:w="90"/>
+              <w:left w:type="dxa" w:w="130"/>
+              <w:bottom w:type="dxa" w:w="90"/>
+              <w:right w:type="dxa" w:w="130"/>
+            </w:tcMar>
+            <w:vAlign w:val="center"/>
+          </w:tcPr>
+          <w:tc>
+            <w:tcPr>
+              <w:tcMar>
+                <w:top w:type="dxa" w:w="90"/>
+                <w:left w:type="dxa" w:w="130"/>
+                <w:bottom w:type="dxa" w:w="90"/>
+                <w:right w:type="dxa" w:w="130"/>
+              </w:tcMar>
+              <w:vAlign w:val="center"/>
+            </w:tcPr>
+            <w:p>
+              <w:pPr>
+                <w:spacing w:after="0" w:before="0"/>
+              </w:pPr>
+              <w:r>
+                <w:rPr>
+                  <w:rFonts w:ascii="Plus Jakarta Sans" w:cs="Plus Jakarta Sans" w:eastAsia="Plus Jakarta Sans" w:hAnsi="Plus Jakarta Sans"/>
+                  <w:color w:val="1F2937"/>
+                  <w:sz w:val="19"/>
+                  <w:szCs w:val="19"/>
+                </w:rPr>
+                <w:t xml:space="preserve">Backup &amp; monitoring, update keamanan, 5 edit konten, respon 2×24 jam</w:t>
+              </w:r>
+            </w:p>
+          </w:tc>
+          <w:p/>
+        </w:tc>
+        <w:tc>
+          <w:tcPr>
+            <w:tcMar>
+              <w:top w:type="dxa" w:w="90"/>
+              <w:left w:type="dxa" w:w="130"/>
+              <w:bottom w:type="dxa" w:w="90"/>
+              <w:right w:type="dxa" w:w="130"/>
+            </w:tcMar>
+            <w:vAlign w:val="center"/>
+          </w:tcPr>
+          <w:tc>
+            <w:tcPr>
+              <w:tcMar>
+                <w:top w:type="dxa" w:w="90"/>
+                <w:left w:type="dxa" w:w="130"/>
+                <w:bottom w:type="dxa" w:w="90"/>
+                <w:right w:type="dxa" w:w="130"/>
+              </w:tcMar>
+              <w:vAlign w:val="center"/>
+            </w:tcPr>
+            <w:p>
+              <w:pPr>
+                <w:spacing w:after="0" w:before="0"/>
+              </w:pPr>
+              <w:r>
+                <w:rPr>
+                  <w:rFonts w:ascii="Plus Jakarta Sans" w:cs="Plus Jakarta Sans" w:eastAsia="Plus Jakarta Sans" w:hAnsi="Plus Jakarta Sans"/>
+                  <w:b/>
+                  <w:bCs/>
+                  <w:color w:val="0B3D91"/>
+                  <w:sz w:val="20"/>
+                  <w:szCs w:val="20"/>
+                </w:rPr>
+                <w:t xml:space="preserve">Rp 250.000/bln</w:t>
+              </w:r>
+            </w:p>
+          </w:tc>
+          <w:p/>
+        </w:tc>
+      </w:tr>
+      <w:tr>
+        <w:tc>
+          <w:tcPr>
+            <w:tcMar>
+              <w:top w:type="dxa" w:w="90"/>
+              <w:left w:type="dxa" w:w="130"/>
+              <w:bottom w:type="dxa" w:w="90"/>
+              <w:right w:type="dxa" w:w="130"/>
+            </w:tcMar>
+            <w:vAlign w:val="center"/>
+          </w:tcPr>
+          <w:tc>
+            <w:tcPr>
+              <w:tcMar>
+                <w:top w:type="dxa" w:w="90"/>
+                <w:left w:type="dxa" w:w="130"/>
+                <w:bottom w:type="dxa" w:w="90"/>
+                <w:right w:type="dxa" w:w="130"/>
+              </w:tcMar>
+              <w:vAlign w:val="center"/>
+            </w:tcPr>
+            <w:p>
+              <w:pPr>
+                <w:spacing w:after="0" w:before="0"/>
+              </w:pPr>
+              <w:r>
+                <w:rPr>
+                  <w:rFonts w:ascii="Plus Jakarta Sans" w:cs="Plus Jakarta Sans" w:eastAsia="Plus Jakarta Sans" w:hAnsi="Plus Jakarta Sans"/>
+                  <w:b/>
+                  <w:bCs/>
+                  <w:color w:val="1F2937"/>
+                  <w:sz w:val="20"/>
+                  <w:szCs w:val="20"/>
+                </w:rPr>
+                <w:t xml:space="preserve">Standar
+(Rekomendasi)</w:t>
+              </w:r>
+            </w:p>
+          </w:tc>
+          <w:p/>
+        </w:tc>
+        <w:tc>
+          <w:tcPr>
+            <w:tcMar>
+              <w:top w:type="dxa" w:w="90"/>
+              <w:left w:type="dxa" w:w="130"/>
+              <w:bottom w:type="dxa" w:w="90"/>
+              <w:right w:type="dxa" w:w="130"/>
+            </w:tcMar>
+            <w:vAlign w:val="center"/>
+          </w:tcPr>
+          <w:tc>
+            <w:tcPr>
+              <w:tcMar>
+                <w:top w:type="dxa" w:w="90"/>
+                <w:left w:type="dxa" w:w="130"/>
+                <w:bottom w:type="dxa" w:w="90"/>
+                <w:right w:type="dxa" w:w="130"/>
+              </w:tcMar>
+              <w:vAlign w:val="center"/>
+            </w:tcPr>
+            <w:p>
+              <w:pPr>
+                <w:spacing w:after="0" w:before="0"/>
+              </w:pPr>
+              <w:r>
+                <w:rPr>
+                  <w:rFonts w:ascii="Plus Jakarta Sans" w:cs="Plus Jakarta Sans" w:eastAsia="Plus Jakarta Sans" w:hAnsi="Plus Jakarta Sans"/>
+                  <w:color w:val="1F2937"/>
+                  <w:sz w:val="19"/>
+                  <w:szCs w:val="19"/>
+                </w:rPr>
+                <w:t xml:space="preserve">Semua Basic + 15 edit konten, bug prioritas, laporan bulanan</w:t>
+              </w:r>
+            </w:p>
+          </w:tc>
+          <w:p/>
+        </w:tc>
+        <w:tc>
+          <w:tcPr>
+            <w:tcMar>
+              <w:top w:type="dxa" w:w="90"/>
+              <w:left w:type="dxa" w:w="130"/>
+              <w:bottom w:type="dxa" w:w="90"/>
+              <w:right w:type="dxa" w:w="130"/>
+            </w:tcMar>
+            <w:vAlign w:val="center"/>
+          </w:tcPr>
+          <w:tc>
+            <w:tcPr>
+              <w:tcMar>
+                <w:top w:type="dxa" w:w="90"/>
+                <w:left w:type="dxa" w:w="130"/>
+                <w:bottom w:type="dxa" w:w="90"/>
+                <w:right w:type="dxa" w:w="130"/>
+              </w:tcMar>
+              <w:vAlign w:val="center"/>
+            </w:tcPr>
+            <w:p>
+              <w:pPr>
+                <w:spacing w:after="0" w:before="0"/>
+              </w:pPr>
+              <w:r>
+                <w:rPr>
+                  <w:rFonts w:ascii="Plus Jakarta Sans" w:cs="Plus Jakarta Sans" w:eastAsia="Plus Jakarta Sans" w:hAnsi="Plus Jakarta Sans"/>
+                  <w:b/>
+                  <w:bCs/>
+                  <w:color w:val="0B3D91"/>
+                  <w:sz w:val="20"/>
+                  <w:szCs w:val="20"/>
+                </w:rPr>
+                <w:t xml:space="preserve">Rp 450.000/bln</w:t>
+              </w:r>
+            </w:p>
+          </w:tc>
+          <w:p/>
+        </w:tc>
+      </w:tr>
+      <w:tr>
+        <w:tc>
+          <w:tcPr>
+            <w:tcMar>
+              <w:top w:type="dxa" w:w="90"/>
+              <w:left w:type="dxa" w:w="130"/>
+              <w:bottom w:type="dxa" w:w="90"/>
+              <w:right w:type="dxa" w:w="130"/>
+            </w:tcMar>
+            <w:vAlign w:val="center"/>
+          </w:tcPr>
+          <w:tc>
+            <w:tcPr>
+              <w:tcMar>
+                <w:top w:type="dxa" w:w="90"/>
+                <w:left w:type="dxa" w:w="130"/>
+                <w:bottom w:type="dxa" w:w="90"/>
+                <w:right w:type="dxa" w:w="130"/>
+              </w:tcMar>
+              <w:vAlign w:val="center"/>
+            </w:tcPr>
+            <w:p>
+              <w:pPr>
+                <w:spacing w:after="0" w:before="0"/>
+              </w:pPr>
+              <w:r>
+                <w:rPr>
+                  <w:rFonts w:ascii="Plus Jakarta Sans" w:cs="Plus Jakarta Sans" w:eastAsia="Plus Jakarta Sans" w:hAnsi="Plus Jakarta Sans"/>
+                  <w:b/>
+                  <w:bCs/>
+                  <w:color w:val="1F2937"/>
+                  <w:sz w:val="20"/>
+                  <w:szCs w:val="20"/>
+                </w:rPr>
+                <w:t xml:space="preserve">Premium</w:t>
+              </w:r>
+            </w:p>
+          </w:tc>
+          <w:p/>
+        </w:tc>
+        <w:tc>
+          <w:tcPr>
+            <w:tcMar>
+              <w:top w:type="dxa" w:w="90"/>
+              <w:left w:type="dxa" w:w="130"/>
+              <w:bottom w:type="dxa" w:w="90"/>
+              <w:right w:type="dxa" w:w="130"/>
+            </w:tcMar>
+            <w:vAlign w:val="center"/>
+          </w:tcPr>
+          <w:tc>
+            <w:tcPr>
+              <w:tcMar>
+                <w:top w:type="dxa" w:w="90"/>
+                <w:left w:type="dxa" w:w="130"/>
+                <w:bottom w:type="dxa" w:w="90"/>
+                <w:right w:type="dxa" w:w="130"/>
+              </w:tcMar>
+              <w:vAlign w:val="center"/>
+            </w:tcPr>
+            <w:p>
+              <w:pPr>
+                <w:spacing w:after="0" w:before="0"/>
+              </w:pPr>
+              <w:r>
+                <w:rPr>
+                  <w:rFonts w:ascii="Plus Jakarta Sans" w:cs="Plus Jakarta Sans" w:eastAsia="Plus Jakarta Sans" w:hAnsi="Plus Jakarta Sans"/>
+                  <w:color w:val="1F2937"/>
+                  <w:sz w:val="19"/>
+                  <w:szCs w:val="19"/>
+                </w:rPr>
+                <w:t xml:space="preserve">Semua Standar + edit tanpa batas, prioritas WA, SEO review</w:t>
+              </w:r>
+            </w:p>
+          </w:tc>
+          <w:p/>
+        </w:tc>
+        <w:tc>
+          <w:tcPr>
+            <w:tcMar>
+              <w:top w:type="dxa" w:w="90"/>
+              <w:left w:type="dxa" w:w="130"/>
+              <w:bottom w:type="dxa" w:w="90"/>
+              <w:right w:type="dxa" w:w="130"/>
+            </w:tcMar>
+            <w:vAlign w:val="center"/>
+          </w:tcPr>
+          <w:tc>
+            <w:tcPr>
+              <w:tcMar>
+                <w:top w:type="dxa" w:w="90"/>
+                <w:left w:type="dxa" w:w="130"/>
+                <w:bottom w:type="dxa" w:w="90"/>
+                <w:right w:type="dxa" w:w="130"/>
+              </w:tcMar>
+              <w:vAlign w:val="center"/>
+            </w:tcPr>
+            <w:p>
+              <w:pPr>
+                <w:spacing w:after="0" w:before="0"/>
+              </w:pPr>
+              <w:r>
+                <w:rPr>
+                  <w:rFonts w:ascii="Plus Jakarta Sans" w:cs="Plus Jakarta Sans" w:eastAsia="Plus Jakarta Sans" w:hAnsi="Plus Jakarta Sans"/>
+                  <w:b/>
+                  <w:bCs/>
+                  <w:color w:val="0B3D91"/>
+                  <w:sz w:val="20"/>
+                  <w:szCs w:val="20"/>
+                </w:rPr>
+                <w:t xml:space="preserve">Rp 700.000/bln</w:t>
+              </w:r>
+            </w:p>
+          </w:tc>
+          <w:p/>
+        </w:tc>
+      </w:tr>
+    </w:tbl>
+    <w:p>
+      <w:pPr>
+        <w:spacing w:after="0" w:before="0"/>
+      </w:pPr>
       <w:r>
         <w:rPr>
           <w:rFonts w:ascii="Plus Jakarta Sans" w:cs="Plus Jakarta Sans" w:eastAsia="Plus Jakarta Sans" w:hAnsi="Plus Jakarta Sans"/>
@@ -5505,137 +6444,36 @@
           <w:sz w:val="22"/>
           <w:szCs w:val="22"/>
         </w:rPr>
-        <w:t xml:space="preserve">Desain modern, mobile-first, dan sesuai identitas sekolah</w:t>
-      </w:r>
-    </w:p>
-    <w:p>
-      <w:pPr>
-        <w:spacing w:after="80"/>
-        <w:ind w:left="360"/>
+        <w:t xml:space="preserve"> </w:t>
+      </w:r>
+    </w:p>
+    <w:p>
+      <w:pPr>
+        <w:spacing w:after="0" w:before="0"/>
       </w:pPr>
       <w:r>
         <w:rPr>
           <w:rFonts w:ascii="Plus Jakarta Sans" w:cs="Plus Jakarta Sans" w:eastAsia="Plus Jakarta Sans" w:hAnsi="Plus Jakarta Sans"/>
           <w:b/>
           <w:bCs/>
-          <w:color w:val="C9A227"/>
-          <w:sz w:val="22"/>
-          <w:szCs w:val="22"/>
-        </w:rPr>
-        <w:t xml:space="preserve">✓  </w:t>
-      </w:r>
-      <w:r>
-        <w:rPr>
-          <w:rFonts w:ascii="Plus Jakarta Sans" w:cs="Plus Jakarta Sans" w:eastAsia="Plus Jakarta Sans" w:hAnsi="Plus Jakarta Sans"/>
+          <w:i/>
+          <w:iCs/>
           <w:color w:val="1F2937"/>
           <w:sz w:val="22"/>
           <w:szCs w:val="22"/>
         </w:rPr>
-        <w:t xml:space="preserve">Panel admin mudah digunakan — staf sekolah bisa update sendiri</w:t>
-      </w:r>
-    </w:p>
-    <w:p>
-      <w:pPr>
-        <w:spacing w:after="80"/>
-        <w:ind w:left="360"/>
-      </w:pPr>
-      <w:r>
-        <w:rPr>
-          <w:rFonts w:ascii="Plus Jakarta Sans" w:cs="Plus Jakarta Sans" w:eastAsia="Plus Jakarta Sans" w:hAnsi="Plus Jakarta Sans"/>
-          <w:b/>
-          <w:bCs/>
-          <w:color w:val="C9A227"/>
-          <w:sz w:val="22"/>
-          <w:szCs w:val="22"/>
-        </w:rPr>
-        <w:t xml:space="preserve">✓  </w:t>
-      </w:r>
-      <w:r>
-        <w:rPr>
-          <w:rFonts w:ascii="Plus Jakarta Sans" w:cs="Plus Jakarta Sans" w:eastAsia="Plus Jakarta Sans" w:hAnsi="Plus Jakarta Sans"/>
-          <w:color w:val="1F2937"/>
-          <w:sz w:val="22"/>
-          <w:szCs w:val="22"/>
-        </w:rPr>
-        <w:t xml:space="preserve">Customizer tampilan: ganti warna &amp; teks tanpa perlu developer</w:t>
-      </w:r>
-    </w:p>
-    <w:p>
-      <w:pPr>
-        <w:spacing w:after="80"/>
-        <w:ind w:left="360"/>
-      </w:pPr>
-      <w:r>
-        <w:rPr>
-          <w:rFonts w:ascii="Plus Jakarta Sans" w:cs="Plus Jakarta Sans" w:eastAsia="Plus Jakarta Sans" w:hAnsi="Plus Jakarta Sans"/>
-          <w:b/>
-          <w:bCs/>
-          <w:color w:val="C9A227"/>
-          <w:sz w:val="22"/>
-          <w:szCs w:val="22"/>
-        </w:rPr>
-        <w:t xml:space="preserve">✓  </w:t>
-      </w:r>
-      <w:r>
-        <w:rPr>
-          <w:rFonts w:ascii="Plus Jakarta Sans" w:cs="Plus Jakarta Sans" w:eastAsia="Plus Jakarta Sans" w:hAnsi="Plus Jakarta Sans"/>
-          <w:color w:val="1F2937"/>
-          <w:sz w:val="22"/>
-          <w:szCs w:val="22"/>
-        </w:rPr>
-        <w:t xml:space="preserve">Harga transparan, tanpa biaya tersembunyi</w:t>
-      </w:r>
-    </w:p>
-    <w:p>
-      <w:pPr>
-        <w:spacing w:after="80"/>
-        <w:ind w:left="360"/>
-      </w:pPr>
-      <w:r>
-        <w:rPr>
-          <w:rFonts w:ascii="Plus Jakarta Sans" w:cs="Plus Jakarta Sans" w:eastAsia="Plus Jakarta Sans" w:hAnsi="Plus Jakarta Sans"/>
-          <w:b/>
-          <w:bCs/>
-          <w:color w:val="C9A227"/>
-          <w:sz w:val="22"/>
-          <w:szCs w:val="22"/>
-        </w:rPr>
-        <w:t xml:space="preserve">✓  </w:t>
-      </w:r>
-      <w:r>
-        <w:rPr>
-          <w:rFonts w:ascii="Plus Jakarta Sans" w:cs="Plus Jakarta Sans" w:eastAsia="Plus Jakarta Sans" w:hAnsi="Plus Jakarta Sans"/>
-          <w:color w:val="1F2937"/>
-          <w:sz w:val="22"/>
-          <w:szCs w:val="22"/>
-        </w:rPr>
-        <w:t xml:space="preserve">Dukungan responsif &amp; garansi 3 bulan</w:t>
-      </w:r>
-    </w:p>
-    <w:p>
-      <w:pPr>
-        <w:spacing w:after="80"/>
-        <w:ind w:left="360"/>
-      </w:pPr>
-      <w:r>
-        <w:rPr>
-          <w:rFonts w:ascii="Plus Jakarta Sans" w:cs="Plus Jakarta Sans" w:eastAsia="Plus Jakarta Sans" w:hAnsi="Plus Jakarta Sans"/>
-          <w:b/>
-          <w:bCs/>
-          <w:color w:val="C9A227"/>
-          <w:sz w:val="22"/>
-          <w:szCs w:val="22"/>
-        </w:rPr>
-        <w:t xml:space="preserve">✓  </w:t>
-      </w:r>
-      <w:r>
-        <w:rPr>
-          <w:rFonts w:ascii="Plus Jakarta Sans" w:cs="Plus Jakarta Sans" w:eastAsia="Plus Jakarta Sans" w:hAnsi="Plus Jakarta Sans"/>
-          <w:color w:val="1F2937"/>
-          <w:sz w:val="22"/>
-          <w:szCs w:val="22"/>
-        </w:rPr>
-        <w:t xml:space="preserve">Demo live dapat dilihat &amp; dicoba langsung sebelum memutuskan</w:t>
+        <w:t xml:space="preserve">Catatan: </w:t>
+      </w:r>
+      <w:r>
+        <w:rPr>
+          <w:rFonts w:ascii="Plus Jakarta Sans" w:cs="Plus Jakarta Sans" w:eastAsia="Plus Jakarta Sans" w:hAnsi="Plus Jakarta Sans"/>
+          <w:i/>
+          <w:iCs/>
+          <w:color w:val="5B6B82"/>
+          <w:sz w:val="19"/>
+          <w:szCs w:val="19"/>
+        </w:rPr>
+        <w:t xml:space="preserve">Langganan tahunan = bayar 10 bulan, gratis 2 bulan.</w:t>
       </w:r>
     </w:p>
     <w:p>
@@ -5652,7 +6490,843 @@
           <w:sz w:val="30"/>
           <w:szCs w:val="30"/>
         </w:rPr>
-        <w:t xml:space="preserve">10. Penutup</w:t>
+        <w:t xml:space="preserve">9. Pilihan Infrastruktur: Supabase vs VPS</w:t>
+      </w:r>
+    </w:p>
+    <w:p>
+      <w:pPr>
+        <w:spacing w:after="120" w:before="0"/>
+      </w:pPr>
+      <w:r>
+        <w:rPr>
+          <w:rFonts w:ascii="Plus Jakarta Sans" w:cs="Plus Jakarta Sans" w:eastAsia="Plus Jakarta Sans" w:hAnsi="Plus Jakarta Sans"/>
+          <w:color w:val="1F2937"/>
+          <w:sz w:val="22"/>
+          <w:szCs w:val="22"/>
+        </w:rPr>
+        <w:t xml:space="preserve">Kedua opsi sudah termasuk database, autentikasi, dan penyimpanan. Pilih sesuai kebutuhan sekolah:</w:t>
+      </w:r>
+    </w:p>
+    <w:tbl>
+      <w:tblPr>
+        <w:tblW w:type="dxa" w:w="9100"/>
+        <w:tblBorders>
+          <w:top w:val="single" w:color="E2E8F0" w:sz="4"/>
+          <w:left w:val="single" w:color="E2E8F0" w:sz="4"/>
+          <w:bottom w:val="single" w:color="E2E8F0" w:sz="4"/>
+          <w:right w:val="single" w:color="E2E8F0" w:sz="4"/>
+          <w:insideH w:val="single" w:color="E2E8F0" w:sz="4"/>
+          <w:insideV w:val="single" w:color="E2E8F0" w:sz="4"/>
+        </w:tblBorders>
+      </w:tblPr>
+      <w:tblGrid>
+        <w:gridCol w:w="1700"/>
+        <w:gridCol w:w="3800"/>
+        <w:gridCol w:w="3600"/>
+      </w:tblGrid>
+      <w:tr>
+        <w:trPr>
+          <w:tblHeader/>
+        </w:trPr>
+        <w:tc>
+          <w:tcPr>
+            <w:shd w:fill="0B3D91" w:color="auto" w:val="clear"/>
+            <w:tcMar>
+              <w:top w:type="dxa" w:w="90"/>
+              <w:left w:type="dxa" w:w="130"/>
+              <w:bottom w:type="dxa" w:w="90"/>
+              <w:right w:type="dxa" w:w="130"/>
+            </w:tcMar>
+            <w:vAlign w:val="center"/>
+          </w:tcPr>
+          <w:p>
+            <w:pPr>
+              <w:spacing w:after="0" w:before="0"/>
+            </w:pPr>
+            <w:r>
+              <w:rPr>
+                <w:rFonts w:ascii="Plus Jakarta Sans" w:cs="Plus Jakarta Sans" w:eastAsia="Plus Jakarta Sans" w:hAnsi="Plus Jakarta Sans"/>
+                <w:b/>
+                <w:bCs/>
+                <w:color w:val="FFFFFF"/>
+                <w:sz w:val="20"/>
+                <w:szCs w:val="20"/>
+              </w:rPr>
+              <w:t xml:space="preserve">Aspek</w:t>
+            </w:r>
+          </w:p>
+        </w:tc>
+        <w:tc>
+          <w:tcPr>
+            <w:shd w:fill="0B3D91" w:color="auto" w:val="clear"/>
+            <w:tcMar>
+              <w:top w:type="dxa" w:w="90"/>
+              <w:left w:type="dxa" w:w="130"/>
+              <w:bottom w:type="dxa" w:w="90"/>
+              <w:right w:type="dxa" w:w="130"/>
+            </w:tcMar>
+            <w:vAlign w:val="center"/>
+          </w:tcPr>
+          <w:p>
+            <w:pPr>
+              <w:spacing w:after="0" w:before="0"/>
+            </w:pPr>
+            <w:r>
+              <w:rPr>
+                <w:rFonts w:ascii="Plus Jakarta Sans" w:cs="Plus Jakarta Sans" w:eastAsia="Plus Jakarta Sans" w:hAnsi="Plus Jakarta Sans"/>
+                <w:b/>
+                <w:bCs/>
+                <w:color w:val="FFFFFF"/>
+                <w:sz w:val="20"/>
+                <w:szCs w:val="20"/>
+              </w:rPr>
+              <w:t xml:space="preserve">Supabase (default)</w:t>
+            </w:r>
+          </w:p>
+        </w:tc>
+        <w:tc>
+          <w:tcPr>
+            <w:shd w:fill="0B3D91" w:color="auto" w:val="clear"/>
+            <w:tcMar>
+              <w:top w:type="dxa" w:w="90"/>
+              <w:left w:type="dxa" w:w="130"/>
+              <w:bottom w:type="dxa" w:w="90"/>
+              <w:right w:type="dxa" w:w="130"/>
+            </w:tcMar>
+            <w:vAlign w:val="center"/>
+          </w:tcPr>
+          <w:p>
+            <w:pPr>
+              <w:spacing w:after="0" w:before="0"/>
+            </w:pPr>
+            <w:r>
+              <w:rPr>
+                <w:rFonts w:ascii="Plus Jakarta Sans" w:cs="Plus Jakarta Sans" w:eastAsia="Plus Jakarta Sans" w:hAnsi="Plus Jakarta Sans"/>
+                <w:b/>
+                <w:bCs/>
+                <w:color w:val="FFFFFF"/>
+                <w:sz w:val="20"/>
+                <w:szCs w:val="20"/>
+              </w:rPr>
+              <w:t xml:space="preserve">VPS (add-on)</w:t>
+            </w:r>
+          </w:p>
+        </w:tc>
+      </w:tr>
+      <w:tr>
+        <w:tc>
+          <w:tcPr>
+            <w:tcMar>
+              <w:top w:type="dxa" w:w="90"/>
+              <w:left w:type="dxa" w:w="130"/>
+              <w:bottom w:type="dxa" w:w="90"/>
+              <w:right w:type="dxa" w:w="130"/>
+            </w:tcMar>
+            <w:vAlign w:val="center"/>
+          </w:tcPr>
+          <w:tc>
+            <w:tcPr>
+              <w:tcMar>
+                <w:top w:type="dxa" w:w="90"/>
+                <w:left w:type="dxa" w:w="130"/>
+                <w:bottom w:type="dxa" w:w="90"/>
+                <w:right w:type="dxa" w:w="130"/>
+              </w:tcMar>
+              <w:vAlign w:val="center"/>
+            </w:tcPr>
+            <w:p>
+              <w:pPr>
+                <w:spacing w:after="0" w:before="0"/>
+              </w:pPr>
+              <w:r>
+                <w:rPr>
+                  <w:rFonts w:ascii="Plus Jakarta Sans" w:cs="Plus Jakarta Sans" w:eastAsia="Plus Jakarta Sans" w:hAnsi="Plus Jakarta Sans"/>
+                  <w:b/>
+                  <w:bCs/>
+                  <w:color w:val="1F2937"/>
+                  <w:sz w:val="20"/>
+                  <w:szCs w:val="20"/>
+                </w:rPr>
+                <w:t xml:space="preserve">Kelebihan</w:t>
+              </w:r>
+            </w:p>
+          </w:tc>
+          <w:p/>
+        </w:tc>
+        <w:tc>
+          <w:tcPr>
+            <w:tcMar>
+              <w:top w:type="dxa" w:w="90"/>
+              <w:left w:type="dxa" w:w="130"/>
+              <w:bottom w:type="dxa" w:w="90"/>
+              <w:right w:type="dxa" w:w="130"/>
+            </w:tcMar>
+            <w:vAlign w:val="center"/>
+          </w:tcPr>
+          <w:tc>
+            <w:tcPr>
+              <w:tcMar>
+                <w:top w:type="dxa" w:w="90"/>
+                <w:left w:type="dxa" w:w="130"/>
+                <w:bottom w:type="dxa" w:w="90"/>
+                <w:right w:type="dxa" w:w="130"/>
+              </w:tcMar>
+              <w:vAlign w:val="center"/>
+            </w:tcPr>
+            <w:p>
+              <w:pPr>
+                <w:spacing w:after="0" w:before="0"/>
+              </w:pPr>
+              <w:r>
+                <w:rPr>
+                  <w:rFonts w:ascii="Plus Jakarta Sans" w:cs="Plus Jakarta Sans" w:eastAsia="Plus Jakarta Sans" w:hAnsi="Plus Jakarta Sans"/>
+                  <w:color w:val="1F2937"/>
+                  <w:sz w:val="19"/>
+                  <w:szCs w:val="19"/>
+                </w:rPr>
+                <w:t xml:space="preserve">Managed, auto backup, tanpa urus server. Cukup untuk profil + PPDB</w:t>
+              </w:r>
+            </w:p>
+          </w:tc>
+          <w:p/>
+        </w:tc>
+        <w:tc>
+          <w:tcPr>
+            <w:tcMar>
+              <w:top w:type="dxa" w:w="90"/>
+              <w:left w:type="dxa" w:w="130"/>
+              <w:bottom w:type="dxa" w:w="90"/>
+              <w:right w:type="dxa" w:w="130"/>
+            </w:tcMar>
+            <w:vAlign w:val="center"/>
+          </w:tcPr>
+          <w:tc>
+            <w:tcPr>
+              <w:tcMar>
+                <w:top w:type="dxa" w:w="90"/>
+                <w:left w:type="dxa" w:w="130"/>
+                <w:bottom w:type="dxa" w:w="90"/>
+                <w:right w:type="dxa" w:w="130"/>
+              </w:tcMar>
+              <w:vAlign w:val="center"/>
+            </w:tcPr>
+            <w:p>
+              <w:pPr>
+                <w:spacing w:after="0" w:before="0"/>
+              </w:pPr>
+              <w:r>
+                <w:rPr>
+                  <w:rFonts w:ascii="Plus Jakarta Sans" w:cs="Plus Jakarta Sans" w:eastAsia="Plus Jakarta Sans" w:hAnsi="Plus Jakarta Sans"/>
+                  <w:color w:val="1F2937"/>
+                  <w:sz w:val="19"/>
+                  <w:szCs w:val="19"/>
+                </w:rPr>
+                <w:t xml:space="preserve">Full kontrol, email kustom, multi-aplikasi, resource besar</w:t>
+              </w:r>
+            </w:p>
+          </w:tc>
+          <w:p/>
+        </w:tc>
+      </w:tr>
+      <w:tr>
+        <w:tc>
+          <w:tcPr>
+            <w:tcMar>
+              <w:top w:type="dxa" w:w="90"/>
+              <w:left w:type="dxa" w:w="130"/>
+              <w:bottom w:type="dxa" w:w="90"/>
+              <w:right w:type="dxa" w:w="130"/>
+            </w:tcMar>
+            <w:vAlign w:val="center"/>
+          </w:tcPr>
+          <w:tc>
+            <w:tcPr>
+              <w:tcMar>
+                <w:top w:type="dxa" w:w="90"/>
+                <w:left w:type="dxa" w:w="130"/>
+                <w:bottom w:type="dxa" w:w="90"/>
+                <w:right w:type="dxa" w:w="130"/>
+              </w:tcMar>
+              <w:vAlign w:val="center"/>
+            </w:tcPr>
+            <w:p>
+              <w:pPr>
+                <w:spacing w:after="0" w:before="0"/>
+              </w:pPr>
+              <w:r>
+                <w:rPr>
+                  <w:rFonts w:ascii="Plus Jakarta Sans" w:cs="Plus Jakarta Sans" w:eastAsia="Plus Jakarta Sans" w:hAnsi="Plus Jakarta Sans"/>
+                  <w:b/>
+                  <w:bCs/>
+                  <w:color w:val="1F2937"/>
+                  <w:sz w:val="20"/>
+                  <w:szCs w:val="20"/>
+                </w:rPr>
+                <w:t xml:space="preserve">Biaya Setup</w:t>
+              </w:r>
+            </w:p>
+          </w:tc>
+          <w:p/>
+        </w:tc>
+        <w:tc>
+          <w:tcPr>
+            <w:tcMar>
+              <w:top w:type="dxa" w:w="90"/>
+              <w:left w:type="dxa" w:w="130"/>
+              <w:bottom w:type="dxa" w:w="90"/>
+              <w:right w:type="dxa" w:w="130"/>
+            </w:tcMar>
+            <w:vAlign w:val="center"/>
+          </w:tcPr>
+          <w:tc>
+            <w:tcPr>
+              <w:tcMar>
+                <w:top w:type="dxa" w:w="90"/>
+                <w:left w:type="dxa" w:w="130"/>
+                <w:bottom w:type="dxa" w:w="90"/>
+                <w:right w:type="dxa" w:w="130"/>
+              </w:tcMar>
+              <w:vAlign w:val="center"/>
+            </w:tcPr>
+            <w:p>
+              <w:pPr>
+                <w:spacing w:after="0" w:before="0"/>
+              </w:pPr>
+              <w:r>
+                <w:rPr>
+                  <w:rFonts w:ascii="Plus Jakarta Sans" w:cs="Plus Jakarta Sans" w:eastAsia="Plus Jakarta Sans" w:hAnsi="Plus Jakarta Sans"/>
+                  <w:color w:val="1F2937"/>
+                  <w:sz w:val="19"/>
+                  <w:szCs w:val="19"/>
+                </w:rPr>
+                <w:t xml:space="preserve">Rp 0 — sudah termasuk paket</w:t>
+              </w:r>
+            </w:p>
+          </w:tc>
+          <w:p/>
+        </w:tc>
+        <w:tc>
+          <w:tcPr>
+            <w:tcMar>
+              <w:top w:type="dxa" w:w="90"/>
+              <w:left w:type="dxa" w:w="130"/>
+              <w:bottom w:type="dxa" w:w="90"/>
+              <w:right w:type="dxa" w:w="130"/>
+            </w:tcMar>
+            <w:vAlign w:val="center"/>
+          </w:tcPr>
+          <w:tc>
+            <w:tcPr>
+              <w:tcMar>
+                <w:top w:type="dxa" w:w="90"/>
+                <w:left w:type="dxa" w:w="130"/>
+                <w:bottom w:type="dxa" w:w="90"/>
+                <w:right w:type="dxa" w:w="130"/>
+              </w:tcMar>
+              <w:vAlign w:val="center"/>
+            </w:tcPr>
+            <w:p>
+              <w:pPr>
+                <w:spacing w:after="0" w:before="0"/>
+              </w:pPr>
+              <w:r>
+                <w:rPr>
+                  <w:rFonts w:ascii="Plus Jakarta Sans" w:cs="Plus Jakarta Sans" w:eastAsia="Plus Jakarta Sans" w:hAnsi="Plus Jakarta Sans"/>
+                  <w:color w:val="1F2937"/>
+                  <w:sz w:val="19"/>
+                  <w:szCs w:val="19"/>
+                </w:rPr>
+                <w:t xml:space="preserve">+Rp 1.500.000 sekali (setting &amp; migrasi)</w:t>
+              </w:r>
+            </w:p>
+          </w:tc>
+          <w:p/>
+        </w:tc>
+      </w:tr>
+      <w:tr>
+        <w:tc>
+          <w:tcPr>
+            <w:tcMar>
+              <w:top w:type="dxa" w:w="90"/>
+              <w:left w:type="dxa" w:w="130"/>
+              <w:bottom w:type="dxa" w:w="90"/>
+              <w:right w:type="dxa" w:w="130"/>
+            </w:tcMar>
+            <w:vAlign w:val="center"/>
+          </w:tcPr>
+          <w:tc>
+            <w:tcPr>
+              <w:tcMar>
+                <w:top w:type="dxa" w:w="90"/>
+                <w:left w:type="dxa" w:w="130"/>
+                <w:bottom w:type="dxa" w:w="90"/>
+                <w:right w:type="dxa" w:w="130"/>
+              </w:tcMar>
+              <w:vAlign w:val="center"/>
+            </w:tcPr>
+            <w:p>
+              <w:pPr>
+                <w:spacing w:after="0" w:before="0"/>
+              </w:pPr>
+              <w:r>
+                <w:rPr>
+                  <w:rFonts w:ascii="Plus Jakarta Sans" w:cs="Plus Jakarta Sans" w:eastAsia="Plus Jakarta Sans" w:hAnsi="Plus Jakarta Sans"/>
+                  <w:b/>
+                  <w:bCs/>
+                  <w:color w:val="1F2937"/>
+                  <w:sz w:val="20"/>
+                  <w:szCs w:val="20"/>
+                </w:rPr>
+                <w:t xml:space="preserve">Biaya Server</w:t>
+              </w:r>
+            </w:p>
+          </w:tc>
+          <w:p/>
+        </w:tc>
+        <w:tc>
+          <w:tcPr>
+            <w:tcMar>
+              <w:top w:type="dxa" w:w="90"/>
+              <w:left w:type="dxa" w:w="130"/>
+              <w:bottom w:type="dxa" w:w="90"/>
+              <w:right w:type="dxa" w:w="130"/>
+            </w:tcMar>
+            <w:vAlign w:val="center"/>
+          </w:tcPr>
+          <w:tc>
+            <w:tcPr>
+              <w:tcMar>
+                <w:top w:type="dxa" w:w="90"/>
+                <w:left w:type="dxa" w:w="130"/>
+                <w:bottom w:type="dxa" w:w="90"/>
+                <w:right w:type="dxa" w:w="130"/>
+              </w:tcMar>
+              <w:vAlign w:val="center"/>
+            </w:tcPr>
+            <w:p>
+              <w:pPr>
+                <w:spacing w:after="0" w:before="0"/>
+              </w:pPr>
+              <w:r>
+                <w:rPr>
+                  <w:rFonts w:ascii="Plus Jakarta Sans" w:cs="Plus Jakarta Sans" w:eastAsia="Plus Jakarta Sans" w:hAnsi="Plus Jakarta Sans"/>
+                  <w:color w:val="1F2937"/>
+                  <w:sz w:val="19"/>
+                  <w:szCs w:val="19"/>
+                </w:rPr>
+                <w:t xml:space="preserve">Rp 0 — kuota project termasuk</w:t>
+              </w:r>
+            </w:p>
+          </w:tc>
+          <w:p/>
+        </w:tc>
+        <w:tc>
+          <w:tcPr>
+            <w:tcMar>
+              <w:top w:type="dxa" w:w="90"/>
+              <w:left w:type="dxa" w:w="130"/>
+              <w:bottom w:type="dxa" w:w="90"/>
+              <w:right w:type="dxa" w:w="130"/>
+            </w:tcMar>
+            <w:vAlign w:val="center"/>
+          </w:tcPr>
+          <w:tc>
+            <w:tcPr>
+              <w:tcMar>
+                <w:top w:type="dxa" w:w="90"/>
+                <w:left w:type="dxa" w:w="130"/>
+                <w:bottom w:type="dxa" w:w="90"/>
+                <w:right w:type="dxa" w:w="130"/>
+              </w:tcMar>
+              <w:vAlign w:val="center"/>
+            </w:tcPr>
+            <w:p>
+              <w:pPr>
+                <w:spacing w:after="0" w:before="0"/>
+              </w:pPr>
+              <w:r>
+                <w:rPr>
+                  <w:rFonts w:ascii="Plus Jakarta Sans" w:cs="Plus Jakarta Sans" w:eastAsia="Plus Jakarta Sans" w:hAnsi="Plus Jakarta Sans"/>
+                  <w:color w:val="1F2937"/>
+                  <w:sz w:val="19"/>
+                  <w:szCs w:val="19"/>
+                </w:rPr>
+                <w:t xml:space="preserve">+Rp 300.000/bulan</w:t>
+              </w:r>
+            </w:p>
+          </w:tc>
+          <w:p/>
+        </w:tc>
+      </w:tr>
+      <w:tr>
+        <w:tc>
+          <w:tcPr>
+            <w:tcMar>
+              <w:top w:type="dxa" w:w="90"/>
+              <w:left w:type="dxa" w:w="130"/>
+              <w:bottom w:type="dxa" w:w="90"/>
+              <w:right w:type="dxa" w:w="130"/>
+            </w:tcMar>
+            <w:vAlign w:val="center"/>
+          </w:tcPr>
+          <w:tc>
+            <w:tcPr>
+              <w:tcMar>
+                <w:top w:type="dxa" w:w="90"/>
+                <w:left w:type="dxa" w:w="130"/>
+                <w:bottom w:type="dxa" w:w="90"/>
+                <w:right w:type="dxa" w:w="130"/>
+              </w:tcMar>
+              <w:vAlign w:val="center"/>
+            </w:tcPr>
+            <w:p>
+              <w:pPr>
+                <w:spacing w:after="0" w:before="0"/>
+              </w:pPr>
+              <w:r>
+                <w:rPr>
+                  <w:rFonts w:ascii="Plus Jakarta Sans" w:cs="Plus Jakarta Sans" w:eastAsia="Plus Jakarta Sans" w:hAnsi="Plus Jakarta Sans"/>
+                  <w:b/>
+                  <w:bCs/>
+                  <w:color w:val="1F2937"/>
+                  <w:sz w:val="20"/>
+                  <w:szCs w:val="20"/>
+                </w:rPr>
+                <w:t xml:space="preserve">Cocok Untuk</w:t>
+              </w:r>
+            </w:p>
+          </w:tc>
+          <w:p/>
+        </w:tc>
+        <w:tc>
+          <w:tcPr>
+            <w:tcMar>
+              <w:top w:type="dxa" w:w="90"/>
+              <w:left w:type="dxa" w:w="130"/>
+              <w:bottom w:type="dxa" w:w="90"/>
+              <w:right w:type="dxa" w:w="130"/>
+            </w:tcMar>
+            <w:vAlign w:val="center"/>
+          </w:tcPr>
+          <w:tc>
+            <w:tcPr>
+              <w:tcMar>
+                <w:top w:type="dxa" w:w="90"/>
+                <w:left w:type="dxa" w:w="130"/>
+                <w:bottom w:type="dxa" w:w="90"/>
+                <w:right w:type="dxa" w:w="130"/>
+              </w:tcMar>
+              <w:vAlign w:val="center"/>
+            </w:tcPr>
+            <w:p>
+              <w:pPr>
+                <w:spacing w:after="0" w:before="0"/>
+              </w:pPr>
+              <w:r>
+                <w:rPr>
+                  <w:rFonts w:ascii="Plus Jakarta Sans" w:cs="Plus Jakarta Sans" w:eastAsia="Plus Jakarta Sans" w:hAnsi="Plus Jakarta Sans"/>
+                  <w:color w:val="1F2937"/>
+                  <w:sz w:val="19"/>
+                  <w:szCs w:val="19"/>
+                </w:rPr>
+                <w:t xml:space="preserve">Website profil, berita, PPDB reguler</w:t>
+              </w:r>
+            </w:p>
+          </w:tc>
+          <w:p/>
+        </w:tc>
+        <w:tc>
+          <w:tcPr>
+            <w:tcMar>
+              <w:top w:type="dxa" w:w="90"/>
+              <w:left w:type="dxa" w:w="130"/>
+              <w:bottom w:type="dxa" w:w="90"/>
+              <w:right w:type="dxa" w:w="130"/>
+            </w:tcMar>
+            <w:vAlign w:val="center"/>
+          </w:tcPr>
+          <w:tc>
+            <w:tcPr>
+              <w:tcMar>
+                <w:top w:type="dxa" w:w="90"/>
+                <w:left w:type="dxa" w:w="130"/>
+                <w:bottom w:type="dxa" w:w="90"/>
+                <w:right w:type="dxa" w:w="130"/>
+              </w:tcMar>
+              <w:vAlign w:val="center"/>
+            </w:tcPr>
+            <w:p>
+              <w:pPr>
+                <w:spacing w:after="0" w:before="0"/>
+              </w:pPr>
+              <w:r>
+                <w:rPr>
+                  <w:rFonts w:ascii="Plus Jakarta Sans" w:cs="Plus Jakarta Sans" w:eastAsia="Plus Jakarta Sans" w:hAnsi="Plus Jakarta Sans"/>
+                  <w:color w:val="1F2937"/>
+                  <w:sz w:val="19"/>
+                  <w:szCs w:val="19"/>
+                </w:rPr>
+                <w:t xml:space="preserve">PPDB volume besar, sistem akademik, multi-admin berat</w:t>
+              </w:r>
+            </w:p>
+          </w:tc>
+          <w:p/>
+        </w:tc>
+      </w:tr>
+    </w:tbl>
+    <w:p>
+      <w:pPr>
+        <w:spacing w:after="0" w:before="0"/>
+      </w:pPr>
+      <w:r>
+        <w:rPr>
+          <w:rFonts w:ascii="Plus Jakarta Sans" w:cs="Plus Jakarta Sans" w:eastAsia="Plus Jakarta Sans" w:hAnsi="Plus Jakarta Sans"/>
+          <w:color w:val="1F2937"/>
+          <w:sz w:val="22"/>
+          <w:szCs w:val="22"/>
+        </w:rPr>
+        <w:t xml:space="preserve"> </w:t>
+      </w:r>
+    </w:p>
+    <w:p>
+      <w:pPr>
+        <w:spacing w:after="0" w:before="0"/>
+      </w:pPr>
+      <w:r>
+        <w:rPr>
+          <w:rFonts w:ascii="Plus Jakarta Sans" w:cs="Plus Jakarta Sans" w:eastAsia="Plus Jakarta Sans" w:hAnsi="Plus Jakarta Sans"/>
+          <w:b/>
+          <w:bCs/>
+          <w:color w:val="1F2937"/>
+          <w:sz w:val="22"/>
+          <w:szCs w:val="22"/>
+        </w:rPr>
+        <w:t xml:space="preserve">Add-on Supabase Pro: </w:t>
+      </w:r>
+      <w:r>
+        <w:rPr>
+          <w:rFonts w:ascii="Plus Jakarta Sans" w:cs="Plus Jakarta Sans" w:eastAsia="Plus Jakarta Sans" w:hAnsi="Plus Jakarta Sans"/>
+          <w:color w:val="1F2937"/>
+          <w:sz w:val="22"/>
+          <w:szCs w:val="22"/>
+        </w:rPr>
+        <w:t xml:space="preserve">+Rp 350.000/bulan untuk PPDB volume besar, backup point-in-time (PITR), bandwidth &amp; storage lebih besar.</w:t>
+      </w:r>
+    </w:p>
+    <w:p>
+      <w:pPr>
+        <w:pStyle w:val="Heading1"/>
+        <w:spacing w:after="160" w:before="400"/>
+      </w:pPr>
+      <w:r>
+        <w:rPr>
+          <w:rFonts w:ascii="Plus Jakarta Sans" w:cs="Plus Jakarta Sans" w:eastAsia="Plus Jakarta Sans" w:hAnsi="Plus Jakarta Sans"/>
+          <w:b/>
+          <w:bCs/>
+          <w:color w:val="082B66"/>
+          <w:sz w:val="30"/>
+          <w:szCs w:val="30"/>
+        </w:rPr>
+        <w:t xml:space="preserve">10. Mengapa Memilih Kami</w:t>
+      </w:r>
+    </w:p>
+    <w:p>
+      <w:pPr>
+        <w:spacing w:after="80"/>
+        <w:ind w:left="360"/>
+      </w:pPr>
+      <w:r>
+        <w:rPr>
+          <w:rFonts w:ascii="Plus Jakarta Sans" w:cs="Plus Jakarta Sans" w:eastAsia="Plus Jakarta Sans" w:hAnsi="Plus Jakarta Sans"/>
+          <w:b/>
+          <w:bCs/>
+          <w:color w:val="C9A227"/>
+          <w:sz w:val="22"/>
+          <w:szCs w:val="22"/>
+        </w:rPr>
+        <w:t xml:space="preserve">✓  </w:t>
+      </w:r>
+      <w:r>
+        <w:rPr>
+          <w:rFonts w:ascii="Plus Jakarta Sans" w:cs="Plus Jakarta Sans" w:eastAsia="Plus Jakarta Sans" w:hAnsi="Plus Jakarta Sans"/>
+          <w:color w:val="1F2937"/>
+          <w:sz w:val="22"/>
+          <w:szCs w:val="22"/>
+        </w:rPr>
+        <w:t xml:space="preserve">Berpengalaman membangun website profil sekolah &amp; instansi pendidikan</w:t>
+      </w:r>
+    </w:p>
+    <w:p>
+      <w:pPr>
+        <w:spacing w:after="80"/>
+        <w:ind w:left="360"/>
+      </w:pPr>
+      <w:r>
+        <w:rPr>
+          <w:rFonts w:ascii="Plus Jakarta Sans" w:cs="Plus Jakarta Sans" w:eastAsia="Plus Jakarta Sans" w:hAnsi="Plus Jakarta Sans"/>
+          <w:b/>
+          <w:bCs/>
+          <w:color w:val="C9A227"/>
+          <w:sz w:val="22"/>
+          <w:szCs w:val="22"/>
+        </w:rPr>
+        <w:t xml:space="preserve">✓  </w:t>
+      </w:r>
+      <w:r>
+        <w:rPr>
+          <w:rFonts w:ascii="Plus Jakarta Sans" w:cs="Plus Jakarta Sans" w:eastAsia="Plus Jakarta Sans" w:hAnsi="Plus Jakarta Sans"/>
+          <w:color w:val="1F2937"/>
+          <w:sz w:val="22"/>
+          <w:szCs w:val="22"/>
+        </w:rPr>
+        <w:t xml:space="preserve">Desain modern, mobile-first, dan sesuai identitas sekolah</w:t>
+      </w:r>
+    </w:p>
+    <w:p>
+      <w:pPr>
+        <w:spacing w:after="80"/>
+        <w:ind w:left="360"/>
+      </w:pPr>
+      <w:r>
+        <w:rPr>
+          <w:rFonts w:ascii="Plus Jakarta Sans" w:cs="Plus Jakarta Sans" w:eastAsia="Plus Jakarta Sans" w:hAnsi="Plus Jakarta Sans"/>
+          <w:b/>
+          <w:bCs/>
+          <w:color w:val="C9A227"/>
+          <w:sz w:val="22"/>
+          <w:szCs w:val="22"/>
+        </w:rPr>
+        <w:t xml:space="preserve">✓  </w:t>
+      </w:r>
+      <w:r>
+        <w:rPr>
+          <w:rFonts w:ascii="Plus Jakarta Sans" w:cs="Plus Jakarta Sans" w:eastAsia="Plus Jakarta Sans" w:hAnsi="Plus Jakarta Sans"/>
+          <w:color w:val="1F2937"/>
+          <w:sz w:val="22"/>
+          <w:szCs w:val="22"/>
+        </w:rPr>
+        <w:t xml:space="preserve">Panel admin mudah digunakan — staf sekolah bisa update sendiri</w:t>
+      </w:r>
+    </w:p>
+    <w:p>
+      <w:pPr>
+        <w:spacing w:after="80"/>
+        <w:ind w:left="360"/>
+      </w:pPr>
+      <w:r>
+        <w:rPr>
+          <w:rFonts w:ascii="Plus Jakarta Sans" w:cs="Plus Jakarta Sans" w:eastAsia="Plus Jakarta Sans" w:hAnsi="Plus Jakarta Sans"/>
+          <w:b/>
+          <w:bCs/>
+          <w:color w:val="C9A227"/>
+          <w:sz w:val="22"/>
+          <w:szCs w:val="22"/>
+        </w:rPr>
+        <w:t xml:space="preserve">✓  </w:t>
+      </w:r>
+      <w:r>
+        <w:rPr>
+          <w:rFonts w:ascii="Plus Jakarta Sans" w:cs="Plus Jakarta Sans" w:eastAsia="Plus Jakarta Sans" w:hAnsi="Plus Jakarta Sans"/>
+          <w:color w:val="1F2937"/>
+          <w:sz w:val="22"/>
+          <w:szCs w:val="22"/>
+        </w:rPr>
+        <w:t xml:space="preserve">Customizer tampilan: ganti warna &amp; teks tanpa perlu developer</w:t>
+      </w:r>
+    </w:p>
+    <w:p>
+      <w:pPr>
+        <w:spacing w:after="80"/>
+        <w:ind w:left="360"/>
+      </w:pPr>
+      <w:r>
+        <w:rPr>
+          <w:rFonts w:ascii="Plus Jakarta Sans" w:cs="Plus Jakarta Sans" w:eastAsia="Plus Jakarta Sans" w:hAnsi="Plus Jakarta Sans"/>
+          <w:b/>
+          <w:bCs/>
+          <w:color w:val="C9A227"/>
+          <w:sz w:val="22"/>
+          <w:szCs w:val="22"/>
+        </w:rPr>
+        <w:t xml:space="preserve">✓  </w:t>
+      </w:r>
+      <w:r>
+        <w:rPr>
+          <w:rFonts w:ascii="Plus Jakarta Sans" w:cs="Plus Jakarta Sans" w:eastAsia="Plus Jakarta Sans" w:hAnsi="Plus Jakarta Sans"/>
+          <w:color w:val="1F2937"/>
+          <w:sz w:val="22"/>
+          <w:szCs w:val="22"/>
+        </w:rPr>
+        <w:t xml:space="preserve">Harga transparan, tanpa biaya tersembunyi</w:t>
+      </w:r>
+    </w:p>
+    <w:p>
+      <w:pPr>
+        <w:spacing w:after="80"/>
+        <w:ind w:left="360"/>
+      </w:pPr>
+      <w:r>
+        <w:rPr>
+          <w:rFonts w:ascii="Plus Jakarta Sans" w:cs="Plus Jakarta Sans" w:eastAsia="Plus Jakarta Sans" w:hAnsi="Plus Jakarta Sans"/>
+          <w:b/>
+          <w:bCs/>
+          <w:color w:val="C9A227"/>
+          <w:sz w:val="22"/>
+          <w:szCs w:val="22"/>
+        </w:rPr>
+        <w:t xml:space="preserve">✓  </w:t>
+      </w:r>
+      <w:r>
+        <w:rPr>
+          <w:rFonts w:ascii="Plus Jakarta Sans" w:cs="Plus Jakarta Sans" w:eastAsia="Plus Jakarta Sans" w:hAnsi="Plus Jakarta Sans"/>
+          <w:color w:val="1F2937"/>
+          <w:sz w:val="22"/>
+          <w:szCs w:val="22"/>
+        </w:rPr>
+        <w:t xml:space="preserve">Dukungan responsif &amp; garansi 3 bulan</w:t>
+      </w:r>
+    </w:p>
+    <w:p>
+      <w:pPr>
+        <w:spacing w:after="80"/>
+        <w:ind w:left="360"/>
+      </w:pPr>
+      <w:r>
+        <w:rPr>
+          <w:rFonts w:ascii="Plus Jakarta Sans" w:cs="Plus Jakarta Sans" w:eastAsia="Plus Jakarta Sans" w:hAnsi="Plus Jakarta Sans"/>
+          <w:b/>
+          <w:bCs/>
+          <w:color w:val="C9A227"/>
+          <w:sz w:val="22"/>
+          <w:szCs w:val="22"/>
+        </w:rPr>
+        <w:t xml:space="preserve">✓  </w:t>
+      </w:r>
+      <w:r>
+        <w:rPr>
+          <w:rFonts w:ascii="Plus Jakarta Sans" w:cs="Plus Jakarta Sans" w:eastAsia="Plus Jakarta Sans" w:hAnsi="Plus Jakarta Sans"/>
+          <w:color w:val="1F2937"/>
+          <w:sz w:val="22"/>
+          <w:szCs w:val="22"/>
+        </w:rPr>
+        <w:t xml:space="preserve">Demo live dapat dilihat &amp; dicoba langsung sebelum memutuskan</w:t>
+      </w:r>
+    </w:p>
+    <w:p>
+      <w:pPr>
+        <w:pStyle w:val="Heading1"/>
+        <w:spacing w:after="160" w:before="400"/>
+      </w:pPr>
+      <w:r>
+        <w:rPr>
+          <w:rFonts w:ascii="Plus Jakarta Sans" w:cs="Plus Jakarta Sans" w:eastAsia="Plus Jakarta Sans" w:hAnsi="Plus Jakarta Sans"/>
+          <w:b/>
+          <w:bCs/>
+          <w:color w:val="082B66"/>
+          <w:sz w:val="30"/>
+          <w:szCs w:val="30"/>
+        </w:rPr>
+        <w:t xml:space="preserve">11. Penutup</w:t>
       </w:r>
     </w:p>
     <w:p>

</xml_diff>

<commit_message>
fix: tarif per edit jadi kisaran 100-400rb
</commit_message>
<xml_diff>
--- a/proposal/Proposal_Website_SD_Muhammadiyah_Pakel.docx
+++ b/proposal/Proposal_Website_SD_Muhammadiyah_Pakel.docx
@@ -5662,7 +5662,7 @@
                   <w:sz w:val="20"/>
                   <w:szCs w:val="20"/>
                 </w:rPr>
-                <w:t xml:space="preserve">Edit teks / gambar / foto (per item)</w:t>
+                <w:t xml:space="preserve">Teks / gambar / foto (sederhana)</w:t>
               </w:r>
             </w:p>
           </w:tc>
@@ -5700,7 +5700,7 @@
                   <w:sz w:val="20"/>
                   <w:szCs w:val="20"/>
                 </w:rPr>
-                <w:t xml:space="preserve">Rp 50.000</w:t>
+                <w:t xml:space="preserve">Rp 100.000 – 200.000</w:t>
               </w:r>
             </w:p>
           </w:tc>
@@ -5739,7 +5739,7 @@
                   <w:sz w:val="20"/>
                   <w:szCs w:val="20"/>
                 </w:rPr>
-                <w:t xml:space="preserve">Edit tampilan / desain (per item)</w:t>
+                <w:t xml:space="preserve">Tampilan / desain (sedang)</w:t>
               </w:r>
             </w:p>
           </w:tc>
@@ -5777,7 +5777,7 @@
                   <w:sz w:val="20"/>
                   <w:szCs w:val="20"/>
                 </w:rPr>
-                <w:t xml:space="preserve">Rp 150.000</w:t>
+                <w:t xml:space="preserve">Rp 200.000 – 300.000</w:t>
               </w:r>
             </w:p>
           </w:tc>
@@ -5816,7 +5816,7 @@
                   <w:sz w:val="20"/>
                   <w:szCs w:val="20"/>
                 </w:rPr>
-                <w:t xml:space="preserve">Tambah halaman / modul baru (per item)</w:t>
+                <w:t xml:space="preserve">Halaman / modul baru (kompleks)</w:t>
               </w:r>
             </w:p>
           </w:tc>
@@ -5854,7 +5854,7 @@
                   <w:sz w:val="20"/>
                   <w:szCs w:val="20"/>
                 </w:rPr>
-                <w:t xml:space="preserve">Rp 350.000</w:t>
+                <w:t xml:space="preserve">Rp 300.000 – 400.000</w:t>
               </w:r>
             </w:p>
           </w:tc>
@@ -5935,7 +5935,7 @@
                   <w:sz w:val="20"/>
                   <w:szCs w:val="20"/>
                 </w:rPr>
-                <w:t xml:space="preserve">Rp 400.000 (hemat Rp 100.000)</w:t>
+                <w:t xml:space="preserve">Rp 1.500.000 (≈ diskon 15%)</w:t>
               </w:r>
             </w:p>
           </w:tc>

</xml_diff>

<commit_message>
fix: tarif service 100-400k, maint 450k, riset harga infra
</commit_message>
<xml_diff>
--- a/proposal/Proposal_Website_SD_Muhammadiyah_Pakel.docx
+++ b/proposal/Proposal_Website_SD_Muhammadiyah_Pakel.docx
@@ -5533,7 +5533,7 @@
           <w:sz w:val="22"/>
           <w:szCs w:val="22"/>
         </w:rPr>
-        <w:t xml:space="preserve">Setelah masa garansi 3 bulan, sekolah dapat memilih layanan per-edit atau paket maintenance bulanan:</w:t>
+        <w:t xml:space="preserve">Setelah masa garansi 3 bulan, sekolah dapat memilih layanan per-service atau berlangganan paket maintenance:</w:t>
       </w:r>
     </w:p>
     <w:p>
@@ -5550,7 +5550,7 @@
           <w:sz w:val="23"/>
           <w:szCs w:val="23"/>
         </w:rPr>
-        <w:t xml:space="preserve">Tarif Per Edit</w:t>
+        <w:t xml:space="preserve">Tarif Per Service</w:t>
       </w:r>
     </w:p>
     <w:tbl>
@@ -5662,7 +5662,7 @@
                   <w:sz w:val="20"/>
                   <w:szCs w:val="20"/>
                 </w:rPr>
-                <w:t xml:space="preserve">Teks / gambar / foto (sederhana)</w:t>
+                <w:t xml:space="preserve">Perubahan / penambahan konten, tampilan, atau modul</w:t>
               </w:r>
             </w:p>
           </w:tc>
@@ -5700,242 +5700,7 @@
                   <w:sz w:val="20"/>
                   <w:szCs w:val="20"/>
                 </w:rPr>
-                <w:t xml:space="preserve">Rp 100.000 – 200.000</w:t>
-              </w:r>
-            </w:p>
-          </w:tc>
-          <w:p/>
-        </w:tc>
-      </w:tr>
-      <w:tr>
-        <w:tc>
-          <w:tcPr>
-            <w:tcMar>
-              <w:top w:type="dxa" w:w="90"/>
-              <w:left w:type="dxa" w:w="130"/>
-              <w:bottom w:type="dxa" w:w="90"/>
-              <w:right w:type="dxa" w:w="130"/>
-            </w:tcMar>
-            <w:vAlign w:val="center"/>
-          </w:tcPr>
-          <w:tc>
-            <w:tcPr>
-              <w:tcMar>
-                <w:top w:type="dxa" w:w="90"/>
-                <w:left w:type="dxa" w:w="130"/>
-                <w:bottom w:type="dxa" w:w="90"/>
-                <w:right w:type="dxa" w:w="130"/>
-              </w:tcMar>
-              <w:vAlign w:val="center"/>
-            </w:tcPr>
-            <w:p>
-              <w:pPr>
-                <w:spacing w:after="0" w:before="0"/>
-              </w:pPr>
-              <w:r>
-                <w:rPr>
-                  <w:rFonts w:ascii="Plus Jakarta Sans" w:cs="Plus Jakarta Sans" w:eastAsia="Plus Jakarta Sans" w:hAnsi="Plus Jakarta Sans"/>
-                  <w:color w:val="1F2937"/>
-                  <w:sz w:val="20"/>
-                  <w:szCs w:val="20"/>
-                </w:rPr>
-                <w:t xml:space="preserve">Tampilan / desain (sedang)</w:t>
-              </w:r>
-            </w:p>
-          </w:tc>
-          <w:p/>
-        </w:tc>
-        <w:tc>
-          <w:tcPr>
-            <w:tcMar>
-              <w:top w:type="dxa" w:w="90"/>
-              <w:left w:type="dxa" w:w="130"/>
-              <w:bottom w:type="dxa" w:w="90"/>
-              <w:right w:type="dxa" w:w="130"/>
-            </w:tcMar>
-            <w:vAlign w:val="center"/>
-          </w:tcPr>
-          <w:tc>
-            <w:tcPr>
-              <w:tcMar>
-                <w:top w:type="dxa" w:w="90"/>
-                <w:left w:type="dxa" w:w="130"/>
-                <w:bottom w:type="dxa" w:w="90"/>
-                <w:right w:type="dxa" w:w="130"/>
-              </w:tcMar>
-              <w:vAlign w:val="center"/>
-            </w:tcPr>
-            <w:p>
-              <w:pPr>
-                <w:spacing w:after="0" w:before="0"/>
-                <w:jc w:val="right"/>
-              </w:pPr>
-              <w:r>
-                <w:rPr>
-                  <w:rFonts w:ascii="Plus Jakarta Sans" w:cs="Plus Jakarta Sans" w:eastAsia="Plus Jakarta Sans" w:hAnsi="Plus Jakarta Sans"/>
-                  <w:color w:val="1F2937"/>
-                  <w:sz w:val="20"/>
-                  <w:szCs w:val="20"/>
-                </w:rPr>
-                <w:t xml:space="preserve">Rp 200.000 – 300.000</w:t>
-              </w:r>
-            </w:p>
-          </w:tc>
-          <w:p/>
-        </w:tc>
-      </w:tr>
-      <w:tr>
-        <w:tc>
-          <w:tcPr>
-            <w:tcMar>
-              <w:top w:type="dxa" w:w="90"/>
-              <w:left w:type="dxa" w:w="130"/>
-              <w:bottom w:type="dxa" w:w="90"/>
-              <w:right w:type="dxa" w:w="130"/>
-            </w:tcMar>
-            <w:vAlign w:val="center"/>
-          </w:tcPr>
-          <w:tc>
-            <w:tcPr>
-              <w:tcMar>
-                <w:top w:type="dxa" w:w="90"/>
-                <w:left w:type="dxa" w:w="130"/>
-                <w:bottom w:type="dxa" w:w="90"/>
-                <w:right w:type="dxa" w:w="130"/>
-              </w:tcMar>
-              <w:vAlign w:val="center"/>
-            </w:tcPr>
-            <w:p>
-              <w:pPr>
-                <w:spacing w:after="0" w:before="0"/>
-              </w:pPr>
-              <w:r>
-                <w:rPr>
-                  <w:rFonts w:ascii="Plus Jakarta Sans" w:cs="Plus Jakarta Sans" w:eastAsia="Plus Jakarta Sans" w:hAnsi="Plus Jakarta Sans"/>
-                  <w:color w:val="1F2937"/>
-                  <w:sz w:val="20"/>
-                  <w:szCs w:val="20"/>
-                </w:rPr>
-                <w:t xml:space="preserve">Halaman / modul baru (kompleks)</w:t>
-              </w:r>
-            </w:p>
-          </w:tc>
-          <w:p/>
-        </w:tc>
-        <w:tc>
-          <w:tcPr>
-            <w:tcMar>
-              <w:top w:type="dxa" w:w="90"/>
-              <w:left w:type="dxa" w:w="130"/>
-              <w:bottom w:type="dxa" w:w="90"/>
-              <w:right w:type="dxa" w:w="130"/>
-            </w:tcMar>
-            <w:vAlign w:val="center"/>
-          </w:tcPr>
-          <w:tc>
-            <w:tcPr>
-              <w:tcMar>
-                <w:top w:type="dxa" w:w="90"/>
-                <w:left w:type="dxa" w:w="130"/>
-                <w:bottom w:type="dxa" w:w="90"/>
-                <w:right w:type="dxa" w:w="130"/>
-              </w:tcMar>
-              <w:vAlign w:val="center"/>
-            </w:tcPr>
-            <w:p>
-              <w:pPr>
-                <w:spacing w:after="0" w:before="0"/>
-                <w:jc w:val="right"/>
-              </w:pPr>
-              <w:r>
-                <w:rPr>
-                  <w:rFonts w:ascii="Plus Jakarta Sans" w:cs="Plus Jakarta Sans" w:eastAsia="Plus Jakarta Sans" w:hAnsi="Plus Jakarta Sans"/>
-                  <w:color w:val="1F2937"/>
-                  <w:sz w:val="20"/>
-                  <w:szCs w:val="20"/>
-                </w:rPr>
-                <w:t xml:space="preserve">Rp 300.000 – 400.000</w:t>
-              </w:r>
-            </w:p>
-          </w:tc>
-          <w:p/>
-        </w:tc>
-      </w:tr>
-      <w:tr>
-        <w:tc>
-          <w:tcPr>
-            <w:tcMar>
-              <w:top w:type="dxa" w:w="90"/>
-              <w:left w:type="dxa" w:w="130"/>
-              <w:bottom w:type="dxa" w:w="90"/>
-              <w:right w:type="dxa" w:w="130"/>
-            </w:tcMar>
-            <w:vAlign w:val="center"/>
-          </w:tcPr>
-          <w:tc>
-            <w:tcPr>
-              <w:tcMar>
-                <w:top w:type="dxa" w:w="90"/>
-                <w:left w:type="dxa" w:w="130"/>
-                <w:bottom w:type="dxa" w:w="90"/>
-                <w:right w:type="dxa" w:w="130"/>
-              </w:tcMar>
-              <w:vAlign w:val="center"/>
-            </w:tcPr>
-            <w:p>
-              <w:pPr>
-                <w:spacing w:after="0" w:before="0"/>
-              </w:pPr>
-              <w:r>
-                <w:rPr>
-                  <w:rFonts w:ascii="Plus Jakarta Sans" w:cs="Plus Jakarta Sans" w:eastAsia="Plus Jakarta Sans" w:hAnsi="Plus Jakarta Sans"/>
-                  <w:b/>
-                  <w:bCs/>
-                  <w:color w:val="1F2937"/>
-                  <w:sz w:val="20"/>
-                  <w:szCs w:val="20"/>
-                </w:rPr>
-                <w:t xml:space="preserve">Paket 10 edit konten</w:t>
-              </w:r>
-            </w:p>
-          </w:tc>
-          <w:p/>
-        </w:tc>
-        <w:tc>
-          <w:tcPr>
-            <w:tcMar>
-              <w:top w:type="dxa" w:w="90"/>
-              <w:left w:type="dxa" w:w="130"/>
-              <w:bottom w:type="dxa" w:w="90"/>
-              <w:right w:type="dxa" w:w="130"/>
-            </w:tcMar>
-            <w:vAlign w:val="center"/>
-          </w:tcPr>
-          <w:tc>
-            <w:tcPr>
-              <w:tcMar>
-                <w:top w:type="dxa" w:w="90"/>
-                <w:left w:type="dxa" w:w="130"/>
-                <w:bottom w:type="dxa" w:w="90"/>
-                <w:right w:type="dxa" w:w="130"/>
-              </w:tcMar>
-              <w:vAlign w:val="center"/>
-            </w:tcPr>
-            <w:p>
-              <w:pPr>
-                <w:spacing w:after="0" w:before="0"/>
-                <w:jc w:val="right"/>
-              </w:pPr>
-              <w:r>
-                <w:rPr>
-                  <w:rFonts w:ascii="Plus Jakarta Sans" w:cs="Plus Jakarta Sans" w:eastAsia="Plus Jakarta Sans" w:hAnsi="Plus Jakarta Sans"/>
-                  <w:b/>
-                  <w:bCs/>
-                  <w:color w:val="0B3D91"/>
-                  <w:sz w:val="20"/>
-                  <w:szCs w:val="20"/>
-                </w:rPr>
-                <w:t xml:space="preserve">Rp 1.500.000 (≈ diskon 15%)</w:t>
+                <w:t xml:space="preserve">Rp 100.000 – 400.000 (sesuai kompleksitas)</w:t>
               </w:r>
             </w:p>
           </w:tc>
@@ -5971,7 +5736,7 @@
           <w:sz w:val="23"/>
           <w:szCs w:val="23"/>
         </w:rPr>
-        <w:t xml:space="preserve">Paket Maintenance Bulanan</w:t>
+        <w:t xml:space="preserve">Paket Maintenance</w:t>
       </w:r>
     </w:p>
     <w:tbl>
@@ -5988,8 +5753,8 @@
       </w:tblPr>
       <w:tblGrid>
         <w:gridCol w:w="1900"/>
-        <w:gridCol w:w="5000"/>
-        <w:gridCol w:w="2200"/>
+        <w:gridCol w:w="5200"/>
+        <w:gridCol w:w="2000"/>
       </w:tblGrid>
       <w:tr>
         <w:trPr>
@@ -6114,7 +5879,7 @@
                   <w:sz w:val="20"/>
                   <w:szCs w:val="20"/>
                 </w:rPr>
-                <w:t xml:space="preserve">Basic</w:t>
+                <w:t xml:space="preserve">Bulanan</w:t>
               </w:r>
             </w:p>
           </w:tc>
@@ -6151,7 +5916,7 @@
                   <w:sz w:val="19"/>
                   <w:szCs w:val="19"/>
                 </w:rPr>
-                <w:t xml:space="preserve">Backup &amp; monitoring, update keamanan, 5 edit konten, respon 2×24 jam</w:t>
+                <w:t xml:space="preserve">Backup &amp; monitoring, update keamanan, edit konten (sampai 10 item/bulan), respon prioritas</w:t>
               </w:r>
             </w:p>
           </w:tc>
@@ -6190,7 +5955,7 @@
                   <w:sz w:val="20"/>
                   <w:szCs w:val="20"/>
                 </w:rPr>
-                <w:t xml:space="preserve">Rp 250.000/bln</w:t>
+                <w:t xml:space="preserve">Rp 450.000/bulan</w:t>
               </w:r>
             </w:p>
           </w:tc>
@@ -6231,7 +5996,7 @@
                   <w:sz w:val="20"/>
                   <w:szCs w:val="20"/>
                 </w:rPr>
-                <w:t xml:space="preserve">Standar
+                <w:t xml:space="preserve">Tahunan
 (Rekomendasi)</w:t>
               </w:r>
             </w:p>
@@ -6269,7 +6034,7 @@
                   <w:sz w:val="19"/>
                   <w:szCs w:val="19"/>
                 </w:rPr>
-                <w:t xml:space="preserve">Semua Basic + 15 edit konten, bug prioritas, laporan bulanan</w:t>
+                <w:t xml:space="preserve">= bayar 10 bulan, GRATIS 2 bulan, prioritas tertinggi, laporan bulanan</w:t>
               </w:r>
             </w:p>
           </w:tc>
@@ -6308,124 +6073,7 @@
                   <w:sz w:val="20"/>
                   <w:szCs w:val="20"/>
                 </w:rPr>
-                <w:t xml:space="preserve">Rp 450.000/bln</w:t>
-              </w:r>
-            </w:p>
-          </w:tc>
-          <w:p/>
-        </w:tc>
-      </w:tr>
-      <w:tr>
-        <w:tc>
-          <w:tcPr>
-            <w:tcMar>
-              <w:top w:type="dxa" w:w="90"/>
-              <w:left w:type="dxa" w:w="130"/>
-              <w:bottom w:type="dxa" w:w="90"/>
-              <w:right w:type="dxa" w:w="130"/>
-            </w:tcMar>
-            <w:vAlign w:val="center"/>
-          </w:tcPr>
-          <w:tc>
-            <w:tcPr>
-              <w:tcMar>
-                <w:top w:type="dxa" w:w="90"/>
-                <w:left w:type="dxa" w:w="130"/>
-                <w:bottom w:type="dxa" w:w="90"/>
-                <w:right w:type="dxa" w:w="130"/>
-              </w:tcMar>
-              <w:vAlign w:val="center"/>
-            </w:tcPr>
-            <w:p>
-              <w:pPr>
-                <w:spacing w:after="0" w:before="0"/>
-              </w:pPr>
-              <w:r>
-                <w:rPr>
-                  <w:rFonts w:ascii="Plus Jakarta Sans" w:cs="Plus Jakarta Sans" w:eastAsia="Plus Jakarta Sans" w:hAnsi="Plus Jakarta Sans"/>
-                  <w:b/>
-                  <w:bCs/>
-                  <w:color w:val="1F2937"/>
-                  <w:sz w:val="20"/>
-                  <w:szCs w:val="20"/>
-                </w:rPr>
-                <w:t xml:space="preserve">Premium</w:t>
-              </w:r>
-            </w:p>
-          </w:tc>
-          <w:p/>
-        </w:tc>
-        <w:tc>
-          <w:tcPr>
-            <w:tcMar>
-              <w:top w:type="dxa" w:w="90"/>
-              <w:left w:type="dxa" w:w="130"/>
-              <w:bottom w:type="dxa" w:w="90"/>
-              <w:right w:type="dxa" w:w="130"/>
-            </w:tcMar>
-            <w:vAlign w:val="center"/>
-          </w:tcPr>
-          <w:tc>
-            <w:tcPr>
-              <w:tcMar>
-                <w:top w:type="dxa" w:w="90"/>
-                <w:left w:type="dxa" w:w="130"/>
-                <w:bottom w:type="dxa" w:w="90"/>
-                <w:right w:type="dxa" w:w="130"/>
-              </w:tcMar>
-              <w:vAlign w:val="center"/>
-            </w:tcPr>
-            <w:p>
-              <w:pPr>
-                <w:spacing w:after="0" w:before="0"/>
-              </w:pPr>
-              <w:r>
-                <w:rPr>
-                  <w:rFonts w:ascii="Plus Jakarta Sans" w:cs="Plus Jakarta Sans" w:eastAsia="Plus Jakarta Sans" w:hAnsi="Plus Jakarta Sans"/>
-                  <w:color w:val="1F2937"/>
-                  <w:sz w:val="19"/>
-                  <w:szCs w:val="19"/>
-                </w:rPr>
-                <w:t xml:space="preserve">Semua Standar + edit tanpa batas, prioritas WA, SEO review</w:t>
-              </w:r>
-            </w:p>
-          </w:tc>
-          <w:p/>
-        </w:tc>
-        <w:tc>
-          <w:tcPr>
-            <w:tcMar>
-              <w:top w:type="dxa" w:w="90"/>
-              <w:left w:type="dxa" w:w="130"/>
-              <w:bottom w:type="dxa" w:w="90"/>
-              <w:right w:type="dxa" w:w="130"/>
-            </w:tcMar>
-            <w:vAlign w:val="center"/>
-          </w:tcPr>
-          <w:tc>
-            <w:tcPr>
-              <w:tcMar>
-                <w:top w:type="dxa" w:w="90"/>
-                <w:left w:type="dxa" w:w="130"/>
-                <w:bottom w:type="dxa" w:w="90"/>
-                <w:right w:type="dxa" w:w="130"/>
-              </w:tcMar>
-              <w:vAlign w:val="center"/>
-            </w:tcPr>
-            <w:p>
-              <w:pPr>
-                <w:spacing w:after="0" w:before="0"/>
-              </w:pPr>
-              <w:r>
-                <w:rPr>
-                  <w:rFonts w:ascii="Plus Jakarta Sans" w:cs="Plus Jakarta Sans" w:eastAsia="Plus Jakarta Sans" w:hAnsi="Plus Jakarta Sans"/>
-                  <w:b/>
-                  <w:bCs/>
-                  <w:color w:val="0B3D91"/>
-                  <w:sz w:val="20"/>
-                  <w:szCs w:val="20"/>
-                </w:rPr>
-                <w:t xml:space="preserve">Rp 700.000/bln</w:t>
+                <w:t xml:space="preserve">Rp 4.500.000/tahun</w:t>
               </w:r>
             </w:p>
           </w:tc>
@@ -6473,7 +6121,7 @@
           <w:sz w:val="19"/>
           <w:szCs w:val="19"/>
         </w:rPr>
-        <w:t xml:space="preserve">Langganan tahunan = bayar 10 bulan, gratis 2 bulan.</w:t>
+        <w:t xml:space="preserve">Paket tahunan menghemat Rp 900.000 dibanding bulanan.</w:t>
       </w:r>
     </w:p>
     <w:p>
@@ -6504,7 +6152,7 @@
           <w:sz w:val="22"/>
           <w:szCs w:val="22"/>
         </w:rPr>
-        <w:t xml:space="preserve">Kedua opsi sudah termasuk database, autentikasi, dan penyimpanan. Pilih sesuai kebutuhan sekolah:</w:t>
+        <w:t xml:space="preserve">Kedua opsi sudah termasuk database, autentikasi, dan penyimpanan. Harga mengacu riset pasar Agustus 2026:</w:t>
       </w:r>
     </w:p>
     <w:tbl>
@@ -6721,7 +6369,7 @@
                   <w:sz w:val="19"/>
                   <w:szCs w:val="19"/>
                 </w:rPr>
-                <w:t xml:space="preserve">Full kontrol, email kustom, multi-aplikasi, resource besar</w:t>
+                <w:t xml:space="preserve">Full kontrol, email kustom, multi-aplikasi, resource lebih besar</w:t>
               </w:r>
             </w:p>
           </w:tc>
@@ -6762,7 +6410,7 @@
                   <w:sz w:val="20"/>
                   <w:szCs w:val="20"/>
                 </w:rPr>
-                <w:t xml:space="preserve">Biaya Setup</w:t>
+                <w:t xml:space="preserve">Biaya Layanan</w:t>
               </w:r>
             </w:p>
           </w:tc>
@@ -6799,7 +6447,7 @@
                   <w:sz w:val="19"/>
                   <w:szCs w:val="19"/>
                 </w:rPr>
-                <w:t xml:space="preserve">Rp 0 — sudah termasuk paket</w:t>
+                <w:t xml:space="preserve">Rp 0 — sudah termasuk paket (free tier)</w:t>
               </w:r>
             </w:p>
           </w:tc>
@@ -6836,7 +6484,7 @@
                   <w:sz w:val="19"/>
                   <w:szCs w:val="19"/>
                 </w:rPr>
-                <w:t xml:space="preserve">+Rp 1.500.000 sekali (setting &amp; migrasi)</w:t>
+                <w:t xml:space="preserve">+Rp 300.000/bulan (VPS 2 vCPU, 8GB RAM — Hostinger KVM 2)</w:t>
               </w:r>
             </w:p>
           </w:tc>
@@ -6877,7 +6525,7 @@
                   <w:sz w:val="20"/>
                   <w:szCs w:val="20"/>
                 </w:rPr>
-                <w:t xml:space="preserve">Biaya Server</w:t>
+                <w:t xml:space="preserve">Biaya Setup</w:t>
               </w:r>
             </w:p>
           </w:tc>
@@ -6914,7 +6562,7 @@
                   <w:sz w:val="19"/>
                   <w:szCs w:val="19"/>
                 </w:rPr>
-                <w:t xml:space="preserve">Rp 0 — kuota project termasuk</w:t>
+                <w:t xml:space="preserve">Rp 0</w:t>
               </w:r>
             </w:p>
           </w:tc>
@@ -6951,7 +6599,122 @@
                   <w:sz w:val="19"/>
                   <w:szCs w:val="19"/>
                 </w:rPr>
-                <w:t xml:space="preserve">+Rp 300.000/bulan</w:t>
+                <w:t xml:space="preserve">+Rp 1.500.000 sekali (setting &amp; migrasi)</w:t>
+              </w:r>
+            </w:p>
+          </w:tc>
+          <w:p/>
+        </w:tc>
+      </w:tr>
+      <w:tr>
+        <w:tc>
+          <w:tcPr>
+            <w:tcMar>
+              <w:top w:type="dxa" w:w="90"/>
+              <w:left w:type="dxa" w:w="130"/>
+              <w:bottom w:type="dxa" w:w="90"/>
+              <w:right w:type="dxa" w:w="130"/>
+            </w:tcMar>
+            <w:vAlign w:val="center"/>
+          </w:tcPr>
+          <w:tc>
+            <w:tcPr>
+              <w:tcMar>
+                <w:top w:type="dxa" w:w="90"/>
+                <w:left w:type="dxa" w:w="130"/>
+                <w:bottom w:type="dxa" w:w="90"/>
+                <w:right w:type="dxa" w:w="130"/>
+              </w:tcMar>
+              <w:vAlign w:val="center"/>
+            </w:tcPr>
+            <w:p>
+              <w:pPr>
+                <w:spacing w:after="0" w:before="0"/>
+              </w:pPr>
+              <w:r>
+                <w:rPr>
+                  <w:rFonts w:ascii="Plus Jakarta Sans" w:cs="Plus Jakarta Sans" w:eastAsia="Plus Jakarta Sans" w:hAnsi="Plus Jakarta Sans"/>
+                  <w:b/>
+                  <w:bCs/>
+                  <w:color w:val="1F2937"/>
+                  <w:sz w:val="20"/>
+                  <w:szCs w:val="20"/>
+                </w:rPr>
+                <w:t xml:space="preserve">Upgrade</w:t>
+              </w:r>
+            </w:p>
+          </w:tc>
+          <w:p/>
+        </w:tc>
+        <w:tc>
+          <w:tcPr>
+            <w:tcMar>
+              <w:top w:type="dxa" w:w="90"/>
+              <w:left w:type="dxa" w:w="130"/>
+              <w:bottom w:type="dxa" w:w="90"/>
+              <w:right w:type="dxa" w:w="130"/>
+            </w:tcMar>
+            <w:vAlign w:val="center"/>
+          </w:tcPr>
+          <w:tc>
+            <w:tcPr>
+              <w:tcMar>
+                <w:top w:type="dxa" w:w="90"/>
+                <w:left w:type="dxa" w:w="130"/>
+                <w:bottom w:type="dxa" w:w="90"/>
+                <w:right w:type="dxa" w:w="130"/>
+              </w:tcMar>
+              <w:vAlign w:val="center"/>
+            </w:tcPr>
+            <w:p>
+              <w:pPr>
+                <w:spacing w:after="0" w:before="0"/>
+              </w:pPr>
+              <w:r>
+                <w:rPr>
+                  <w:rFonts w:ascii="Plus Jakarta Sans" w:cs="Plus Jakarta Sans" w:eastAsia="Plus Jakarta Sans" w:hAnsi="Plus Jakarta Sans"/>
+                  <w:color w:val="1F2937"/>
+                  <w:sz w:val="19"/>
+                  <w:szCs w:val="19"/>
+                </w:rPr>
+                <w:t xml:space="preserve">Supabase Pro +Rp 1.200.000/bulan (~$75)</w:t>
+              </w:r>
+            </w:p>
+          </w:tc>
+          <w:p/>
+        </w:tc>
+        <w:tc>
+          <w:tcPr>
+            <w:tcMar>
+              <w:top w:type="dxa" w:w="90"/>
+              <w:left w:type="dxa" w:w="130"/>
+              <w:bottom w:type="dxa" w:w="90"/>
+              <w:right w:type="dxa" w:w="130"/>
+            </w:tcMar>
+            <w:vAlign w:val="center"/>
+          </w:tcPr>
+          <w:tc>
+            <w:tcPr>
+              <w:tcMar>
+                <w:top w:type="dxa" w:w="90"/>
+                <w:left w:type="dxa" w:w="130"/>
+                <w:bottom w:type="dxa" w:w="90"/>
+                <w:right w:type="dxa" w:w="130"/>
+              </w:tcMar>
+              <w:vAlign w:val="center"/>
+            </w:tcPr>
+            <w:p>
+              <w:pPr>
+                <w:spacing w:after="0" w:before="0"/>
+              </w:pPr>
+              <w:r>
+                <w:rPr>
+                  <w:rFonts w:ascii="Plus Jakarta Sans" w:cs="Plus Jakarta Sans" w:eastAsia="Plus Jakarta Sans" w:hAnsi="Plus Jakarta Sans"/>
+                  <w:color w:val="1F2937"/>
+                  <w:sz w:val="19"/>
+                  <w:szCs w:val="19"/>
+                </w:rPr>
+                <w:t xml:space="preserve">Scale up kapan saja, harga naik sesuai spek</w:t>
               </w:r>
             </w:p>
           </w:tc>
@@ -7101,7 +6864,7 @@
           <w:sz w:val="22"/>
           <w:szCs w:val="22"/>
         </w:rPr>
-        <w:t xml:space="preserve">Add-on Supabase Pro: </w:t>
+        <w:t xml:space="preserve">Hosting frontend (Vercel): </w:t>
       </w:r>
       <w:r>
         <w:rPr>
@@ -7110,7 +6873,7 @@
           <w:sz w:val="22"/>
           <w:szCs w:val="22"/>
         </w:rPr>
-        <w:t xml:space="preserve">+Rp 350.000/bulan untuk PPDB volume besar, backup point-in-time (PITR), bandwidth &amp; storage lebih besar.</w:t>
+        <w:t xml:space="preserve">sudah termasuk di semua paket (Hobby, Rp 0). Upgrade Vercel Pro +Rp 320.000/bulan (~$20) untuk tim &amp; analitik lanjutan.</w:t>
       </w:r>
     </w:p>
     <w:p>

</xml_diff>

<commit_message>
deploy: tarif & riset infra
</commit_message>
<xml_diff>
--- a/proposal/Proposal_Website_SD_Muhammadiyah_Pakel.docx
+++ b/proposal/Proposal_Website_SD_Muhammadiyah_Pakel.docx
@@ -5533,7 +5533,7 @@
           <w:sz w:val="22"/>
           <w:szCs w:val="22"/>
         </w:rPr>
-        <w:t xml:space="preserve">Setelah masa garansi 3 bulan, sekolah dapat memilih layanan per-edit atau paket maintenance bulanan:</w:t>
+        <w:t xml:space="preserve">Setelah masa garansi 3 bulan, sekolah dapat memilih layanan per-service atau berlangganan paket maintenance:</w:t>
       </w:r>
     </w:p>
     <w:p>
@@ -5550,7 +5550,7 @@
           <w:sz w:val="23"/>
           <w:szCs w:val="23"/>
         </w:rPr>
-        <w:t xml:space="preserve">Tarif Per Edit</w:t>
+        <w:t xml:space="preserve">Tarif Per Service</w:t>
       </w:r>
     </w:p>
     <w:tbl>
@@ -5662,7 +5662,7 @@
                   <w:sz w:val="20"/>
                   <w:szCs w:val="20"/>
                 </w:rPr>
-                <w:t xml:space="preserve">Teks / gambar / foto (sederhana)</w:t>
+                <w:t xml:space="preserve">Perubahan / penambahan konten, tampilan, atau modul</w:t>
               </w:r>
             </w:p>
           </w:tc>
@@ -5700,242 +5700,7 @@
                   <w:sz w:val="20"/>
                   <w:szCs w:val="20"/>
                 </w:rPr>
-                <w:t xml:space="preserve">Rp 100.000 – 200.000</w:t>
-              </w:r>
-            </w:p>
-          </w:tc>
-          <w:p/>
-        </w:tc>
-      </w:tr>
-      <w:tr>
-        <w:tc>
-          <w:tcPr>
-            <w:tcMar>
-              <w:top w:type="dxa" w:w="90"/>
-              <w:left w:type="dxa" w:w="130"/>
-              <w:bottom w:type="dxa" w:w="90"/>
-              <w:right w:type="dxa" w:w="130"/>
-            </w:tcMar>
-            <w:vAlign w:val="center"/>
-          </w:tcPr>
-          <w:tc>
-            <w:tcPr>
-              <w:tcMar>
-                <w:top w:type="dxa" w:w="90"/>
-                <w:left w:type="dxa" w:w="130"/>
-                <w:bottom w:type="dxa" w:w="90"/>
-                <w:right w:type="dxa" w:w="130"/>
-              </w:tcMar>
-              <w:vAlign w:val="center"/>
-            </w:tcPr>
-            <w:p>
-              <w:pPr>
-                <w:spacing w:after="0" w:before="0"/>
-              </w:pPr>
-              <w:r>
-                <w:rPr>
-                  <w:rFonts w:ascii="Plus Jakarta Sans" w:cs="Plus Jakarta Sans" w:eastAsia="Plus Jakarta Sans" w:hAnsi="Plus Jakarta Sans"/>
-                  <w:color w:val="1F2937"/>
-                  <w:sz w:val="20"/>
-                  <w:szCs w:val="20"/>
-                </w:rPr>
-                <w:t xml:space="preserve">Tampilan / desain (sedang)</w:t>
-              </w:r>
-            </w:p>
-          </w:tc>
-          <w:p/>
-        </w:tc>
-        <w:tc>
-          <w:tcPr>
-            <w:tcMar>
-              <w:top w:type="dxa" w:w="90"/>
-              <w:left w:type="dxa" w:w="130"/>
-              <w:bottom w:type="dxa" w:w="90"/>
-              <w:right w:type="dxa" w:w="130"/>
-            </w:tcMar>
-            <w:vAlign w:val="center"/>
-          </w:tcPr>
-          <w:tc>
-            <w:tcPr>
-              <w:tcMar>
-                <w:top w:type="dxa" w:w="90"/>
-                <w:left w:type="dxa" w:w="130"/>
-                <w:bottom w:type="dxa" w:w="90"/>
-                <w:right w:type="dxa" w:w="130"/>
-              </w:tcMar>
-              <w:vAlign w:val="center"/>
-            </w:tcPr>
-            <w:p>
-              <w:pPr>
-                <w:spacing w:after="0" w:before="0"/>
-                <w:jc w:val="right"/>
-              </w:pPr>
-              <w:r>
-                <w:rPr>
-                  <w:rFonts w:ascii="Plus Jakarta Sans" w:cs="Plus Jakarta Sans" w:eastAsia="Plus Jakarta Sans" w:hAnsi="Plus Jakarta Sans"/>
-                  <w:color w:val="1F2937"/>
-                  <w:sz w:val="20"/>
-                  <w:szCs w:val="20"/>
-                </w:rPr>
-                <w:t xml:space="preserve">Rp 200.000 – 300.000</w:t>
-              </w:r>
-            </w:p>
-          </w:tc>
-          <w:p/>
-        </w:tc>
-      </w:tr>
-      <w:tr>
-        <w:tc>
-          <w:tcPr>
-            <w:tcMar>
-              <w:top w:type="dxa" w:w="90"/>
-              <w:left w:type="dxa" w:w="130"/>
-              <w:bottom w:type="dxa" w:w="90"/>
-              <w:right w:type="dxa" w:w="130"/>
-            </w:tcMar>
-            <w:vAlign w:val="center"/>
-          </w:tcPr>
-          <w:tc>
-            <w:tcPr>
-              <w:tcMar>
-                <w:top w:type="dxa" w:w="90"/>
-                <w:left w:type="dxa" w:w="130"/>
-                <w:bottom w:type="dxa" w:w="90"/>
-                <w:right w:type="dxa" w:w="130"/>
-              </w:tcMar>
-              <w:vAlign w:val="center"/>
-            </w:tcPr>
-            <w:p>
-              <w:pPr>
-                <w:spacing w:after="0" w:before="0"/>
-              </w:pPr>
-              <w:r>
-                <w:rPr>
-                  <w:rFonts w:ascii="Plus Jakarta Sans" w:cs="Plus Jakarta Sans" w:eastAsia="Plus Jakarta Sans" w:hAnsi="Plus Jakarta Sans"/>
-                  <w:color w:val="1F2937"/>
-                  <w:sz w:val="20"/>
-                  <w:szCs w:val="20"/>
-                </w:rPr>
-                <w:t xml:space="preserve">Halaman / modul baru (kompleks)</w:t>
-              </w:r>
-            </w:p>
-          </w:tc>
-          <w:p/>
-        </w:tc>
-        <w:tc>
-          <w:tcPr>
-            <w:tcMar>
-              <w:top w:type="dxa" w:w="90"/>
-              <w:left w:type="dxa" w:w="130"/>
-              <w:bottom w:type="dxa" w:w="90"/>
-              <w:right w:type="dxa" w:w="130"/>
-            </w:tcMar>
-            <w:vAlign w:val="center"/>
-          </w:tcPr>
-          <w:tc>
-            <w:tcPr>
-              <w:tcMar>
-                <w:top w:type="dxa" w:w="90"/>
-                <w:left w:type="dxa" w:w="130"/>
-                <w:bottom w:type="dxa" w:w="90"/>
-                <w:right w:type="dxa" w:w="130"/>
-              </w:tcMar>
-              <w:vAlign w:val="center"/>
-            </w:tcPr>
-            <w:p>
-              <w:pPr>
-                <w:spacing w:after="0" w:before="0"/>
-                <w:jc w:val="right"/>
-              </w:pPr>
-              <w:r>
-                <w:rPr>
-                  <w:rFonts w:ascii="Plus Jakarta Sans" w:cs="Plus Jakarta Sans" w:eastAsia="Plus Jakarta Sans" w:hAnsi="Plus Jakarta Sans"/>
-                  <w:color w:val="1F2937"/>
-                  <w:sz w:val="20"/>
-                  <w:szCs w:val="20"/>
-                </w:rPr>
-                <w:t xml:space="preserve">Rp 300.000 – 400.000</w:t>
-              </w:r>
-            </w:p>
-          </w:tc>
-          <w:p/>
-        </w:tc>
-      </w:tr>
-      <w:tr>
-        <w:tc>
-          <w:tcPr>
-            <w:tcMar>
-              <w:top w:type="dxa" w:w="90"/>
-              <w:left w:type="dxa" w:w="130"/>
-              <w:bottom w:type="dxa" w:w="90"/>
-              <w:right w:type="dxa" w:w="130"/>
-            </w:tcMar>
-            <w:vAlign w:val="center"/>
-          </w:tcPr>
-          <w:tc>
-            <w:tcPr>
-              <w:tcMar>
-                <w:top w:type="dxa" w:w="90"/>
-                <w:left w:type="dxa" w:w="130"/>
-                <w:bottom w:type="dxa" w:w="90"/>
-                <w:right w:type="dxa" w:w="130"/>
-              </w:tcMar>
-              <w:vAlign w:val="center"/>
-            </w:tcPr>
-            <w:p>
-              <w:pPr>
-                <w:spacing w:after="0" w:before="0"/>
-              </w:pPr>
-              <w:r>
-                <w:rPr>
-                  <w:rFonts w:ascii="Plus Jakarta Sans" w:cs="Plus Jakarta Sans" w:eastAsia="Plus Jakarta Sans" w:hAnsi="Plus Jakarta Sans"/>
-                  <w:b/>
-                  <w:bCs/>
-                  <w:color w:val="1F2937"/>
-                  <w:sz w:val="20"/>
-                  <w:szCs w:val="20"/>
-                </w:rPr>
-                <w:t xml:space="preserve">Paket 10 edit konten</w:t>
-              </w:r>
-            </w:p>
-          </w:tc>
-          <w:p/>
-        </w:tc>
-        <w:tc>
-          <w:tcPr>
-            <w:tcMar>
-              <w:top w:type="dxa" w:w="90"/>
-              <w:left w:type="dxa" w:w="130"/>
-              <w:bottom w:type="dxa" w:w="90"/>
-              <w:right w:type="dxa" w:w="130"/>
-            </w:tcMar>
-            <w:vAlign w:val="center"/>
-          </w:tcPr>
-          <w:tc>
-            <w:tcPr>
-              <w:tcMar>
-                <w:top w:type="dxa" w:w="90"/>
-                <w:left w:type="dxa" w:w="130"/>
-                <w:bottom w:type="dxa" w:w="90"/>
-                <w:right w:type="dxa" w:w="130"/>
-              </w:tcMar>
-              <w:vAlign w:val="center"/>
-            </w:tcPr>
-            <w:p>
-              <w:pPr>
-                <w:spacing w:after="0" w:before="0"/>
-                <w:jc w:val="right"/>
-              </w:pPr>
-              <w:r>
-                <w:rPr>
-                  <w:rFonts w:ascii="Plus Jakarta Sans" w:cs="Plus Jakarta Sans" w:eastAsia="Plus Jakarta Sans" w:hAnsi="Plus Jakarta Sans"/>
-                  <w:b/>
-                  <w:bCs/>
-                  <w:color w:val="0B3D91"/>
-                  <w:sz w:val="20"/>
-                  <w:szCs w:val="20"/>
-                </w:rPr>
-                <w:t xml:space="preserve">Rp 1.500.000 (≈ diskon 15%)</w:t>
+                <w:t xml:space="preserve">Rp 100.000 – 400.000 (sesuai kompleksitas)</w:t>
               </w:r>
             </w:p>
           </w:tc>
@@ -5971,7 +5736,7 @@
           <w:sz w:val="23"/>
           <w:szCs w:val="23"/>
         </w:rPr>
-        <w:t xml:space="preserve">Paket Maintenance Bulanan</w:t>
+        <w:t xml:space="preserve">Paket Maintenance</w:t>
       </w:r>
     </w:p>
     <w:tbl>
@@ -5988,8 +5753,8 @@
       </w:tblPr>
       <w:tblGrid>
         <w:gridCol w:w="1900"/>
-        <w:gridCol w:w="5000"/>
-        <w:gridCol w:w="2200"/>
+        <w:gridCol w:w="5200"/>
+        <w:gridCol w:w="2000"/>
       </w:tblGrid>
       <w:tr>
         <w:trPr>
@@ -6114,7 +5879,7 @@
                   <w:sz w:val="20"/>
                   <w:szCs w:val="20"/>
                 </w:rPr>
-                <w:t xml:space="preserve">Basic</w:t>
+                <w:t xml:space="preserve">Bulanan</w:t>
               </w:r>
             </w:p>
           </w:tc>
@@ -6151,7 +5916,7 @@
                   <w:sz w:val="19"/>
                   <w:szCs w:val="19"/>
                 </w:rPr>
-                <w:t xml:space="preserve">Backup &amp; monitoring, update keamanan, 5 edit konten, respon 2×24 jam</w:t>
+                <w:t xml:space="preserve">Backup &amp; monitoring, update keamanan, edit konten (sampai 10 item/bulan), respon prioritas</w:t>
               </w:r>
             </w:p>
           </w:tc>
@@ -6190,7 +5955,7 @@
                   <w:sz w:val="20"/>
                   <w:szCs w:val="20"/>
                 </w:rPr>
-                <w:t xml:space="preserve">Rp 250.000/bln</w:t>
+                <w:t xml:space="preserve">Rp 450.000/bulan</w:t>
               </w:r>
             </w:p>
           </w:tc>
@@ -6231,7 +5996,7 @@
                   <w:sz w:val="20"/>
                   <w:szCs w:val="20"/>
                 </w:rPr>
-                <w:t xml:space="preserve">Standar
+                <w:t xml:space="preserve">Tahunan
 (Rekomendasi)</w:t>
               </w:r>
             </w:p>
@@ -6269,7 +6034,7 @@
                   <w:sz w:val="19"/>
                   <w:szCs w:val="19"/>
                 </w:rPr>
-                <w:t xml:space="preserve">Semua Basic + 15 edit konten, bug prioritas, laporan bulanan</w:t>
+                <w:t xml:space="preserve">= bayar 10 bulan, GRATIS 2 bulan, prioritas tertinggi, laporan bulanan</w:t>
               </w:r>
             </w:p>
           </w:tc>
@@ -6308,124 +6073,7 @@
                   <w:sz w:val="20"/>
                   <w:szCs w:val="20"/>
                 </w:rPr>
-                <w:t xml:space="preserve">Rp 450.000/bln</w:t>
-              </w:r>
-            </w:p>
-          </w:tc>
-          <w:p/>
-        </w:tc>
-      </w:tr>
-      <w:tr>
-        <w:tc>
-          <w:tcPr>
-            <w:tcMar>
-              <w:top w:type="dxa" w:w="90"/>
-              <w:left w:type="dxa" w:w="130"/>
-              <w:bottom w:type="dxa" w:w="90"/>
-              <w:right w:type="dxa" w:w="130"/>
-            </w:tcMar>
-            <w:vAlign w:val="center"/>
-          </w:tcPr>
-          <w:tc>
-            <w:tcPr>
-              <w:tcMar>
-                <w:top w:type="dxa" w:w="90"/>
-                <w:left w:type="dxa" w:w="130"/>
-                <w:bottom w:type="dxa" w:w="90"/>
-                <w:right w:type="dxa" w:w="130"/>
-              </w:tcMar>
-              <w:vAlign w:val="center"/>
-            </w:tcPr>
-            <w:p>
-              <w:pPr>
-                <w:spacing w:after="0" w:before="0"/>
-              </w:pPr>
-              <w:r>
-                <w:rPr>
-                  <w:rFonts w:ascii="Plus Jakarta Sans" w:cs="Plus Jakarta Sans" w:eastAsia="Plus Jakarta Sans" w:hAnsi="Plus Jakarta Sans"/>
-                  <w:b/>
-                  <w:bCs/>
-                  <w:color w:val="1F2937"/>
-                  <w:sz w:val="20"/>
-                  <w:szCs w:val="20"/>
-                </w:rPr>
-                <w:t xml:space="preserve">Premium</w:t>
-              </w:r>
-            </w:p>
-          </w:tc>
-          <w:p/>
-        </w:tc>
-        <w:tc>
-          <w:tcPr>
-            <w:tcMar>
-              <w:top w:type="dxa" w:w="90"/>
-              <w:left w:type="dxa" w:w="130"/>
-              <w:bottom w:type="dxa" w:w="90"/>
-              <w:right w:type="dxa" w:w="130"/>
-            </w:tcMar>
-            <w:vAlign w:val="center"/>
-          </w:tcPr>
-          <w:tc>
-            <w:tcPr>
-              <w:tcMar>
-                <w:top w:type="dxa" w:w="90"/>
-                <w:left w:type="dxa" w:w="130"/>
-                <w:bottom w:type="dxa" w:w="90"/>
-                <w:right w:type="dxa" w:w="130"/>
-              </w:tcMar>
-              <w:vAlign w:val="center"/>
-            </w:tcPr>
-            <w:p>
-              <w:pPr>
-                <w:spacing w:after="0" w:before="0"/>
-              </w:pPr>
-              <w:r>
-                <w:rPr>
-                  <w:rFonts w:ascii="Plus Jakarta Sans" w:cs="Plus Jakarta Sans" w:eastAsia="Plus Jakarta Sans" w:hAnsi="Plus Jakarta Sans"/>
-                  <w:color w:val="1F2937"/>
-                  <w:sz w:val="19"/>
-                  <w:szCs w:val="19"/>
-                </w:rPr>
-                <w:t xml:space="preserve">Semua Standar + edit tanpa batas, prioritas WA, SEO review</w:t>
-              </w:r>
-            </w:p>
-          </w:tc>
-          <w:p/>
-        </w:tc>
-        <w:tc>
-          <w:tcPr>
-            <w:tcMar>
-              <w:top w:type="dxa" w:w="90"/>
-              <w:left w:type="dxa" w:w="130"/>
-              <w:bottom w:type="dxa" w:w="90"/>
-              <w:right w:type="dxa" w:w="130"/>
-            </w:tcMar>
-            <w:vAlign w:val="center"/>
-          </w:tcPr>
-          <w:tc>
-            <w:tcPr>
-              <w:tcMar>
-                <w:top w:type="dxa" w:w="90"/>
-                <w:left w:type="dxa" w:w="130"/>
-                <w:bottom w:type="dxa" w:w="90"/>
-                <w:right w:type="dxa" w:w="130"/>
-              </w:tcMar>
-              <w:vAlign w:val="center"/>
-            </w:tcPr>
-            <w:p>
-              <w:pPr>
-                <w:spacing w:after="0" w:before="0"/>
-              </w:pPr>
-              <w:r>
-                <w:rPr>
-                  <w:rFonts w:ascii="Plus Jakarta Sans" w:cs="Plus Jakarta Sans" w:eastAsia="Plus Jakarta Sans" w:hAnsi="Plus Jakarta Sans"/>
-                  <w:b/>
-                  <w:bCs/>
-                  <w:color w:val="0B3D91"/>
-                  <w:sz w:val="20"/>
-                  <w:szCs w:val="20"/>
-                </w:rPr>
-                <w:t xml:space="preserve">Rp 700.000/bln</w:t>
+                <w:t xml:space="preserve">Rp 4.500.000/tahun</w:t>
               </w:r>
             </w:p>
           </w:tc>
@@ -6473,7 +6121,7 @@
           <w:sz w:val="19"/>
           <w:szCs w:val="19"/>
         </w:rPr>
-        <w:t xml:space="preserve">Langganan tahunan = bayar 10 bulan, gratis 2 bulan.</w:t>
+        <w:t xml:space="preserve">Paket tahunan menghemat Rp 900.000 dibanding bulanan.</w:t>
       </w:r>
     </w:p>
     <w:p>
@@ -6504,7 +6152,7 @@
           <w:sz w:val="22"/>
           <w:szCs w:val="22"/>
         </w:rPr>
-        <w:t xml:space="preserve">Kedua opsi sudah termasuk database, autentikasi, dan penyimpanan. Pilih sesuai kebutuhan sekolah:</w:t>
+        <w:t xml:space="preserve">Kedua opsi sudah termasuk database, autentikasi, dan penyimpanan. Harga mengacu riset pasar Agustus 2026:</w:t>
       </w:r>
     </w:p>
     <w:tbl>
@@ -6721,7 +6369,7 @@
                   <w:sz w:val="19"/>
                   <w:szCs w:val="19"/>
                 </w:rPr>
-                <w:t xml:space="preserve">Full kontrol, email kustom, multi-aplikasi, resource besar</w:t>
+                <w:t xml:space="preserve">Full kontrol, email kustom, multi-aplikasi, resource lebih besar</w:t>
               </w:r>
             </w:p>
           </w:tc>
@@ -6762,7 +6410,7 @@
                   <w:sz w:val="20"/>
                   <w:szCs w:val="20"/>
                 </w:rPr>
-                <w:t xml:space="preserve">Biaya Setup</w:t>
+                <w:t xml:space="preserve">Biaya Layanan</w:t>
               </w:r>
             </w:p>
           </w:tc>
@@ -6799,7 +6447,7 @@
                   <w:sz w:val="19"/>
                   <w:szCs w:val="19"/>
                 </w:rPr>
-                <w:t xml:space="preserve">Rp 0 — sudah termasuk paket</w:t>
+                <w:t xml:space="preserve">Rp 0 — sudah termasuk paket (free tier)</w:t>
               </w:r>
             </w:p>
           </w:tc>
@@ -6836,7 +6484,7 @@
                   <w:sz w:val="19"/>
                   <w:szCs w:val="19"/>
                 </w:rPr>
-                <w:t xml:space="preserve">+Rp 1.500.000 sekali (setting &amp; migrasi)</w:t>
+                <w:t xml:space="preserve">+Rp 300.000/bulan (VPS 2 vCPU, 8GB RAM — Hostinger KVM 2)</w:t>
               </w:r>
             </w:p>
           </w:tc>
@@ -6877,7 +6525,7 @@
                   <w:sz w:val="20"/>
                   <w:szCs w:val="20"/>
                 </w:rPr>
-                <w:t xml:space="preserve">Biaya Server</w:t>
+                <w:t xml:space="preserve">Biaya Setup</w:t>
               </w:r>
             </w:p>
           </w:tc>
@@ -6914,7 +6562,7 @@
                   <w:sz w:val="19"/>
                   <w:szCs w:val="19"/>
                 </w:rPr>
-                <w:t xml:space="preserve">Rp 0 — kuota project termasuk</w:t>
+                <w:t xml:space="preserve">Rp 0</w:t>
               </w:r>
             </w:p>
           </w:tc>
@@ -6951,7 +6599,122 @@
                   <w:sz w:val="19"/>
                   <w:szCs w:val="19"/>
                 </w:rPr>
-                <w:t xml:space="preserve">+Rp 300.000/bulan</w:t>
+                <w:t xml:space="preserve">+Rp 1.500.000 sekali (setting &amp; migrasi)</w:t>
+              </w:r>
+            </w:p>
+          </w:tc>
+          <w:p/>
+        </w:tc>
+      </w:tr>
+      <w:tr>
+        <w:tc>
+          <w:tcPr>
+            <w:tcMar>
+              <w:top w:type="dxa" w:w="90"/>
+              <w:left w:type="dxa" w:w="130"/>
+              <w:bottom w:type="dxa" w:w="90"/>
+              <w:right w:type="dxa" w:w="130"/>
+            </w:tcMar>
+            <w:vAlign w:val="center"/>
+          </w:tcPr>
+          <w:tc>
+            <w:tcPr>
+              <w:tcMar>
+                <w:top w:type="dxa" w:w="90"/>
+                <w:left w:type="dxa" w:w="130"/>
+                <w:bottom w:type="dxa" w:w="90"/>
+                <w:right w:type="dxa" w:w="130"/>
+              </w:tcMar>
+              <w:vAlign w:val="center"/>
+            </w:tcPr>
+            <w:p>
+              <w:pPr>
+                <w:spacing w:after="0" w:before="0"/>
+              </w:pPr>
+              <w:r>
+                <w:rPr>
+                  <w:rFonts w:ascii="Plus Jakarta Sans" w:cs="Plus Jakarta Sans" w:eastAsia="Plus Jakarta Sans" w:hAnsi="Plus Jakarta Sans"/>
+                  <w:b/>
+                  <w:bCs/>
+                  <w:color w:val="1F2937"/>
+                  <w:sz w:val="20"/>
+                  <w:szCs w:val="20"/>
+                </w:rPr>
+                <w:t xml:space="preserve">Upgrade</w:t>
+              </w:r>
+            </w:p>
+          </w:tc>
+          <w:p/>
+        </w:tc>
+        <w:tc>
+          <w:tcPr>
+            <w:tcMar>
+              <w:top w:type="dxa" w:w="90"/>
+              <w:left w:type="dxa" w:w="130"/>
+              <w:bottom w:type="dxa" w:w="90"/>
+              <w:right w:type="dxa" w:w="130"/>
+            </w:tcMar>
+            <w:vAlign w:val="center"/>
+          </w:tcPr>
+          <w:tc>
+            <w:tcPr>
+              <w:tcMar>
+                <w:top w:type="dxa" w:w="90"/>
+                <w:left w:type="dxa" w:w="130"/>
+                <w:bottom w:type="dxa" w:w="90"/>
+                <w:right w:type="dxa" w:w="130"/>
+              </w:tcMar>
+              <w:vAlign w:val="center"/>
+            </w:tcPr>
+            <w:p>
+              <w:pPr>
+                <w:spacing w:after="0" w:before="0"/>
+              </w:pPr>
+              <w:r>
+                <w:rPr>
+                  <w:rFonts w:ascii="Plus Jakarta Sans" w:cs="Plus Jakarta Sans" w:eastAsia="Plus Jakarta Sans" w:hAnsi="Plus Jakarta Sans"/>
+                  <w:color w:val="1F2937"/>
+                  <w:sz w:val="19"/>
+                  <w:szCs w:val="19"/>
+                </w:rPr>
+                <w:t xml:space="preserve">Supabase Pro +Rp 1.200.000/bulan (~$75)</w:t>
+              </w:r>
+            </w:p>
+          </w:tc>
+          <w:p/>
+        </w:tc>
+        <w:tc>
+          <w:tcPr>
+            <w:tcMar>
+              <w:top w:type="dxa" w:w="90"/>
+              <w:left w:type="dxa" w:w="130"/>
+              <w:bottom w:type="dxa" w:w="90"/>
+              <w:right w:type="dxa" w:w="130"/>
+            </w:tcMar>
+            <w:vAlign w:val="center"/>
+          </w:tcPr>
+          <w:tc>
+            <w:tcPr>
+              <w:tcMar>
+                <w:top w:type="dxa" w:w="90"/>
+                <w:left w:type="dxa" w:w="130"/>
+                <w:bottom w:type="dxa" w:w="90"/>
+                <w:right w:type="dxa" w:w="130"/>
+              </w:tcMar>
+              <w:vAlign w:val="center"/>
+            </w:tcPr>
+            <w:p>
+              <w:pPr>
+                <w:spacing w:after="0" w:before="0"/>
+              </w:pPr>
+              <w:r>
+                <w:rPr>
+                  <w:rFonts w:ascii="Plus Jakarta Sans" w:cs="Plus Jakarta Sans" w:eastAsia="Plus Jakarta Sans" w:hAnsi="Plus Jakarta Sans"/>
+                  <w:color w:val="1F2937"/>
+                  <w:sz w:val="19"/>
+                  <w:szCs w:val="19"/>
+                </w:rPr>
+                <w:t xml:space="preserve">Scale up kapan saja, harga naik sesuai spek</w:t>
               </w:r>
             </w:p>
           </w:tc>
@@ -7101,7 +6864,7 @@
           <w:sz w:val="22"/>
           <w:szCs w:val="22"/>
         </w:rPr>
-        <w:t xml:space="preserve">Add-on Supabase Pro: </w:t>
+        <w:t xml:space="preserve">Hosting frontend (Vercel): </w:t>
       </w:r>
       <w:r>
         <w:rPr>
@@ -7110,7 +6873,7 @@
           <w:sz w:val="22"/>
           <w:szCs w:val="22"/>
         </w:rPr>
-        <w:t xml:space="preserve">+Rp 350.000/bulan untuk PPDB volume besar, backup point-in-time (PITR), bandwidth &amp; storage lebih besar.</w:t>
+        <w:t xml:space="preserve">sudah termasuk di semua paket (Hobby, Rp 0). Upgrade Vercel Pro +Rp 320.000/bulan (~$20) untuk tim &amp; analitik lanjutan.</w:t>
       </w:r>
     </w:p>
     <w:p>

</xml_diff>

<commit_message>
fix: VPS tanpa Vercel, supabase self-host
</commit_message>
<xml_diff>
--- a/proposal/Proposal_Website_SD_Muhammadiyah_Pakel.docx
+++ b/proposal/Proposal_Website_SD_Muhammadiyah_Pakel.docx
@@ -6410,6 +6410,121 @@
                   <w:sz w:val="20"/>
                   <w:szCs w:val="20"/>
                 </w:rPr>
+                <w:t xml:space="preserve">Hosting Website</w:t>
+              </w:r>
+            </w:p>
+          </w:tc>
+          <w:p/>
+        </w:tc>
+        <w:tc>
+          <w:tcPr>
+            <w:tcMar>
+              <w:top w:type="dxa" w:w="90"/>
+              <w:left w:type="dxa" w:w="130"/>
+              <w:bottom w:type="dxa" w:w="90"/>
+              <w:right w:type="dxa" w:w="130"/>
+            </w:tcMar>
+            <w:vAlign w:val="center"/>
+          </w:tcPr>
+          <w:tc>
+            <w:tcPr>
+              <w:tcMar>
+                <w:top w:type="dxa" w:w="90"/>
+                <w:left w:type="dxa" w:w="130"/>
+                <w:bottom w:type="dxa" w:w="90"/>
+                <w:right w:type="dxa" w:w="130"/>
+              </w:tcMar>
+              <w:vAlign w:val="center"/>
+            </w:tcPr>
+            <w:p>
+              <w:pPr>
+                <w:spacing w:after="0" w:before="0"/>
+              </w:pPr>
+              <w:r>
+                <w:rPr>
+                  <w:rFonts w:ascii="Plus Jakarta Sans" w:cs="Plus Jakarta Sans" w:eastAsia="Plus Jakarta Sans" w:hAnsi="Plus Jakarta Sans"/>
+                  <w:color w:val="1F2937"/>
+                  <w:sz w:val="19"/>
+                  <w:szCs w:val="19"/>
+                </w:rPr>
+                <w:t xml:space="preserve">Vercel (gratis) — sudah termasuk</w:t>
+              </w:r>
+            </w:p>
+          </w:tc>
+          <w:p/>
+        </w:tc>
+        <w:tc>
+          <w:tcPr>
+            <w:tcMar>
+              <w:top w:type="dxa" w:w="90"/>
+              <w:left w:type="dxa" w:w="130"/>
+              <w:bottom w:type="dxa" w:w="90"/>
+              <w:right w:type="dxa" w:w="130"/>
+            </w:tcMar>
+            <w:vAlign w:val="center"/>
+          </w:tcPr>
+          <w:tc>
+            <w:tcPr>
+              <w:tcMar>
+                <w:top w:type="dxa" w:w="90"/>
+                <w:left w:type="dxa" w:w="130"/>
+                <w:bottom w:type="dxa" w:w="90"/>
+                <w:right w:type="dxa" w:w="130"/>
+              </w:tcMar>
+              <w:vAlign w:val="center"/>
+            </w:tcPr>
+            <w:p>
+              <w:pPr>
+                <w:spacing w:after="0" w:before="0"/>
+              </w:pPr>
+              <w:r>
+                <w:rPr>
+                  <w:rFonts w:ascii="Plus Jakarta Sans" w:cs="Plus Jakarta Sans" w:eastAsia="Plus Jakarta Sans" w:hAnsi="Plus Jakarta Sans"/>
+                  <w:color w:val="1F2937"/>
+                  <w:sz w:val="19"/>
+                  <w:szCs w:val="19"/>
+                </w:rPr>
+                <w:t xml:space="preserve">Langsung di VPS — tanpa Vercel</w:t>
+              </w:r>
+            </w:p>
+          </w:tc>
+          <w:p/>
+        </w:tc>
+      </w:tr>
+      <w:tr>
+        <w:tc>
+          <w:tcPr>
+            <w:tcMar>
+              <w:top w:type="dxa" w:w="90"/>
+              <w:left w:type="dxa" w:w="130"/>
+              <w:bottom w:type="dxa" w:w="90"/>
+              <w:right w:type="dxa" w:w="130"/>
+            </w:tcMar>
+            <w:vAlign w:val="center"/>
+          </w:tcPr>
+          <w:tc>
+            <w:tcPr>
+              <w:tcMar>
+                <w:top w:type="dxa" w:w="90"/>
+                <w:left w:type="dxa" w:w="130"/>
+                <w:bottom w:type="dxa" w:w="90"/>
+                <w:right w:type="dxa" w:w="130"/>
+              </w:tcMar>
+              <w:vAlign w:val="center"/>
+            </w:tcPr>
+            <w:p>
+              <w:pPr>
+                <w:spacing w:after="0" w:before="0"/>
+              </w:pPr>
+              <w:r>
+                <w:rPr>
+                  <w:rFonts w:ascii="Plus Jakarta Sans" w:cs="Plus Jakarta Sans" w:eastAsia="Plus Jakarta Sans" w:hAnsi="Plus Jakarta Sans"/>
+                  <w:b/>
+                  <w:bCs/>
+                  <w:color w:val="1F2937"/>
+                  <w:sz w:val="20"/>
+                  <w:szCs w:val="20"/>
+                </w:rPr>
                 <w:t xml:space="preserve">Biaya Layanan</w:t>
               </w:r>
             </w:p>
@@ -6864,7 +6979,7 @@
           <w:sz w:val="22"/>
           <w:szCs w:val="22"/>
         </w:rPr>
-        <w:t xml:space="preserve">Hosting frontend (Vercel): </w:t>
+        <w:t xml:space="preserve">Catatan: </w:t>
       </w:r>
       <w:r>
         <w:rPr>
@@ -6873,7 +6988,7 @@
           <w:sz w:val="22"/>
           <w:szCs w:val="22"/>
         </w:rPr>
-        <w:t xml:space="preserve">sudah termasuk di semua paket (Hobby, Rp 0). Upgrade Vercel Pro +Rp 320.000/bulan (~$20) untuk tim &amp; analitik lanjutan.</w:t>
+        <w:t xml:space="preserve">VPS tidak butuh Vercel — website jalan langsung di VPS (Node + Nginx). Supabase bisa self-host di VPS yang sama tanpa biaya langganan tambahan. Vercel hanya dipakai di skema default (Supabase cloud + Vercel gratis).</w:t>
       </w:r>
     </w:p>
     <w:p>

</xml_diff>

<commit_message>
deploy: VPS tanpa Vercel
</commit_message>
<xml_diff>
--- a/proposal/Proposal_Website_SD_Muhammadiyah_Pakel.docx
+++ b/proposal/Proposal_Website_SD_Muhammadiyah_Pakel.docx
@@ -6410,6 +6410,121 @@
                   <w:sz w:val="20"/>
                   <w:szCs w:val="20"/>
                 </w:rPr>
+                <w:t xml:space="preserve">Hosting Website</w:t>
+              </w:r>
+            </w:p>
+          </w:tc>
+          <w:p/>
+        </w:tc>
+        <w:tc>
+          <w:tcPr>
+            <w:tcMar>
+              <w:top w:type="dxa" w:w="90"/>
+              <w:left w:type="dxa" w:w="130"/>
+              <w:bottom w:type="dxa" w:w="90"/>
+              <w:right w:type="dxa" w:w="130"/>
+            </w:tcMar>
+            <w:vAlign w:val="center"/>
+          </w:tcPr>
+          <w:tc>
+            <w:tcPr>
+              <w:tcMar>
+                <w:top w:type="dxa" w:w="90"/>
+                <w:left w:type="dxa" w:w="130"/>
+                <w:bottom w:type="dxa" w:w="90"/>
+                <w:right w:type="dxa" w:w="130"/>
+              </w:tcMar>
+              <w:vAlign w:val="center"/>
+            </w:tcPr>
+            <w:p>
+              <w:pPr>
+                <w:spacing w:after="0" w:before="0"/>
+              </w:pPr>
+              <w:r>
+                <w:rPr>
+                  <w:rFonts w:ascii="Plus Jakarta Sans" w:cs="Plus Jakarta Sans" w:eastAsia="Plus Jakarta Sans" w:hAnsi="Plus Jakarta Sans"/>
+                  <w:color w:val="1F2937"/>
+                  <w:sz w:val="19"/>
+                  <w:szCs w:val="19"/>
+                </w:rPr>
+                <w:t xml:space="preserve">Vercel (gratis) — sudah termasuk</w:t>
+              </w:r>
+            </w:p>
+          </w:tc>
+          <w:p/>
+        </w:tc>
+        <w:tc>
+          <w:tcPr>
+            <w:tcMar>
+              <w:top w:type="dxa" w:w="90"/>
+              <w:left w:type="dxa" w:w="130"/>
+              <w:bottom w:type="dxa" w:w="90"/>
+              <w:right w:type="dxa" w:w="130"/>
+            </w:tcMar>
+            <w:vAlign w:val="center"/>
+          </w:tcPr>
+          <w:tc>
+            <w:tcPr>
+              <w:tcMar>
+                <w:top w:type="dxa" w:w="90"/>
+                <w:left w:type="dxa" w:w="130"/>
+                <w:bottom w:type="dxa" w:w="90"/>
+                <w:right w:type="dxa" w:w="130"/>
+              </w:tcMar>
+              <w:vAlign w:val="center"/>
+            </w:tcPr>
+            <w:p>
+              <w:pPr>
+                <w:spacing w:after="0" w:before="0"/>
+              </w:pPr>
+              <w:r>
+                <w:rPr>
+                  <w:rFonts w:ascii="Plus Jakarta Sans" w:cs="Plus Jakarta Sans" w:eastAsia="Plus Jakarta Sans" w:hAnsi="Plus Jakarta Sans"/>
+                  <w:color w:val="1F2937"/>
+                  <w:sz w:val="19"/>
+                  <w:szCs w:val="19"/>
+                </w:rPr>
+                <w:t xml:space="preserve">Langsung di VPS — tanpa Vercel</w:t>
+              </w:r>
+            </w:p>
+          </w:tc>
+          <w:p/>
+        </w:tc>
+      </w:tr>
+      <w:tr>
+        <w:tc>
+          <w:tcPr>
+            <w:tcMar>
+              <w:top w:type="dxa" w:w="90"/>
+              <w:left w:type="dxa" w:w="130"/>
+              <w:bottom w:type="dxa" w:w="90"/>
+              <w:right w:type="dxa" w:w="130"/>
+            </w:tcMar>
+            <w:vAlign w:val="center"/>
+          </w:tcPr>
+          <w:tc>
+            <w:tcPr>
+              <w:tcMar>
+                <w:top w:type="dxa" w:w="90"/>
+                <w:left w:type="dxa" w:w="130"/>
+                <w:bottom w:type="dxa" w:w="90"/>
+                <w:right w:type="dxa" w:w="130"/>
+              </w:tcMar>
+              <w:vAlign w:val="center"/>
+            </w:tcPr>
+            <w:p>
+              <w:pPr>
+                <w:spacing w:after="0" w:before="0"/>
+              </w:pPr>
+              <w:r>
+                <w:rPr>
+                  <w:rFonts w:ascii="Plus Jakarta Sans" w:cs="Plus Jakarta Sans" w:eastAsia="Plus Jakarta Sans" w:hAnsi="Plus Jakarta Sans"/>
+                  <w:b/>
+                  <w:bCs/>
+                  <w:color w:val="1F2937"/>
+                  <w:sz w:val="20"/>
+                  <w:szCs w:val="20"/>
+                </w:rPr>
                 <w:t xml:space="preserve">Biaya Layanan</w:t>
               </w:r>
             </w:p>
@@ -6864,7 +6979,7 @@
           <w:sz w:val="22"/>
           <w:szCs w:val="22"/>
         </w:rPr>
-        <w:t xml:space="preserve">Hosting frontend (Vercel): </w:t>
+        <w:t xml:space="preserve">Catatan: </w:t>
       </w:r>
       <w:r>
         <w:rPr>
@@ -6873,7 +6988,7 @@
           <w:sz w:val="22"/>
           <w:szCs w:val="22"/>
         </w:rPr>
-        <w:t xml:space="preserve">sudah termasuk di semua paket (Hobby, Rp 0). Upgrade Vercel Pro +Rp 320.000/bulan (~$20) untuk tim &amp; analitik lanjutan.</w:t>
+        <w:t xml:space="preserve">VPS tidak butuh Vercel — website jalan langsung di VPS (Node + Nginx). Supabase bisa self-host di VPS yang sama tanpa biaya langganan tambahan. Vercel hanya dipakai di skema default (Supabase cloud + Vercel gratis).</w:t>
       </w:r>
     </w:p>
     <w:p>

</xml_diff>

<commit_message>
feat: batas gratis & upgrade, VPS all-in-one
</commit_message>
<xml_diff>
--- a/proposal/Proposal_Website_SD_Muhammadiyah_Pakel.docx
+++ b/proposal/Proposal_Website_SD_Muhammadiyah_Pakel.docx
@@ -6168,9 +6168,9 @@
         </w:tblBorders>
       </w:tblPr>
       <w:tblGrid>
-        <w:gridCol w:w="1700"/>
-        <w:gridCol w:w="3800"/>
-        <w:gridCol w:w="3600"/>
+        <w:gridCol w:w="1500"/>
+        <w:gridCol w:w="3700"/>
+        <w:gridCol w:w="3900"/>
       </w:tblGrid>
       <w:tr>
         <w:trPr>
@@ -6256,7 +6256,7 @@
                 <w:sz w:val="20"/>
                 <w:szCs w:val="20"/>
               </w:rPr>
-              <w:t xml:space="preserve">VPS (add-on)</w:t>
+              <w:t xml:space="preserve">VPS All-in-One (add-on)</w:t>
             </w:r>
           </w:p>
         </w:tc>
@@ -6295,7 +6295,7 @@
                   <w:sz w:val="20"/>
                   <w:szCs w:val="20"/>
                 </w:rPr>
-                <w:t xml:space="preserve">Kelebihan</w:t>
+                <w:t xml:space="preserve">Frontend</w:t>
               </w:r>
             </w:p>
           </w:tc>
@@ -6332,7 +6332,7 @@
                   <w:sz w:val="19"/>
                   <w:szCs w:val="19"/>
                 </w:rPr>
-                <w:t xml:space="preserve">Managed, auto backup, tanpa urus server. Cukup untuk profil + PPDB</w:t>
+                <w:t xml:space="preserve">Vercel (gratis)</w:t>
               </w:r>
             </w:p>
           </w:tc>
@@ -6369,7 +6369,7 @@
                   <w:sz w:val="19"/>
                   <w:szCs w:val="19"/>
                 </w:rPr>
-                <w:t xml:space="preserve">Full kontrol, email kustom, multi-aplikasi, resource lebih besar</w:t>
+                <w:t xml:space="preserve">Langsung di VPS — tanpa Vercel</w:t>
               </w:r>
             </w:p>
           </w:tc>
@@ -6410,7 +6410,7 @@
                   <w:sz w:val="20"/>
                   <w:szCs w:val="20"/>
                 </w:rPr>
-                <w:t xml:space="preserve">Hosting Website</w:t>
+                <w:t xml:space="preserve">Backend</w:t>
               </w:r>
             </w:p>
           </w:tc>
@@ -6447,7 +6447,7 @@
                   <w:sz w:val="19"/>
                   <w:szCs w:val="19"/>
                 </w:rPr>
-                <w:t xml:space="preserve">Vercel (gratis) — sudah termasuk</w:t>
+                <w:t xml:space="preserve">Supabase cloud (gratis)</w:t>
               </w:r>
             </w:p>
           </w:tc>
@@ -6484,7 +6484,7 @@
                   <w:sz w:val="19"/>
                   <w:szCs w:val="19"/>
                 </w:rPr>
-                <w:t xml:space="preserve">Langsung di VPS — tanpa Vercel</w:t>
+                <w:t xml:space="preserve">Supabase self-host di VPS yang sama</w:t>
               </w:r>
             </w:p>
           </w:tc>
@@ -6525,7 +6525,7 @@
                   <w:sz w:val="20"/>
                   <w:szCs w:val="20"/>
                 </w:rPr>
-                <w:t xml:space="preserve">Biaya Layanan</w:t>
+                <w:t xml:space="preserve">Biaya</w:t>
               </w:r>
             </w:p>
           </w:tc>
@@ -6562,7 +6562,7 @@
                   <w:sz w:val="19"/>
                   <w:szCs w:val="19"/>
                 </w:rPr>
-                <w:t xml:space="preserve">Rp 0 — sudah termasuk paket (free tier)</w:t>
+                <w:t xml:space="preserve">Rp 0/bulan (s.d. batas gratis)</w:t>
               </w:r>
             </w:p>
           </w:tc>
@@ -6599,7 +6599,7 @@
                   <w:sz w:val="19"/>
                   <w:szCs w:val="19"/>
                 </w:rPr>
-                <w:t xml:space="preserve">+Rp 300.000/bulan (VPS 2 vCPU, 8GB RAM — Hostinger KVM 2)</w:t>
+                <w:t xml:space="preserve">+Rp 300.000/bulan</w:t>
               </w:r>
             </w:p>
           </w:tc>
@@ -6755,7 +6755,7 @@
                   <w:sz w:val="20"/>
                   <w:szCs w:val="20"/>
                 </w:rPr>
-                <w:t xml:space="preserve">Upgrade</w:t>
+                <w:t xml:space="preserve">Batas Gratis</w:t>
               </w:r>
             </w:p>
           </w:tc>
@@ -6792,7 +6792,7 @@
                   <w:sz w:val="19"/>
                   <w:szCs w:val="19"/>
                 </w:rPr>
-                <w:t xml:space="preserve">Supabase Pro +Rp 1.200.000/bulan (~$75)</w:t>
+                <w:t xml:space="preserve">500MB database, 1GB storage, 50.000 user, 5GB bandwidth/bulan. Project berhenti (pause) jika 7 hari tidak aktif — harus dibuka manual.</w:t>
               </w:r>
             </w:p>
           </w:tc>
@@ -6829,7 +6829,7 @@
                   <w:sz w:val="19"/>
                   <w:szCs w:val="19"/>
                 </w:rPr>
-                <w:t xml:space="preserve">Scale up kapan saja, harga naik sesuai spek</w:t>
+                <w:t xml:space="preserve">Tidak ada batasan kuota — resource penuh sesuai spek server (2 vCPU, 8GB RAM, 100GB NVMe)</w:t>
               </w:r>
             </w:p>
           </w:tc>
@@ -6870,7 +6870,7 @@
                   <w:sz w:val="20"/>
                   <w:szCs w:val="20"/>
                 </w:rPr>
-                <w:t xml:space="preserve">Cocok Untuk</w:t>
+                <w:t xml:space="preserve">Upgrade</w:t>
               </w:r>
             </w:p>
           </w:tc>
@@ -6907,7 +6907,7 @@
                   <w:sz w:val="19"/>
                   <w:szCs w:val="19"/>
                 </w:rPr>
-                <w:t xml:space="preserve">Website profil, berita, PPDB reguler</w:t>
+                <w:t xml:space="preserve">Supabase Pro +Rp 1.200.000/bulan (~$75): DB 8GB, backup point-in-time, bandwidth 250GB</w:t>
               </w:r>
             </w:p>
           </w:tc>
@@ -6944,7 +6944,7 @@
                   <w:sz w:val="19"/>
                   <w:szCs w:val="19"/>
                 </w:rPr>
-                <w:t xml:space="preserve">PPDB volume besar, sistem akademik, multi-admin berat</w:t>
+                <w:t xml:space="preserve">Scale up spek VPS kapan saja — mulai +Rp 213.000/bulan (4 vCPU, 16GB RAM)</w:t>
               </w:r>
             </w:p>
           </w:tc>
@@ -6979,7 +6979,7 @@
           <w:sz w:val="22"/>
           <w:szCs w:val="22"/>
         </w:rPr>
-        <w:t xml:space="preserve">Catatan: </w:t>
+        <w:t xml:space="preserve">Rekomendasi — VPS All-in-One: </w:t>
       </w:r>
       <w:r>
         <w:rPr>
@@ -6988,7 +6988,7 @@
           <w:sz w:val="22"/>
           <w:szCs w:val="22"/>
         </w:rPr>
-        <w:t xml:space="preserve">VPS tidak butuh Vercel — website jalan langsung di VPS (Node + Nginx). Supabase bisa self-host di VPS yang sama tanpa biaya langganan tambahan. Vercel hanya dipakai di skema default (Supabase cloud + Vercel gratis).</w:t>
+        <w:t xml:space="preserve">frontend (Next.js) + backend (Supabase) dalam 1 VPS, tanpa Vercel, tanpa langganan cloud, tanpa batas kuota. Satu biaya tetap Rp 300.000/bulan.</w:t>
       </w:r>
     </w:p>
     <w:p>

</xml_diff>

<commit_message>
deploy: batas gratis & VPS all-in-one
</commit_message>
<xml_diff>
--- a/proposal/Proposal_Website_SD_Muhammadiyah_Pakel.docx
+++ b/proposal/Proposal_Website_SD_Muhammadiyah_Pakel.docx
@@ -6168,9 +6168,9 @@
         </w:tblBorders>
       </w:tblPr>
       <w:tblGrid>
-        <w:gridCol w:w="1700"/>
-        <w:gridCol w:w="3800"/>
-        <w:gridCol w:w="3600"/>
+        <w:gridCol w:w="1500"/>
+        <w:gridCol w:w="3700"/>
+        <w:gridCol w:w="3900"/>
       </w:tblGrid>
       <w:tr>
         <w:trPr>
@@ -6256,7 +6256,7 @@
                 <w:sz w:val="20"/>
                 <w:szCs w:val="20"/>
               </w:rPr>
-              <w:t xml:space="preserve">VPS (add-on)</w:t>
+              <w:t xml:space="preserve">VPS All-in-One (add-on)</w:t>
             </w:r>
           </w:p>
         </w:tc>
@@ -6295,7 +6295,7 @@
                   <w:sz w:val="20"/>
                   <w:szCs w:val="20"/>
                 </w:rPr>
-                <w:t xml:space="preserve">Kelebihan</w:t>
+                <w:t xml:space="preserve">Frontend</w:t>
               </w:r>
             </w:p>
           </w:tc>
@@ -6332,7 +6332,7 @@
                   <w:sz w:val="19"/>
                   <w:szCs w:val="19"/>
                 </w:rPr>
-                <w:t xml:space="preserve">Managed, auto backup, tanpa urus server. Cukup untuk profil + PPDB</w:t>
+                <w:t xml:space="preserve">Vercel (gratis)</w:t>
               </w:r>
             </w:p>
           </w:tc>
@@ -6369,7 +6369,7 @@
                   <w:sz w:val="19"/>
                   <w:szCs w:val="19"/>
                 </w:rPr>
-                <w:t xml:space="preserve">Full kontrol, email kustom, multi-aplikasi, resource lebih besar</w:t>
+                <w:t xml:space="preserve">Langsung di VPS — tanpa Vercel</w:t>
               </w:r>
             </w:p>
           </w:tc>
@@ -6410,7 +6410,7 @@
                   <w:sz w:val="20"/>
                   <w:szCs w:val="20"/>
                 </w:rPr>
-                <w:t xml:space="preserve">Hosting Website</w:t>
+                <w:t xml:space="preserve">Backend</w:t>
               </w:r>
             </w:p>
           </w:tc>
@@ -6447,7 +6447,7 @@
                   <w:sz w:val="19"/>
                   <w:szCs w:val="19"/>
                 </w:rPr>
-                <w:t xml:space="preserve">Vercel (gratis) — sudah termasuk</w:t>
+                <w:t xml:space="preserve">Supabase cloud (gratis)</w:t>
               </w:r>
             </w:p>
           </w:tc>
@@ -6484,7 +6484,7 @@
                   <w:sz w:val="19"/>
                   <w:szCs w:val="19"/>
                 </w:rPr>
-                <w:t xml:space="preserve">Langsung di VPS — tanpa Vercel</w:t>
+                <w:t xml:space="preserve">Supabase self-host di VPS yang sama</w:t>
               </w:r>
             </w:p>
           </w:tc>
@@ -6525,7 +6525,7 @@
                   <w:sz w:val="20"/>
                   <w:szCs w:val="20"/>
                 </w:rPr>
-                <w:t xml:space="preserve">Biaya Layanan</w:t>
+                <w:t xml:space="preserve">Biaya</w:t>
               </w:r>
             </w:p>
           </w:tc>
@@ -6562,7 +6562,7 @@
                   <w:sz w:val="19"/>
                   <w:szCs w:val="19"/>
                 </w:rPr>
-                <w:t xml:space="preserve">Rp 0 — sudah termasuk paket (free tier)</w:t>
+                <w:t xml:space="preserve">Rp 0/bulan (s.d. batas gratis)</w:t>
               </w:r>
             </w:p>
           </w:tc>
@@ -6599,7 +6599,7 @@
                   <w:sz w:val="19"/>
                   <w:szCs w:val="19"/>
                 </w:rPr>
-                <w:t xml:space="preserve">+Rp 300.000/bulan (VPS 2 vCPU, 8GB RAM — Hostinger KVM 2)</w:t>
+                <w:t xml:space="preserve">+Rp 300.000/bulan</w:t>
               </w:r>
             </w:p>
           </w:tc>
@@ -6755,7 +6755,7 @@
                   <w:sz w:val="20"/>
                   <w:szCs w:val="20"/>
                 </w:rPr>
-                <w:t xml:space="preserve">Upgrade</w:t>
+                <w:t xml:space="preserve">Batas Gratis</w:t>
               </w:r>
             </w:p>
           </w:tc>
@@ -6792,7 +6792,7 @@
                   <w:sz w:val="19"/>
                   <w:szCs w:val="19"/>
                 </w:rPr>
-                <w:t xml:space="preserve">Supabase Pro +Rp 1.200.000/bulan (~$75)</w:t>
+                <w:t xml:space="preserve">500MB database, 1GB storage, 50.000 user, 5GB bandwidth/bulan. Project berhenti (pause) jika 7 hari tidak aktif — harus dibuka manual.</w:t>
               </w:r>
             </w:p>
           </w:tc>
@@ -6829,7 +6829,7 @@
                   <w:sz w:val="19"/>
                   <w:szCs w:val="19"/>
                 </w:rPr>
-                <w:t xml:space="preserve">Scale up kapan saja, harga naik sesuai spek</w:t>
+                <w:t xml:space="preserve">Tidak ada batasan kuota — resource penuh sesuai spek server (2 vCPU, 8GB RAM, 100GB NVMe)</w:t>
               </w:r>
             </w:p>
           </w:tc>
@@ -6870,7 +6870,7 @@
                   <w:sz w:val="20"/>
                   <w:szCs w:val="20"/>
                 </w:rPr>
-                <w:t xml:space="preserve">Cocok Untuk</w:t>
+                <w:t xml:space="preserve">Upgrade</w:t>
               </w:r>
             </w:p>
           </w:tc>
@@ -6907,7 +6907,7 @@
                   <w:sz w:val="19"/>
                   <w:szCs w:val="19"/>
                 </w:rPr>
-                <w:t xml:space="preserve">Website profil, berita, PPDB reguler</w:t>
+                <w:t xml:space="preserve">Supabase Pro +Rp 1.200.000/bulan (~$75): DB 8GB, backup point-in-time, bandwidth 250GB</w:t>
               </w:r>
             </w:p>
           </w:tc>
@@ -6944,7 +6944,7 @@
                   <w:sz w:val="19"/>
                   <w:szCs w:val="19"/>
                 </w:rPr>
-                <w:t xml:space="preserve">PPDB volume besar, sistem akademik, multi-admin berat</w:t>
+                <w:t xml:space="preserve">Scale up spek VPS kapan saja — mulai +Rp 213.000/bulan (4 vCPU, 16GB RAM)</w:t>
               </w:r>
             </w:p>
           </w:tc>
@@ -6979,7 +6979,7 @@
           <w:sz w:val="22"/>
           <w:szCs w:val="22"/>
         </w:rPr>
-        <w:t xml:space="preserve">Catatan: </w:t>
+        <w:t xml:space="preserve">Rekomendasi — VPS All-in-One: </w:t>
       </w:r>
       <w:r>
         <w:rPr>
@@ -6988,7 +6988,7 @@
           <w:sz w:val="22"/>
           <w:szCs w:val="22"/>
         </w:rPr>
-        <w:t xml:space="preserve">VPS tidak butuh Vercel — website jalan langsung di VPS (Node + Nginx). Supabase bisa self-host di VPS yang sama tanpa biaya langganan tambahan. Vercel hanya dipakai di skema default (Supabase cloud + Vercel gratis).</w:t>
+        <w:t xml:space="preserve">frontend (Next.js) + backend (Supabase) dalam 1 VPS, tanpa Vercel, tanpa langganan cloud, tanpa batas kuota. Satu biaya tetap Rp 300.000/bulan.</w:t>
       </w:r>
     </w:p>
     <w:p>

</xml_diff>

<commit_message>
feat: arsitektur Helipod + R2 + PostgreSQL
</commit_message>
<xml_diff>
--- a/proposal/Proposal_Website_SD_Muhammadiyah_Pakel.docx
+++ b/proposal/Proposal_Website_SD_Muhammadiyah_Pakel.docx
@@ -419,7 +419,7 @@
           <w:sz w:val="22"/>
           <w:szCs w:val="22"/>
         </w:rPr>
-        <w:t xml:space="preserve">Pilihan Infrastruktur (Supabase vs VPS)</w:t>
+        <w:t xml:space="preserve">Arsitektur &amp; Infrastruktur</w:t>
       </w:r>
       <w:r>
         <w:rPr>
@@ -6138,7 +6138,7 @@
           <w:sz w:val="30"/>
           <w:szCs w:val="30"/>
         </w:rPr>
-        <w:t xml:space="preserve">9. Pilihan Infrastruktur: Supabase vs VPS</w:t>
+        <w:t xml:space="preserve">9. Arsitektur &amp; Infrastruktur</w:t>
       </w:r>
     </w:p>
     <w:p>
@@ -6152,7 +6152,24 @@
           <w:sz w:val="22"/>
           <w:szCs w:val="22"/>
         </w:rPr>
-        <w:t xml:space="preserve">Kedua opsi sudah termasuk database, autentikasi, dan penyimpanan. Harga mengacu riset pasar Agustus 2026:</w:t>
+        <w:t xml:space="preserve">Semua aplikasi berjalan di satu server Helipod — frontend (Next.js) dan database (PostgreSQL) dalam container Docker. Dokumen PPDB dan backup disimpan di Cloudflare R2 (free tier).</w:t>
+      </w:r>
+    </w:p>
+    <w:p>
+      <w:pPr>
+        <w:pStyle w:val="Heading3"/>
+        <w:spacing w:after="160" w:before="200"/>
+      </w:pPr>
+      <w:r>
+        <w:rPr>
+          <w:rFonts w:ascii="Plus Jakarta Sans" w:cs="Plus Jakarta Sans" w:eastAsia="Plus Jakarta Sans" w:hAnsi="Plus Jakarta Sans"/>
+          <w:b/>
+          <w:bCs/>
+          <w:color w:val="082B66"/>
+          <w:sz w:val="23"/>
+          <w:szCs w:val="23"/>
+        </w:rPr>
+        <w:t xml:space="preserve">Spesifikasi Server — Helipod</w:t>
       </w:r>
     </w:p>
     <w:tbl>
@@ -6168,9 +6185,8 @@
         </w:tblBorders>
       </w:tblPr>
       <w:tblGrid>
-        <w:gridCol w:w="1500"/>
-        <w:gridCol w:w="3700"/>
-        <w:gridCol w:w="3900"/>
+        <w:gridCol w:w="2400"/>
+        <w:gridCol w:w="6700"/>
       </w:tblGrid>
       <w:tr>
         <w:trPr>
@@ -6200,7 +6216,7 @@
                 <w:sz w:val="20"/>
                 <w:szCs w:val="20"/>
               </w:rPr>
-              <w:t xml:space="preserve">Aspek</w:t>
+              <w:t xml:space="preserve">Komponen</w:t>
             </w:r>
           </w:p>
         </w:tc>
@@ -6228,38 +6244,10 @@
                 <w:sz w:val="20"/>
                 <w:szCs w:val="20"/>
               </w:rPr>
-              <w:t xml:space="preserve">Supabase (default)</w:t>
+              <w:t xml:space="preserve">Detail</w:t>
             </w:r>
           </w:p>
         </w:tc>
-        <w:tc>
-          <w:tcPr>
-            <w:shd w:fill="0B3D91" w:color="auto" w:val="clear"/>
-            <w:tcMar>
-              <w:top w:type="dxa" w:w="90"/>
-              <w:left w:type="dxa" w:w="130"/>
-              <w:bottom w:type="dxa" w:w="90"/>
-              <w:right w:type="dxa" w:w="130"/>
-            </w:tcMar>
-            <w:vAlign w:val="center"/>
-          </w:tcPr>
-          <w:p>
-            <w:pPr>
-              <w:spacing w:after="0" w:before="0"/>
-            </w:pPr>
-            <w:r>
-              <w:rPr>
-                <w:rFonts w:ascii="Plus Jakarta Sans" w:cs="Plus Jakarta Sans" w:eastAsia="Plus Jakarta Sans" w:hAnsi="Plus Jakarta Sans"/>
-                <w:b/>
-                <w:bCs/>
-                <w:color w:val="FFFFFF"/>
-                <w:sz w:val="20"/>
-                <w:szCs w:val="20"/>
-              </w:rPr>
-              <w:t xml:space="preserve">VPS All-in-One (add-on)</w:t>
-            </w:r>
-          </w:p>
-        </w:tc>
       </w:tr>
       <w:tr>
         <w:tc>
@@ -6295,81 +6283,44 @@
                   <w:sz w:val="20"/>
                   <w:szCs w:val="20"/>
                 </w:rPr>
-                <w:t xml:space="preserve">Frontend</w:t>
-              </w:r>
-            </w:p>
-          </w:tc>
-          <w:p/>
-        </w:tc>
-        <w:tc>
-          <w:tcPr>
-            <w:tcMar>
-              <w:top w:type="dxa" w:w="90"/>
-              <w:left w:type="dxa" w:w="130"/>
-              <w:bottom w:type="dxa" w:w="90"/>
-              <w:right w:type="dxa" w:w="130"/>
-            </w:tcMar>
-            <w:vAlign w:val="center"/>
-          </w:tcPr>
-          <w:tc>
-            <w:tcPr>
-              <w:tcMar>
-                <w:top w:type="dxa" w:w="90"/>
-                <w:left w:type="dxa" w:w="130"/>
-                <w:bottom w:type="dxa" w:w="90"/>
-                <w:right w:type="dxa" w:w="130"/>
-              </w:tcMar>
-              <w:vAlign w:val="center"/>
-            </w:tcPr>
-            <w:p>
-              <w:pPr>
-                <w:spacing w:after="0" w:before="0"/>
-              </w:pPr>
-              <w:r>
-                <w:rPr>
-                  <w:rFonts w:ascii="Plus Jakarta Sans" w:cs="Plus Jakarta Sans" w:eastAsia="Plus Jakarta Sans" w:hAnsi="Plus Jakarta Sans"/>
-                  <w:color w:val="1F2937"/>
-                  <w:sz w:val="19"/>
-                  <w:szCs w:val="19"/>
-                </w:rPr>
-                <w:t xml:space="preserve">Vercel (gratis)</w:t>
-              </w:r>
-            </w:p>
-          </w:tc>
-          <w:p/>
-        </w:tc>
-        <w:tc>
-          <w:tcPr>
-            <w:tcMar>
-              <w:top w:type="dxa" w:w="90"/>
-              <w:left w:type="dxa" w:w="130"/>
-              <w:bottom w:type="dxa" w:w="90"/>
-              <w:right w:type="dxa" w:w="130"/>
-            </w:tcMar>
-            <w:vAlign w:val="center"/>
-          </w:tcPr>
-          <w:tc>
-            <w:tcPr>
-              <w:tcMar>
-                <w:top w:type="dxa" w:w="90"/>
-                <w:left w:type="dxa" w:w="130"/>
-                <w:bottom w:type="dxa" w:w="90"/>
-                <w:right w:type="dxa" w:w="130"/>
-              </w:tcMar>
-              <w:vAlign w:val="center"/>
-            </w:tcPr>
-            <w:p>
-              <w:pPr>
-                <w:spacing w:after="0" w:before="0"/>
-              </w:pPr>
-              <w:r>
-                <w:rPr>
-                  <w:rFonts w:ascii="Plus Jakarta Sans" w:cs="Plus Jakarta Sans" w:eastAsia="Plus Jakarta Sans" w:hAnsi="Plus Jakarta Sans"/>
-                  <w:color w:val="1F2937"/>
-                  <w:sz w:val="19"/>
-                  <w:szCs w:val="19"/>
-                </w:rPr>
-                <w:t xml:space="preserve">Langsung di VPS — tanpa Vercel</w:t>
+                <w:t xml:space="preserve">Server</w:t>
+              </w:r>
+            </w:p>
+          </w:tc>
+          <w:p/>
+        </w:tc>
+        <w:tc>
+          <w:tcPr>
+            <w:tcMar>
+              <w:top w:type="dxa" w:w="90"/>
+              <w:left w:type="dxa" w:w="130"/>
+              <w:bottom w:type="dxa" w:w="90"/>
+              <w:right w:type="dxa" w:w="130"/>
+            </w:tcMar>
+            <w:vAlign w:val="center"/>
+          </w:tcPr>
+          <w:tc>
+            <w:tcPr>
+              <w:tcMar>
+                <w:top w:type="dxa" w:w="90"/>
+                <w:left w:type="dxa" w:w="130"/>
+                <w:bottom w:type="dxa" w:w="90"/>
+                <w:right w:type="dxa" w:w="130"/>
+              </w:tcMar>
+              <w:vAlign w:val="center"/>
+            </w:tcPr>
+            <w:p>
+              <w:pPr>
+                <w:spacing w:after="0" w:before="0"/>
+              </w:pPr>
+              <w:r>
+                <w:rPr>
+                  <w:rFonts w:ascii="Plus Jakarta Sans" w:cs="Plus Jakarta Sans" w:eastAsia="Plus Jakarta Sans" w:hAnsi="Plus Jakarta Sans"/>
+                  <w:color w:val="1F2937"/>
+                  <w:sz w:val="20"/>
+                  <w:szCs w:val="20"/>
+                </w:rPr>
+                <w:t xml:space="preserve">Helipod — 1 vCPU, 1 GB RAM, 15 GB storage, unlimited bandwidth</w:t>
               </w:r>
             </w:p>
           </w:tc>
@@ -6410,81 +6361,44 @@
                   <w:sz w:val="20"/>
                   <w:szCs w:val="20"/>
                 </w:rPr>
-                <w:t xml:space="preserve">Backend</w:t>
-              </w:r>
-            </w:p>
-          </w:tc>
-          <w:p/>
-        </w:tc>
-        <w:tc>
-          <w:tcPr>
-            <w:tcMar>
-              <w:top w:type="dxa" w:w="90"/>
-              <w:left w:type="dxa" w:w="130"/>
-              <w:bottom w:type="dxa" w:w="90"/>
-              <w:right w:type="dxa" w:w="130"/>
-            </w:tcMar>
-            <w:vAlign w:val="center"/>
-          </w:tcPr>
-          <w:tc>
-            <w:tcPr>
-              <w:tcMar>
-                <w:top w:type="dxa" w:w="90"/>
-                <w:left w:type="dxa" w:w="130"/>
-                <w:bottom w:type="dxa" w:w="90"/>
-                <w:right w:type="dxa" w:w="130"/>
-              </w:tcMar>
-              <w:vAlign w:val="center"/>
-            </w:tcPr>
-            <w:p>
-              <w:pPr>
-                <w:spacing w:after="0" w:before="0"/>
-              </w:pPr>
-              <w:r>
-                <w:rPr>
-                  <w:rFonts w:ascii="Plus Jakarta Sans" w:cs="Plus Jakarta Sans" w:eastAsia="Plus Jakarta Sans" w:hAnsi="Plus Jakarta Sans"/>
-                  <w:color w:val="1F2937"/>
-                  <w:sz w:val="19"/>
-                  <w:szCs w:val="19"/>
-                </w:rPr>
-                <w:t xml:space="preserve">Supabase cloud (gratis)</w:t>
-              </w:r>
-            </w:p>
-          </w:tc>
-          <w:p/>
-        </w:tc>
-        <w:tc>
-          <w:tcPr>
-            <w:tcMar>
-              <w:top w:type="dxa" w:w="90"/>
-              <w:left w:type="dxa" w:w="130"/>
-              <w:bottom w:type="dxa" w:w="90"/>
-              <w:right w:type="dxa" w:w="130"/>
-            </w:tcMar>
-            <w:vAlign w:val="center"/>
-          </w:tcPr>
-          <w:tc>
-            <w:tcPr>
-              <w:tcMar>
-                <w:top w:type="dxa" w:w="90"/>
-                <w:left w:type="dxa" w:w="130"/>
-                <w:bottom w:type="dxa" w:w="90"/>
-                <w:right w:type="dxa" w:w="130"/>
-              </w:tcMar>
-              <w:vAlign w:val="center"/>
-            </w:tcPr>
-            <w:p>
-              <w:pPr>
-                <w:spacing w:after="0" w:before="0"/>
-              </w:pPr>
-              <w:r>
-                <w:rPr>
-                  <w:rFonts w:ascii="Plus Jakarta Sans" w:cs="Plus Jakarta Sans" w:eastAsia="Plus Jakarta Sans" w:hAnsi="Plus Jakarta Sans"/>
-                  <w:color w:val="1F2937"/>
-                  <w:sz w:val="19"/>
-                  <w:szCs w:val="19"/>
-                </w:rPr>
-                <w:t xml:space="preserve">Supabase self-host di VPS yang sama</w:t>
+                <w:t xml:space="preserve">Biaya</w:t>
+              </w:r>
+            </w:p>
+          </w:tc>
+          <w:p/>
+        </w:tc>
+        <w:tc>
+          <w:tcPr>
+            <w:tcMar>
+              <w:top w:type="dxa" w:w="90"/>
+              <w:left w:type="dxa" w:w="130"/>
+              <w:bottom w:type="dxa" w:w="90"/>
+              <w:right w:type="dxa" w:w="130"/>
+            </w:tcMar>
+            <w:vAlign w:val="center"/>
+          </w:tcPr>
+          <w:tc>
+            <w:tcPr>
+              <w:tcMar>
+                <w:top w:type="dxa" w:w="90"/>
+                <w:left w:type="dxa" w:w="130"/>
+                <w:bottom w:type="dxa" w:w="90"/>
+                <w:right w:type="dxa" w:w="130"/>
+              </w:tcMar>
+              <w:vAlign w:val="center"/>
+            </w:tcPr>
+            <w:p>
+              <w:pPr>
+                <w:spacing w:after="0" w:before="0"/>
+              </w:pPr>
+              <w:r>
+                <w:rPr>
+                  <w:rFonts w:ascii="Plus Jakarta Sans" w:cs="Plus Jakarta Sans" w:eastAsia="Plus Jakarta Sans" w:hAnsi="Plus Jakarta Sans"/>
+                  <w:color w:val="1F2937"/>
+                  <w:sz w:val="20"/>
+                  <w:szCs w:val="20"/>
+                </w:rPr>
+                <w:t xml:space="preserve">Rp 61.875/bulan</w:t>
               </w:r>
             </w:p>
           </w:tc>
@@ -6525,81 +6439,44 @@
                   <w:sz w:val="20"/>
                   <w:szCs w:val="20"/>
                 </w:rPr>
-                <w:t xml:space="preserve">Biaya</w:t>
-              </w:r>
-            </w:p>
-          </w:tc>
-          <w:p/>
-        </w:tc>
-        <w:tc>
-          <w:tcPr>
-            <w:tcMar>
-              <w:top w:type="dxa" w:w="90"/>
-              <w:left w:type="dxa" w:w="130"/>
-              <w:bottom w:type="dxa" w:w="90"/>
-              <w:right w:type="dxa" w:w="130"/>
-            </w:tcMar>
-            <w:vAlign w:val="center"/>
-          </w:tcPr>
-          <w:tc>
-            <w:tcPr>
-              <w:tcMar>
-                <w:top w:type="dxa" w:w="90"/>
-                <w:left w:type="dxa" w:w="130"/>
-                <w:bottom w:type="dxa" w:w="90"/>
-                <w:right w:type="dxa" w:w="130"/>
-              </w:tcMar>
-              <w:vAlign w:val="center"/>
-            </w:tcPr>
-            <w:p>
-              <w:pPr>
-                <w:spacing w:after="0" w:before="0"/>
-              </w:pPr>
-              <w:r>
-                <w:rPr>
-                  <w:rFonts w:ascii="Plus Jakarta Sans" w:cs="Plus Jakarta Sans" w:eastAsia="Plus Jakarta Sans" w:hAnsi="Plus Jakarta Sans"/>
-                  <w:color w:val="1F2937"/>
-                  <w:sz w:val="19"/>
-                  <w:szCs w:val="19"/>
-                </w:rPr>
-                <w:t xml:space="preserve">Rp 0/bulan (s.d. batas gratis)</w:t>
-              </w:r>
-            </w:p>
-          </w:tc>
-          <w:p/>
-        </w:tc>
-        <w:tc>
-          <w:tcPr>
-            <w:tcMar>
-              <w:top w:type="dxa" w:w="90"/>
-              <w:left w:type="dxa" w:w="130"/>
-              <w:bottom w:type="dxa" w:w="90"/>
-              <w:right w:type="dxa" w:w="130"/>
-            </w:tcMar>
-            <w:vAlign w:val="center"/>
-          </w:tcPr>
-          <w:tc>
-            <w:tcPr>
-              <w:tcMar>
-                <w:top w:type="dxa" w:w="90"/>
-                <w:left w:type="dxa" w:w="130"/>
-                <w:bottom w:type="dxa" w:w="90"/>
-                <w:right w:type="dxa" w:w="130"/>
-              </w:tcMar>
-              <w:vAlign w:val="center"/>
-            </w:tcPr>
-            <w:p>
-              <w:pPr>
-                <w:spacing w:after="0" w:before="0"/>
-              </w:pPr>
-              <w:r>
-                <w:rPr>
-                  <w:rFonts w:ascii="Plus Jakarta Sans" w:cs="Plus Jakarta Sans" w:eastAsia="Plus Jakarta Sans" w:hAnsi="Plus Jakarta Sans"/>
-                  <w:color w:val="1F2937"/>
-                  <w:sz w:val="19"/>
-                  <w:szCs w:val="19"/>
-                </w:rPr>
-                <w:t xml:space="preserve">+Rp 300.000/bulan</w:t>
+                <w:t xml:space="preserve">Aplikasi</w:t>
+              </w:r>
+            </w:p>
+          </w:tc>
+          <w:p/>
+        </w:tc>
+        <w:tc>
+          <w:tcPr>
+            <w:tcMar>
+              <w:top w:type="dxa" w:w="90"/>
+              <w:left w:type="dxa" w:w="130"/>
+              <w:bottom w:type="dxa" w:w="90"/>
+              <w:right w:type="dxa" w:w="130"/>
+            </w:tcMar>
+            <w:vAlign w:val="center"/>
+          </w:tcPr>
+          <w:tc>
+            <w:tcPr>
+              <w:tcMar>
+                <w:top w:type="dxa" w:w="90"/>
+                <w:left w:type="dxa" w:w="130"/>
+                <w:bottom w:type="dxa" w:w="90"/>
+                <w:right w:type="dxa" w:w="130"/>
+              </w:tcMar>
+              <w:vAlign w:val="center"/>
+            </w:tcPr>
+            <w:p>
+              <w:pPr>
+                <w:spacing w:after="0" w:before="0"/>
+              </w:pPr>
+              <w:r>
+                <w:rPr>
+                  <w:rFonts w:ascii="Plus Jakarta Sans" w:cs="Plus Jakarta Sans" w:eastAsia="Plus Jakarta Sans" w:hAnsi="Plus Jakarta Sans"/>
+                  <w:color w:val="1F2937"/>
+                  <w:sz w:val="20"/>
+                  <w:szCs w:val="20"/>
+                </w:rPr>
+                <w:t xml:space="preserve">Next.js (Docker) + PostgreSQL (Docker Compose) + Nginx</w:t>
               </w:r>
             </w:p>
           </w:tc>
@@ -6640,81 +6517,44 @@
                   <w:sz w:val="20"/>
                   <w:szCs w:val="20"/>
                 </w:rPr>
-                <w:t xml:space="preserve">Biaya Setup</w:t>
-              </w:r>
-            </w:p>
-          </w:tc>
-          <w:p/>
-        </w:tc>
-        <w:tc>
-          <w:tcPr>
-            <w:tcMar>
-              <w:top w:type="dxa" w:w="90"/>
-              <w:left w:type="dxa" w:w="130"/>
-              <w:bottom w:type="dxa" w:w="90"/>
-              <w:right w:type="dxa" w:w="130"/>
-            </w:tcMar>
-            <w:vAlign w:val="center"/>
-          </w:tcPr>
-          <w:tc>
-            <w:tcPr>
-              <w:tcMar>
-                <w:top w:type="dxa" w:w="90"/>
-                <w:left w:type="dxa" w:w="130"/>
-                <w:bottom w:type="dxa" w:w="90"/>
-                <w:right w:type="dxa" w:w="130"/>
-              </w:tcMar>
-              <w:vAlign w:val="center"/>
-            </w:tcPr>
-            <w:p>
-              <w:pPr>
-                <w:spacing w:after="0" w:before="0"/>
-              </w:pPr>
-              <w:r>
-                <w:rPr>
-                  <w:rFonts w:ascii="Plus Jakarta Sans" w:cs="Plus Jakarta Sans" w:eastAsia="Plus Jakarta Sans" w:hAnsi="Plus Jakarta Sans"/>
-                  <w:color w:val="1F2937"/>
-                  <w:sz w:val="19"/>
-                  <w:szCs w:val="19"/>
-                </w:rPr>
-                <w:t xml:space="preserve">Rp 0</w:t>
-              </w:r>
-            </w:p>
-          </w:tc>
-          <w:p/>
-        </w:tc>
-        <w:tc>
-          <w:tcPr>
-            <w:tcMar>
-              <w:top w:type="dxa" w:w="90"/>
-              <w:left w:type="dxa" w:w="130"/>
-              <w:bottom w:type="dxa" w:w="90"/>
-              <w:right w:type="dxa" w:w="130"/>
-            </w:tcMar>
-            <w:vAlign w:val="center"/>
-          </w:tcPr>
-          <w:tc>
-            <w:tcPr>
-              <w:tcMar>
-                <w:top w:type="dxa" w:w="90"/>
-                <w:left w:type="dxa" w:w="130"/>
-                <w:bottom w:type="dxa" w:w="90"/>
-                <w:right w:type="dxa" w:w="130"/>
-              </w:tcMar>
-              <w:vAlign w:val="center"/>
-            </w:tcPr>
-            <w:p>
-              <w:pPr>
-                <w:spacing w:after="0" w:before="0"/>
-              </w:pPr>
-              <w:r>
-                <w:rPr>
-                  <w:rFonts w:ascii="Plus Jakarta Sans" w:cs="Plus Jakarta Sans" w:eastAsia="Plus Jakarta Sans" w:hAnsi="Plus Jakarta Sans"/>
-                  <w:color w:val="1F2937"/>
-                  <w:sz w:val="19"/>
-                  <w:szCs w:val="19"/>
-                </w:rPr>
-                <w:t xml:space="preserve">+Rp 1.500.000 sekali (setting &amp; migrasi)</w:t>
+                <w:t xml:space="preserve">Object Storage</w:t>
+              </w:r>
+            </w:p>
+          </w:tc>
+          <w:p/>
+        </w:tc>
+        <w:tc>
+          <w:tcPr>
+            <w:tcMar>
+              <w:top w:type="dxa" w:w="90"/>
+              <w:left w:type="dxa" w:w="130"/>
+              <w:bottom w:type="dxa" w:w="90"/>
+              <w:right w:type="dxa" w:w="130"/>
+            </w:tcMar>
+            <w:vAlign w:val="center"/>
+          </w:tcPr>
+          <w:tc>
+            <w:tcPr>
+              <w:tcMar>
+                <w:top w:type="dxa" w:w="90"/>
+                <w:left w:type="dxa" w:w="130"/>
+                <w:bottom w:type="dxa" w:w="90"/>
+                <w:right w:type="dxa" w:w="130"/>
+              </w:tcMar>
+              <w:vAlign w:val="center"/>
+            </w:tcPr>
+            <w:p>
+              <w:pPr>
+                <w:spacing w:after="0" w:before="0"/>
+              </w:pPr>
+              <w:r>
+                <w:rPr>
+                  <w:rFonts w:ascii="Plus Jakarta Sans" w:cs="Plus Jakarta Sans" w:eastAsia="Plus Jakarta Sans" w:hAnsi="Plus Jakarta Sans"/>
+                  <w:color w:val="1F2937"/>
+                  <w:sz w:val="20"/>
+                  <w:szCs w:val="20"/>
+                </w:rPr>
+                <w:t xml:space="preserve">Cloudflare R2 (free tier) — dokumen pendaftar + backup database</w:t>
               </w:r>
             </w:p>
           </w:tc>
@@ -6755,81 +6595,44 @@
                   <w:sz w:val="20"/>
                   <w:szCs w:val="20"/>
                 </w:rPr>
-                <w:t xml:space="preserve">Batas Gratis</w:t>
-              </w:r>
-            </w:p>
-          </w:tc>
-          <w:p/>
-        </w:tc>
-        <w:tc>
-          <w:tcPr>
-            <w:tcMar>
-              <w:top w:type="dxa" w:w="90"/>
-              <w:left w:type="dxa" w:w="130"/>
-              <w:bottom w:type="dxa" w:w="90"/>
-              <w:right w:type="dxa" w:w="130"/>
-            </w:tcMar>
-            <w:vAlign w:val="center"/>
-          </w:tcPr>
-          <w:tc>
-            <w:tcPr>
-              <w:tcMar>
-                <w:top w:type="dxa" w:w="90"/>
-                <w:left w:type="dxa" w:w="130"/>
-                <w:bottom w:type="dxa" w:w="90"/>
-                <w:right w:type="dxa" w:w="130"/>
-              </w:tcMar>
-              <w:vAlign w:val="center"/>
-            </w:tcPr>
-            <w:p>
-              <w:pPr>
-                <w:spacing w:after="0" w:before="0"/>
-              </w:pPr>
-              <w:r>
-                <w:rPr>
-                  <w:rFonts w:ascii="Plus Jakarta Sans" w:cs="Plus Jakarta Sans" w:eastAsia="Plus Jakarta Sans" w:hAnsi="Plus Jakarta Sans"/>
-                  <w:color w:val="1F2937"/>
-                  <w:sz w:val="19"/>
-                  <w:szCs w:val="19"/>
-                </w:rPr>
-                <w:t xml:space="preserve">500MB database, 1GB storage, 50.000 user, 5GB bandwidth/bulan. Project berhenti (pause) jika 7 hari tidak aktif — harus dibuka manual.</w:t>
-              </w:r>
-            </w:p>
-          </w:tc>
-          <w:p/>
-        </w:tc>
-        <w:tc>
-          <w:tcPr>
-            <w:tcMar>
-              <w:top w:type="dxa" w:w="90"/>
-              <w:left w:type="dxa" w:w="130"/>
-              <w:bottom w:type="dxa" w:w="90"/>
-              <w:right w:type="dxa" w:w="130"/>
-            </w:tcMar>
-            <w:vAlign w:val="center"/>
-          </w:tcPr>
-          <w:tc>
-            <w:tcPr>
-              <w:tcMar>
-                <w:top w:type="dxa" w:w="90"/>
-                <w:left w:type="dxa" w:w="130"/>
-                <w:bottom w:type="dxa" w:w="90"/>
-                <w:right w:type="dxa" w:w="130"/>
-              </w:tcMar>
-              <w:vAlign w:val="center"/>
-            </w:tcPr>
-            <w:p>
-              <w:pPr>
-                <w:spacing w:after="0" w:before="0"/>
-              </w:pPr>
-              <w:r>
-                <w:rPr>
-                  <w:rFonts w:ascii="Plus Jakarta Sans" w:cs="Plus Jakarta Sans" w:eastAsia="Plus Jakarta Sans" w:hAnsi="Plus Jakarta Sans"/>
-                  <w:color w:val="1F2937"/>
-                  <w:sz w:val="19"/>
-                  <w:szCs w:val="19"/>
-                </w:rPr>
-                <w:t xml:space="preserve">Tidak ada batasan kuota — resource penuh sesuai spek server (2 vCPU, 8GB RAM, 100GB NVMe)</w:t>
+                <w:t xml:space="preserve">CI/CD</w:t>
+              </w:r>
+            </w:p>
+          </w:tc>
+          <w:p/>
+        </w:tc>
+        <w:tc>
+          <w:tcPr>
+            <w:tcMar>
+              <w:top w:type="dxa" w:w="90"/>
+              <w:left w:type="dxa" w:w="130"/>
+              <w:bottom w:type="dxa" w:w="90"/>
+              <w:right w:type="dxa" w:w="130"/>
+            </w:tcMar>
+            <w:vAlign w:val="center"/>
+          </w:tcPr>
+          <w:tc>
+            <w:tcPr>
+              <w:tcMar>
+                <w:top w:type="dxa" w:w="90"/>
+                <w:left w:type="dxa" w:w="130"/>
+                <w:bottom w:type="dxa" w:w="90"/>
+                <w:right w:type="dxa" w:w="130"/>
+              </w:tcMar>
+              <w:vAlign w:val="center"/>
+            </w:tcPr>
+            <w:p>
+              <w:pPr>
+                <w:spacing w:after="0" w:before="0"/>
+              </w:pPr>
+              <w:r>
+                <w:rPr>
+                  <w:rFonts w:ascii="Plus Jakarta Sans" w:cs="Plus Jakarta Sans" w:eastAsia="Plus Jakarta Sans" w:hAnsi="Plus Jakarta Sans"/>
+                  <w:color w:val="1F2937"/>
+                  <w:sz w:val="20"/>
+                  <w:szCs w:val="20"/>
+                </w:rPr>
+                <w:t xml:space="preserve">GitHub Actions: lint, typecheck, test, build → deploy ke Helipod</w:t>
               </w:r>
             </w:p>
           </w:tc>
@@ -6870,81 +6673,44 @@
                   <w:sz w:val="20"/>
                   <w:szCs w:val="20"/>
                 </w:rPr>
-                <w:t xml:space="preserve">Upgrade</w:t>
-              </w:r>
-            </w:p>
-          </w:tc>
-          <w:p/>
-        </w:tc>
-        <w:tc>
-          <w:tcPr>
-            <w:tcMar>
-              <w:top w:type="dxa" w:w="90"/>
-              <w:left w:type="dxa" w:w="130"/>
-              <w:bottom w:type="dxa" w:w="90"/>
-              <w:right w:type="dxa" w:w="130"/>
-            </w:tcMar>
-            <w:vAlign w:val="center"/>
-          </w:tcPr>
-          <w:tc>
-            <w:tcPr>
-              <w:tcMar>
-                <w:top w:type="dxa" w:w="90"/>
-                <w:left w:type="dxa" w:w="130"/>
-                <w:bottom w:type="dxa" w:w="90"/>
-                <w:right w:type="dxa" w:w="130"/>
-              </w:tcMar>
-              <w:vAlign w:val="center"/>
-            </w:tcPr>
-            <w:p>
-              <w:pPr>
-                <w:spacing w:after="0" w:before="0"/>
-              </w:pPr>
-              <w:r>
-                <w:rPr>
-                  <w:rFonts w:ascii="Plus Jakarta Sans" w:cs="Plus Jakarta Sans" w:eastAsia="Plus Jakarta Sans" w:hAnsi="Plus Jakarta Sans"/>
-                  <w:color w:val="1F2937"/>
-                  <w:sz w:val="19"/>
-                  <w:szCs w:val="19"/>
-                </w:rPr>
-                <w:t xml:space="preserve">Supabase Pro +Rp 1.200.000/bulan (~$75): DB 8GB, backup point-in-time, bandwidth 250GB</w:t>
-              </w:r>
-            </w:p>
-          </w:tc>
-          <w:p/>
-        </w:tc>
-        <w:tc>
-          <w:tcPr>
-            <w:tcMar>
-              <w:top w:type="dxa" w:w="90"/>
-              <w:left w:type="dxa" w:w="130"/>
-              <w:bottom w:type="dxa" w:w="90"/>
-              <w:right w:type="dxa" w:w="130"/>
-            </w:tcMar>
-            <w:vAlign w:val="center"/>
-          </w:tcPr>
-          <w:tc>
-            <w:tcPr>
-              <w:tcMar>
-                <w:top w:type="dxa" w:w="90"/>
-                <w:left w:type="dxa" w:w="130"/>
-                <w:bottom w:type="dxa" w:w="90"/>
-                <w:right w:type="dxa" w:w="130"/>
-              </w:tcMar>
-              <w:vAlign w:val="center"/>
-            </w:tcPr>
-            <w:p>
-              <w:pPr>
-                <w:spacing w:after="0" w:before="0"/>
-              </w:pPr>
-              <w:r>
-                <w:rPr>
-                  <w:rFonts w:ascii="Plus Jakarta Sans" w:cs="Plus Jakarta Sans" w:eastAsia="Plus Jakarta Sans" w:hAnsi="Plus Jakarta Sans"/>
-                  <w:color w:val="1F2937"/>
-                  <w:sz w:val="19"/>
-                  <w:szCs w:val="19"/>
-                </w:rPr>
-                <w:t xml:space="preserve">Scale up spek VPS kapan saja — mulai +Rp 213.000/bulan (4 vCPU, 16GB RAM)</w:t>
+                <w:t xml:space="preserve">Storage Dokumen</w:t>
+              </w:r>
+            </w:p>
+          </w:tc>
+          <w:p/>
+        </w:tc>
+        <w:tc>
+          <w:tcPr>
+            <w:tcMar>
+              <w:top w:type="dxa" w:w="90"/>
+              <w:left w:type="dxa" w:w="130"/>
+              <w:bottom w:type="dxa" w:w="90"/>
+              <w:right w:type="dxa" w:w="130"/>
+            </w:tcMar>
+            <w:vAlign w:val="center"/>
+          </w:tcPr>
+          <w:tc>
+            <w:tcPr>
+              <w:tcMar>
+                <w:top w:type="dxa" w:w="90"/>
+                <w:left w:type="dxa" w:w="130"/>
+                <w:bottom w:type="dxa" w:w="90"/>
+                <w:right w:type="dxa" w:w="130"/>
+              </w:tcMar>
+              <w:vAlign w:val="center"/>
+            </w:tcPr>
+            <w:p>
+              <w:pPr>
+                <w:spacing w:after="0" w:before="0"/>
+              </w:pPr>
+              <w:r>
+                <w:rPr>
+                  <w:rFonts w:ascii="Plus Jakarta Sans" w:cs="Plus Jakarta Sans" w:eastAsia="Plus Jakarta Sans" w:hAnsi="Plus Jakarta Sans"/>
+                  <w:color w:val="1F2937"/>
+                  <w:sz w:val="20"/>
+                  <w:szCs w:val="20"/>
+                </w:rPr>
+                <w:t xml:space="preserve">±1 GB/tahun disimpan di R2, bukan di server (15 GB cukup untuk aplikasi)</w:t>
               </w:r>
             </w:p>
           </w:tc>
@@ -6952,6 +6718,79 @@
         </w:tc>
       </w:tr>
     </w:tbl>
+    <w:p>
+      <w:pPr>
+        <w:spacing w:after="0" w:before="0"/>
+      </w:pPr>
+      <w:r>
+        <w:rPr>
+          <w:rFonts w:ascii="Plus Jakarta Sans" w:cs="Plus Jakarta Sans" w:eastAsia="Plus Jakarta Sans" w:hAnsi="Plus Jakarta Sans"/>
+          <w:color w:val="1F2937"/>
+          <w:sz w:val="22"/>
+          <w:szCs w:val="22"/>
+        </w:rPr>
+        <w:t xml:space="preserve"> </w:t>
+      </w:r>
+    </w:p>
+    <w:p>
+      <w:pPr>
+        <w:pStyle w:val="Heading3"/>
+        <w:spacing w:after="160" w:before="200"/>
+      </w:pPr>
+      <w:r>
+        <w:rPr>
+          <w:rFonts w:ascii="Plus Jakarta Sans" w:cs="Plus Jakarta Sans" w:eastAsia="Plus Jakarta Sans" w:hAnsi="Plus Jakarta Sans"/>
+          <w:b/>
+          <w:bCs/>
+          <w:color w:val="082B66"/>
+          <w:sz w:val="23"/>
+          <w:szCs w:val="23"/>
+        </w:rPr>
+        <w:t xml:space="preserve">Alur Upload &amp; Download Dokumen</w:t>
+      </w:r>
+    </w:p>
+    <w:p>
+      <w:pPr>
+        <w:spacing w:after="120" w:before="0"/>
+      </w:pPr>
+      <w:r>
+        <w:rPr>
+          <w:rFonts w:ascii="Plus Jakarta Sans" w:cs="Plus Jakarta Sans" w:eastAsia="Plus Jakarta Sans" w:hAnsi="Plus Jakarta Sans"/>
+          <w:color w:val="1F2937"/>
+          <w:sz w:val="22"/>
+          <w:szCs w:val="22"/>
+        </w:rPr>
+        <w:t xml:space="preserve">Upload: browser minta presigned URL → Next.js generate → browser upload langsung ke R2 (tanpa lewat server, hemat CPU/storage).</w:t>
+      </w:r>
+    </w:p>
+    <w:p>
+      <w:pPr>
+        <w:spacing w:after="120" w:before="0"/>
+      </w:pPr>
+      <w:r>
+        <w:rPr>
+          <w:rFonts w:ascii="Plus Jakarta Sans" w:cs="Plus Jakarta Sans" w:eastAsia="Plus Jakarta Sans" w:hAnsi="Plus Jakarta Sans"/>
+          <w:color w:val="1F2937"/>
+          <w:sz w:val="22"/>
+          <w:szCs w:val="22"/>
+        </w:rPr>
+        <w:t xml:space="preserve">Download/lihat: admin login → Next.js cek otorisasi → generate signed URL sementara → akses dokumen dari R2. Bucket privat, URL terbatas waktu.</w:t>
+      </w:r>
+    </w:p>
+    <w:p>
+      <w:pPr>
+        <w:spacing w:after="120" w:before="0"/>
+      </w:pPr>
+      <w:r>
+        <w:rPr>
+          <w:rFonts w:ascii="Plus Jakarta Sans" w:cs="Plus Jakarta Sans" w:eastAsia="Plus Jakarta Sans" w:hAnsi="Plus Jakarta Sans"/>
+          <w:color w:val="1F2937"/>
+          <w:sz w:val="22"/>
+          <w:szCs w:val="22"/>
+        </w:rPr>
+        <w:t xml:space="preserve">Backup: PostgreSQL di-backup terjadwal (daily) → compressed SQL → Cloudflare R2 (database-backups/daily/), dengan retention policy. Restore diuji berkala.</w:t>
+      </w:r>
+    </w:p>
     <w:p>
       <w:pPr>
         <w:spacing w:after="0" w:before="0"/>
@@ -6979,7 +6818,7 @@
           <w:sz w:val="22"/>
           <w:szCs w:val="22"/>
         </w:rPr>
-        <w:t xml:space="preserve">Rekomendasi — VPS All-in-One: </w:t>
+        <w:t xml:space="preserve">Catatan: </w:t>
       </w:r>
       <w:r>
         <w:rPr>
@@ -6988,7 +6827,7 @@
           <w:sz w:val="22"/>
           <w:szCs w:val="22"/>
         </w:rPr>
-        <w:t xml:space="preserve">frontend (Next.js) + backend (Supabase) dalam 1 VPS, tanpa Vercel, tanpa langganan cloud, tanpa batas kuota. Satu biaya tetap Rp 300.000/bulan.</w:t>
+        <w:t xml:space="preserve">Tanpa Vercel, tanpa Supabase — semua di 1 server Helipod. Murah (Rp 61.875/bln), sederhana, mudah maintain, production-ready.</w:t>
       </w:r>
     </w:p>
     <w:p>

</xml_diff>

<commit_message>
feat: 3 pilihan arsitektur + harga markup
</commit_message>
<xml_diff>
--- a/proposal/Proposal_Website_SD_Muhammadiyah_Pakel.docx
+++ b/proposal/Proposal_Website_SD_Muhammadiyah_Pakel.docx
@@ -419,7 +419,7 @@
           <w:sz w:val="22"/>
           <w:szCs w:val="22"/>
         </w:rPr>
-        <w:t xml:space="preserve">Arsitektur &amp; Infrastruktur</w:t>
+        <w:t xml:space="preserve">Pilihan Arsitektur &amp; Infrastruktur</w:t>
       </w:r>
       <w:r>
         <w:rPr>
@@ -6138,7 +6138,7 @@
           <w:sz w:val="30"/>
           <w:szCs w:val="30"/>
         </w:rPr>
-        <w:t xml:space="preserve">9. Arsitektur &amp; Infrastruktur</w:t>
+        <w:t xml:space="preserve">9. Pilihan Arsitektur &amp; Infrastruktur</w:t>
       </w:r>
     </w:p>
     <w:p>
@@ -6152,24 +6152,7 @@
           <w:sz w:val="22"/>
           <w:szCs w:val="22"/>
         </w:rPr>
-        <w:t xml:space="preserve">Semua aplikasi berjalan di satu server Helipod — frontend (Next.js) dan database (PostgreSQL) dalam container Docker. Dokumen PPDB dan backup disimpan di Cloudflare R2 (free tier).</w:t>
-      </w:r>
-    </w:p>
-    <w:p>
-      <w:pPr>
-        <w:pStyle w:val="Heading3"/>
-        <w:spacing w:after="160" w:before="200"/>
-      </w:pPr>
-      <w:r>
-        <w:rPr>
-          <w:rFonts w:ascii="Plus Jakarta Sans" w:cs="Plus Jakarta Sans" w:eastAsia="Plus Jakarta Sans" w:hAnsi="Plus Jakarta Sans"/>
-          <w:b/>
-          <w:bCs/>
-          <w:color w:val="082B66"/>
-          <w:sz w:val="23"/>
-          <w:szCs w:val="23"/>
-        </w:rPr>
-        <w:t xml:space="preserve">Spesifikasi Server — Helipod</w:t>
+        <w:t xml:space="preserve">Tersedia 3 pilihan infrastruktur. Semua sudah termasuk hosting, database, penyimpanan dokumen (Cloudflare R2), monitoring, keamanan, dan dukungan teknis setiap bulan.</w:t>
       </w:r>
     </w:p>
     <w:tbl>
@@ -6185,8 +6168,10 @@
         </w:tblBorders>
       </w:tblPr>
       <w:tblGrid>
-        <w:gridCol w:w="2400"/>
-        <w:gridCol w:w="6700"/>
+        <w:gridCol w:w="1500"/>
+        <w:gridCol w:w="2500"/>
+        <w:gridCol w:w="2600"/>
+        <w:gridCol w:w="2500"/>
       </w:tblGrid>
       <w:tr>
         <w:trPr>
@@ -6216,7 +6201,7 @@
                 <w:sz w:val="20"/>
                 <w:szCs w:val="20"/>
               </w:rPr>
-              <w:t xml:space="preserve">Komponen</w:t>
+              <w:t xml:space="preserve">Aspek</w:t>
             </w:r>
           </w:p>
         </w:tc>
@@ -6244,10 +6229,66 @@
                 <w:sz w:val="20"/>
                 <w:szCs w:val="20"/>
               </w:rPr>
-              <w:t xml:space="preserve">Detail</w:t>
+              <w:t xml:space="preserve">Supabase Cloud</w:t>
             </w:r>
           </w:p>
         </w:tc>
+        <w:tc>
+          <w:tcPr>
+            <w:shd w:fill="0B3D91" w:color="auto" w:val="clear"/>
+            <w:tcMar>
+              <w:top w:type="dxa" w:w="90"/>
+              <w:left w:type="dxa" w:w="130"/>
+              <w:bottom w:type="dxa" w:w="90"/>
+              <w:right w:type="dxa" w:w="130"/>
+            </w:tcMar>
+            <w:vAlign w:val="center"/>
+          </w:tcPr>
+          <w:p>
+            <w:pPr>
+              <w:spacing w:after="0" w:before="0"/>
+            </w:pPr>
+            <w:r>
+              <w:rPr>
+                <w:rFonts w:ascii="Plus Jakarta Sans" w:cs="Plus Jakarta Sans" w:eastAsia="Plus Jakarta Sans" w:hAnsi="Plus Jakarta Sans"/>
+                <w:b/>
+                <w:bCs/>
+                <w:color w:val="FFFFFF"/>
+                <w:sz w:val="20"/>
+                <w:szCs w:val="20"/>
+              </w:rPr>
+              <w:t xml:space="preserve">Helipod (Rekomendasi)</w:t>
+            </w:r>
+          </w:p>
+        </w:tc>
+        <w:tc>
+          <w:tcPr>
+            <w:shd w:fill="0B3D91" w:color="auto" w:val="clear"/>
+            <w:tcMar>
+              <w:top w:type="dxa" w:w="90"/>
+              <w:left w:type="dxa" w:w="130"/>
+              <w:bottom w:type="dxa" w:w="90"/>
+              <w:right w:type="dxa" w:w="130"/>
+            </w:tcMar>
+            <w:vAlign w:val="center"/>
+          </w:tcPr>
+          <w:p>
+            <w:pPr>
+              <w:spacing w:after="0" w:before="0"/>
+            </w:pPr>
+            <w:r>
+              <w:rPr>
+                <w:rFonts w:ascii="Plus Jakarta Sans" w:cs="Plus Jakarta Sans" w:eastAsia="Plus Jakarta Sans" w:hAnsi="Plus Jakarta Sans"/>
+                <w:b/>
+                <w:bCs/>
+                <w:color w:val="FFFFFF"/>
+                <w:sz w:val="20"/>
+                <w:szCs w:val="20"/>
+              </w:rPr>
+              <w:t xml:space="preserve">VPS Dedicated</w:t>
+            </w:r>
+          </w:p>
+        </w:tc>
       </w:tr>
       <w:tr>
         <w:tc>
@@ -6283,44 +6324,118 @@
                   <w:sz w:val="20"/>
                   <w:szCs w:val="20"/>
                 </w:rPr>
-                <w:t xml:space="preserve">Server</w:t>
-              </w:r>
-            </w:p>
-          </w:tc>
-          <w:p/>
-        </w:tc>
-        <w:tc>
-          <w:tcPr>
-            <w:tcMar>
-              <w:top w:type="dxa" w:w="90"/>
-              <w:left w:type="dxa" w:w="130"/>
-              <w:bottom w:type="dxa" w:w="90"/>
-              <w:right w:type="dxa" w:w="130"/>
-            </w:tcMar>
-            <w:vAlign w:val="center"/>
-          </w:tcPr>
-          <w:tc>
-            <w:tcPr>
-              <w:tcMar>
-                <w:top w:type="dxa" w:w="90"/>
-                <w:left w:type="dxa" w:w="130"/>
-                <w:bottom w:type="dxa" w:w="90"/>
-                <w:right w:type="dxa" w:w="130"/>
-              </w:tcMar>
-              <w:vAlign w:val="center"/>
-            </w:tcPr>
-            <w:p>
-              <w:pPr>
-                <w:spacing w:after="0" w:before="0"/>
-              </w:pPr>
-              <w:r>
-                <w:rPr>
-                  <w:rFonts w:ascii="Plus Jakarta Sans" w:cs="Plus Jakarta Sans" w:eastAsia="Plus Jakarta Sans" w:hAnsi="Plus Jakarta Sans"/>
-                  <w:color w:val="1F2937"/>
-                  <w:sz w:val="20"/>
-                  <w:szCs w:val="20"/>
-                </w:rPr>
-                <w:t xml:space="preserve">Helipod — 1 vCPU, 1 GB RAM, 15 GB storage, unlimited bandwidth</w:t>
+                <w:t xml:space="preserve">Komponen</w:t>
+              </w:r>
+            </w:p>
+          </w:tc>
+          <w:p/>
+        </w:tc>
+        <w:tc>
+          <w:tcPr>
+            <w:tcMar>
+              <w:top w:type="dxa" w:w="90"/>
+              <w:left w:type="dxa" w:w="130"/>
+              <w:bottom w:type="dxa" w:w="90"/>
+              <w:right w:type="dxa" w:w="130"/>
+            </w:tcMar>
+            <w:vAlign w:val="center"/>
+          </w:tcPr>
+          <w:tc>
+            <w:tcPr>
+              <w:tcMar>
+                <w:top w:type="dxa" w:w="90"/>
+                <w:left w:type="dxa" w:w="130"/>
+                <w:bottom w:type="dxa" w:w="90"/>
+                <w:right w:type="dxa" w:w="130"/>
+              </w:tcMar>
+              <w:vAlign w:val="center"/>
+            </w:tcPr>
+            <w:p>
+              <w:pPr>
+                <w:spacing w:after="0" w:before="0"/>
+              </w:pPr>
+              <w:r>
+                <w:rPr>
+                  <w:rFonts w:ascii="Plus Jakarta Sans" w:cs="Plus Jakarta Sans" w:eastAsia="Plus Jakarta Sans" w:hAnsi="Plus Jakarta Sans"/>
+                  <w:color w:val="1F2937"/>
+                  <w:sz w:val="19"/>
+                  <w:szCs w:val="19"/>
+                </w:rPr>
+                <w:t xml:space="preserve">Vercel + Supabase + R2</w:t>
+              </w:r>
+            </w:p>
+          </w:tc>
+          <w:p/>
+        </w:tc>
+        <w:tc>
+          <w:tcPr>
+            <w:tcMar>
+              <w:top w:type="dxa" w:w="90"/>
+              <w:left w:type="dxa" w:w="130"/>
+              <w:bottom w:type="dxa" w:w="90"/>
+              <w:right w:type="dxa" w:w="130"/>
+            </w:tcMar>
+            <w:vAlign w:val="center"/>
+          </w:tcPr>
+          <w:tc>
+            <w:tcPr>
+              <w:tcMar>
+                <w:top w:type="dxa" w:w="90"/>
+                <w:left w:type="dxa" w:w="130"/>
+                <w:bottom w:type="dxa" w:w="90"/>
+                <w:right w:type="dxa" w:w="130"/>
+              </w:tcMar>
+              <w:vAlign w:val="center"/>
+            </w:tcPr>
+            <w:p>
+              <w:pPr>
+                <w:spacing w:after="0" w:before="0"/>
+              </w:pPr>
+              <w:r>
+                <w:rPr>
+                  <w:rFonts w:ascii="Plus Jakarta Sans" w:cs="Plus Jakarta Sans" w:eastAsia="Plus Jakarta Sans" w:hAnsi="Plus Jakarta Sans"/>
+                  <w:color w:val="1F2937"/>
+                  <w:sz w:val="19"/>
+                  <w:szCs w:val="19"/>
+                </w:rPr>
+                <w:t xml:space="preserve">1 server: Next.js + PostgreSQL + R2</w:t>
+              </w:r>
+            </w:p>
+          </w:tc>
+          <w:p/>
+        </w:tc>
+        <w:tc>
+          <w:tcPr>
+            <w:tcMar>
+              <w:top w:type="dxa" w:w="90"/>
+              <w:left w:type="dxa" w:w="130"/>
+              <w:bottom w:type="dxa" w:w="90"/>
+              <w:right w:type="dxa" w:w="130"/>
+            </w:tcMar>
+            <w:vAlign w:val="center"/>
+          </w:tcPr>
+          <w:tc>
+            <w:tcPr>
+              <w:tcMar>
+                <w:top w:type="dxa" w:w="90"/>
+                <w:left w:type="dxa" w:w="130"/>
+                <w:bottom w:type="dxa" w:w="90"/>
+                <w:right w:type="dxa" w:w="130"/>
+              </w:tcMar>
+              <w:vAlign w:val="center"/>
+            </w:tcPr>
+            <w:p>
+              <w:pPr>
+                <w:spacing w:after="0" w:before="0"/>
+              </w:pPr>
+              <w:r>
+                <w:rPr>
+                  <w:rFonts w:ascii="Plus Jakarta Sans" w:cs="Plus Jakarta Sans" w:eastAsia="Plus Jakarta Sans" w:hAnsi="Plus Jakarta Sans"/>
+                  <w:color w:val="1F2937"/>
+                  <w:sz w:val="19"/>
+                  <w:szCs w:val="19"/>
+                </w:rPr>
+                <w:t xml:space="preserve">2 vCPU, 8GB RAM, full kontrol</w:t>
               </w:r>
             </w:p>
           </w:tc>
@@ -6361,44 +6476,124 @@
                   <w:sz w:val="20"/>
                   <w:szCs w:val="20"/>
                 </w:rPr>
-                <w:t xml:space="preserve">Biaya</w:t>
-              </w:r>
-            </w:p>
-          </w:tc>
-          <w:p/>
-        </w:tc>
-        <w:tc>
-          <w:tcPr>
-            <w:tcMar>
-              <w:top w:type="dxa" w:w="90"/>
-              <w:left w:type="dxa" w:w="130"/>
-              <w:bottom w:type="dxa" w:w="90"/>
-              <w:right w:type="dxa" w:w="130"/>
-            </w:tcMar>
-            <w:vAlign w:val="center"/>
-          </w:tcPr>
-          <w:tc>
-            <w:tcPr>
-              <w:tcMar>
-                <w:top w:type="dxa" w:w="90"/>
-                <w:left w:type="dxa" w:w="130"/>
-                <w:bottom w:type="dxa" w:w="90"/>
-                <w:right w:type="dxa" w:w="130"/>
-              </w:tcMar>
-              <w:vAlign w:val="center"/>
-            </w:tcPr>
-            <w:p>
-              <w:pPr>
-                <w:spacing w:after="0" w:before="0"/>
-              </w:pPr>
-              <w:r>
-                <w:rPr>
-                  <w:rFonts w:ascii="Plus Jakarta Sans" w:cs="Plus Jakarta Sans" w:eastAsia="Plus Jakarta Sans" w:hAnsi="Plus Jakarta Sans"/>
-                  <w:color w:val="1F2937"/>
-                  <w:sz w:val="20"/>
-                  <w:szCs w:val="20"/>
-                </w:rPr>
-                <w:t xml:space="preserve">Rp 61.875/bulan</w:t>
+                <w:t xml:space="preserve">Biaya Bulanan</w:t>
+              </w:r>
+            </w:p>
+          </w:tc>
+          <w:p/>
+        </w:tc>
+        <w:tc>
+          <w:tcPr>
+            <w:tcMar>
+              <w:top w:type="dxa" w:w="90"/>
+              <w:left w:type="dxa" w:w="130"/>
+              <w:bottom w:type="dxa" w:w="90"/>
+              <w:right w:type="dxa" w:w="130"/>
+            </w:tcMar>
+            <w:vAlign w:val="center"/>
+          </w:tcPr>
+          <w:tc>
+            <w:tcPr>
+              <w:tcMar>
+                <w:top w:type="dxa" w:w="90"/>
+                <w:left w:type="dxa" w:w="130"/>
+                <w:bottom w:type="dxa" w:w="90"/>
+                <w:right w:type="dxa" w:w="130"/>
+              </w:tcMar>
+              <w:vAlign w:val="center"/>
+            </w:tcPr>
+            <w:p>
+              <w:pPr>
+                <w:spacing w:after="0" w:before="0"/>
+              </w:pPr>
+              <w:r>
+                <w:rPr>
+                  <w:rFonts w:ascii="Plus Jakarta Sans" w:cs="Plus Jakarta Sans" w:eastAsia="Plus Jakarta Sans" w:hAnsi="Plus Jakarta Sans"/>
+                  <w:b/>
+                  <w:bCs/>
+                  <w:color w:val="0B3D91"/>
+                  <w:sz w:val="19"/>
+                  <w:szCs w:val="19"/>
+                </w:rPr>
+                <w:t xml:space="preserve">Rp 75.000</w:t>
+              </w:r>
+            </w:p>
+          </w:tc>
+          <w:p/>
+        </w:tc>
+        <w:tc>
+          <w:tcPr>
+            <w:tcMar>
+              <w:top w:type="dxa" w:w="90"/>
+              <w:left w:type="dxa" w:w="130"/>
+              <w:bottom w:type="dxa" w:w="90"/>
+              <w:right w:type="dxa" w:w="130"/>
+            </w:tcMar>
+            <w:vAlign w:val="center"/>
+          </w:tcPr>
+          <w:tc>
+            <w:tcPr>
+              <w:tcMar>
+                <w:top w:type="dxa" w:w="90"/>
+                <w:left w:type="dxa" w:w="130"/>
+                <w:bottom w:type="dxa" w:w="90"/>
+                <w:right w:type="dxa" w:w="130"/>
+              </w:tcMar>
+              <w:vAlign w:val="center"/>
+            </w:tcPr>
+            <w:p>
+              <w:pPr>
+                <w:spacing w:after="0" w:before="0"/>
+              </w:pPr>
+              <w:r>
+                <w:rPr>
+                  <w:rFonts w:ascii="Plus Jakarta Sans" w:cs="Plus Jakarta Sans" w:eastAsia="Plus Jakarta Sans" w:hAnsi="Plus Jakarta Sans"/>
+                  <w:b/>
+                  <w:bCs/>
+                  <w:color w:val="0B3D91"/>
+                  <w:sz w:val="19"/>
+                  <w:szCs w:val="19"/>
+                </w:rPr>
+                <w:t xml:space="preserve">Rp 150.000</w:t>
+              </w:r>
+            </w:p>
+          </w:tc>
+          <w:p/>
+        </w:tc>
+        <w:tc>
+          <w:tcPr>
+            <w:tcMar>
+              <w:top w:type="dxa" w:w="90"/>
+              <w:left w:type="dxa" w:w="130"/>
+              <w:bottom w:type="dxa" w:w="90"/>
+              <w:right w:type="dxa" w:w="130"/>
+            </w:tcMar>
+            <w:vAlign w:val="center"/>
+          </w:tcPr>
+          <w:tc>
+            <w:tcPr>
+              <w:tcMar>
+                <w:top w:type="dxa" w:w="90"/>
+                <w:left w:type="dxa" w:w="130"/>
+                <w:bottom w:type="dxa" w:w="90"/>
+                <w:right w:type="dxa" w:w="130"/>
+              </w:tcMar>
+              <w:vAlign w:val="center"/>
+            </w:tcPr>
+            <w:p>
+              <w:pPr>
+                <w:spacing w:after="0" w:before="0"/>
+              </w:pPr>
+              <w:r>
+                <w:rPr>
+                  <w:rFonts w:ascii="Plus Jakarta Sans" w:cs="Plus Jakarta Sans" w:eastAsia="Plus Jakarta Sans" w:hAnsi="Plus Jakarta Sans"/>
+                  <w:b/>
+                  <w:bCs/>
+                  <w:color w:val="0B3D91"/>
+                  <w:sz w:val="19"/>
+                  <w:szCs w:val="19"/>
+                </w:rPr>
+                <w:t xml:space="preserve">Rp 350.000</w:t>
               </w:r>
             </w:p>
           </w:tc>
@@ -6439,44 +6634,118 @@
                   <w:sz w:val="20"/>
                   <w:szCs w:val="20"/>
                 </w:rPr>
-                <w:t xml:space="preserve">Aplikasi</w:t>
-              </w:r>
-            </w:p>
-          </w:tc>
-          <w:p/>
-        </w:tc>
-        <w:tc>
-          <w:tcPr>
-            <w:tcMar>
-              <w:top w:type="dxa" w:w="90"/>
-              <w:left w:type="dxa" w:w="130"/>
-              <w:bottom w:type="dxa" w:w="90"/>
-              <w:right w:type="dxa" w:w="130"/>
-            </w:tcMar>
-            <w:vAlign w:val="center"/>
-          </w:tcPr>
-          <w:tc>
-            <w:tcPr>
-              <w:tcMar>
-                <w:top w:type="dxa" w:w="90"/>
-                <w:left w:type="dxa" w:w="130"/>
-                <w:bottom w:type="dxa" w:w="90"/>
-                <w:right w:type="dxa" w:w="130"/>
-              </w:tcMar>
-              <w:vAlign w:val="center"/>
-            </w:tcPr>
-            <w:p>
-              <w:pPr>
-                <w:spacing w:after="0" w:before="0"/>
-              </w:pPr>
-              <w:r>
-                <w:rPr>
-                  <w:rFonts w:ascii="Plus Jakarta Sans" w:cs="Plus Jakarta Sans" w:eastAsia="Plus Jakarta Sans" w:hAnsi="Plus Jakarta Sans"/>
-                  <w:color w:val="1F2937"/>
-                  <w:sz w:val="20"/>
-                  <w:szCs w:val="20"/>
-                </w:rPr>
-                <w:t xml:space="preserve">Next.js (Docker) + PostgreSQL (Docker Compose) + Nginx</w:t>
+                <w:t xml:space="preserve">Biaya Setup</w:t>
+              </w:r>
+            </w:p>
+          </w:tc>
+          <w:p/>
+        </w:tc>
+        <w:tc>
+          <w:tcPr>
+            <w:tcMar>
+              <w:top w:type="dxa" w:w="90"/>
+              <w:left w:type="dxa" w:w="130"/>
+              <w:bottom w:type="dxa" w:w="90"/>
+              <w:right w:type="dxa" w:w="130"/>
+            </w:tcMar>
+            <w:vAlign w:val="center"/>
+          </w:tcPr>
+          <w:tc>
+            <w:tcPr>
+              <w:tcMar>
+                <w:top w:type="dxa" w:w="90"/>
+                <w:left w:type="dxa" w:w="130"/>
+                <w:bottom w:type="dxa" w:w="90"/>
+                <w:right w:type="dxa" w:w="130"/>
+              </w:tcMar>
+              <w:vAlign w:val="center"/>
+            </w:tcPr>
+            <w:p>
+              <w:pPr>
+                <w:spacing w:after="0" w:before="0"/>
+              </w:pPr>
+              <w:r>
+                <w:rPr>
+                  <w:rFonts w:ascii="Plus Jakarta Sans" w:cs="Plus Jakarta Sans" w:eastAsia="Plus Jakarta Sans" w:hAnsi="Plus Jakarta Sans"/>
+                  <w:color w:val="1F2937"/>
+                  <w:sz w:val="19"/>
+                  <w:szCs w:val="19"/>
+                </w:rPr>
+                <w:t xml:space="preserve">Rp 0</w:t>
+              </w:r>
+            </w:p>
+          </w:tc>
+          <w:p/>
+        </w:tc>
+        <w:tc>
+          <w:tcPr>
+            <w:tcMar>
+              <w:top w:type="dxa" w:w="90"/>
+              <w:left w:type="dxa" w:w="130"/>
+              <w:bottom w:type="dxa" w:w="90"/>
+              <w:right w:type="dxa" w:w="130"/>
+            </w:tcMar>
+            <w:vAlign w:val="center"/>
+          </w:tcPr>
+          <w:tc>
+            <w:tcPr>
+              <w:tcMar>
+                <w:top w:type="dxa" w:w="90"/>
+                <w:left w:type="dxa" w:w="130"/>
+                <w:bottom w:type="dxa" w:w="90"/>
+                <w:right w:type="dxa" w:w="130"/>
+              </w:tcMar>
+              <w:vAlign w:val="center"/>
+            </w:tcPr>
+            <w:p>
+              <w:pPr>
+                <w:spacing w:after="0" w:before="0"/>
+              </w:pPr>
+              <w:r>
+                <w:rPr>
+                  <w:rFonts w:ascii="Plus Jakarta Sans" w:cs="Plus Jakarta Sans" w:eastAsia="Plus Jakarta Sans" w:hAnsi="Plus Jakarta Sans"/>
+                  <w:color w:val="1F2937"/>
+                  <w:sz w:val="19"/>
+                  <w:szCs w:val="19"/>
+                </w:rPr>
+                <w:t xml:space="preserve">Rp 500.000 sekali</w:t>
+              </w:r>
+            </w:p>
+          </w:tc>
+          <w:p/>
+        </w:tc>
+        <w:tc>
+          <w:tcPr>
+            <w:tcMar>
+              <w:top w:type="dxa" w:w="90"/>
+              <w:left w:type="dxa" w:w="130"/>
+              <w:bottom w:type="dxa" w:w="90"/>
+              <w:right w:type="dxa" w:w="130"/>
+            </w:tcMar>
+            <w:vAlign w:val="center"/>
+          </w:tcPr>
+          <w:tc>
+            <w:tcPr>
+              <w:tcMar>
+                <w:top w:type="dxa" w:w="90"/>
+                <w:left w:type="dxa" w:w="130"/>
+                <w:bottom w:type="dxa" w:w="90"/>
+                <w:right w:type="dxa" w:w="130"/>
+              </w:tcMar>
+              <w:vAlign w:val="center"/>
+            </w:tcPr>
+            <w:p>
+              <w:pPr>
+                <w:spacing w:after="0" w:before="0"/>
+              </w:pPr>
+              <w:r>
+                <w:rPr>
+                  <w:rFonts w:ascii="Plus Jakarta Sans" w:cs="Plus Jakarta Sans" w:eastAsia="Plus Jakarta Sans" w:hAnsi="Plus Jakarta Sans"/>
+                  <w:color w:val="1F2937"/>
+                  <w:sz w:val="19"/>
+                  <w:szCs w:val="19"/>
+                </w:rPr>
+                <w:t xml:space="preserve">Rp 1.500.000 sekali</w:t>
               </w:r>
             </w:p>
           </w:tc>
@@ -6517,44 +6786,118 @@
                   <w:sz w:val="20"/>
                   <w:szCs w:val="20"/>
                 </w:rPr>
-                <w:t xml:space="preserve">Object Storage</w:t>
-              </w:r>
-            </w:p>
-          </w:tc>
-          <w:p/>
-        </w:tc>
-        <w:tc>
-          <w:tcPr>
-            <w:tcMar>
-              <w:top w:type="dxa" w:w="90"/>
-              <w:left w:type="dxa" w:w="130"/>
-              <w:bottom w:type="dxa" w:w="90"/>
-              <w:right w:type="dxa" w:w="130"/>
-            </w:tcMar>
-            <w:vAlign w:val="center"/>
-          </w:tcPr>
-          <w:tc>
-            <w:tcPr>
-              <w:tcMar>
-                <w:top w:type="dxa" w:w="90"/>
-                <w:left w:type="dxa" w:w="130"/>
-                <w:bottom w:type="dxa" w:w="90"/>
-                <w:right w:type="dxa" w:w="130"/>
-              </w:tcMar>
-              <w:vAlign w:val="center"/>
-            </w:tcPr>
-            <w:p>
-              <w:pPr>
-                <w:spacing w:after="0" w:before="0"/>
-              </w:pPr>
-              <w:r>
-                <w:rPr>
-                  <w:rFonts w:ascii="Plus Jakarta Sans" w:cs="Plus Jakarta Sans" w:eastAsia="Plus Jakarta Sans" w:hAnsi="Plus Jakarta Sans"/>
-                  <w:color w:val="1F2937"/>
-                  <w:sz w:val="20"/>
-                  <w:szCs w:val="20"/>
-                </w:rPr>
-                <w:t xml:space="preserve">Cloudflare R2 (free tier) — dokumen pendaftar + backup database</w:t>
+                <w:t xml:space="preserve">Kelebihan</w:t>
+              </w:r>
+            </w:p>
+          </w:tc>
+          <w:p/>
+        </w:tc>
+        <w:tc>
+          <w:tcPr>
+            <w:tcMar>
+              <w:top w:type="dxa" w:w="90"/>
+              <w:left w:type="dxa" w:w="130"/>
+              <w:bottom w:type="dxa" w:w="90"/>
+              <w:right w:type="dxa" w:w="130"/>
+            </w:tcMar>
+            <w:vAlign w:val="center"/>
+          </w:tcPr>
+          <w:tc>
+            <w:tcPr>
+              <w:tcMar>
+                <w:top w:type="dxa" w:w="90"/>
+                <w:left w:type="dxa" w:w="130"/>
+                <w:bottom w:type="dxa" w:w="90"/>
+                <w:right w:type="dxa" w:w="130"/>
+              </w:tcMar>
+              <w:vAlign w:val="center"/>
+            </w:tcPr>
+            <w:p>
+              <w:pPr>
+                <w:spacing w:after="0" w:before="0"/>
+              </w:pPr>
+              <w:r>
+                <w:rPr>
+                  <w:rFonts w:ascii="Plus Jakarta Sans" w:cs="Plus Jakarta Sans" w:eastAsia="Plus Jakarta Sans" w:hAnsi="Plus Jakarta Sans"/>
+                  <w:color w:val="1F2937"/>
+                  <w:sz w:val="19"/>
+                  <w:szCs w:val="19"/>
+                </w:rPr>
+                <w:t xml:space="preserve">Paling simpel, auto scale, tanpa urus server</w:t>
+              </w:r>
+            </w:p>
+          </w:tc>
+          <w:p/>
+        </w:tc>
+        <w:tc>
+          <w:tcPr>
+            <w:tcMar>
+              <w:top w:type="dxa" w:w="90"/>
+              <w:left w:type="dxa" w:w="130"/>
+              <w:bottom w:type="dxa" w:w="90"/>
+              <w:right w:type="dxa" w:w="130"/>
+            </w:tcMar>
+            <w:vAlign w:val="center"/>
+          </w:tcPr>
+          <w:tc>
+            <w:tcPr>
+              <w:tcMar>
+                <w:top w:type="dxa" w:w="90"/>
+                <w:left w:type="dxa" w:w="130"/>
+                <w:bottom w:type="dxa" w:w="90"/>
+                <w:right w:type="dxa" w:w="130"/>
+              </w:tcMar>
+              <w:vAlign w:val="center"/>
+            </w:tcPr>
+            <w:p>
+              <w:pPr>
+                <w:spacing w:after="0" w:before="0"/>
+              </w:pPr>
+              <w:r>
+                <w:rPr>
+                  <w:rFonts w:ascii="Plus Jakarta Sans" w:cs="Plus Jakarta Sans" w:eastAsia="Plus Jakarta Sans" w:hAnsi="Plus Jakarta Sans"/>
+                  <w:color w:val="1F2937"/>
+                  <w:sz w:val="19"/>
+                  <w:szCs w:val="19"/>
+                </w:rPr>
+                <w:t xml:space="preserve">Murah, all-in-one, mudah di-maintain</w:t>
+              </w:r>
+            </w:p>
+          </w:tc>
+          <w:p/>
+        </w:tc>
+        <w:tc>
+          <w:tcPr>
+            <w:tcMar>
+              <w:top w:type="dxa" w:w="90"/>
+              <w:left w:type="dxa" w:w="130"/>
+              <w:bottom w:type="dxa" w:w="90"/>
+              <w:right w:type="dxa" w:w="130"/>
+            </w:tcMar>
+            <w:vAlign w:val="center"/>
+          </w:tcPr>
+          <w:tc>
+            <w:tcPr>
+              <w:tcMar>
+                <w:top w:type="dxa" w:w="90"/>
+                <w:left w:type="dxa" w:w="130"/>
+                <w:bottom w:type="dxa" w:w="90"/>
+                <w:right w:type="dxa" w:w="130"/>
+              </w:tcMar>
+              <w:vAlign w:val="center"/>
+            </w:tcPr>
+            <w:p>
+              <w:pPr>
+                <w:spacing w:after="0" w:before="0"/>
+              </w:pPr>
+              <w:r>
+                <w:rPr>
+                  <w:rFonts w:ascii="Plus Jakarta Sans" w:cs="Plus Jakarta Sans" w:eastAsia="Plus Jakarta Sans" w:hAnsi="Plus Jakarta Sans"/>
+                  <w:color w:val="1F2937"/>
+                  <w:sz w:val="19"/>
+                  <w:szCs w:val="19"/>
+                </w:rPr>
+                <w:t xml:space="preserve">Resource besar, email kustom, multi-aplikasi</w:t>
               </w:r>
             </w:p>
           </w:tc>
@@ -6595,122 +6938,118 @@
                   <w:sz w:val="20"/>
                   <w:szCs w:val="20"/>
                 </w:rPr>
-                <w:t xml:space="preserve">CI/CD</w:t>
-              </w:r>
-            </w:p>
-          </w:tc>
-          <w:p/>
-        </w:tc>
-        <w:tc>
-          <w:tcPr>
-            <w:tcMar>
-              <w:top w:type="dxa" w:w="90"/>
-              <w:left w:type="dxa" w:w="130"/>
-              <w:bottom w:type="dxa" w:w="90"/>
-              <w:right w:type="dxa" w:w="130"/>
-            </w:tcMar>
-            <w:vAlign w:val="center"/>
-          </w:tcPr>
-          <w:tc>
-            <w:tcPr>
-              <w:tcMar>
-                <w:top w:type="dxa" w:w="90"/>
-                <w:left w:type="dxa" w:w="130"/>
-                <w:bottom w:type="dxa" w:w="90"/>
-                <w:right w:type="dxa" w:w="130"/>
-              </w:tcMar>
-              <w:vAlign w:val="center"/>
-            </w:tcPr>
-            <w:p>
-              <w:pPr>
-                <w:spacing w:after="0" w:before="0"/>
-              </w:pPr>
-              <w:r>
-                <w:rPr>
-                  <w:rFonts w:ascii="Plus Jakarta Sans" w:cs="Plus Jakarta Sans" w:eastAsia="Plus Jakarta Sans" w:hAnsi="Plus Jakarta Sans"/>
-                  <w:color w:val="1F2937"/>
-                  <w:sz w:val="20"/>
-                  <w:szCs w:val="20"/>
-                </w:rPr>
-                <w:t xml:space="preserve">GitHub Actions: lint, typecheck, test, build → deploy ke Helipod</w:t>
-              </w:r>
-            </w:p>
-          </w:tc>
-          <w:p/>
-        </w:tc>
-      </w:tr>
-      <w:tr>
-        <w:tc>
-          <w:tcPr>
-            <w:tcMar>
-              <w:top w:type="dxa" w:w="90"/>
-              <w:left w:type="dxa" w:w="130"/>
-              <w:bottom w:type="dxa" w:w="90"/>
-              <w:right w:type="dxa" w:w="130"/>
-            </w:tcMar>
-            <w:vAlign w:val="center"/>
-          </w:tcPr>
-          <w:tc>
-            <w:tcPr>
-              <w:tcMar>
-                <w:top w:type="dxa" w:w="90"/>
-                <w:left w:type="dxa" w:w="130"/>
-                <w:bottom w:type="dxa" w:w="90"/>
-                <w:right w:type="dxa" w:w="130"/>
-              </w:tcMar>
-              <w:vAlign w:val="center"/>
-            </w:tcPr>
-            <w:p>
-              <w:pPr>
-                <w:spacing w:after="0" w:before="0"/>
-              </w:pPr>
-              <w:r>
-                <w:rPr>
-                  <w:rFonts w:ascii="Plus Jakarta Sans" w:cs="Plus Jakarta Sans" w:eastAsia="Plus Jakarta Sans" w:hAnsi="Plus Jakarta Sans"/>
-                  <w:b/>
-                  <w:bCs/>
-                  <w:color w:val="1F2937"/>
-                  <w:sz w:val="20"/>
-                  <w:szCs w:val="20"/>
-                </w:rPr>
-                <w:t xml:space="preserve">Storage Dokumen</w:t>
-              </w:r>
-            </w:p>
-          </w:tc>
-          <w:p/>
-        </w:tc>
-        <w:tc>
-          <w:tcPr>
-            <w:tcMar>
-              <w:top w:type="dxa" w:w="90"/>
-              <w:left w:type="dxa" w:w="130"/>
-              <w:bottom w:type="dxa" w:w="90"/>
-              <w:right w:type="dxa" w:w="130"/>
-            </w:tcMar>
-            <w:vAlign w:val="center"/>
-          </w:tcPr>
-          <w:tc>
-            <w:tcPr>
-              <w:tcMar>
-                <w:top w:type="dxa" w:w="90"/>
-                <w:left w:type="dxa" w:w="130"/>
-                <w:bottom w:type="dxa" w:w="90"/>
-                <w:right w:type="dxa" w:w="130"/>
-              </w:tcMar>
-              <w:vAlign w:val="center"/>
-            </w:tcPr>
-            <w:p>
-              <w:pPr>
-                <w:spacing w:after="0" w:before="0"/>
-              </w:pPr>
-              <w:r>
-                <w:rPr>
-                  <w:rFonts w:ascii="Plus Jakarta Sans" w:cs="Plus Jakarta Sans" w:eastAsia="Plus Jakarta Sans" w:hAnsi="Plus Jakarta Sans"/>
-                  <w:color w:val="1F2937"/>
-                  <w:sz w:val="20"/>
-                  <w:szCs w:val="20"/>
-                </w:rPr>
-                <w:t xml:space="preserve">±1 GB/tahun disimpan di R2, bukan di server (15 GB cukup untuk aplikasi)</w:t>
+                <w:t xml:space="preserve">Cocok Untuk</w:t>
+              </w:r>
+            </w:p>
+          </w:tc>
+          <w:p/>
+        </w:tc>
+        <w:tc>
+          <w:tcPr>
+            <w:tcMar>
+              <w:top w:type="dxa" w:w="90"/>
+              <w:left w:type="dxa" w:w="130"/>
+              <w:bottom w:type="dxa" w:w="90"/>
+              <w:right w:type="dxa" w:w="130"/>
+            </w:tcMar>
+            <w:vAlign w:val="center"/>
+          </w:tcPr>
+          <w:tc>
+            <w:tcPr>
+              <w:tcMar>
+                <w:top w:type="dxa" w:w="90"/>
+                <w:left w:type="dxa" w:w="130"/>
+                <w:bottom w:type="dxa" w:w="90"/>
+                <w:right w:type="dxa" w:w="130"/>
+              </w:tcMar>
+              <w:vAlign w:val="center"/>
+            </w:tcPr>
+            <w:p>
+              <w:pPr>
+                <w:spacing w:after="0" w:before="0"/>
+              </w:pPr>
+              <w:r>
+                <w:rPr>
+                  <w:rFonts w:ascii="Plus Jakarta Sans" w:cs="Plus Jakarta Sans" w:eastAsia="Plus Jakarta Sans" w:hAnsi="Plus Jakarta Sans"/>
+                  <w:color w:val="1F2937"/>
+                  <w:sz w:val="19"/>
+                  <w:szCs w:val="19"/>
+                </w:rPr>
+                <w:t xml:space="preserve">Profil &amp; PPDB reguler</w:t>
+              </w:r>
+            </w:p>
+          </w:tc>
+          <w:p/>
+        </w:tc>
+        <w:tc>
+          <w:tcPr>
+            <w:tcMar>
+              <w:top w:type="dxa" w:w="90"/>
+              <w:left w:type="dxa" w:w="130"/>
+              <w:bottom w:type="dxa" w:w="90"/>
+              <w:right w:type="dxa" w:w="130"/>
+            </w:tcMar>
+            <w:vAlign w:val="center"/>
+          </w:tcPr>
+          <w:tc>
+            <w:tcPr>
+              <w:tcMar>
+                <w:top w:type="dxa" w:w="90"/>
+                <w:left w:type="dxa" w:w="130"/>
+                <w:bottom w:type="dxa" w:w="90"/>
+                <w:right w:type="dxa" w:w="130"/>
+              </w:tcMar>
+              <w:vAlign w:val="center"/>
+            </w:tcPr>
+            <w:p>
+              <w:pPr>
+                <w:spacing w:after="0" w:before="0"/>
+              </w:pPr>
+              <w:r>
+                <w:rPr>
+                  <w:rFonts w:ascii="Plus Jakarta Sans" w:cs="Plus Jakarta Sans" w:eastAsia="Plus Jakarta Sans" w:hAnsi="Plus Jakarta Sans"/>
+                  <w:color w:val="1F2937"/>
+                  <w:sz w:val="19"/>
+                  <w:szCs w:val="19"/>
+                </w:rPr>
+                <w:t xml:space="preserve">Kebanyakan sekolah</w:t>
+              </w:r>
+            </w:p>
+          </w:tc>
+          <w:p/>
+        </w:tc>
+        <w:tc>
+          <w:tcPr>
+            <w:tcMar>
+              <w:top w:type="dxa" w:w="90"/>
+              <w:left w:type="dxa" w:w="130"/>
+              <w:bottom w:type="dxa" w:w="90"/>
+              <w:right w:type="dxa" w:w="130"/>
+            </w:tcMar>
+            <w:vAlign w:val="center"/>
+          </w:tcPr>
+          <w:tc>
+            <w:tcPr>
+              <w:tcMar>
+                <w:top w:type="dxa" w:w="90"/>
+                <w:left w:type="dxa" w:w="130"/>
+                <w:bottom w:type="dxa" w:w="90"/>
+                <w:right w:type="dxa" w:w="130"/>
+              </w:tcMar>
+              <w:vAlign w:val="center"/>
+            </w:tcPr>
+            <w:p>
+              <w:pPr>
+                <w:spacing w:after="0" w:before="0"/>
+              </w:pPr>
+              <w:r>
+                <w:rPr>
+                  <w:rFonts w:ascii="Plus Jakarta Sans" w:cs="Plus Jakarta Sans" w:eastAsia="Plus Jakarta Sans" w:hAnsi="Plus Jakarta Sans"/>
+                  <w:color w:val="1F2937"/>
+                  <w:sz w:val="19"/>
+                  <w:szCs w:val="19"/>
+                </w:rPr>
+                <w:t xml:space="preserve">PPDB volume besar, akademik</w:t>
               </w:r>
             </w:p>
           </w:tc>
@@ -6718,79 +7057,6 @@
         </w:tc>
       </w:tr>
     </w:tbl>
-    <w:p>
-      <w:pPr>
-        <w:spacing w:after="0" w:before="0"/>
-      </w:pPr>
-      <w:r>
-        <w:rPr>
-          <w:rFonts w:ascii="Plus Jakarta Sans" w:cs="Plus Jakarta Sans" w:eastAsia="Plus Jakarta Sans" w:hAnsi="Plus Jakarta Sans"/>
-          <w:color w:val="1F2937"/>
-          <w:sz w:val="22"/>
-          <w:szCs w:val="22"/>
-        </w:rPr>
-        <w:t xml:space="preserve"> </w:t>
-      </w:r>
-    </w:p>
-    <w:p>
-      <w:pPr>
-        <w:pStyle w:val="Heading3"/>
-        <w:spacing w:after="160" w:before="200"/>
-      </w:pPr>
-      <w:r>
-        <w:rPr>
-          <w:rFonts w:ascii="Plus Jakarta Sans" w:cs="Plus Jakarta Sans" w:eastAsia="Plus Jakarta Sans" w:hAnsi="Plus Jakarta Sans"/>
-          <w:b/>
-          <w:bCs/>
-          <w:color w:val="082B66"/>
-          <w:sz w:val="23"/>
-          <w:szCs w:val="23"/>
-        </w:rPr>
-        <w:t xml:space="preserve">Alur Upload &amp; Download Dokumen</w:t>
-      </w:r>
-    </w:p>
-    <w:p>
-      <w:pPr>
-        <w:spacing w:after="120" w:before="0"/>
-      </w:pPr>
-      <w:r>
-        <w:rPr>
-          <w:rFonts w:ascii="Plus Jakarta Sans" w:cs="Plus Jakarta Sans" w:eastAsia="Plus Jakarta Sans" w:hAnsi="Plus Jakarta Sans"/>
-          <w:color w:val="1F2937"/>
-          <w:sz w:val="22"/>
-          <w:szCs w:val="22"/>
-        </w:rPr>
-        <w:t xml:space="preserve">Upload: browser minta presigned URL → Next.js generate → browser upload langsung ke R2 (tanpa lewat server, hemat CPU/storage).</w:t>
-      </w:r>
-    </w:p>
-    <w:p>
-      <w:pPr>
-        <w:spacing w:after="120" w:before="0"/>
-      </w:pPr>
-      <w:r>
-        <w:rPr>
-          <w:rFonts w:ascii="Plus Jakarta Sans" w:cs="Plus Jakarta Sans" w:eastAsia="Plus Jakarta Sans" w:hAnsi="Plus Jakarta Sans"/>
-          <w:color w:val="1F2937"/>
-          <w:sz w:val="22"/>
-          <w:szCs w:val="22"/>
-        </w:rPr>
-        <w:t xml:space="preserve">Download/lihat: admin login → Next.js cek otorisasi → generate signed URL sementara → akses dokumen dari R2. Bucket privat, URL terbatas waktu.</w:t>
-      </w:r>
-    </w:p>
-    <w:p>
-      <w:pPr>
-        <w:spacing w:after="120" w:before="0"/>
-      </w:pPr>
-      <w:r>
-        <w:rPr>
-          <w:rFonts w:ascii="Plus Jakarta Sans" w:cs="Plus Jakarta Sans" w:eastAsia="Plus Jakarta Sans" w:hAnsi="Plus Jakarta Sans"/>
-          <w:color w:val="1F2937"/>
-          <w:sz w:val="22"/>
-          <w:szCs w:val="22"/>
-        </w:rPr>
-        <w:t xml:space="preserve">Backup: PostgreSQL di-backup terjadwal (daily) → compressed SQL → Cloudflare R2 (database-backups/daily/), dengan retention policy. Restore diuji berkala.</w:t>
-      </w:r>
-    </w:p>
     <w:p>
       <w:pPr>
         <w:spacing w:after="0" w:before="0"/>
@@ -6827,7 +7093,7 @@
           <w:sz w:val="22"/>
           <w:szCs w:val="22"/>
         </w:rPr>
-        <w:t xml:space="preserve">Tanpa Vercel, tanpa Supabase — semua di 1 server Helipod. Murah (Rp 61.875/bln), sederhana, mudah maintain, production-ready.</w:t>
+        <w:t xml:space="preserve">Dokumen pendaftar &amp; backup database selalu disimpan di Cloudflare R2 (private bucket, presigned URL). Harga bulanan sudah termasuk layanan monitoring, keamanan &amp; dukungan teknis.</w:t>
       </w:r>
     </w:p>
     <w:p>

</xml_diff>

<commit_message>
fix: hapus dukungan prioritas
</commit_message>
<xml_diff>
--- a/proposal/Proposal_Website_SD_Muhammadiyah_Pakel.docx
+++ b/proposal/Proposal_Website_SD_Muhammadiyah_Pakel.docx
@@ -3979,7 +3979,7 @@
                   <w:sz w:val="19"/>
                   <w:szCs w:val="19"/>
                 </w:rPr>
-                <w:t xml:space="preserve">Semua fitur Standar + multi-admin &amp; hak akses + dukungan prioritas + pelatihan 3 sesi + update konten 3 bulan + SEO &amp; sitemap</w:t>
+                <w:t xml:space="preserve">Semua fitur Standar + multi-admin &amp; hak akses + pelatihan 3 sesi + update konten 3 bulan + SEO &amp; sitemap</w:t>
               </w:r>
             </w:p>
           </w:tc>
@@ -5916,7 +5916,7 @@
                   <w:sz w:val="19"/>
                   <w:szCs w:val="19"/>
                 </w:rPr>
-                <w:t xml:space="preserve">Backup &amp; monitoring, update keamanan, edit konten (sampai 10 item/bulan), respon prioritas</w:t>
+                <w:t xml:space="preserve">Backup &amp; monitoring, update keamanan, edit konten (sampai 10 item/bulan), respon cepat</w:t>
               </w:r>
             </w:p>
           </w:tc>
@@ -6034,7 +6034,7 @@
                   <w:sz w:val="19"/>
                   <w:szCs w:val="19"/>
                 </w:rPr>
-                <w:t xml:space="preserve">= bayar 10 bulan, GRATIS 2 bulan, prioritas tertinggi, laporan bulanan</w:t>
+                <w:t xml:space="preserve">= bayar 10 bulan, GRATIS 2 bulan, laporan bulanan</w:t>
               </w:r>
             </w:p>
           </w:tc>

</xml_diff>

<commit_message>
feat: pilihan infrastruktur 4 opsi, setup 0
</commit_message>
<xml_diff>
--- a/proposal/Proposal_Website_SD_Muhammadiyah_Pakel.docx
+++ b/proposal/Proposal_Website_SD_Muhammadiyah_Pakel.docx
@@ -142,7 +142,7 @@
           <w:sz w:val="18"/>
           <w:szCs w:val="18"/>
         </w:rPr>
-        <w:t xml:space="preserve">WA/HP: 08xx-xxxx-xxxx  ·  Email: novskidev@email.com</w:t>
+        <w:t xml:space="preserve">WA/HP: 0852-2615-5240  ·  Email: novskidev@email.com</w:t>
       </w:r>
     </w:p>
     <w:p>
@@ -320,7 +320,7 @@
           <w:sz w:val="22"/>
           <w:szCs w:val="22"/>
         </w:rPr>
-        <w:t xml:space="preserve">Spesifikasi Teknis</w:t>
+        <w:t xml:space="preserve">Pilihan Infrastruktur</w:t>
       </w:r>
       <w:r>
         <w:rPr>
@@ -419,7 +419,7 @@
           <w:sz w:val="22"/>
           <w:szCs w:val="22"/>
         </w:rPr>
-        <w:t xml:space="preserve">Pilihan Arsitektur &amp; Infrastruktur</w:t>
+        <w:t xml:space="preserve">Ketentuan Layanan</w:t>
       </w:r>
       <w:r>
         <w:rPr>
@@ -452,7 +452,7 @@
           <w:sz w:val="22"/>
           <w:szCs w:val="22"/>
         </w:rPr>
-        <w:t xml:space="preserve">Ketentuan Layanan</w:t>
+        <w:t xml:space="preserve">Tahapan Pekerjaan</w:t>
       </w:r>
       <w:r>
         <w:rPr>
@@ -485,7 +485,7 @@
           <w:sz w:val="22"/>
           <w:szCs w:val="22"/>
         </w:rPr>
-        <w:t xml:space="preserve">Tahapan Pekerjaan</w:t>
+        <w:t xml:space="preserve">Mengapa Memilih Kami</w:t>
       </w:r>
       <w:r>
         <w:rPr>
@@ -518,7 +518,7 @@
           <w:sz w:val="22"/>
           <w:szCs w:val="22"/>
         </w:rPr>
-        <w:t xml:space="preserve">Mengapa Memilih Kami</w:t>
+        <w:t xml:space="preserve">Penutup</w:t>
       </w:r>
       <w:r>
         <w:rPr>
@@ -535,39 +535,6 @@
           <w:szCs w:val="22"/>
         </w:rPr>
         <w:t xml:space="preserve">12</w:t>
-      </w:r>
-    </w:p>
-    <w:p>
-      <w:pPr>
-        <w:tabs>
-          <w:tab w:val="right" w:pos="9070" w:leader="1"/>
-        </w:tabs>
-        <w:spacing w:after="140"/>
-      </w:pPr>
-      <w:r>
-        <w:rPr>
-          <w:rFonts w:ascii="Plus Jakarta Sans" w:cs="Plus Jakarta Sans" w:eastAsia="Plus Jakarta Sans" w:hAnsi="Plus Jakarta Sans"/>
-          <w:color w:val="1F2937"/>
-          <w:sz w:val="22"/>
-          <w:szCs w:val="22"/>
-        </w:rPr>
-        <w:t xml:space="preserve">Penutup</w:t>
-      </w:r>
-      <w:r>
-        <w:rPr>
-          <w:sz w:val="22"/>
-          <w:szCs w:val="22"/>
-        </w:rPr>
-        <w:t xml:space="preserve">	</w:t>
-      </w:r>
-      <w:r>
-        <w:rPr>
-          <w:rFonts w:ascii="Plus Jakarta Sans" w:cs="Plus Jakarta Sans" w:eastAsia="Plus Jakarta Sans" w:hAnsi="Plus Jakarta Sans"/>
-          <w:color w:val="5B6B82"/>
-          <w:sz w:val="22"/>
-          <w:szCs w:val="22"/>
-        </w:rPr>
-        <w:t xml:space="preserve">13</w:t>
       </w:r>
     </w:p>
     <w:p>
@@ -2817,7 +2784,21 @@
           <w:sz w:val="30"/>
           <w:szCs w:val="30"/>
         </w:rPr>
-        <w:t xml:space="preserve">5. Spesifikasi Teknis</w:t>
+        <w:t xml:space="preserve">5. Pilihan Infrastruktur</w:t>
+      </w:r>
+    </w:p>
+    <w:p>
+      <w:pPr>
+        <w:spacing w:after="120" w:before="0"/>
+      </w:pPr>
+      <w:r>
+        <w:rPr>
+          <w:rFonts w:ascii="Plus Jakarta Sans" w:cs="Plus Jakarta Sans" w:eastAsia="Plus Jakarta Sans" w:hAnsi="Plus Jakarta Sans"/>
+          <w:color w:val="1F2937"/>
+          <w:sz w:val="22"/>
+          <w:szCs w:val="22"/>
+        </w:rPr>
+        <w:t xml:space="preserve">Tersedia 4 opsi infrastruktur. Semua sudah termasuk aplikasi (Next.js), database (PostgreSQL), dan penyimpanan dokumen (Cloudflare R2). Biaya setup Rp 0 untuk semua opsi.</w:t>
       </w:r>
     </w:p>
     <w:tbl>
@@ -2833,8 +2814,9 @@
         </w:tblBorders>
       </w:tblPr>
       <w:tblGrid>
-        <w:gridCol w:w="2200"/>
-        <w:gridCol w:w="6900"/>
+        <w:gridCol w:w="1500"/>
+        <w:gridCol w:w="2100"/>
+        <w:gridCol w:w="5500"/>
       </w:tblGrid>
       <w:tr>
         <w:trPr>
@@ -2864,7 +2846,7 @@
                 <w:sz w:val="20"/>
                 <w:szCs w:val="20"/>
               </w:rPr>
-              <w:t xml:space="preserve">Aspek</w:t>
+              <w:t xml:space="preserve">Opsi</w:t>
             </w:r>
           </w:p>
         </w:tc>
@@ -2892,10 +2874,38 @@
                 <w:sz w:val="20"/>
                 <w:szCs w:val="20"/>
               </w:rPr>
-              <w:t xml:space="preserve">Spesifikasi</w:t>
+              <w:t xml:space="preserve">Biaya</w:t>
             </w:r>
           </w:p>
         </w:tc>
+        <w:tc>
+          <w:tcPr>
+            <w:shd w:fill="0B3D91" w:color="auto" w:val="clear"/>
+            <w:tcMar>
+              <w:top w:type="dxa" w:w="90"/>
+              <w:left w:type="dxa" w:w="130"/>
+              <w:bottom w:type="dxa" w:w="90"/>
+              <w:right w:type="dxa" w:w="130"/>
+            </w:tcMar>
+            <w:vAlign w:val="center"/>
+          </w:tcPr>
+          <w:p>
+            <w:pPr>
+              <w:spacing w:after="0" w:before="0"/>
+            </w:pPr>
+            <w:r>
+              <w:rPr>
+                <w:rFonts w:ascii="Plus Jakarta Sans" w:cs="Plus Jakarta Sans" w:eastAsia="Plus Jakarta Sans" w:hAnsi="Plus Jakarta Sans"/>
+                <w:b/>
+                <w:bCs/>
+                <w:color w:val="FFFFFF"/>
+                <w:sz w:val="20"/>
+                <w:szCs w:val="20"/>
+              </w:rPr>
+              <w:t xml:space="preserve">Spek &amp; Batasan</w:t>
+            </w:r>
+          </w:p>
+        </w:tc>
       </w:tr>
       <w:tr>
         <w:tc>
@@ -2931,44 +2941,83 @@
                   <w:sz w:val="20"/>
                   <w:szCs w:val="20"/>
                 </w:rPr>
-                <w:t xml:space="preserve">Desain</w:t>
-              </w:r>
-            </w:p>
-          </w:tc>
-          <w:p/>
-        </w:tc>
-        <w:tc>
-          <w:tcPr>
-            <w:tcMar>
-              <w:top w:type="dxa" w:w="90"/>
-              <w:left w:type="dxa" w:w="130"/>
-              <w:bottom w:type="dxa" w:w="90"/>
-              <w:right w:type="dxa" w:w="130"/>
-            </w:tcMar>
-            <w:vAlign w:val="center"/>
-          </w:tcPr>
-          <w:tc>
-            <w:tcPr>
-              <w:tcMar>
-                <w:top w:type="dxa" w:w="90"/>
-                <w:left w:type="dxa" w:w="130"/>
-                <w:bottom w:type="dxa" w:w="90"/>
-                <w:right w:type="dxa" w:w="130"/>
-              </w:tcMar>
-              <w:vAlign w:val="center"/>
-            </w:tcPr>
-            <w:p>
-              <w:pPr>
-                <w:spacing w:after="0" w:before="0"/>
-              </w:pPr>
-              <w:r>
-                <w:rPr>
-                  <w:rFonts w:ascii="Plus Jakarta Sans" w:cs="Plus Jakarta Sans" w:eastAsia="Plus Jakarta Sans" w:hAnsi="Plus Jakarta Sans"/>
-                  <w:color w:val="1F2937"/>
-                  <w:sz w:val="20"/>
-                  <w:szCs w:val="20"/>
-                </w:rPr>
-                <w:t xml:space="preserve">Responsive (HP, tablet, desktop), modern, sesuai branding sekolah</w:t>
+                <w:t xml:space="preserve">Supabase Free</w:t>
+              </w:r>
+            </w:p>
+          </w:tc>
+          <w:p/>
+        </w:tc>
+        <w:tc>
+          <w:tcPr>
+            <w:tcMar>
+              <w:top w:type="dxa" w:w="90"/>
+              <w:left w:type="dxa" w:w="130"/>
+              <w:bottom w:type="dxa" w:w="90"/>
+              <w:right w:type="dxa" w:w="130"/>
+            </w:tcMar>
+            <w:vAlign w:val="center"/>
+          </w:tcPr>
+          <w:tc>
+            <w:tcPr>
+              <w:tcMar>
+                <w:top w:type="dxa" w:w="90"/>
+                <w:left w:type="dxa" w:w="130"/>
+                <w:bottom w:type="dxa" w:w="90"/>
+                <w:right w:type="dxa" w:w="130"/>
+              </w:tcMar>
+              <w:vAlign w:val="center"/>
+            </w:tcPr>
+            <w:p>
+              <w:pPr>
+                <w:spacing w:after="0" w:before="0"/>
+              </w:pPr>
+              <w:r>
+                <w:rPr>
+                  <w:rFonts w:ascii="Plus Jakarta Sans" w:cs="Plus Jakarta Sans" w:eastAsia="Plus Jakarta Sans" w:hAnsi="Plus Jakarta Sans"/>
+                  <w:b/>
+                  <w:bCs/>
+                  <w:color w:val="0B3D91"/>
+                  <w:sz w:val="20"/>
+                  <w:szCs w:val="20"/>
+                </w:rPr>
+                <w:t xml:space="preserve">Rp 0/bulan</w:t>
+              </w:r>
+            </w:p>
+          </w:tc>
+          <w:p/>
+        </w:tc>
+        <w:tc>
+          <w:tcPr>
+            <w:tcMar>
+              <w:top w:type="dxa" w:w="90"/>
+              <w:left w:type="dxa" w:w="130"/>
+              <w:bottom w:type="dxa" w:w="90"/>
+              <w:right w:type="dxa" w:w="130"/>
+            </w:tcMar>
+            <w:vAlign w:val="center"/>
+          </w:tcPr>
+          <w:tc>
+            <w:tcPr>
+              <w:tcMar>
+                <w:top w:type="dxa" w:w="90"/>
+                <w:left w:type="dxa" w:w="130"/>
+                <w:bottom w:type="dxa" w:w="90"/>
+                <w:right w:type="dxa" w:w="130"/>
+              </w:tcMar>
+              <w:vAlign w:val="center"/>
+            </w:tcPr>
+            <w:p>
+              <w:pPr>
+                <w:spacing w:after="0" w:before="0"/>
+              </w:pPr>
+              <w:r>
+                <w:rPr>
+                  <w:rFonts w:ascii="Plus Jakarta Sans" w:cs="Plus Jakarta Sans" w:eastAsia="Plus Jakarta Sans" w:hAnsi="Plus Jakarta Sans"/>
+                  <w:color w:val="1F2937"/>
+                  <w:sz w:val="19"/>
+                  <w:szCs w:val="19"/>
+                </w:rPr>
+                <w:t xml:space="preserve">Vercel hosting gratis + Supabase free: 500MB database, 1GB storage, 50.000 user, 5GB bandwidth/bulan. Project pause otomatis jika 7 hari tidak aktif (harus dibuka manual). Cukup untuk PPDB ±200 pendaftar/tahun.</w:t>
               </w:r>
             </w:p>
           </w:tc>
@@ -3009,44 +3058,83 @@
                   <w:sz w:val="20"/>
                   <w:szCs w:val="20"/>
                 </w:rPr>
-                <w:t xml:space="preserve">Teknologi</w:t>
-              </w:r>
-            </w:p>
-          </w:tc>
-          <w:p/>
-        </w:tc>
-        <w:tc>
-          <w:tcPr>
-            <w:tcMar>
-              <w:top w:type="dxa" w:w="90"/>
-              <w:left w:type="dxa" w:w="130"/>
-              <w:bottom w:type="dxa" w:w="90"/>
-              <w:right w:type="dxa" w:w="130"/>
-            </w:tcMar>
-            <w:vAlign w:val="center"/>
-          </w:tcPr>
-          <w:tc>
-            <w:tcPr>
-              <w:tcMar>
-                <w:top w:type="dxa" w:w="90"/>
-                <w:left w:type="dxa" w:w="130"/>
-                <w:bottom w:type="dxa" w:w="90"/>
-                <w:right w:type="dxa" w:w="130"/>
-              </w:tcMar>
-              <w:vAlign w:val="center"/>
-            </w:tcPr>
-            <w:p>
-              <w:pPr>
-                <w:spacing w:after="0" w:before="0"/>
-              </w:pPr>
-              <w:r>
-                <w:rPr>
-                  <w:rFonts w:ascii="Plus Jakarta Sans" w:cs="Plus Jakarta Sans" w:eastAsia="Plus Jakarta Sans" w:hAnsi="Plus Jakarta Sans"/>
-                  <w:color w:val="1F2937"/>
-                  <w:sz w:val="20"/>
-                  <w:szCs w:val="20"/>
-                </w:rPr>
-                <w:t xml:space="preserve">Next.js (React modern, SEO-friendly) + Vercel (hosting global CDN, SSL otomatis) + Supabase (PostgreSQL, auth, storage)</w:t>
+                <w:t xml:space="preserve">Supabase Pro</w:t>
+              </w:r>
+            </w:p>
+          </w:tc>
+          <w:p/>
+        </w:tc>
+        <w:tc>
+          <w:tcPr>
+            <w:tcMar>
+              <w:top w:type="dxa" w:w="90"/>
+              <w:left w:type="dxa" w:w="130"/>
+              <w:bottom w:type="dxa" w:w="90"/>
+              <w:right w:type="dxa" w:w="130"/>
+            </w:tcMar>
+            <w:vAlign w:val="center"/>
+          </w:tcPr>
+          <w:tc>
+            <w:tcPr>
+              <w:tcMar>
+                <w:top w:type="dxa" w:w="90"/>
+                <w:left w:type="dxa" w:w="130"/>
+                <w:bottom w:type="dxa" w:w="90"/>
+                <w:right w:type="dxa" w:w="130"/>
+              </w:tcMar>
+              <w:vAlign w:val="center"/>
+            </w:tcPr>
+            <w:p>
+              <w:pPr>
+                <w:spacing w:after="0" w:before="0"/>
+              </w:pPr>
+              <w:r>
+                <w:rPr>
+                  <w:rFonts w:ascii="Plus Jakarta Sans" w:cs="Plus Jakarta Sans" w:eastAsia="Plus Jakarta Sans" w:hAnsi="Plus Jakarta Sans"/>
+                  <w:b/>
+                  <w:bCs/>
+                  <w:color w:val="0B3D91"/>
+                  <w:sz w:val="20"/>
+                  <w:szCs w:val="20"/>
+                </w:rPr>
+                <w:t xml:space="preserve">+Rp 1.200.000/bulan (~$75)</w:t>
+              </w:r>
+            </w:p>
+          </w:tc>
+          <w:p/>
+        </w:tc>
+        <w:tc>
+          <w:tcPr>
+            <w:tcMar>
+              <w:top w:type="dxa" w:w="90"/>
+              <w:left w:type="dxa" w:w="130"/>
+              <w:bottom w:type="dxa" w:w="90"/>
+              <w:right w:type="dxa" w:w="130"/>
+            </w:tcMar>
+            <w:vAlign w:val="center"/>
+          </w:tcPr>
+          <w:tc>
+            <w:tcPr>
+              <w:tcMar>
+                <w:top w:type="dxa" w:w="90"/>
+                <w:left w:type="dxa" w:w="130"/>
+                <w:bottom w:type="dxa" w:w="90"/>
+                <w:right w:type="dxa" w:w="130"/>
+              </w:tcMar>
+              <w:vAlign w:val="center"/>
+            </w:tcPr>
+            <w:p>
+              <w:pPr>
+                <w:spacing w:after="0" w:before="0"/>
+              </w:pPr>
+              <w:r>
+                <w:rPr>
+                  <w:rFonts w:ascii="Plus Jakarta Sans" w:cs="Plus Jakarta Sans" w:eastAsia="Plus Jakarta Sans" w:hAnsi="Plus Jakarta Sans"/>
+                  <w:color w:val="1F2937"/>
+                  <w:sz w:val="19"/>
+                  <w:szCs w:val="19"/>
+                </w:rPr>
+                <w:t xml:space="preserve">Semua free + database 8GB, backup point-in-time (PITR), bandwidth 250GB, tanpa pause, dukungan prioritas. Cocok saat data &amp; trafik membesar.</w:t>
               </w:r>
             </w:p>
           </w:tc>
@@ -3087,44 +3175,83 @@
                   <w:sz w:val="20"/>
                   <w:szCs w:val="20"/>
                 </w:rPr>
-                <w:t xml:space="preserve">Panel Admin</w:t>
-              </w:r>
-            </w:p>
-          </w:tc>
-          <w:p/>
-        </w:tc>
-        <w:tc>
-          <w:tcPr>
-            <w:tcMar>
-              <w:top w:type="dxa" w:w="90"/>
-              <w:left w:type="dxa" w:w="130"/>
-              <w:bottom w:type="dxa" w:w="90"/>
-              <w:right w:type="dxa" w:w="130"/>
-            </w:tcMar>
-            <w:vAlign w:val="center"/>
-          </w:tcPr>
-          <w:tc>
-            <w:tcPr>
-              <w:tcMar>
-                <w:top w:type="dxa" w:w="90"/>
-                <w:left w:type="dxa" w:w="130"/>
-                <w:bottom w:type="dxa" w:w="90"/>
-                <w:right w:type="dxa" w:w="130"/>
-              </w:tcMar>
-              <w:vAlign w:val="center"/>
-            </w:tcPr>
-            <w:p>
-              <w:pPr>
-                <w:spacing w:after="0" w:before="0"/>
-              </w:pPr>
-              <w:r>
-                <w:rPr>
-                  <w:rFonts w:ascii="Plus Jakarta Sans" w:cs="Plus Jakarta Sans" w:eastAsia="Plus Jakarta Sans" w:hAnsi="Plus Jakarta Sans"/>
-                  <w:color w:val="1F2937"/>
-                  <w:sz w:val="20"/>
-                  <w:szCs w:val="20"/>
-                </w:rPr>
-                <w:t xml:space="preserve">Dashboard: kelola berita, galeri, halaman, PPDB, pengaturan tampilan</w:t>
+                <w:t xml:space="preserve">Helipod</w:t>
+              </w:r>
+            </w:p>
+          </w:tc>
+          <w:p/>
+        </w:tc>
+        <w:tc>
+          <w:tcPr>
+            <w:tcMar>
+              <w:top w:type="dxa" w:w="90"/>
+              <w:left w:type="dxa" w:w="130"/>
+              <w:bottom w:type="dxa" w:w="90"/>
+              <w:right w:type="dxa" w:w="130"/>
+            </w:tcMar>
+            <w:vAlign w:val="center"/>
+          </w:tcPr>
+          <w:tc>
+            <w:tcPr>
+              <w:tcMar>
+                <w:top w:type="dxa" w:w="90"/>
+                <w:left w:type="dxa" w:w="130"/>
+                <w:bottom w:type="dxa" w:w="90"/>
+                <w:right w:type="dxa" w:w="130"/>
+              </w:tcMar>
+              <w:vAlign w:val="center"/>
+            </w:tcPr>
+            <w:p>
+              <w:pPr>
+                <w:spacing w:after="0" w:before="0"/>
+              </w:pPr>
+              <w:r>
+                <w:rPr>
+                  <w:rFonts w:ascii="Plus Jakarta Sans" w:cs="Plus Jakarta Sans" w:eastAsia="Plus Jakarta Sans" w:hAnsi="Plus Jakarta Sans"/>
+                  <w:b/>
+                  <w:bCs/>
+                  <w:color w:val="0B3D91"/>
+                  <w:sz w:val="20"/>
+                  <w:szCs w:val="20"/>
+                </w:rPr>
+                <w:t xml:space="preserve">Rp 100.000/bulan</w:t>
+              </w:r>
+            </w:p>
+          </w:tc>
+          <w:p/>
+        </w:tc>
+        <w:tc>
+          <w:tcPr>
+            <w:tcMar>
+              <w:top w:type="dxa" w:w="90"/>
+              <w:left w:type="dxa" w:w="130"/>
+              <w:bottom w:type="dxa" w:w="90"/>
+              <w:right w:type="dxa" w:w="130"/>
+            </w:tcMar>
+            <w:vAlign w:val="center"/>
+          </w:tcPr>
+          <w:tc>
+            <w:tcPr>
+              <w:tcMar>
+                <w:top w:type="dxa" w:w="90"/>
+                <w:left w:type="dxa" w:w="130"/>
+                <w:bottom w:type="dxa" w:w="90"/>
+                <w:right w:type="dxa" w:w="130"/>
+              </w:tcMar>
+              <w:vAlign w:val="center"/>
+            </w:tcPr>
+            <w:p>
+              <w:pPr>
+                <w:spacing w:after="0" w:before="0"/>
+              </w:pPr>
+              <w:r>
+                <w:rPr>
+                  <w:rFonts w:ascii="Plus Jakarta Sans" w:cs="Plus Jakarta Sans" w:eastAsia="Plus Jakarta Sans" w:hAnsi="Plus Jakarta Sans"/>
+                  <w:color w:val="1F2937"/>
+                  <w:sz w:val="19"/>
+                  <w:szCs w:val="19"/>
+                </w:rPr>
+                <w:t xml:space="preserve">1 server all-in-one: 1 vCPU, 1GB RAM, 15GB storage, unlimited bandwidth. Next.js + PostgreSQL (Docker) + Nginx jalan langsung di server — tanpa Vercel, tanpa Supabase cloud. Dokumen &amp; backup di R2.</w:t>
               </w:r>
             </w:p>
           </w:tc>
@@ -3165,51 +3292,12 @@
                   <w:sz w:val="20"/>
                   <w:szCs w:val="20"/>
                 </w:rPr>
-                <w:t xml:space="preserve">Customizer</w:t>
-              </w:r>
-            </w:p>
-          </w:tc>
-          <w:p/>
-        </w:tc>
-        <w:tc>
-          <w:tcPr>
-            <w:tcMar>
-              <w:top w:type="dxa" w:w="90"/>
-              <w:left w:type="dxa" w:w="130"/>
-              <w:bottom w:type="dxa" w:w="90"/>
-              <w:right w:type="dxa" w:w="130"/>
-            </w:tcMar>
-            <w:vAlign w:val="center"/>
-          </w:tcPr>
-          <w:tc>
-            <w:tcPr>
-              <w:tcMar>
-                <w:top w:type="dxa" w:w="90"/>
-                <w:left w:type="dxa" w:w="130"/>
-                <w:bottom w:type="dxa" w:w="90"/>
-                <w:right w:type="dxa" w:w="130"/>
-              </w:tcMar>
-              <w:vAlign w:val="center"/>
-            </w:tcPr>
-            <w:p>
-              <w:pPr>
-                <w:spacing w:after="0" w:before="0"/>
-              </w:pPr>
-              <w:r>
-                <w:rPr>
-                  <w:rFonts w:ascii="Plus Jakarta Sans" w:cs="Plus Jakarta Sans" w:eastAsia="Plus Jakarta Sans" w:hAnsi="Plus Jakarta Sans"/>
-                  <w:color w:val="1F2937"/>
-                  <w:sz w:val="20"/>
-                  <w:szCs w:val="20"/>
-                </w:rPr>
-                <w:t xml:space="preserve">Ganti warna, font, navbar, teks hero tanpa menyentuh kode</w:t>
-              </w:r>
-            </w:p>
-          </w:tc>
-          <w:p/>
-        </w:tc>
-      </w:tr>
-      <w:tr>
+                <w:t xml:space="preserve">VPS Dedicated</w:t>
+              </w:r>
+            </w:p>
+          </w:tc>
+          <w:p/>
+        </w:tc>
         <w:tc>
           <w:tcPr>
             <w:tcMar>
@@ -3239,282 +3327,48 @@
                   <w:rFonts w:ascii="Plus Jakarta Sans" w:cs="Plus Jakarta Sans" w:eastAsia="Plus Jakarta Sans" w:hAnsi="Plus Jakarta Sans"/>
                   <w:b/>
                   <w:bCs/>
-                  <w:color w:val="1F2937"/>
-                  <w:sz w:val="20"/>
-                  <w:szCs w:val="20"/>
-                </w:rPr>
-                <w:t xml:space="preserve">Keamanan</w:t>
-              </w:r>
-            </w:p>
-          </w:tc>
-          <w:p/>
-        </w:tc>
-        <w:tc>
-          <w:tcPr>
-            <w:tcMar>
-              <w:top w:type="dxa" w:w="90"/>
-              <w:left w:type="dxa" w:w="130"/>
-              <w:bottom w:type="dxa" w:w="90"/>
-              <w:right w:type="dxa" w:w="130"/>
-            </w:tcMar>
-            <w:vAlign w:val="center"/>
-          </w:tcPr>
-          <w:tc>
-            <w:tcPr>
-              <w:tcMar>
-                <w:top w:type="dxa" w:w="90"/>
-                <w:left w:type="dxa" w:w="130"/>
-                <w:bottom w:type="dxa" w:w="90"/>
-                <w:right w:type="dxa" w:w="130"/>
-              </w:tcMar>
-              <w:vAlign w:val="center"/>
-            </w:tcPr>
-            <w:p>
-              <w:pPr>
-                <w:spacing w:after="0" w:before="0"/>
-              </w:pPr>
-              <w:r>
-                <w:rPr>
-                  <w:rFonts w:ascii="Plus Jakarta Sans" w:cs="Plus Jakarta Sans" w:eastAsia="Plus Jakarta Sans" w:hAnsi="Plus Jakarta Sans"/>
-                  <w:color w:val="1F2937"/>
-                  <w:sz w:val="20"/>
-                  <w:szCs w:val="20"/>
-                </w:rPr>
-                <w:t xml:space="preserve">SSL/HTTPS, proteksi panel admin, backup otomatis</w:t>
-              </w:r>
-            </w:p>
-          </w:tc>
-          <w:p/>
-        </w:tc>
-      </w:tr>
-      <w:tr>
-        <w:tc>
-          <w:tcPr>
-            <w:tcMar>
-              <w:top w:type="dxa" w:w="90"/>
-              <w:left w:type="dxa" w:w="130"/>
-              <w:bottom w:type="dxa" w:w="90"/>
-              <w:right w:type="dxa" w:w="130"/>
-            </w:tcMar>
-            <w:vAlign w:val="center"/>
-          </w:tcPr>
-          <w:tc>
-            <w:tcPr>
-              <w:tcMar>
-                <w:top w:type="dxa" w:w="90"/>
-                <w:left w:type="dxa" w:w="130"/>
-                <w:bottom w:type="dxa" w:w="90"/>
-                <w:right w:type="dxa" w:w="130"/>
-              </w:tcMar>
-              <w:vAlign w:val="center"/>
-            </w:tcPr>
-            <w:p>
-              <w:pPr>
-                <w:spacing w:after="0" w:before="0"/>
-              </w:pPr>
-              <w:r>
-                <w:rPr>
-                  <w:rFonts w:ascii="Plus Jakarta Sans" w:cs="Plus Jakarta Sans" w:eastAsia="Plus Jakarta Sans" w:hAnsi="Plus Jakarta Sans"/>
-                  <w:b/>
-                  <w:bCs/>
-                  <w:color w:val="1F2937"/>
-                  <w:sz w:val="20"/>
-                  <w:szCs w:val="20"/>
-                </w:rPr>
-                <w:t xml:space="preserve">SEO</w:t>
-              </w:r>
-            </w:p>
-          </w:tc>
-          <w:p/>
-        </w:tc>
-        <w:tc>
-          <w:tcPr>
-            <w:tcMar>
-              <w:top w:type="dxa" w:w="90"/>
-              <w:left w:type="dxa" w:w="130"/>
-              <w:bottom w:type="dxa" w:w="90"/>
-              <w:right w:type="dxa" w:w="130"/>
-            </w:tcMar>
-            <w:vAlign w:val="center"/>
-          </w:tcPr>
-          <w:tc>
-            <w:tcPr>
-              <w:tcMar>
-                <w:top w:type="dxa" w:w="90"/>
-                <w:left w:type="dxa" w:w="130"/>
-                <w:bottom w:type="dxa" w:w="90"/>
-                <w:right w:type="dxa" w:w="130"/>
-              </w:tcMar>
-              <w:vAlign w:val="center"/>
-            </w:tcPr>
-            <w:p>
-              <w:pPr>
-                <w:spacing w:after="0" w:before="0"/>
-              </w:pPr>
-              <w:r>
-                <w:rPr>
-                  <w:rFonts w:ascii="Plus Jakarta Sans" w:cs="Plus Jakarta Sans" w:eastAsia="Plus Jakarta Sans" w:hAnsi="Plus Jakarta Sans"/>
-                  <w:color w:val="1F2937"/>
-                  <w:sz w:val="20"/>
-                  <w:szCs w:val="20"/>
-                </w:rPr>
-                <w:t xml:space="preserve">Optimasi mesin pencari (Google), sitemap, meta tags</w:t>
-              </w:r>
-            </w:p>
-          </w:tc>
-          <w:p/>
-        </w:tc>
-      </w:tr>
-      <w:tr>
-        <w:tc>
-          <w:tcPr>
-            <w:tcMar>
-              <w:top w:type="dxa" w:w="90"/>
-              <w:left w:type="dxa" w:w="130"/>
-              <w:bottom w:type="dxa" w:w="90"/>
-              <w:right w:type="dxa" w:w="130"/>
-            </w:tcMar>
-            <w:vAlign w:val="center"/>
-          </w:tcPr>
-          <w:tc>
-            <w:tcPr>
-              <w:tcMar>
-                <w:top w:type="dxa" w:w="90"/>
-                <w:left w:type="dxa" w:w="130"/>
-                <w:bottom w:type="dxa" w:w="90"/>
-                <w:right w:type="dxa" w:w="130"/>
-              </w:tcMar>
-              <w:vAlign w:val="center"/>
-            </w:tcPr>
-            <w:p>
-              <w:pPr>
-                <w:spacing w:after="0" w:before="0"/>
-              </w:pPr>
-              <w:r>
-                <w:rPr>
-                  <w:rFonts w:ascii="Plus Jakarta Sans" w:cs="Plus Jakarta Sans" w:eastAsia="Plus Jakarta Sans" w:hAnsi="Plus Jakarta Sans"/>
-                  <w:b/>
-                  <w:bCs/>
-                  <w:color w:val="1F2937"/>
-                  <w:sz w:val="20"/>
-                  <w:szCs w:val="20"/>
-                </w:rPr>
-                <w:t xml:space="preserve">Performa</w:t>
-              </w:r>
-            </w:p>
-          </w:tc>
-          <w:p/>
-        </w:tc>
-        <w:tc>
-          <w:tcPr>
-            <w:tcMar>
-              <w:top w:type="dxa" w:w="90"/>
-              <w:left w:type="dxa" w:w="130"/>
-              <w:bottom w:type="dxa" w:w="90"/>
-              <w:right w:type="dxa" w:w="130"/>
-            </w:tcMar>
-            <w:vAlign w:val="center"/>
-          </w:tcPr>
-          <w:tc>
-            <w:tcPr>
-              <w:tcMar>
-                <w:top w:type="dxa" w:w="90"/>
-                <w:left w:type="dxa" w:w="130"/>
-                <w:bottom w:type="dxa" w:w="90"/>
-                <w:right w:type="dxa" w:w="130"/>
-              </w:tcMar>
-              <w:vAlign w:val="center"/>
-            </w:tcPr>
-            <w:p>
-              <w:pPr>
-                <w:spacing w:after="0" w:before="0"/>
-              </w:pPr>
-              <w:r>
-                <w:rPr>
-                  <w:rFonts w:ascii="Plus Jakarta Sans" w:cs="Plus Jakarta Sans" w:eastAsia="Plus Jakarta Sans" w:hAnsi="Plus Jakarta Sans"/>
-                  <w:color w:val="1F2937"/>
-                  <w:sz w:val="20"/>
-                  <w:szCs w:val="20"/>
-                </w:rPr>
-                <w:t xml:space="preserve">Optimasi gambar, cache, waktu muat cepat (&lt; 3 detik)</w:t>
-              </w:r>
-            </w:p>
-          </w:tc>
-          <w:p/>
-        </w:tc>
-      </w:tr>
-      <w:tr>
-        <w:tc>
-          <w:tcPr>
-            <w:tcMar>
-              <w:top w:type="dxa" w:w="90"/>
-              <w:left w:type="dxa" w:w="130"/>
-              <w:bottom w:type="dxa" w:w="90"/>
-              <w:right w:type="dxa" w:w="130"/>
-            </w:tcMar>
-            <w:vAlign w:val="center"/>
-          </w:tcPr>
-          <w:tc>
-            <w:tcPr>
-              <w:tcMar>
-                <w:top w:type="dxa" w:w="90"/>
-                <w:left w:type="dxa" w:w="130"/>
-                <w:bottom w:type="dxa" w:w="90"/>
-                <w:right w:type="dxa" w:w="130"/>
-              </w:tcMar>
-              <w:vAlign w:val="center"/>
-            </w:tcPr>
-            <w:p>
-              <w:pPr>
-                <w:spacing w:after="0" w:before="0"/>
-              </w:pPr>
-              <w:r>
-                <w:rPr>
-                  <w:rFonts w:ascii="Plus Jakarta Sans" w:cs="Plus Jakarta Sans" w:eastAsia="Plus Jakarta Sans" w:hAnsi="Plus Jakarta Sans"/>
-                  <w:b/>
-                  <w:bCs/>
-                  <w:color w:val="1F2937"/>
-                  <w:sz w:val="20"/>
-                  <w:szCs w:val="20"/>
-                </w:rPr>
-                <w:t xml:space="preserve">Integrasi</w:t>
-              </w:r>
-            </w:p>
-          </w:tc>
-          <w:p/>
-        </w:tc>
-        <w:tc>
-          <w:tcPr>
-            <w:tcMar>
-              <w:top w:type="dxa" w:w="90"/>
-              <w:left w:type="dxa" w:w="130"/>
-              <w:bottom w:type="dxa" w:w="90"/>
-              <w:right w:type="dxa" w:w="130"/>
-            </w:tcMar>
-            <w:vAlign w:val="center"/>
-          </w:tcPr>
-          <w:tc>
-            <w:tcPr>
-              <w:tcMar>
-                <w:top w:type="dxa" w:w="90"/>
-                <w:left w:type="dxa" w:w="130"/>
-                <w:bottom w:type="dxa" w:w="90"/>
-                <w:right w:type="dxa" w:w="130"/>
-              </w:tcMar>
-              <w:vAlign w:val="center"/>
-            </w:tcPr>
-            <w:p>
-              <w:pPr>
-                <w:spacing w:after="0" w:before="0"/>
-              </w:pPr>
-              <w:r>
-                <w:rPr>
-                  <w:rFonts w:ascii="Plus Jakarta Sans" w:cs="Plus Jakarta Sans" w:eastAsia="Plus Jakarta Sans" w:hAnsi="Plus Jakarta Sans"/>
-                  <w:color w:val="1F2937"/>
-                  <w:sz w:val="20"/>
-                  <w:szCs w:val="20"/>
-                </w:rPr>
-                <w:t xml:space="preserve">Google Maps, WhatsApp, formulir kontak, media sosial</w:t>
+                  <w:color w:val="0B3D91"/>
+                  <w:sz w:val="20"/>
+                  <w:szCs w:val="20"/>
+                </w:rPr>
+                <w:t xml:space="preserve">Rp 300.000/bulan</w:t>
+              </w:r>
+            </w:p>
+          </w:tc>
+          <w:p/>
+        </w:tc>
+        <w:tc>
+          <w:tcPr>
+            <w:tcMar>
+              <w:top w:type="dxa" w:w="90"/>
+              <w:left w:type="dxa" w:w="130"/>
+              <w:bottom w:type="dxa" w:w="90"/>
+              <w:right w:type="dxa" w:w="130"/>
+            </w:tcMar>
+            <w:vAlign w:val="center"/>
+          </w:tcPr>
+          <w:tc>
+            <w:tcPr>
+              <w:tcMar>
+                <w:top w:type="dxa" w:w="90"/>
+                <w:left w:type="dxa" w:w="130"/>
+                <w:bottom w:type="dxa" w:w="90"/>
+                <w:right w:type="dxa" w:w="130"/>
+              </w:tcMar>
+              <w:vAlign w:val="center"/>
+            </w:tcPr>
+            <w:p>
+              <w:pPr>
+                <w:spacing w:after="0" w:before="0"/>
+              </w:pPr>
+              <w:r>
+                <w:rPr>
+                  <w:rFonts w:ascii="Plus Jakarta Sans" w:cs="Plus Jakarta Sans" w:eastAsia="Plus Jakarta Sans" w:hAnsi="Plus Jakarta Sans"/>
+                  <w:color w:val="1F2937"/>
+                  <w:sz w:val="19"/>
+                  <w:szCs w:val="19"/>
+                </w:rPr>
+                <w:t xml:space="preserve">Server lebih besar: 2 vCPU, 8GB RAM, 100GB NVMe. Full kontrol server, email kustom, multi-aplikasi. Frontend + backend + database dalam 1 server, tanpa batas kuota.</w:t>
               </w:r>
             </w:p>
           </w:tc>
@@ -3534,6 +3388,35 @@
           <w:szCs w:val="22"/>
         </w:rPr>
         <w:t xml:space="preserve"> </w:t>
+      </w:r>
+    </w:p>
+    <w:p>
+      <w:pPr>
+        <w:spacing w:after="0" w:before="0"/>
+      </w:pPr>
+      <w:r>
+        <w:rPr>
+          <w:rFonts w:ascii="Plus Jakarta Sans" w:cs="Plus Jakarta Sans" w:eastAsia="Plus Jakarta Sans" w:hAnsi="Plus Jakarta Sans"/>
+          <w:b/>
+          <w:bCs/>
+          <w:i/>
+          <w:iCs/>
+          <w:color w:val="1F2937"/>
+          <w:sz w:val="22"/>
+          <w:szCs w:val="22"/>
+        </w:rPr>
+        <w:t xml:space="preserve">Catatan: </w:t>
+      </w:r>
+      <w:r>
+        <w:rPr>
+          <w:rFonts w:ascii="Plus Jakarta Sans" w:cs="Plus Jakarta Sans" w:eastAsia="Plus Jakarta Sans" w:hAnsi="Plus Jakarta Sans"/>
+          <w:i/>
+          <w:iCs/>
+          <w:color w:val="5B6B82"/>
+          <w:sz w:val="19"/>
+          <w:szCs w:val="19"/>
+        </w:rPr>
+        <w:t xml:space="preserve">Semua opsi sudah termasuk monitoring, keamanan &amp; dukungan teknis. Dokumen pendaftar (±1 GB/tahun) dan backup database tersimpan aman di Cloudflare R2 (private bucket, presigned URL).</w:t>
       </w:r>
     </w:p>
     <w:p>
@@ -6138,953 +6021,50 @@
           <w:sz w:val="30"/>
           <w:szCs w:val="30"/>
         </w:rPr>
-        <w:t xml:space="preserve">9. Pilihan Arsitektur &amp; Infrastruktur</w:t>
-      </w:r>
-    </w:p>
-    <w:p>
-      <w:pPr>
-        <w:spacing w:after="120" w:before="0"/>
-      </w:pPr>
-      <w:r>
-        <w:rPr>
-          <w:rFonts w:ascii="Plus Jakarta Sans" w:cs="Plus Jakarta Sans" w:eastAsia="Plus Jakarta Sans" w:hAnsi="Plus Jakarta Sans"/>
-          <w:color w:val="1F2937"/>
-          <w:sz w:val="22"/>
-          <w:szCs w:val="22"/>
-        </w:rPr>
-        <w:t xml:space="preserve">Tersedia 3 pilihan infrastruktur. Semua sudah termasuk hosting, database, penyimpanan dokumen (Cloudflare R2), monitoring, keamanan, dan dukungan teknis setiap bulan.</w:t>
-      </w:r>
-    </w:p>
-    <w:tbl>
-      <w:tblPr>
-        <w:tblW w:type="dxa" w:w="9100"/>
-        <w:tblBorders>
-          <w:top w:val="single" w:color="E2E8F0" w:sz="4"/>
-          <w:left w:val="single" w:color="E2E8F0" w:sz="4"/>
-          <w:bottom w:val="single" w:color="E2E8F0" w:sz="4"/>
-          <w:right w:val="single" w:color="E2E8F0" w:sz="4"/>
-          <w:insideH w:val="single" w:color="E2E8F0" w:sz="4"/>
-          <w:insideV w:val="single" w:color="E2E8F0" w:sz="4"/>
-        </w:tblBorders>
-      </w:tblPr>
-      <w:tblGrid>
-        <w:gridCol w:w="1500"/>
-        <w:gridCol w:w="2500"/>
-        <w:gridCol w:w="2600"/>
-        <w:gridCol w:w="2500"/>
-      </w:tblGrid>
-      <w:tr>
-        <w:trPr>
-          <w:tblHeader/>
-        </w:trPr>
-        <w:tc>
-          <w:tcPr>
-            <w:shd w:fill="0B3D91" w:color="auto" w:val="clear"/>
-            <w:tcMar>
-              <w:top w:type="dxa" w:w="90"/>
-              <w:left w:type="dxa" w:w="130"/>
-              <w:bottom w:type="dxa" w:w="90"/>
-              <w:right w:type="dxa" w:w="130"/>
-            </w:tcMar>
-            <w:vAlign w:val="center"/>
-          </w:tcPr>
-          <w:p>
-            <w:pPr>
-              <w:spacing w:after="0" w:before="0"/>
-            </w:pPr>
-            <w:r>
-              <w:rPr>
-                <w:rFonts w:ascii="Plus Jakarta Sans" w:cs="Plus Jakarta Sans" w:eastAsia="Plus Jakarta Sans" w:hAnsi="Plus Jakarta Sans"/>
-                <w:b/>
-                <w:bCs/>
-                <w:color w:val="FFFFFF"/>
-                <w:sz w:val="20"/>
-                <w:szCs w:val="20"/>
-              </w:rPr>
-              <w:t xml:space="preserve">Aspek</w:t>
-            </w:r>
-          </w:p>
-        </w:tc>
-        <w:tc>
-          <w:tcPr>
-            <w:shd w:fill="0B3D91" w:color="auto" w:val="clear"/>
-            <w:tcMar>
-              <w:top w:type="dxa" w:w="90"/>
-              <w:left w:type="dxa" w:w="130"/>
-              <w:bottom w:type="dxa" w:w="90"/>
-              <w:right w:type="dxa" w:w="130"/>
-            </w:tcMar>
-            <w:vAlign w:val="center"/>
-          </w:tcPr>
-          <w:p>
-            <w:pPr>
-              <w:spacing w:after="0" w:before="0"/>
-            </w:pPr>
-            <w:r>
-              <w:rPr>
-                <w:rFonts w:ascii="Plus Jakarta Sans" w:cs="Plus Jakarta Sans" w:eastAsia="Plus Jakarta Sans" w:hAnsi="Plus Jakarta Sans"/>
-                <w:b/>
-                <w:bCs/>
-                <w:color w:val="FFFFFF"/>
-                <w:sz w:val="20"/>
-                <w:szCs w:val="20"/>
-              </w:rPr>
-              <w:t xml:space="preserve">Supabase Cloud</w:t>
-            </w:r>
-          </w:p>
-        </w:tc>
-        <w:tc>
-          <w:tcPr>
-            <w:shd w:fill="0B3D91" w:color="auto" w:val="clear"/>
-            <w:tcMar>
-              <w:top w:type="dxa" w:w="90"/>
-              <w:left w:type="dxa" w:w="130"/>
-              <w:bottom w:type="dxa" w:w="90"/>
-              <w:right w:type="dxa" w:w="130"/>
-            </w:tcMar>
-            <w:vAlign w:val="center"/>
-          </w:tcPr>
-          <w:p>
-            <w:pPr>
-              <w:spacing w:after="0" w:before="0"/>
-            </w:pPr>
-            <w:r>
-              <w:rPr>
-                <w:rFonts w:ascii="Plus Jakarta Sans" w:cs="Plus Jakarta Sans" w:eastAsia="Plus Jakarta Sans" w:hAnsi="Plus Jakarta Sans"/>
-                <w:b/>
-                <w:bCs/>
-                <w:color w:val="FFFFFF"/>
-                <w:sz w:val="20"/>
-                <w:szCs w:val="20"/>
-              </w:rPr>
-              <w:t xml:space="preserve">Helipod (Rekomendasi)</w:t>
-            </w:r>
-          </w:p>
-        </w:tc>
-        <w:tc>
-          <w:tcPr>
-            <w:shd w:fill="0B3D91" w:color="auto" w:val="clear"/>
-            <w:tcMar>
-              <w:top w:type="dxa" w:w="90"/>
-              <w:left w:type="dxa" w:w="130"/>
-              <w:bottom w:type="dxa" w:w="90"/>
-              <w:right w:type="dxa" w:w="130"/>
-            </w:tcMar>
-            <w:vAlign w:val="center"/>
-          </w:tcPr>
-          <w:p>
-            <w:pPr>
-              <w:spacing w:after="0" w:before="0"/>
-            </w:pPr>
-            <w:r>
-              <w:rPr>
-                <w:rFonts w:ascii="Plus Jakarta Sans" w:cs="Plus Jakarta Sans" w:eastAsia="Plus Jakarta Sans" w:hAnsi="Plus Jakarta Sans"/>
-                <w:b/>
-                <w:bCs/>
-                <w:color w:val="FFFFFF"/>
-                <w:sz w:val="20"/>
-                <w:szCs w:val="20"/>
-              </w:rPr>
-              <w:t xml:space="preserve">VPS Dedicated</w:t>
-            </w:r>
-          </w:p>
-        </w:tc>
-      </w:tr>
-      <w:tr>
-        <w:tc>
-          <w:tcPr>
-            <w:tcMar>
-              <w:top w:type="dxa" w:w="90"/>
-              <w:left w:type="dxa" w:w="130"/>
-              <w:bottom w:type="dxa" w:w="90"/>
-              <w:right w:type="dxa" w:w="130"/>
-            </w:tcMar>
-            <w:vAlign w:val="center"/>
-          </w:tcPr>
-          <w:tc>
-            <w:tcPr>
-              <w:tcMar>
-                <w:top w:type="dxa" w:w="90"/>
-                <w:left w:type="dxa" w:w="130"/>
-                <w:bottom w:type="dxa" w:w="90"/>
-                <w:right w:type="dxa" w:w="130"/>
-              </w:tcMar>
-              <w:vAlign w:val="center"/>
-            </w:tcPr>
-            <w:p>
-              <w:pPr>
-                <w:spacing w:after="0" w:before="0"/>
-              </w:pPr>
-              <w:r>
-                <w:rPr>
-                  <w:rFonts w:ascii="Plus Jakarta Sans" w:cs="Plus Jakarta Sans" w:eastAsia="Plus Jakarta Sans" w:hAnsi="Plus Jakarta Sans"/>
-                  <w:b/>
-                  <w:bCs/>
-                  <w:color w:val="1F2937"/>
-                  <w:sz w:val="20"/>
-                  <w:szCs w:val="20"/>
-                </w:rPr>
-                <w:t xml:space="preserve">Komponen</w:t>
-              </w:r>
-            </w:p>
-          </w:tc>
-          <w:p/>
-        </w:tc>
-        <w:tc>
-          <w:tcPr>
-            <w:tcMar>
-              <w:top w:type="dxa" w:w="90"/>
-              <w:left w:type="dxa" w:w="130"/>
-              <w:bottom w:type="dxa" w:w="90"/>
-              <w:right w:type="dxa" w:w="130"/>
-            </w:tcMar>
-            <w:vAlign w:val="center"/>
-          </w:tcPr>
-          <w:tc>
-            <w:tcPr>
-              <w:tcMar>
-                <w:top w:type="dxa" w:w="90"/>
-                <w:left w:type="dxa" w:w="130"/>
-                <w:bottom w:type="dxa" w:w="90"/>
-                <w:right w:type="dxa" w:w="130"/>
-              </w:tcMar>
-              <w:vAlign w:val="center"/>
-            </w:tcPr>
-            <w:p>
-              <w:pPr>
-                <w:spacing w:after="0" w:before="0"/>
-              </w:pPr>
-              <w:r>
-                <w:rPr>
-                  <w:rFonts w:ascii="Plus Jakarta Sans" w:cs="Plus Jakarta Sans" w:eastAsia="Plus Jakarta Sans" w:hAnsi="Plus Jakarta Sans"/>
-                  <w:color w:val="1F2937"/>
-                  <w:sz w:val="19"/>
-                  <w:szCs w:val="19"/>
-                </w:rPr>
-                <w:t xml:space="preserve">Vercel + Supabase + R2</w:t>
-              </w:r>
-            </w:p>
-          </w:tc>
-          <w:p/>
-        </w:tc>
-        <w:tc>
-          <w:tcPr>
-            <w:tcMar>
-              <w:top w:type="dxa" w:w="90"/>
-              <w:left w:type="dxa" w:w="130"/>
-              <w:bottom w:type="dxa" w:w="90"/>
-              <w:right w:type="dxa" w:w="130"/>
-            </w:tcMar>
-            <w:vAlign w:val="center"/>
-          </w:tcPr>
-          <w:tc>
-            <w:tcPr>
-              <w:tcMar>
-                <w:top w:type="dxa" w:w="90"/>
-                <w:left w:type="dxa" w:w="130"/>
-                <w:bottom w:type="dxa" w:w="90"/>
-                <w:right w:type="dxa" w:w="130"/>
-              </w:tcMar>
-              <w:vAlign w:val="center"/>
-            </w:tcPr>
-            <w:p>
-              <w:pPr>
-                <w:spacing w:after="0" w:before="0"/>
-              </w:pPr>
-              <w:r>
-                <w:rPr>
-                  <w:rFonts w:ascii="Plus Jakarta Sans" w:cs="Plus Jakarta Sans" w:eastAsia="Plus Jakarta Sans" w:hAnsi="Plus Jakarta Sans"/>
-                  <w:color w:val="1F2937"/>
-                  <w:sz w:val="19"/>
-                  <w:szCs w:val="19"/>
-                </w:rPr>
-                <w:t xml:space="preserve">1 server: Next.js + PostgreSQL + R2</w:t>
-              </w:r>
-            </w:p>
-          </w:tc>
-          <w:p/>
-        </w:tc>
-        <w:tc>
-          <w:tcPr>
-            <w:tcMar>
-              <w:top w:type="dxa" w:w="90"/>
-              <w:left w:type="dxa" w:w="130"/>
-              <w:bottom w:type="dxa" w:w="90"/>
-              <w:right w:type="dxa" w:w="130"/>
-            </w:tcMar>
-            <w:vAlign w:val="center"/>
-          </w:tcPr>
-          <w:tc>
-            <w:tcPr>
-              <w:tcMar>
-                <w:top w:type="dxa" w:w="90"/>
-                <w:left w:type="dxa" w:w="130"/>
-                <w:bottom w:type="dxa" w:w="90"/>
-                <w:right w:type="dxa" w:w="130"/>
-              </w:tcMar>
-              <w:vAlign w:val="center"/>
-            </w:tcPr>
-            <w:p>
-              <w:pPr>
-                <w:spacing w:after="0" w:before="0"/>
-              </w:pPr>
-              <w:r>
-                <w:rPr>
-                  <w:rFonts w:ascii="Plus Jakarta Sans" w:cs="Plus Jakarta Sans" w:eastAsia="Plus Jakarta Sans" w:hAnsi="Plus Jakarta Sans"/>
-                  <w:color w:val="1F2937"/>
-                  <w:sz w:val="19"/>
-                  <w:szCs w:val="19"/>
-                </w:rPr>
-                <w:t xml:space="preserve">2 vCPU, 8GB RAM, full kontrol</w:t>
-              </w:r>
-            </w:p>
-          </w:tc>
-          <w:p/>
-        </w:tc>
-      </w:tr>
-      <w:tr>
-        <w:tc>
-          <w:tcPr>
-            <w:tcMar>
-              <w:top w:type="dxa" w:w="90"/>
-              <w:left w:type="dxa" w:w="130"/>
-              <w:bottom w:type="dxa" w:w="90"/>
-              <w:right w:type="dxa" w:w="130"/>
-            </w:tcMar>
-            <w:vAlign w:val="center"/>
-          </w:tcPr>
-          <w:tc>
-            <w:tcPr>
-              <w:tcMar>
-                <w:top w:type="dxa" w:w="90"/>
-                <w:left w:type="dxa" w:w="130"/>
-                <w:bottom w:type="dxa" w:w="90"/>
-                <w:right w:type="dxa" w:w="130"/>
-              </w:tcMar>
-              <w:vAlign w:val="center"/>
-            </w:tcPr>
-            <w:p>
-              <w:pPr>
-                <w:spacing w:after="0" w:before="0"/>
-              </w:pPr>
-              <w:r>
-                <w:rPr>
-                  <w:rFonts w:ascii="Plus Jakarta Sans" w:cs="Plus Jakarta Sans" w:eastAsia="Plus Jakarta Sans" w:hAnsi="Plus Jakarta Sans"/>
-                  <w:b/>
-                  <w:bCs/>
-                  <w:color w:val="1F2937"/>
-                  <w:sz w:val="20"/>
-                  <w:szCs w:val="20"/>
-                </w:rPr>
-                <w:t xml:space="preserve">Biaya Bulanan</w:t>
-              </w:r>
-            </w:p>
-          </w:tc>
-          <w:p/>
-        </w:tc>
-        <w:tc>
-          <w:tcPr>
-            <w:tcMar>
-              <w:top w:type="dxa" w:w="90"/>
-              <w:left w:type="dxa" w:w="130"/>
-              <w:bottom w:type="dxa" w:w="90"/>
-              <w:right w:type="dxa" w:w="130"/>
-            </w:tcMar>
-            <w:vAlign w:val="center"/>
-          </w:tcPr>
-          <w:tc>
-            <w:tcPr>
-              <w:tcMar>
-                <w:top w:type="dxa" w:w="90"/>
-                <w:left w:type="dxa" w:w="130"/>
-                <w:bottom w:type="dxa" w:w="90"/>
-                <w:right w:type="dxa" w:w="130"/>
-              </w:tcMar>
-              <w:vAlign w:val="center"/>
-            </w:tcPr>
-            <w:p>
-              <w:pPr>
-                <w:spacing w:after="0" w:before="0"/>
-              </w:pPr>
-              <w:r>
-                <w:rPr>
-                  <w:rFonts w:ascii="Plus Jakarta Sans" w:cs="Plus Jakarta Sans" w:eastAsia="Plus Jakarta Sans" w:hAnsi="Plus Jakarta Sans"/>
-                  <w:b/>
-                  <w:bCs/>
-                  <w:color w:val="0B3D91"/>
-                  <w:sz w:val="19"/>
-                  <w:szCs w:val="19"/>
-                </w:rPr>
-                <w:t xml:space="preserve">Rp 75.000</w:t>
-              </w:r>
-            </w:p>
-          </w:tc>
-          <w:p/>
-        </w:tc>
-        <w:tc>
-          <w:tcPr>
-            <w:tcMar>
-              <w:top w:type="dxa" w:w="90"/>
-              <w:left w:type="dxa" w:w="130"/>
-              <w:bottom w:type="dxa" w:w="90"/>
-              <w:right w:type="dxa" w:w="130"/>
-            </w:tcMar>
-            <w:vAlign w:val="center"/>
-          </w:tcPr>
-          <w:tc>
-            <w:tcPr>
-              <w:tcMar>
-                <w:top w:type="dxa" w:w="90"/>
-                <w:left w:type="dxa" w:w="130"/>
-                <w:bottom w:type="dxa" w:w="90"/>
-                <w:right w:type="dxa" w:w="130"/>
-              </w:tcMar>
-              <w:vAlign w:val="center"/>
-            </w:tcPr>
-            <w:p>
-              <w:pPr>
-                <w:spacing w:after="0" w:before="0"/>
-              </w:pPr>
-              <w:r>
-                <w:rPr>
-                  <w:rFonts w:ascii="Plus Jakarta Sans" w:cs="Plus Jakarta Sans" w:eastAsia="Plus Jakarta Sans" w:hAnsi="Plus Jakarta Sans"/>
-                  <w:b/>
-                  <w:bCs/>
-                  <w:color w:val="0B3D91"/>
-                  <w:sz w:val="19"/>
-                  <w:szCs w:val="19"/>
-                </w:rPr>
-                <w:t xml:space="preserve">Rp 150.000</w:t>
-              </w:r>
-            </w:p>
-          </w:tc>
-          <w:p/>
-        </w:tc>
-        <w:tc>
-          <w:tcPr>
-            <w:tcMar>
-              <w:top w:type="dxa" w:w="90"/>
-              <w:left w:type="dxa" w:w="130"/>
-              <w:bottom w:type="dxa" w:w="90"/>
-              <w:right w:type="dxa" w:w="130"/>
-            </w:tcMar>
-            <w:vAlign w:val="center"/>
-          </w:tcPr>
-          <w:tc>
-            <w:tcPr>
-              <w:tcMar>
-                <w:top w:type="dxa" w:w="90"/>
-                <w:left w:type="dxa" w:w="130"/>
-                <w:bottom w:type="dxa" w:w="90"/>
-                <w:right w:type="dxa" w:w="130"/>
-              </w:tcMar>
-              <w:vAlign w:val="center"/>
-            </w:tcPr>
-            <w:p>
-              <w:pPr>
-                <w:spacing w:after="0" w:before="0"/>
-              </w:pPr>
-              <w:r>
-                <w:rPr>
-                  <w:rFonts w:ascii="Plus Jakarta Sans" w:cs="Plus Jakarta Sans" w:eastAsia="Plus Jakarta Sans" w:hAnsi="Plus Jakarta Sans"/>
-                  <w:b/>
-                  <w:bCs/>
-                  <w:color w:val="0B3D91"/>
-                  <w:sz w:val="19"/>
-                  <w:szCs w:val="19"/>
-                </w:rPr>
-                <w:t xml:space="preserve">Rp 350.000</w:t>
-              </w:r>
-            </w:p>
-          </w:tc>
-          <w:p/>
-        </w:tc>
-      </w:tr>
-      <w:tr>
-        <w:tc>
-          <w:tcPr>
-            <w:tcMar>
-              <w:top w:type="dxa" w:w="90"/>
-              <w:left w:type="dxa" w:w="130"/>
-              <w:bottom w:type="dxa" w:w="90"/>
-              <w:right w:type="dxa" w:w="130"/>
-            </w:tcMar>
-            <w:vAlign w:val="center"/>
-          </w:tcPr>
-          <w:tc>
-            <w:tcPr>
-              <w:tcMar>
-                <w:top w:type="dxa" w:w="90"/>
-                <w:left w:type="dxa" w:w="130"/>
-                <w:bottom w:type="dxa" w:w="90"/>
-                <w:right w:type="dxa" w:w="130"/>
-              </w:tcMar>
-              <w:vAlign w:val="center"/>
-            </w:tcPr>
-            <w:p>
-              <w:pPr>
-                <w:spacing w:after="0" w:before="0"/>
-              </w:pPr>
-              <w:r>
-                <w:rPr>
-                  <w:rFonts w:ascii="Plus Jakarta Sans" w:cs="Plus Jakarta Sans" w:eastAsia="Plus Jakarta Sans" w:hAnsi="Plus Jakarta Sans"/>
-                  <w:b/>
-                  <w:bCs/>
-                  <w:color w:val="1F2937"/>
-                  <w:sz w:val="20"/>
-                  <w:szCs w:val="20"/>
-                </w:rPr>
-                <w:t xml:space="preserve">Biaya Setup</w:t>
-              </w:r>
-            </w:p>
-          </w:tc>
-          <w:p/>
-        </w:tc>
-        <w:tc>
-          <w:tcPr>
-            <w:tcMar>
-              <w:top w:type="dxa" w:w="90"/>
-              <w:left w:type="dxa" w:w="130"/>
-              <w:bottom w:type="dxa" w:w="90"/>
-              <w:right w:type="dxa" w:w="130"/>
-            </w:tcMar>
-            <w:vAlign w:val="center"/>
-          </w:tcPr>
-          <w:tc>
-            <w:tcPr>
-              <w:tcMar>
-                <w:top w:type="dxa" w:w="90"/>
-                <w:left w:type="dxa" w:w="130"/>
-                <w:bottom w:type="dxa" w:w="90"/>
-                <w:right w:type="dxa" w:w="130"/>
-              </w:tcMar>
-              <w:vAlign w:val="center"/>
-            </w:tcPr>
-            <w:p>
-              <w:pPr>
-                <w:spacing w:after="0" w:before="0"/>
-              </w:pPr>
-              <w:r>
-                <w:rPr>
-                  <w:rFonts w:ascii="Plus Jakarta Sans" w:cs="Plus Jakarta Sans" w:eastAsia="Plus Jakarta Sans" w:hAnsi="Plus Jakarta Sans"/>
-                  <w:color w:val="1F2937"/>
-                  <w:sz w:val="19"/>
-                  <w:szCs w:val="19"/>
-                </w:rPr>
-                <w:t xml:space="preserve">Rp 0</w:t>
-              </w:r>
-            </w:p>
-          </w:tc>
-          <w:p/>
-        </w:tc>
-        <w:tc>
-          <w:tcPr>
-            <w:tcMar>
-              <w:top w:type="dxa" w:w="90"/>
-              <w:left w:type="dxa" w:w="130"/>
-              <w:bottom w:type="dxa" w:w="90"/>
-              <w:right w:type="dxa" w:w="130"/>
-            </w:tcMar>
-            <w:vAlign w:val="center"/>
-          </w:tcPr>
-          <w:tc>
-            <w:tcPr>
-              <w:tcMar>
-                <w:top w:type="dxa" w:w="90"/>
-                <w:left w:type="dxa" w:w="130"/>
-                <w:bottom w:type="dxa" w:w="90"/>
-                <w:right w:type="dxa" w:w="130"/>
-              </w:tcMar>
-              <w:vAlign w:val="center"/>
-            </w:tcPr>
-            <w:p>
-              <w:pPr>
-                <w:spacing w:after="0" w:before="0"/>
-              </w:pPr>
-              <w:r>
-                <w:rPr>
-                  <w:rFonts w:ascii="Plus Jakarta Sans" w:cs="Plus Jakarta Sans" w:eastAsia="Plus Jakarta Sans" w:hAnsi="Plus Jakarta Sans"/>
-                  <w:color w:val="1F2937"/>
-                  <w:sz w:val="19"/>
-                  <w:szCs w:val="19"/>
-                </w:rPr>
-                <w:t xml:space="preserve">Rp 500.000 sekali</w:t>
-              </w:r>
-            </w:p>
-          </w:tc>
-          <w:p/>
-        </w:tc>
-        <w:tc>
-          <w:tcPr>
-            <w:tcMar>
-              <w:top w:type="dxa" w:w="90"/>
-              <w:left w:type="dxa" w:w="130"/>
-              <w:bottom w:type="dxa" w:w="90"/>
-              <w:right w:type="dxa" w:w="130"/>
-            </w:tcMar>
-            <w:vAlign w:val="center"/>
-          </w:tcPr>
-          <w:tc>
-            <w:tcPr>
-              <w:tcMar>
-                <w:top w:type="dxa" w:w="90"/>
-                <w:left w:type="dxa" w:w="130"/>
-                <w:bottom w:type="dxa" w:w="90"/>
-                <w:right w:type="dxa" w:w="130"/>
-              </w:tcMar>
-              <w:vAlign w:val="center"/>
-            </w:tcPr>
-            <w:p>
-              <w:pPr>
-                <w:spacing w:after="0" w:before="0"/>
-              </w:pPr>
-              <w:r>
-                <w:rPr>
-                  <w:rFonts w:ascii="Plus Jakarta Sans" w:cs="Plus Jakarta Sans" w:eastAsia="Plus Jakarta Sans" w:hAnsi="Plus Jakarta Sans"/>
-                  <w:color w:val="1F2937"/>
-                  <w:sz w:val="19"/>
-                  <w:szCs w:val="19"/>
-                </w:rPr>
-                <w:t xml:space="preserve">Rp 1.500.000 sekali</w:t>
-              </w:r>
-            </w:p>
-          </w:tc>
-          <w:p/>
-        </w:tc>
-      </w:tr>
-      <w:tr>
-        <w:tc>
-          <w:tcPr>
-            <w:tcMar>
-              <w:top w:type="dxa" w:w="90"/>
-              <w:left w:type="dxa" w:w="130"/>
-              <w:bottom w:type="dxa" w:w="90"/>
-              <w:right w:type="dxa" w:w="130"/>
-            </w:tcMar>
-            <w:vAlign w:val="center"/>
-          </w:tcPr>
-          <w:tc>
-            <w:tcPr>
-              <w:tcMar>
-                <w:top w:type="dxa" w:w="90"/>
-                <w:left w:type="dxa" w:w="130"/>
-                <w:bottom w:type="dxa" w:w="90"/>
-                <w:right w:type="dxa" w:w="130"/>
-              </w:tcMar>
-              <w:vAlign w:val="center"/>
-            </w:tcPr>
-            <w:p>
-              <w:pPr>
-                <w:spacing w:after="0" w:before="0"/>
-              </w:pPr>
-              <w:r>
-                <w:rPr>
-                  <w:rFonts w:ascii="Plus Jakarta Sans" w:cs="Plus Jakarta Sans" w:eastAsia="Plus Jakarta Sans" w:hAnsi="Plus Jakarta Sans"/>
-                  <w:b/>
-                  <w:bCs/>
-                  <w:color w:val="1F2937"/>
-                  <w:sz w:val="20"/>
-                  <w:szCs w:val="20"/>
-                </w:rPr>
-                <w:t xml:space="preserve">Kelebihan</w:t>
-              </w:r>
-            </w:p>
-          </w:tc>
-          <w:p/>
-        </w:tc>
-        <w:tc>
-          <w:tcPr>
-            <w:tcMar>
-              <w:top w:type="dxa" w:w="90"/>
-              <w:left w:type="dxa" w:w="130"/>
-              <w:bottom w:type="dxa" w:w="90"/>
-              <w:right w:type="dxa" w:w="130"/>
-            </w:tcMar>
-            <w:vAlign w:val="center"/>
-          </w:tcPr>
-          <w:tc>
-            <w:tcPr>
-              <w:tcMar>
-                <w:top w:type="dxa" w:w="90"/>
-                <w:left w:type="dxa" w:w="130"/>
-                <w:bottom w:type="dxa" w:w="90"/>
-                <w:right w:type="dxa" w:w="130"/>
-              </w:tcMar>
-              <w:vAlign w:val="center"/>
-            </w:tcPr>
-            <w:p>
-              <w:pPr>
-                <w:spacing w:after="0" w:before="0"/>
-              </w:pPr>
-              <w:r>
-                <w:rPr>
-                  <w:rFonts w:ascii="Plus Jakarta Sans" w:cs="Plus Jakarta Sans" w:eastAsia="Plus Jakarta Sans" w:hAnsi="Plus Jakarta Sans"/>
-                  <w:color w:val="1F2937"/>
-                  <w:sz w:val="19"/>
-                  <w:szCs w:val="19"/>
-                </w:rPr>
-                <w:t xml:space="preserve">Paling simpel, auto scale, tanpa urus server</w:t>
-              </w:r>
-            </w:p>
-          </w:tc>
-          <w:p/>
-        </w:tc>
-        <w:tc>
-          <w:tcPr>
-            <w:tcMar>
-              <w:top w:type="dxa" w:w="90"/>
-              <w:left w:type="dxa" w:w="130"/>
-              <w:bottom w:type="dxa" w:w="90"/>
-              <w:right w:type="dxa" w:w="130"/>
-            </w:tcMar>
-            <w:vAlign w:val="center"/>
-          </w:tcPr>
-          <w:tc>
-            <w:tcPr>
-              <w:tcMar>
-                <w:top w:type="dxa" w:w="90"/>
-                <w:left w:type="dxa" w:w="130"/>
-                <w:bottom w:type="dxa" w:w="90"/>
-                <w:right w:type="dxa" w:w="130"/>
-              </w:tcMar>
-              <w:vAlign w:val="center"/>
-            </w:tcPr>
-            <w:p>
-              <w:pPr>
-                <w:spacing w:after="0" w:before="0"/>
-              </w:pPr>
-              <w:r>
-                <w:rPr>
-                  <w:rFonts w:ascii="Plus Jakarta Sans" w:cs="Plus Jakarta Sans" w:eastAsia="Plus Jakarta Sans" w:hAnsi="Plus Jakarta Sans"/>
-                  <w:color w:val="1F2937"/>
-                  <w:sz w:val="19"/>
-                  <w:szCs w:val="19"/>
-                </w:rPr>
-                <w:t xml:space="preserve">Murah, all-in-one, mudah di-maintain</w:t>
-              </w:r>
-            </w:p>
-          </w:tc>
-          <w:p/>
-        </w:tc>
-        <w:tc>
-          <w:tcPr>
-            <w:tcMar>
-              <w:top w:type="dxa" w:w="90"/>
-              <w:left w:type="dxa" w:w="130"/>
-              <w:bottom w:type="dxa" w:w="90"/>
-              <w:right w:type="dxa" w:w="130"/>
-            </w:tcMar>
-            <w:vAlign w:val="center"/>
-          </w:tcPr>
-          <w:tc>
-            <w:tcPr>
-              <w:tcMar>
-                <w:top w:type="dxa" w:w="90"/>
-                <w:left w:type="dxa" w:w="130"/>
-                <w:bottom w:type="dxa" w:w="90"/>
-                <w:right w:type="dxa" w:w="130"/>
-              </w:tcMar>
-              <w:vAlign w:val="center"/>
-            </w:tcPr>
-            <w:p>
-              <w:pPr>
-                <w:spacing w:after="0" w:before="0"/>
-              </w:pPr>
-              <w:r>
-                <w:rPr>
-                  <w:rFonts w:ascii="Plus Jakarta Sans" w:cs="Plus Jakarta Sans" w:eastAsia="Plus Jakarta Sans" w:hAnsi="Plus Jakarta Sans"/>
-                  <w:color w:val="1F2937"/>
-                  <w:sz w:val="19"/>
-                  <w:szCs w:val="19"/>
-                </w:rPr>
-                <w:t xml:space="preserve">Resource besar, email kustom, multi-aplikasi</w:t>
-              </w:r>
-            </w:p>
-          </w:tc>
-          <w:p/>
-        </w:tc>
-      </w:tr>
-      <w:tr>
-        <w:tc>
-          <w:tcPr>
-            <w:tcMar>
-              <w:top w:type="dxa" w:w="90"/>
-              <w:left w:type="dxa" w:w="130"/>
-              <w:bottom w:type="dxa" w:w="90"/>
-              <w:right w:type="dxa" w:w="130"/>
-            </w:tcMar>
-            <w:vAlign w:val="center"/>
-          </w:tcPr>
-          <w:tc>
-            <w:tcPr>
-              <w:tcMar>
-                <w:top w:type="dxa" w:w="90"/>
-                <w:left w:type="dxa" w:w="130"/>
-                <w:bottom w:type="dxa" w:w="90"/>
-                <w:right w:type="dxa" w:w="130"/>
-              </w:tcMar>
-              <w:vAlign w:val="center"/>
-            </w:tcPr>
-            <w:p>
-              <w:pPr>
-                <w:spacing w:after="0" w:before="0"/>
-              </w:pPr>
-              <w:r>
-                <w:rPr>
-                  <w:rFonts w:ascii="Plus Jakarta Sans" w:cs="Plus Jakarta Sans" w:eastAsia="Plus Jakarta Sans" w:hAnsi="Plus Jakarta Sans"/>
-                  <w:b/>
-                  <w:bCs/>
-                  <w:color w:val="1F2937"/>
-                  <w:sz w:val="20"/>
-                  <w:szCs w:val="20"/>
-                </w:rPr>
-                <w:t xml:space="preserve">Cocok Untuk</w:t>
-              </w:r>
-            </w:p>
-          </w:tc>
-          <w:p/>
-        </w:tc>
-        <w:tc>
-          <w:tcPr>
-            <w:tcMar>
-              <w:top w:type="dxa" w:w="90"/>
-              <w:left w:type="dxa" w:w="130"/>
-              <w:bottom w:type="dxa" w:w="90"/>
-              <w:right w:type="dxa" w:w="130"/>
-            </w:tcMar>
-            <w:vAlign w:val="center"/>
-          </w:tcPr>
-          <w:tc>
-            <w:tcPr>
-              <w:tcMar>
-                <w:top w:type="dxa" w:w="90"/>
-                <w:left w:type="dxa" w:w="130"/>
-                <w:bottom w:type="dxa" w:w="90"/>
-                <w:right w:type="dxa" w:w="130"/>
-              </w:tcMar>
-              <w:vAlign w:val="center"/>
-            </w:tcPr>
-            <w:p>
-              <w:pPr>
-                <w:spacing w:after="0" w:before="0"/>
-              </w:pPr>
-              <w:r>
-                <w:rPr>
-                  <w:rFonts w:ascii="Plus Jakarta Sans" w:cs="Plus Jakarta Sans" w:eastAsia="Plus Jakarta Sans" w:hAnsi="Plus Jakarta Sans"/>
-                  <w:color w:val="1F2937"/>
-                  <w:sz w:val="19"/>
-                  <w:szCs w:val="19"/>
-                </w:rPr>
-                <w:t xml:space="preserve">Profil &amp; PPDB reguler</w:t>
-              </w:r>
-            </w:p>
-          </w:tc>
-          <w:p/>
-        </w:tc>
-        <w:tc>
-          <w:tcPr>
-            <w:tcMar>
-              <w:top w:type="dxa" w:w="90"/>
-              <w:left w:type="dxa" w:w="130"/>
-              <w:bottom w:type="dxa" w:w="90"/>
-              <w:right w:type="dxa" w:w="130"/>
-            </w:tcMar>
-            <w:vAlign w:val="center"/>
-          </w:tcPr>
-          <w:tc>
-            <w:tcPr>
-              <w:tcMar>
-                <w:top w:type="dxa" w:w="90"/>
-                <w:left w:type="dxa" w:w="130"/>
-                <w:bottom w:type="dxa" w:w="90"/>
-                <w:right w:type="dxa" w:w="130"/>
-              </w:tcMar>
-              <w:vAlign w:val="center"/>
-            </w:tcPr>
-            <w:p>
-              <w:pPr>
-                <w:spacing w:after="0" w:before="0"/>
-              </w:pPr>
-              <w:r>
-                <w:rPr>
-                  <w:rFonts w:ascii="Plus Jakarta Sans" w:cs="Plus Jakarta Sans" w:eastAsia="Plus Jakarta Sans" w:hAnsi="Plus Jakarta Sans"/>
-                  <w:color w:val="1F2937"/>
-                  <w:sz w:val="19"/>
-                  <w:szCs w:val="19"/>
-                </w:rPr>
-                <w:t xml:space="preserve">Kebanyakan sekolah</w:t>
-              </w:r>
-            </w:p>
-          </w:tc>
-          <w:p/>
-        </w:tc>
-        <w:tc>
-          <w:tcPr>
-            <w:tcMar>
-              <w:top w:type="dxa" w:w="90"/>
-              <w:left w:type="dxa" w:w="130"/>
-              <w:bottom w:type="dxa" w:w="90"/>
-              <w:right w:type="dxa" w:w="130"/>
-            </w:tcMar>
-            <w:vAlign w:val="center"/>
-          </w:tcPr>
-          <w:tc>
-            <w:tcPr>
-              <w:tcMar>
-                <w:top w:type="dxa" w:w="90"/>
-                <w:left w:type="dxa" w:w="130"/>
-                <w:bottom w:type="dxa" w:w="90"/>
-                <w:right w:type="dxa" w:w="130"/>
-              </w:tcMar>
-              <w:vAlign w:val="center"/>
-            </w:tcPr>
-            <w:p>
-              <w:pPr>
-                <w:spacing w:after="0" w:before="0"/>
-              </w:pPr>
-              <w:r>
-                <w:rPr>
-                  <w:rFonts w:ascii="Plus Jakarta Sans" w:cs="Plus Jakarta Sans" w:eastAsia="Plus Jakarta Sans" w:hAnsi="Plus Jakarta Sans"/>
-                  <w:color w:val="1F2937"/>
-                  <w:sz w:val="19"/>
-                  <w:szCs w:val="19"/>
-                </w:rPr>
-                <w:t xml:space="preserve">PPDB volume besar, akademik</w:t>
-              </w:r>
-            </w:p>
-          </w:tc>
-          <w:p/>
-        </w:tc>
-      </w:tr>
-    </w:tbl>
-    <w:p>
-      <w:pPr>
-        <w:spacing w:after="0" w:before="0"/>
-      </w:pPr>
-      <w:r>
-        <w:rPr>
-          <w:rFonts w:ascii="Plus Jakarta Sans" w:cs="Plus Jakarta Sans" w:eastAsia="Plus Jakarta Sans" w:hAnsi="Plus Jakarta Sans"/>
-          <w:color w:val="1F2937"/>
-          <w:sz w:val="22"/>
-          <w:szCs w:val="22"/>
-        </w:rPr>
-        <w:t xml:space="preserve"> </w:t>
-      </w:r>
-    </w:p>
-    <w:p>
-      <w:pPr>
-        <w:spacing w:after="0" w:before="0"/>
+        <w:t xml:space="preserve">9. Mengapa Memilih Kami</w:t>
+      </w:r>
+    </w:p>
+    <w:p>
+      <w:pPr>
+        <w:spacing w:after="80"/>
+        <w:ind w:left="360"/>
       </w:pPr>
       <w:r>
         <w:rPr>
           <w:rFonts w:ascii="Plus Jakarta Sans" w:cs="Plus Jakarta Sans" w:eastAsia="Plus Jakarta Sans" w:hAnsi="Plus Jakarta Sans"/>
           <w:b/>
           <w:bCs/>
+          <w:color w:val="C9A227"/>
+          <w:sz w:val="22"/>
+          <w:szCs w:val="22"/>
+        </w:rPr>
+        <w:t xml:space="preserve">✓  </w:t>
+      </w:r>
+      <w:r>
+        <w:rPr>
+          <w:rFonts w:ascii="Plus Jakarta Sans" w:cs="Plus Jakarta Sans" w:eastAsia="Plus Jakarta Sans" w:hAnsi="Plus Jakarta Sans"/>
           <w:color w:val="1F2937"/>
           <w:sz w:val="22"/>
           <w:szCs w:val="22"/>
         </w:rPr>
-        <w:t xml:space="preserve">Catatan: </w:t>
+        <w:t xml:space="preserve">Berpengalaman membangun website profil sekolah &amp; instansi pendidikan</w:t>
+      </w:r>
+    </w:p>
+    <w:p>
+      <w:pPr>
+        <w:spacing w:after="80"/>
+        <w:ind w:left="360"/>
+      </w:pPr>
+      <w:r>
+        <w:rPr>
+          <w:rFonts w:ascii="Plus Jakarta Sans" w:cs="Plus Jakarta Sans" w:eastAsia="Plus Jakarta Sans" w:hAnsi="Plus Jakarta Sans"/>
+          <w:b/>
+          <w:bCs/>
+          <w:color w:val="C9A227"/>
+          <w:sz w:val="22"/>
+          <w:szCs w:val="22"/>
+        </w:rPr>
+        <w:t xml:space="preserve">✓  </w:t>
       </w:r>
       <w:r>
         <w:rPr>
@@ -7093,7 +6073,137 @@
           <w:sz w:val="22"/>
           <w:szCs w:val="22"/>
         </w:rPr>
-        <w:t xml:space="preserve">Dokumen pendaftar &amp; backup database selalu disimpan di Cloudflare R2 (private bucket, presigned URL). Harga bulanan sudah termasuk layanan monitoring, keamanan &amp; dukungan teknis.</w:t>
+        <w:t xml:space="preserve">Desain modern, mobile-first, dan sesuai identitas sekolah</w:t>
+      </w:r>
+    </w:p>
+    <w:p>
+      <w:pPr>
+        <w:spacing w:after="80"/>
+        <w:ind w:left="360"/>
+      </w:pPr>
+      <w:r>
+        <w:rPr>
+          <w:rFonts w:ascii="Plus Jakarta Sans" w:cs="Plus Jakarta Sans" w:eastAsia="Plus Jakarta Sans" w:hAnsi="Plus Jakarta Sans"/>
+          <w:b/>
+          <w:bCs/>
+          <w:color w:val="C9A227"/>
+          <w:sz w:val="22"/>
+          <w:szCs w:val="22"/>
+        </w:rPr>
+        <w:t xml:space="preserve">✓  </w:t>
+      </w:r>
+      <w:r>
+        <w:rPr>
+          <w:rFonts w:ascii="Plus Jakarta Sans" w:cs="Plus Jakarta Sans" w:eastAsia="Plus Jakarta Sans" w:hAnsi="Plus Jakarta Sans"/>
+          <w:color w:val="1F2937"/>
+          <w:sz w:val="22"/>
+          <w:szCs w:val="22"/>
+        </w:rPr>
+        <w:t xml:space="preserve">Panel admin mudah digunakan — staf sekolah bisa update sendiri</w:t>
+      </w:r>
+    </w:p>
+    <w:p>
+      <w:pPr>
+        <w:spacing w:after="80"/>
+        <w:ind w:left="360"/>
+      </w:pPr>
+      <w:r>
+        <w:rPr>
+          <w:rFonts w:ascii="Plus Jakarta Sans" w:cs="Plus Jakarta Sans" w:eastAsia="Plus Jakarta Sans" w:hAnsi="Plus Jakarta Sans"/>
+          <w:b/>
+          <w:bCs/>
+          <w:color w:val="C9A227"/>
+          <w:sz w:val="22"/>
+          <w:szCs w:val="22"/>
+        </w:rPr>
+        <w:t xml:space="preserve">✓  </w:t>
+      </w:r>
+      <w:r>
+        <w:rPr>
+          <w:rFonts w:ascii="Plus Jakarta Sans" w:cs="Plus Jakarta Sans" w:eastAsia="Plus Jakarta Sans" w:hAnsi="Plus Jakarta Sans"/>
+          <w:color w:val="1F2937"/>
+          <w:sz w:val="22"/>
+          <w:szCs w:val="22"/>
+        </w:rPr>
+        <w:t xml:space="preserve">Customizer tampilan: ganti warna &amp; teks tanpa perlu developer</w:t>
+      </w:r>
+    </w:p>
+    <w:p>
+      <w:pPr>
+        <w:spacing w:after="80"/>
+        <w:ind w:left="360"/>
+      </w:pPr>
+      <w:r>
+        <w:rPr>
+          <w:rFonts w:ascii="Plus Jakarta Sans" w:cs="Plus Jakarta Sans" w:eastAsia="Plus Jakarta Sans" w:hAnsi="Plus Jakarta Sans"/>
+          <w:b/>
+          <w:bCs/>
+          <w:color w:val="C9A227"/>
+          <w:sz w:val="22"/>
+          <w:szCs w:val="22"/>
+        </w:rPr>
+        <w:t xml:space="preserve">✓  </w:t>
+      </w:r>
+      <w:r>
+        <w:rPr>
+          <w:rFonts w:ascii="Plus Jakarta Sans" w:cs="Plus Jakarta Sans" w:eastAsia="Plus Jakarta Sans" w:hAnsi="Plus Jakarta Sans"/>
+          <w:color w:val="1F2937"/>
+          <w:sz w:val="22"/>
+          <w:szCs w:val="22"/>
+        </w:rPr>
+        <w:t xml:space="preserve">Harga transparan, tanpa biaya tersembunyi</w:t>
+      </w:r>
+    </w:p>
+    <w:p>
+      <w:pPr>
+        <w:spacing w:after="80"/>
+        <w:ind w:left="360"/>
+      </w:pPr>
+      <w:r>
+        <w:rPr>
+          <w:rFonts w:ascii="Plus Jakarta Sans" w:cs="Plus Jakarta Sans" w:eastAsia="Plus Jakarta Sans" w:hAnsi="Plus Jakarta Sans"/>
+          <w:b/>
+          <w:bCs/>
+          <w:color w:val="C9A227"/>
+          <w:sz w:val="22"/>
+          <w:szCs w:val="22"/>
+        </w:rPr>
+        <w:t xml:space="preserve">✓  </w:t>
+      </w:r>
+      <w:r>
+        <w:rPr>
+          <w:rFonts w:ascii="Plus Jakarta Sans" w:cs="Plus Jakarta Sans" w:eastAsia="Plus Jakarta Sans" w:hAnsi="Plus Jakarta Sans"/>
+          <w:color w:val="1F2937"/>
+          <w:sz w:val="22"/>
+          <w:szCs w:val="22"/>
+        </w:rPr>
+        <w:t xml:space="preserve">Dukungan responsif &amp; garansi 3 bulan</w:t>
+      </w:r>
+    </w:p>
+    <w:p>
+      <w:pPr>
+        <w:spacing w:after="80"/>
+        <w:ind w:left="360"/>
+      </w:pPr>
+      <w:r>
+        <w:rPr>
+          <w:rFonts w:ascii="Plus Jakarta Sans" w:cs="Plus Jakarta Sans" w:eastAsia="Plus Jakarta Sans" w:hAnsi="Plus Jakarta Sans"/>
+          <w:b/>
+          <w:bCs/>
+          <w:color w:val="C9A227"/>
+          <w:sz w:val="22"/>
+          <w:szCs w:val="22"/>
+        </w:rPr>
+        <w:t xml:space="preserve">✓  </w:t>
+      </w:r>
+      <w:r>
+        <w:rPr>
+          <w:rFonts w:ascii="Plus Jakarta Sans" w:cs="Plus Jakarta Sans" w:eastAsia="Plus Jakarta Sans" w:hAnsi="Plus Jakarta Sans"/>
+          <w:color w:val="1F2937"/>
+          <w:sz w:val="22"/>
+          <w:szCs w:val="22"/>
+        </w:rPr>
+        <w:t xml:space="preserve">Demo live dapat dilihat &amp; dicoba langsung sebelum memutuskan</w:t>
       </w:r>
     </w:p>
     <w:p>
@@ -7110,206 +6220,7 @@
           <w:sz w:val="30"/>
           <w:szCs w:val="30"/>
         </w:rPr>
-        <w:t xml:space="preserve">10. Mengapa Memilih Kami</w:t>
-      </w:r>
-    </w:p>
-    <w:p>
-      <w:pPr>
-        <w:spacing w:after="80"/>
-        <w:ind w:left="360"/>
-      </w:pPr>
-      <w:r>
-        <w:rPr>
-          <w:rFonts w:ascii="Plus Jakarta Sans" w:cs="Plus Jakarta Sans" w:eastAsia="Plus Jakarta Sans" w:hAnsi="Plus Jakarta Sans"/>
-          <w:b/>
-          <w:bCs/>
-          <w:color w:val="C9A227"/>
-          <w:sz w:val="22"/>
-          <w:szCs w:val="22"/>
-        </w:rPr>
-        <w:t xml:space="preserve">✓  </w:t>
-      </w:r>
-      <w:r>
-        <w:rPr>
-          <w:rFonts w:ascii="Plus Jakarta Sans" w:cs="Plus Jakarta Sans" w:eastAsia="Plus Jakarta Sans" w:hAnsi="Plus Jakarta Sans"/>
-          <w:color w:val="1F2937"/>
-          <w:sz w:val="22"/>
-          <w:szCs w:val="22"/>
-        </w:rPr>
-        <w:t xml:space="preserve">Berpengalaman membangun website profil sekolah &amp; instansi pendidikan</w:t>
-      </w:r>
-    </w:p>
-    <w:p>
-      <w:pPr>
-        <w:spacing w:after="80"/>
-        <w:ind w:left="360"/>
-      </w:pPr>
-      <w:r>
-        <w:rPr>
-          <w:rFonts w:ascii="Plus Jakarta Sans" w:cs="Plus Jakarta Sans" w:eastAsia="Plus Jakarta Sans" w:hAnsi="Plus Jakarta Sans"/>
-          <w:b/>
-          <w:bCs/>
-          <w:color w:val="C9A227"/>
-          <w:sz w:val="22"/>
-          <w:szCs w:val="22"/>
-        </w:rPr>
-        <w:t xml:space="preserve">✓  </w:t>
-      </w:r>
-      <w:r>
-        <w:rPr>
-          <w:rFonts w:ascii="Plus Jakarta Sans" w:cs="Plus Jakarta Sans" w:eastAsia="Plus Jakarta Sans" w:hAnsi="Plus Jakarta Sans"/>
-          <w:color w:val="1F2937"/>
-          <w:sz w:val="22"/>
-          <w:szCs w:val="22"/>
-        </w:rPr>
-        <w:t xml:space="preserve">Desain modern, mobile-first, dan sesuai identitas sekolah</w:t>
-      </w:r>
-    </w:p>
-    <w:p>
-      <w:pPr>
-        <w:spacing w:after="80"/>
-        <w:ind w:left="360"/>
-      </w:pPr>
-      <w:r>
-        <w:rPr>
-          <w:rFonts w:ascii="Plus Jakarta Sans" w:cs="Plus Jakarta Sans" w:eastAsia="Plus Jakarta Sans" w:hAnsi="Plus Jakarta Sans"/>
-          <w:b/>
-          <w:bCs/>
-          <w:color w:val="C9A227"/>
-          <w:sz w:val="22"/>
-          <w:szCs w:val="22"/>
-        </w:rPr>
-        <w:t xml:space="preserve">✓  </w:t>
-      </w:r>
-      <w:r>
-        <w:rPr>
-          <w:rFonts w:ascii="Plus Jakarta Sans" w:cs="Plus Jakarta Sans" w:eastAsia="Plus Jakarta Sans" w:hAnsi="Plus Jakarta Sans"/>
-          <w:color w:val="1F2937"/>
-          <w:sz w:val="22"/>
-          <w:szCs w:val="22"/>
-        </w:rPr>
-        <w:t xml:space="preserve">Panel admin mudah digunakan — staf sekolah bisa update sendiri</w:t>
-      </w:r>
-    </w:p>
-    <w:p>
-      <w:pPr>
-        <w:spacing w:after="80"/>
-        <w:ind w:left="360"/>
-      </w:pPr>
-      <w:r>
-        <w:rPr>
-          <w:rFonts w:ascii="Plus Jakarta Sans" w:cs="Plus Jakarta Sans" w:eastAsia="Plus Jakarta Sans" w:hAnsi="Plus Jakarta Sans"/>
-          <w:b/>
-          <w:bCs/>
-          <w:color w:val="C9A227"/>
-          <w:sz w:val="22"/>
-          <w:szCs w:val="22"/>
-        </w:rPr>
-        <w:t xml:space="preserve">✓  </w:t>
-      </w:r>
-      <w:r>
-        <w:rPr>
-          <w:rFonts w:ascii="Plus Jakarta Sans" w:cs="Plus Jakarta Sans" w:eastAsia="Plus Jakarta Sans" w:hAnsi="Plus Jakarta Sans"/>
-          <w:color w:val="1F2937"/>
-          <w:sz w:val="22"/>
-          <w:szCs w:val="22"/>
-        </w:rPr>
-        <w:t xml:space="preserve">Customizer tampilan: ganti warna &amp; teks tanpa perlu developer</w:t>
-      </w:r>
-    </w:p>
-    <w:p>
-      <w:pPr>
-        <w:spacing w:after="80"/>
-        <w:ind w:left="360"/>
-      </w:pPr>
-      <w:r>
-        <w:rPr>
-          <w:rFonts w:ascii="Plus Jakarta Sans" w:cs="Plus Jakarta Sans" w:eastAsia="Plus Jakarta Sans" w:hAnsi="Plus Jakarta Sans"/>
-          <w:b/>
-          <w:bCs/>
-          <w:color w:val="C9A227"/>
-          <w:sz w:val="22"/>
-          <w:szCs w:val="22"/>
-        </w:rPr>
-        <w:t xml:space="preserve">✓  </w:t>
-      </w:r>
-      <w:r>
-        <w:rPr>
-          <w:rFonts w:ascii="Plus Jakarta Sans" w:cs="Plus Jakarta Sans" w:eastAsia="Plus Jakarta Sans" w:hAnsi="Plus Jakarta Sans"/>
-          <w:color w:val="1F2937"/>
-          <w:sz w:val="22"/>
-          <w:szCs w:val="22"/>
-        </w:rPr>
-        <w:t xml:space="preserve">Harga transparan, tanpa biaya tersembunyi</w:t>
-      </w:r>
-    </w:p>
-    <w:p>
-      <w:pPr>
-        <w:spacing w:after="80"/>
-        <w:ind w:left="360"/>
-      </w:pPr>
-      <w:r>
-        <w:rPr>
-          <w:rFonts w:ascii="Plus Jakarta Sans" w:cs="Plus Jakarta Sans" w:eastAsia="Plus Jakarta Sans" w:hAnsi="Plus Jakarta Sans"/>
-          <w:b/>
-          <w:bCs/>
-          <w:color w:val="C9A227"/>
-          <w:sz w:val="22"/>
-          <w:szCs w:val="22"/>
-        </w:rPr>
-        <w:t xml:space="preserve">✓  </w:t>
-      </w:r>
-      <w:r>
-        <w:rPr>
-          <w:rFonts w:ascii="Plus Jakarta Sans" w:cs="Plus Jakarta Sans" w:eastAsia="Plus Jakarta Sans" w:hAnsi="Plus Jakarta Sans"/>
-          <w:color w:val="1F2937"/>
-          <w:sz w:val="22"/>
-          <w:szCs w:val="22"/>
-        </w:rPr>
-        <w:t xml:space="preserve">Dukungan responsif &amp; garansi 3 bulan</w:t>
-      </w:r>
-    </w:p>
-    <w:p>
-      <w:pPr>
-        <w:spacing w:after="80"/>
-        <w:ind w:left="360"/>
-      </w:pPr>
-      <w:r>
-        <w:rPr>
-          <w:rFonts w:ascii="Plus Jakarta Sans" w:cs="Plus Jakarta Sans" w:eastAsia="Plus Jakarta Sans" w:hAnsi="Plus Jakarta Sans"/>
-          <w:b/>
-          <w:bCs/>
-          <w:color w:val="C9A227"/>
-          <w:sz w:val="22"/>
-          <w:szCs w:val="22"/>
-        </w:rPr>
-        <w:t xml:space="preserve">✓  </w:t>
-      </w:r>
-      <w:r>
-        <w:rPr>
-          <w:rFonts w:ascii="Plus Jakarta Sans" w:cs="Plus Jakarta Sans" w:eastAsia="Plus Jakarta Sans" w:hAnsi="Plus Jakarta Sans"/>
-          <w:color w:val="1F2937"/>
-          <w:sz w:val="22"/>
-          <w:szCs w:val="22"/>
-        </w:rPr>
-        <w:t xml:space="preserve">Demo live dapat dilihat &amp; dicoba langsung sebelum memutuskan</w:t>
-      </w:r>
-    </w:p>
-    <w:p>
-      <w:pPr>
-        <w:pStyle w:val="Heading1"/>
-        <w:spacing w:after="160" w:before="400"/>
-      </w:pPr>
-      <w:r>
-        <w:rPr>
-          <w:rFonts w:ascii="Plus Jakarta Sans" w:cs="Plus Jakarta Sans" w:eastAsia="Plus Jakarta Sans" w:hAnsi="Plus Jakarta Sans"/>
-          <w:b/>
-          <w:bCs/>
-          <w:color w:val="082B66"/>
-          <w:sz w:val="30"/>
-          <w:szCs w:val="30"/>
-        </w:rPr>
-        <w:t xml:space="preserve">11. Penutup</w:t>
+        <w:t xml:space="preserve">10. Penutup</w:t>
       </w:r>
     </w:p>
     <w:p>
@@ -7423,7 +6334,7 @@
           <w:sz w:val="20"/>
           <w:szCs w:val="20"/>
         </w:rPr>
-        <w:t xml:space="preserve">WA/HP: 08xx-xxxx-xxxx · Email: novskidev@email.com</w:t>
+        <w:t xml:space="preserve">WA/HP: 0852-2615-5240 · Email: novskidev@email.com</w:t>
       </w:r>
     </w:p>
     <w:sectPr>

</xml_diff>

<commit_message>
deploy: infra 4 opsi
</commit_message>
<xml_diff>
--- a/proposal/Proposal_Website_SD_Muhammadiyah_Pakel.docx
+++ b/proposal/Proposal_Website_SD_Muhammadiyah_Pakel.docx
@@ -142,7 +142,7 @@
           <w:sz w:val="18"/>
           <w:szCs w:val="18"/>
         </w:rPr>
-        <w:t xml:space="preserve">WA/HP: 08xx-xxxx-xxxx  ·  Email: novskidev@email.com</w:t>
+        <w:t xml:space="preserve">WA/HP: 0852-2615-5240  ·  Email: novskidev@email.com</w:t>
       </w:r>
     </w:p>
     <w:p>
@@ -320,7 +320,7 @@
           <w:sz w:val="22"/>
           <w:szCs w:val="22"/>
         </w:rPr>
-        <w:t xml:space="preserve">Spesifikasi Teknis</w:t>
+        <w:t xml:space="preserve">Pilihan Infrastruktur</w:t>
       </w:r>
       <w:r>
         <w:rPr>
@@ -419,7 +419,7 @@
           <w:sz w:val="22"/>
           <w:szCs w:val="22"/>
         </w:rPr>
-        <w:t xml:space="preserve">Pilihan Arsitektur &amp; Infrastruktur</w:t>
+        <w:t xml:space="preserve">Ketentuan Layanan</w:t>
       </w:r>
       <w:r>
         <w:rPr>
@@ -452,7 +452,7 @@
           <w:sz w:val="22"/>
           <w:szCs w:val="22"/>
         </w:rPr>
-        <w:t xml:space="preserve">Ketentuan Layanan</w:t>
+        <w:t xml:space="preserve">Tahapan Pekerjaan</w:t>
       </w:r>
       <w:r>
         <w:rPr>
@@ -485,7 +485,7 @@
           <w:sz w:val="22"/>
           <w:szCs w:val="22"/>
         </w:rPr>
-        <w:t xml:space="preserve">Tahapan Pekerjaan</w:t>
+        <w:t xml:space="preserve">Mengapa Memilih Kami</w:t>
       </w:r>
       <w:r>
         <w:rPr>
@@ -518,7 +518,7 @@
           <w:sz w:val="22"/>
           <w:szCs w:val="22"/>
         </w:rPr>
-        <w:t xml:space="preserve">Mengapa Memilih Kami</w:t>
+        <w:t xml:space="preserve">Penutup</w:t>
       </w:r>
       <w:r>
         <w:rPr>
@@ -535,39 +535,6 @@
           <w:szCs w:val="22"/>
         </w:rPr>
         <w:t xml:space="preserve">12</w:t>
-      </w:r>
-    </w:p>
-    <w:p>
-      <w:pPr>
-        <w:tabs>
-          <w:tab w:val="right" w:pos="9070" w:leader="1"/>
-        </w:tabs>
-        <w:spacing w:after="140"/>
-      </w:pPr>
-      <w:r>
-        <w:rPr>
-          <w:rFonts w:ascii="Plus Jakarta Sans" w:cs="Plus Jakarta Sans" w:eastAsia="Plus Jakarta Sans" w:hAnsi="Plus Jakarta Sans"/>
-          <w:color w:val="1F2937"/>
-          <w:sz w:val="22"/>
-          <w:szCs w:val="22"/>
-        </w:rPr>
-        <w:t xml:space="preserve">Penutup</w:t>
-      </w:r>
-      <w:r>
-        <w:rPr>
-          <w:sz w:val="22"/>
-          <w:szCs w:val="22"/>
-        </w:rPr>
-        <w:t xml:space="preserve">	</w:t>
-      </w:r>
-      <w:r>
-        <w:rPr>
-          <w:rFonts w:ascii="Plus Jakarta Sans" w:cs="Plus Jakarta Sans" w:eastAsia="Plus Jakarta Sans" w:hAnsi="Plus Jakarta Sans"/>
-          <w:color w:val="5B6B82"/>
-          <w:sz w:val="22"/>
-          <w:szCs w:val="22"/>
-        </w:rPr>
-        <w:t xml:space="preserve">13</w:t>
       </w:r>
     </w:p>
     <w:p>
@@ -2817,7 +2784,21 @@
           <w:sz w:val="30"/>
           <w:szCs w:val="30"/>
         </w:rPr>
-        <w:t xml:space="preserve">5. Spesifikasi Teknis</w:t>
+        <w:t xml:space="preserve">5. Pilihan Infrastruktur</w:t>
+      </w:r>
+    </w:p>
+    <w:p>
+      <w:pPr>
+        <w:spacing w:after="120" w:before="0"/>
+      </w:pPr>
+      <w:r>
+        <w:rPr>
+          <w:rFonts w:ascii="Plus Jakarta Sans" w:cs="Plus Jakarta Sans" w:eastAsia="Plus Jakarta Sans" w:hAnsi="Plus Jakarta Sans"/>
+          <w:color w:val="1F2937"/>
+          <w:sz w:val="22"/>
+          <w:szCs w:val="22"/>
+        </w:rPr>
+        <w:t xml:space="preserve">Tersedia 4 opsi infrastruktur. Semua sudah termasuk aplikasi (Next.js), database (PostgreSQL), dan penyimpanan dokumen (Cloudflare R2). Biaya setup Rp 0 untuk semua opsi.</w:t>
       </w:r>
     </w:p>
     <w:tbl>
@@ -2833,8 +2814,9 @@
         </w:tblBorders>
       </w:tblPr>
       <w:tblGrid>
-        <w:gridCol w:w="2200"/>
-        <w:gridCol w:w="6900"/>
+        <w:gridCol w:w="1500"/>
+        <w:gridCol w:w="2100"/>
+        <w:gridCol w:w="5500"/>
       </w:tblGrid>
       <w:tr>
         <w:trPr>
@@ -2864,7 +2846,7 @@
                 <w:sz w:val="20"/>
                 <w:szCs w:val="20"/>
               </w:rPr>
-              <w:t xml:space="preserve">Aspek</w:t>
+              <w:t xml:space="preserve">Opsi</w:t>
             </w:r>
           </w:p>
         </w:tc>
@@ -2892,10 +2874,38 @@
                 <w:sz w:val="20"/>
                 <w:szCs w:val="20"/>
               </w:rPr>
-              <w:t xml:space="preserve">Spesifikasi</w:t>
+              <w:t xml:space="preserve">Biaya</w:t>
             </w:r>
           </w:p>
         </w:tc>
+        <w:tc>
+          <w:tcPr>
+            <w:shd w:fill="0B3D91" w:color="auto" w:val="clear"/>
+            <w:tcMar>
+              <w:top w:type="dxa" w:w="90"/>
+              <w:left w:type="dxa" w:w="130"/>
+              <w:bottom w:type="dxa" w:w="90"/>
+              <w:right w:type="dxa" w:w="130"/>
+            </w:tcMar>
+            <w:vAlign w:val="center"/>
+          </w:tcPr>
+          <w:p>
+            <w:pPr>
+              <w:spacing w:after="0" w:before="0"/>
+            </w:pPr>
+            <w:r>
+              <w:rPr>
+                <w:rFonts w:ascii="Plus Jakarta Sans" w:cs="Plus Jakarta Sans" w:eastAsia="Plus Jakarta Sans" w:hAnsi="Plus Jakarta Sans"/>
+                <w:b/>
+                <w:bCs/>
+                <w:color w:val="FFFFFF"/>
+                <w:sz w:val="20"/>
+                <w:szCs w:val="20"/>
+              </w:rPr>
+              <w:t xml:space="preserve">Spek &amp; Batasan</w:t>
+            </w:r>
+          </w:p>
+        </w:tc>
       </w:tr>
       <w:tr>
         <w:tc>
@@ -2931,44 +2941,83 @@
                   <w:sz w:val="20"/>
                   <w:szCs w:val="20"/>
                 </w:rPr>
-                <w:t xml:space="preserve">Desain</w:t>
-              </w:r>
-            </w:p>
-          </w:tc>
-          <w:p/>
-        </w:tc>
-        <w:tc>
-          <w:tcPr>
-            <w:tcMar>
-              <w:top w:type="dxa" w:w="90"/>
-              <w:left w:type="dxa" w:w="130"/>
-              <w:bottom w:type="dxa" w:w="90"/>
-              <w:right w:type="dxa" w:w="130"/>
-            </w:tcMar>
-            <w:vAlign w:val="center"/>
-          </w:tcPr>
-          <w:tc>
-            <w:tcPr>
-              <w:tcMar>
-                <w:top w:type="dxa" w:w="90"/>
-                <w:left w:type="dxa" w:w="130"/>
-                <w:bottom w:type="dxa" w:w="90"/>
-                <w:right w:type="dxa" w:w="130"/>
-              </w:tcMar>
-              <w:vAlign w:val="center"/>
-            </w:tcPr>
-            <w:p>
-              <w:pPr>
-                <w:spacing w:after="0" w:before="0"/>
-              </w:pPr>
-              <w:r>
-                <w:rPr>
-                  <w:rFonts w:ascii="Plus Jakarta Sans" w:cs="Plus Jakarta Sans" w:eastAsia="Plus Jakarta Sans" w:hAnsi="Plus Jakarta Sans"/>
-                  <w:color w:val="1F2937"/>
-                  <w:sz w:val="20"/>
-                  <w:szCs w:val="20"/>
-                </w:rPr>
-                <w:t xml:space="preserve">Responsive (HP, tablet, desktop), modern, sesuai branding sekolah</w:t>
+                <w:t xml:space="preserve">Supabase Free</w:t>
+              </w:r>
+            </w:p>
+          </w:tc>
+          <w:p/>
+        </w:tc>
+        <w:tc>
+          <w:tcPr>
+            <w:tcMar>
+              <w:top w:type="dxa" w:w="90"/>
+              <w:left w:type="dxa" w:w="130"/>
+              <w:bottom w:type="dxa" w:w="90"/>
+              <w:right w:type="dxa" w:w="130"/>
+            </w:tcMar>
+            <w:vAlign w:val="center"/>
+          </w:tcPr>
+          <w:tc>
+            <w:tcPr>
+              <w:tcMar>
+                <w:top w:type="dxa" w:w="90"/>
+                <w:left w:type="dxa" w:w="130"/>
+                <w:bottom w:type="dxa" w:w="90"/>
+                <w:right w:type="dxa" w:w="130"/>
+              </w:tcMar>
+              <w:vAlign w:val="center"/>
+            </w:tcPr>
+            <w:p>
+              <w:pPr>
+                <w:spacing w:after="0" w:before="0"/>
+              </w:pPr>
+              <w:r>
+                <w:rPr>
+                  <w:rFonts w:ascii="Plus Jakarta Sans" w:cs="Plus Jakarta Sans" w:eastAsia="Plus Jakarta Sans" w:hAnsi="Plus Jakarta Sans"/>
+                  <w:b/>
+                  <w:bCs/>
+                  <w:color w:val="0B3D91"/>
+                  <w:sz w:val="20"/>
+                  <w:szCs w:val="20"/>
+                </w:rPr>
+                <w:t xml:space="preserve">Rp 0/bulan</w:t>
+              </w:r>
+            </w:p>
+          </w:tc>
+          <w:p/>
+        </w:tc>
+        <w:tc>
+          <w:tcPr>
+            <w:tcMar>
+              <w:top w:type="dxa" w:w="90"/>
+              <w:left w:type="dxa" w:w="130"/>
+              <w:bottom w:type="dxa" w:w="90"/>
+              <w:right w:type="dxa" w:w="130"/>
+            </w:tcMar>
+            <w:vAlign w:val="center"/>
+          </w:tcPr>
+          <w:tc>
+            <w:tcPr>
+              <w:tcMar>
+                <w:top w:type="dxa" w:w="90"/>
+                <w:left w:type="dxa" w:w="130"/>
+                <w:bottom w:type="dxa" w:w="90"/>
+                <w:right w:type="dxa" w:w="130"/>
+              </w:tcMar>
+              <w:vAlign w:val="center"/>
+            </w:tcPr>
+            <w:p>
+              <w:pPr>
+                <w:spacing w:after="0" w:before="0"/>
+              </w:pPr>
+              <w:r>
+                <w:rPr>
+                  <w:rFonts w:ascii="Plus Jakarta Sans" w:cs="Plus Jakarta Sans" w:eastAsia="Plus Jakarta Sans" w:hAnsi="Plus Jakarta Sans"/>
+                  <w:color w:val="1F2937"/>
+                  <w:sz w:val="19"/>
+                  <w:szCs w:val="19"/>
+                </w:rPr>
+                <w:t xml:space="preserve">Vercel hosting gratis + Supabase free: 500MB database, 1GB storage, 50.000 user, 5GB bandwidth/bulan. Project pause otomatis jika 7 hari tidak aktif (harus dibuka manual). Cukup untuk PPDB ±200 pendaftar/tahun.</w:t>
               </w:r>
             </w:p>
           </w:tc>
@@ -3009,44 +3058,83 @@
                   <w:sz w:val="20"/>
                   <w:szCs w:val="20"/>
                 </w:rPr>
-                <w:t xml:space="preserve">Teknologi</w:t>
-              </w:r>
-            </w:p>
-          </w:tc>
-          <w:p/>
-        </w:tc>
-        <w:tc>
-          <w:tcPr>
-            <w:tcMar>
-              <w:top w:type="dxa" w:w="90"/>
-              <w:left w:type="dxa" w:w="130"/>
-              <w:bottom w:type="dxa" w:w="90"/>
-              <w:right w:type="dxa" w:w="130"/>
-            </w:tcMar>
-            <w:vAlign w:val="center"/>
-          </w:tcPr>
-          <w:tc>
-            <w:tcPr>
-              <w:tcMar>
-                <w:top w:type="dxa" w:w="90"/>
-                <w:left w:type="dxa" w:w="130"/>
-                <w:bottom w:type="dxa" w:w="90"/>
-                <w:right w:type="dxa" w:w="130"/>
-              </w:tcMar>
-              <w:vAlign w:val="center"/>
-            </w:tcPr>
-            <w:p>
-              <w:pPr>
-                <w:spacing w:after="0" w:before="0"/>
-              </w:pPr>
-              <w:r>
-                <w:rPr>
-                  <w:rFonts w:ascii="Plus Jakarta Sans" w:cs="Plus Jakarta Sans" w:eastAsia="Plus Jakarta Sans" w:hAnsi="Plus Jakarta Sans"/>
-                  <w:color w:val="1F2937"/>
-                  <w:sz w:val="20"/>
-                  <w:szCs w:val="20"/>
-                </w:rPr>
-                <w:t xml:space="preserve">Next.js (React modern, SEO-friendly) + Vercel (hosting global CDN, SSL otomatis) + Supabase (PostgreSQL, auth, storage)</w:t>
+                <w:t xml:space="preserve">Supabase Pro</w:t>
+              </w:r>
+            </w:p>
+          </w:tc>
+          <w:p/>
+        </w:tc>
+        <w:tc>
+          <w:tcPr>
+            <w:tcMar>
+              <w:top w:type="dxa" w:w="90"/>
+              <w:left w:type="dxa" w:w="130"/>
+              <w:bottom w:type="dxa" w:w="90"/>
+              <w:right w:type="dxa" w:w="130"/>
+            </w:tcMar>
+            <w:vAlign w:val="center"/>
+          </w:tcPr>
+          <w:tc>
+            <w:tcPr>
+              <w:tcMar>
+                <w:top w:type="dxa" w:w="90"/>
+                <w:left w:type="dxa" w:w="130"/>
+                <w:bottom w:type="dxa" w:w="90"/>
+                <w:right w:type="dxa" w:w="130"/>
+              </w:tcMar>
+              <w:vAlign w:val="center"/>
+            </w:tcPr>
+            <w:p>
+              <w:pPr>
+                <w:spacing w:after="0" w:before="0"/>
+              </w:pPr>
+              <w:r>
+                <w:rPr>
+                  <w:rFonts w:ascii="Plus Jakarta Sans" w:cs="Plus Jakarta Sans" w:eastAsia="Plus Jakarta Sans" w:hAnsi="Plus Jakarta Sans"/>
+                  <w:b/>
+                  <w:bCs/>
+                  <w:color w:val="0B3D91"/>
+                  <w:sz w:val="20"/>
+                  <w:szCs w:val="20"/>
+                </w:rPr>
+                <w:t xml:space="preserve">+Rp 1.200.000/bulan (~$75)</w:t>
+              </w:r>
+            </w:p>
+          </w:tc>
+          <w:p/>
+        </w:tc>
+        <w:tc>
+          <w:tcPr>
+            <w:tcMar>
+              <w:top w:type="dxa" w:w="90"/>
+              <w:left w:type="dxa" w:w="130"/>
+              <w:bottom w:type="dxa" w:w="90"/>
+              <w:right w:type="dxa" w:w="130"/>
+            </w:tcMar>
+            <w:vAlign w:val="center"/>
+          </w:tcPr>
+          <w:tc>
+            <w:tcPr>
+              <w:tcMar>
+                <w:top w:type="dxa" w:w="90"/>
+                <w:left w:type="dxa" w:w="130"/>
+                <w:bottom w:type="dxa" w:w="90"/>
+                <w:right w:type="dxa" w:w="130"/>
+              </w:tcMar>
+              <w:vAlign w:val="center"/>
+            </w:tcPr>
+            <w:p>
+              <w:pPr>
+                <w:spacing w:after="0" w:before="0"/>
+              </w:pPr>
+              <w:r>
+                <w:rPr>
+                  <w:rFonts w:ascii="Plus Jakarta Sans" w:cs="Plus Jakarta Sans" w:eastAsia="Plus Jakarta Sans" w:hAnsi="Plus Jakarta Sans"/>
+                  <w:color w:val="1F2937"/>
+                  <w:sz w:val="19"/>
+                  <w:szCs w:val="19"/>
+                </w:rPr>
+                <w:t xml:space="preserve">Semua free + database 8GB, backup point-in-time (PITR), bandwidth 250GB, tanpa pause, dukungan prioritas. Cocok saat data &amp; trafik membesar.</w:t>
               </w:r>
             </w:p>
           </w:tc>
@@ -3087,44 +3175,83 @@
                   <w:sz w:val="20"/>
                   <w:szCs w:val="20"/>
                 </w:rPr>
-                <w:t xml:space="preserve">Panel Admin</w:t>
-              </w:r>
-            </w:p>
-          </w:tc>
-          <w:p/>
-        </w:tc>
-        <w:tc>
-          <w:tcPr>
-            <w:tcMar>
-              <w:top w:type="dxa" w:w="90"/>
-              <w:left w:type="dxa" w:w="130"/>
-              <w:bottom w:type="dxa" w:w="90"/>
-              <w:right w:type="dxa" w:w="130"/>
-            </w:tcMar>
-            <w:vAlign w:val="center"/>
-          </w:tcPr>
-          <w:tc>
-            <w:tcPr>
-              <w:tcMar>
-                <w:top w:type="dxa" w:w="90"/>
-                <w:left w:type="dxa" w:w="130"/>
-                <w:bottom w:type="dxa" w:w="90"/>
-                <w:right w:type="dxa" w:w="130"/>
-              </w:tcMar>
-              <w:vAlign w:val="center"/>
-            </w:tcPr>
-            <w:p>
-              <w:pPr>
-                <w:spacing w:after="0" w:before="0"/>
-              </w:pPr>
-              <w:r>
-                <w:rPr>
-                  <w:rFonts w:ascii="Plus Jakarta Sans" w:cs="Plus Jakarta Sans" w:eastAsia="Plus Jakarta Sans" w:hAnsi="Plus Jakarta Sans"/>
-                  <w:color w:val="1F2937"/>
-                  <w:sz w:val="20"/>
-                  <w:szCs w:val="20"/>
-                </w:rPr>
-                <w:t xml:space="preserve">Dashboard: kelola berita, galeri, halaman, PPDB, pengaturan tampilan</w:t>
+                <w:t xml:space="preserve">Helipod</w:t>
+              </w:r>
+            </w:p>
+          </w:tc>
+          <w:p/>
+        </w:tc>
+        <w:tc>
+          <w:tcPr>
+            <w:tcMar>
+              <w:top w:type="dxa" w:w="90"/>
+              <w:left w:type="dxa" w:w="130"/>
+              <w:bottom w:type="dxa" w:w="90"/>
+              <w:right w:type="dxa" w:w="130"/>
+            </w:tcMar>
+            <w:vAlign w:val="center"/>
+          </w:tcPr>
+          <w:tc>
+            <w:tcPr>
+              <w:tcMar>
+                <w:top w:type="dxa" w:w="90"/>
+                <w:left w:type="dxa" w:w="130"/>
+                <w:bottom w:type="dxa" w:w="90"/>
+                <w:right w:type="dxa" w:w="130"/>
+              </w:tcMar>
+              <w:vAlign w:val="center"/>
+            </w:tcPr>
+            <w:p>
+              <w:pPr>
+                <w:spacing w:after="0" w:before="0"/>
+              </w:pPr>
+              <w:r>
+                <w:rPr>
+                  <w:rFonts w:ascii="Plus Jakarta Sans" w:cs="Plus Jakarta Sans" w:eastAsia="Plus Jakarta Sans" w:hAnsi="Plus Jakarta Sans"/>
+                  <w:b/>
+                  <w:bCs/>
+                  <w:color w:val="0B3D91"/>
+                  <w:sz w:val="20"/>
+                  <w:szCs w:val="20"/>
+                </w:rPr>
+                <w:t xml:space="preserve">Rp 100.000/bulan</w:t>
+              </w:r>
+            </w:p>
+          </w:tc>
+          <w:p/>
+        </w:tc>
+        <w:tc>
+          <w:tcPr>
+            <w:tcMar>
+              <w:top w:type="dxa" w:w="90"/>
+              <w:left w:type="dxa" w:w="130"/>
+              <w:bottom w:type="dxa" w:w="90"/>
+              <w:right w:type="dxa" w:w="130"/>
+            </w:tcMar>
+            <w:vAlign w:val="center"/>
+          </w:tcPr>
+          <w:tc>
+            <w:tcPr>
+              <w:tcMar>
+                <w:top w:type="dxa" w:w="90"/>
+                <w:left w:type="dxa" w:w="130"/>
+                <w:bottom w:type="dxa" w:w="90"/>
+                <w:right w:type="dxa" w:w="130"/>
+              </w:tcMar>
+              <w:vAlign w:val="center"/>
+            </w:tcPr>
+            <w:p>
+              <w:pPr>
+                <w:spacing w:after="0" w:before="0"/>
+              </w:pPr>
+              <w:r>
+                <w:rPr>
+                  <w:rFonts w:ascii="Plus Jakarta Sans" w:cs="Plus Jakarta Sans" w:eastAsia="Plus Jakarta Sans" w:hAnsi="Plus Jakarta Sans"/>
+                  <w:color w:val="1F2937"/>
+                  <w:sz w:val="19"/>
+                  <w:szCs w:val="19"/>
+                </w:rPr>
+                <w:t xml:space="preserve">1 server all-in-one: 1 vCPU, 1GB RAM, 15GB storage, unlimited bandwidth. Next.js + PostgreSQL (Docker) + Nginx jalan langsung di server — tanpa Vercel, tanpa Supabase cloud. Dokumen &amp; backup di R2.</w:t>
               </w:r>
             </w:p>
           </w:tc>
@@ -3165,51 +3292,12 @@
                   <w:sz w:val="20"/>
                   <w:szCs w:val="20"/>
                 </w:rPr>
-                <w:t xml:space="preserve">Customizer</w:t>
-              </w:r>
-            </w:p>
-          </w:tc>
-          <w:p/>
-        </w:tc>
-        <w:tc>
-          <w:tcPr>
-            <w:tcMar>
-              <w:top w:type="dxa" w:w="90"/>
-              <w:left w:type="dxa" w:w="130"/>
-              <w:bottom w:type="dxa" w:w="90"/>
-              <w:right w:type="dxa" w:w="130"/>
-            </w:tcMar>
-            <w:vAlign w:val="center"/>
-          </w:tcPr>
-          <w:tc>
-            <w:tcPr>
-              <w:tcMar>
-                <w:top w:type="dxa" w:w="90"/>
-                <w:left w:type="dxa" w:w="130"/>
-                <w:bottom w:type="dxa" w:w="90"/>
-                <w:right w:type="dxa" w:w="130"/>
-              </w:tcMar>
-              <w:vAlign w:val="center"/>
-            </w:tcPr>
-            <w:p>
-              <w:pPr>
-                <w:spacing w:after="0" w:before="0"/>
-              </w:pPr>
-              <w:r>
-                <w:rPr>
-                  <w:rFonts w:ascii="Plus Jakarta Sans" w:cs="Plus Jakarta Sans" w:eastAsia="Plus Jakarta Sans" w:hAnsi="Plus Jakarta Sans"/>
-                  <w:color w:val="1F2937"/>
-                  <w:sz w:val="20"/>
-                  <w:szCs w:val="20"/>
-                </w:rPr>
-                <w:t xml:space="preserve">Ganti warna, font, navbar, teks hero tanpa menyentuh kode</w:t>
-              </w:r>
-            </w:p>
-          </w:tc>
-          <w:p/>
-        </w:tc>
-      </w:tr>
-      <w:tr>
+                <w:t xml:space="preserve">VPS Dedicated</w:t>
+              </w:r>
+            </w:p>
+          </w:tc>
+          <w:p/>
+        </w:tc>
         <w:tc>
           <w:tcPr>
             <w:tcMar>
@@ -3239,282 +3327,48 @@
                   <w:rFonts w:ascii="Plus Jakarta Sans" w:cs="Plus Jakarta Sans" w:eastAsia="Plus Jakarta Sans" w:hAnsi="Plus Jakarta Sans"/>
                   <w:b/>
                   <w:bCs/>
-                  <w:color w:val="1F2937"/>
-                  <w:sz w:val="20"/>
-                  <w:szCs w:val="20"/>
-                </w:rPr>
-                <w:t xml:space="preserve">Keamanan</w:t>
-              </w:r>
-            </w:p>
-          </w:tc>
-          <w:p/>
-        </w:tc>
-        <w:tc>
-          <w:tcPr>
-            <w:tcMar>
-              <w:top w:type="dxa" w:w="90"/>
-              <w:left w:type="dxa" w:w="130"/>
-              <w:bottom w:type="dxa" w:w="90"/>
-              <w:right w:type="dxa" w:w="130"/>
-            </w:tcMar>
-            <w:vAlign w:val="center"/>
-          </w:tcPr>
-          <w:tc>
-            <w:tcPr>
-              <w:tcMar>
-                <w:top w:type="dxa" w:w="90"/>
-                <w:left w:type="dxa" w:w="130"/>
-                <w:bottom w:type="dxa" w:w="90"/>
-                <w:right w:type="dxa" w:w="130"/>
-              </w:tcMar>
-              <w:vAlign w:val="center"/>
-            </w:tcPr>
-            <w:p>
-              <w:pPr>
-                <w:spacing w:after="0" w:before="0"/>
-              </w:pPr>
-              <w:r>
-                <w:rPr>
-                  <w:rFonts w:ascii="Plus Jakarta Sans" w:cs="Plus Jakarta Sans" w:eastAsia="Plus Jakarta Sans" w:hAnsi="Plus Jakarta Sans"/>
-                  <w:color w:val="1F2937"/>
-                  <w:sz w:val="20"/>
-                  <w:szCs w:val="20"/>
-                </w:rPr>
-                <w:t xml:space="preserve">SSL/HTTPS, proteksi panel admin, backup otomatis</w:t>
-              </w:r>
-            </w:p>
-          </w:tc>
-          <w:p/>
-        </w:tc>
-      </w:tr>
-      <w:tr>
-        <w:tc>
-          <w:tcPr>
-            <w:tcMar>
-              <w:top w:type="dxa" w:w="90"/>
-              <w:left w:type="dxa" w:w="130"/>
-              <w:bottom w:type="dxa" w:w="90"/>
-              <w:right w:type="dxa" w:w="130"/>
-            </w:tcMar>
-            <w:vAlign w:val="center"/>
-          </w:tcPr>
-          <w:tc>
-            <w:tcPr>
-              <w:tcMar>
-                <w:top w:type="dxa" w:w="90"/>
-                <w:left w:type="dxa" w:w="130"/>
-                <w:bottom w:type="dxa" w:w="90"/>
-                <w:right w:type="dxa" w:w="130"/>
-              </w:tcMar>
-              <w:vAlign w:val="center"/>
-            </w:tcPr>
-            <w:p>
-              <w:pPr>
-                <w:spacing w:after="0" w:before="0"/>
-              </w:pPr>
-              <w:r>
-                <w:rPr>
-                  <w:rFonts w:ascii="Plus Jakarta Sans" w:cs="Plus Jakarta Sans" w:eastAsia="Plus Jakarta Sans" w:hAnsi="Plus Jakarta Sans"/>
-                  <w:b/>
-                  <w:bCs/>
-                  <w:color w:val="1F2937"/>
-                  <w:sz w:val="20"/>
-                  <w:szCs w:val="20"/>
-                </w:rPr>
-                <w:t xml:space="preserve">SEO</w:t>
-              </w:r>
-            </w:p>
-          </w:tc>
-          <w:p/>
-        </w:tc>
-        <w:tc>
-          <w:tcPr>
-            <w:tcMar>
-              <w:top w:type="dxa" w:w="90"/>
-              <w:left w:type="dxa" w:w="130"/>
-              <w:bottom w:type="dxa" w:w="90"/>
-              <w:right w:type="dxa" w:w="130"/>
-            </w:tcMar>
-            <w:vAlign w:val="center"/>
-          </w:tcPr>
-          <w:tc>
-            <w:tcPr>
-              <w:tcMar>
-                <w:top w:type="dxa" w:w="90"/>
-                <w:left w:type="dxa" w:w="130"/>
-                <w:bottom w:type="dxa" w:w="90"/>
-                <w:right w:type="dxa" w:w="130"/>
-              </w:tcMar>
-              <w:vAlign w:val="center"/>
-            </w:tcPr>
-            <w:p>
-              <w:pPr>
-                <w:spacing w:after="0" w:before="0"/>
-              </w:pPr>
-              <w:r>
-                <w:rPr>
-                  <w:rFonts w:ascii="Plus Jakarta Sans" w:cs="Plus Jakarta Sans" w:eastAsia="Plus Jakarta Sans" w:hAnsi="Plus Jakarta Sans"/>
-                  <w:color w:val="1F2937"/>
-                  <w:sz w:val="20"/>
-                  <w:szCs w:val="20"/>
-                </w:rPr>
-                <w:t xml:space="preserve">Optimasi mesin pencari (Google), sitemap, meta tags</w:t>
-              </w:r>
-            </w:p>
-          </w:tc>
-          <w:p/>
-        </w:tc>
-      </w:tr>
-      <w:tr>
-        <w:tc>
-          <w:tcPr>
-            <w:tcMar>
-              <w:top w:type="dxa" w:w="90"/>
-              <w:left w:type="dxa" w:w="130"/>
-              <w:bottom w:type="dxa" w:w="90"/>
-              <w:right w:type="dxa" w:w="130"/>
-            </w:tcMar>
-            <w:vAlign w:val="center"/>
-          </w:tcPr>
-          <w:tc>
-            <w:tcPr>
-              <w:tcMar>
-                <w:top w:type="dxa" w:w="90"/>
-                <w:left w:type="dxa" w:w="130"/>
-                <w:bottom w:type="dxa" w:w="90"/>
-                <w:right w:type="dxa" w:w="130"/>
-              </w:tcMar>
-              <w:vAlign w:val="center"/>
-            </w:tcPr>
-            <w:p>
-              <w:pPr>
-                <w:spacing w:after="0" w:before="0"/>
-              </w:pPr>
-              <w:r>
-                <w:rPr>
-                  <w:rFonts w:ascii="Plus Jakarta Sans" w:cs="Plus Jakarta Sans" w:eastAsia="Plus Jakarta Sans" w:hAnsi="Plus Jakarta Sans"/>
-                  <w:b/>
-                  <w:bCs/>
-                  <w:color w:val="1F2937"/>
-                  <w:sz w:val="20"/>
-                  <w:szCs w:val="20"/>
-                </w:rPr>
-                <w:t xml:space="preserve">Performa</w:t>
-              </w:r>
-            </w:p>
-          </w:tc>
-          <w:p/>
-        </w:tc>
-        <w:tc>
-          <w:tcPr>
-            <w:tcMar>
-              <w:top w:type="dxa" w:w="90"/>
-              <w:left w:type="dxa" w:w="130"/>
-              <w:bottom w:type="dxa" w:w="90"/>
-              <w:right w:type="dxa" w:w="130"/>
-            </w:tcMar>
-            <w:vAlign w:val="center"/>
-          </w:tcPr>
-          <w:tc>
-            <w:tcPr>
-              <w:tcMar>
-                <w:top w:type="dxa" w:w="90"/>
-                <w:left w:type="dxa" w:w="130"/>
-                <w:bottom w:type="dxa" w:w="90"/>
-                <w:right w:type="dxa" w:w="130"/>
-              </w:tcMar>
-              <w:vAlign w:val="center"/>
-            </w:tcPr>
-            <w:p>
-              <w:pPr>
-                <w:spacing w:after="0" w:before="0"/>
-              </w:pPr>
-              <w:r>
-                <w:rPr>
-                  <w:rFonts w:ascii="Plus Jakarta Sans" w:cs="Plus Jakarta Sans" w:eastAsia="Plus Jakarta Sans" w:hAnsi="Plus Jakarta Sans"/>
-                  <w:color w:val="1F2937"/>
-                  <w:sz w:val="20"/>
-                  <w:szCs w:val="20"/>
-                </w:rPr>
-                <w:t xml:space="preserve">Optimasi gambar, cache, waktu muat cepat (&lt; 3 detik)</w:t>
-              </w:r>
-            </w:p>
-          </w:tc>
-          <w:p/>
-        </w:tc>
-      </w:tr>
-      <w:tr>
-        <w:tc>
-          <w:tcPr>
-            <w:tcMar>
-              <w:top w:type="dxa" w:w="90"/>
-              <w:left w:type="dxa" w:w="130"/>
-              <w:bottom w:type="dxa" w:w="90"/>
-              <w:right w:type="dxa" w:w="130"/>
-            </w:tcMar>
-            <w:vAlign w:val="center"/>
-          </w:tcPr>
-          <w:tc>
-            <w:tcPr>
-              <w:tcMar>
-                <w:top w:type="dxa" w:w="90"/>
-                <w:left w:type="dxa" w:w="130"/>
-                <w:bottom w:type="dxa" w:w="90"/>
-                <w:right w:type="dxa" w:w="130"/>
-              </w:tcMar>
-              <w:vAlign w:val="center"/>
-            </w:tcPr>
-            <w:p>
-              <w:pPr>
-                <w:spacing w:after="0" w:before="0"/>
-              </w:pPr>
-              <w:r>
-                <w:rPr>
-                  <w:rFonts w:ascii="Plus Jakarta Sans" w:cs="Plus Jakarta Sans" w:eastAsia="Plus Jakarta Sans" w:hAnsi="Plus Jakarta Sans"/>
-                  <w:b/>
-                  <w:bCs/>
-                  <w:color w:val="1F2937"/>
-                  <w:sz w:val="20"/>
-                  <w:szCs w:val="20"/>
-                </w:rPr>
-                <w:t xml:space="preserve">Integrasi</w:t>
-              </w:r>
-            </w:p>
-          </w:tc>
-          <w:p/>
-        </w:tc>
-        <w:tc>
-          <w:tcPr>
-            <w:tcMar>
-              <w:top w:type="dxa" w:w="90"/>
-              <w:left w:type="dxa" w:w="130"/>
-              <w:bottom w:type="dxa" w:w="90"/>
-              <w:right w:type="dxa" w:w="130"/>
-            </w:tcMar>
-            <w:vAlign w:val="center"/>
-          </w:tcPr>
-          <w:tc>
-            <w:tcPr>
-              <w:tcMar>
-                <w:top w:type="dxa" w:w="90"/>
-                <w:left w:type="dxa" w:w="130"/>
-                <w:bottom w:type="dxa" w:w="90"/>
-                <w:right w:type="dxa" w:w="130"/>
-              </w:tcMar>
-              <w:vAlign w:val="center"/>
-            </w:tcPr>
-            <w:p>
-              <w:pPr>
-                <w:spacing w:after="0" w:before="0"/>
-              </w:pPr>
-              <w:r>
-                <w:rPr>
-                  <w:rFonts w:ascii="Plus Jakarta Sans" w:cs="Plus Jakarta Sans" w:eastAsia="Plus Jakarta Sans" w:hAnsi="Plus Jakarta Sans"/>
-                  <w:color w:val="1F2937"/>
-                  <w:sz w:val="20"/>
-                  <w:szCs w:val="20"/>
-                </w:rPr>
-                <w:t xml:space="preserve">Google Maps, WhatsApp, formulir kontak, media sosial</w:t>
+                  <w:color w:val="0B3D91"/>
+                  <w:sz w:val="20"/>
+                  <w:szCs w:val="20"/>
+                </w:rPr>
+                <w:t xml:space="preserve">Rp 300.000/bulan</w:t>
+              </w:r>
+            </w:p>
+          </w:tc>
+          <w:p/>
+        </w:tc>
+        <w:tc>
+          <w:tcPr>
+            <w:tcMar>
+              <w:top w:type="dxa" w:w="90"/>
+              <w:left w:type="dxa" w:w="130"/>
+              <w:bottom w:type="dxa" w:w="90"/>
+              <w:right w:type="dxa" w:w="130"/>
+            </w:tcMar>
+            <w:vAlign w:val="center"/>
+          </w:tcPr>
+          <w:tc>
+            <w:tcPr>
+              <w:tcMar>
+                <w:top w:type="dxa" w:w="90"/>
+                <w:left w:type="dxa" w:w="130"/>
+                <w:bottom w:type="dxa" w:w="90"/>
+                <w:right w:type="dxa" w:w="130"/>
+              </w:tcMar>
+              <w:vAlign w:val="center"/>
+            </w:tcPr>
+            <w:p>
+              <w:pPr>
+                <w:spacing w:after="0" w:before="0"/>
+              </w:pPr>
+              <w:r>
+                <w:rPr>
+                  <w:rFonts w:ascii="Plus Jakarta Sans" w:cs="Plus Jakarta Sans" w:eastAsia="Plus Jakarta Sans" w:hAnsi="Plus Jakarta Sans"/>
+                  <w:color w:val="1F2937"/>
+                  <w:sz w:val="19"/>
+                  <w:szCs w:val="19"/>
+                </w:rPr>
+                <w:t xml:space="preserve">Server lebih besar: 2 vCPU, 8GB RAM, 100GB NVMe. Full kontrol server, email kustom, multi-aplikasi. Frontend + backend + database dalam 1 server, tanpa batas kuota.</w:t>
               </w:r>
             </w:p>
           </w:tc>
@@ -3534,6 +3388,35 @@
           <w:szCs w:val="22"/>
         </w:rPr>
         <w:t xml:space="preserve"> </w:t>
+      </w:r>
+    </w:p>
+    <w:p>
+      <w:pPr>
+        <w:spacing w:after="0" w:before="0"/>
+      </w:pPr>
+      <w:r>
+        <w:rPr>
+          <w:rFonts w:ascii="Plus Jakarta Sans" w:cs="Plus Jakarta Sans" w:eastAsia="Plus Jakarta Sans" w:hAnsi="Plus Jakarta Sans"/>
+          <w:b/>
+          <w:bCs/>
+          <w:i/>
+          <w:iCs/>
+          <w:color w:val="1F2937"/>
+          <w:sz w:val="22"/>
+          <w:szCs w:val="22"/>
+        </w:rPr>
+        <w:t xml:space="preserve">Catatan: </w:t>
+      </w:r>
+      <w:r>
+        <w:rPr>
+          <w:rFonts w:ascii="Plus Jakarta Sans" w:cs="Plus Jakarta Sans" w:eastAsia="Plus Jakarta Sans" w:hAnsi="Plus Jakarta Sans"/>
+          <w:i/>
+          <w:iCs/>
+          <w:color w:val="5B6B82"/>
+          <w:sz w:val="19"/>
+          <w:szCs w:val="19"/>
+        </w:rPr>
+        <w:t xml:space="preserve">Semua opsi sudah termasuk monitoring, keamanan &amp; dukungan teknis. Dokumen pendaftar (±1 GB/tahun) dan backup database tersimpan aman di Cloudflare R2 (private bucket, presigned URL).</w:t>
       </w:r>
     </w:p>
     <w:p>
@@ -6138,953 +6021,50 @@
           <w:sz w:val="30"/>
           <w:szCs w:val="30"/>
         </w:rPr>
-        <w:t xml:space="preserve">9. Pilihan Arsitektur &amp; Infrastruktur</w:t>
-      </w:r>
-    </w:p>
-    <w:p>
-      <w:pPr>
-        <w:spacing w:after="120" w:before="0"/>
-      </w:pPr>
-      <w:r>
-        <w:rPr>
-          <w:rFonts w:ascii="Plus Jakarta Sans" w:cs="Plus Jakarta Sans" w:eastAsia="Plus Jakarta Sans" w:hAnsi="Plus Jakarta Sans"/>
-          <w:color w:val="1F2937"/>
-          <w:sz w:val="22"/>
-          <w:szCs w:val="22"/>
-        </w:rPr>
-        <w:t xml:space="preserve">Tersedia 3 pilihan infrastruktur. Semua sudah termasuk hosting, database, penyimpanan dokumen (Cloudflare R2), monitoring, keamanan, dan dukungan teknis setiap bulan.</w:t>
-      </w:r>
-    </w:p>
-    <w:tbl>
-      <w:tblPr>
-        <w:tblW w:type="dxa" w:w="9100"/>
-        <w:tblBorders>
-          <w:top w:val="single" w:color="E2E8F0" w:sz="4"/>
-          <w:left w:val="single" w:color="E2E8F0" w:sz="4"/>
-          <w:bottom w:val="single" w:color="E2E8F0" w:sz="4"/>
-          <w:right w:val="single" w:color="E2E8F0" w:sz="4"/>
-          <w:insideH w:val="single" w:color="E2E8F0" w:sz="4"/>
-          <w:insideV w:val="single" w:color="E2E8F0" w:sz="4"/>
-        </w:tblBorders>
-      </w:tblPr>
-      <w:tblGrid>
-        <w:gridCol w:w="1500"/>
-        <w:gridCol w:w="2500"/>
-        <w:gridCol w:w="2600"/>
-        <w:gridCol w:w="2500"/>
-      </w:tblGrid>
-      <w:tr>
-        <w:trPr>
-          <w:tblHeader/>
-        </w:trPr>
-        <w:tc>
-          <w:tcPr>
-            <w:shd w:fill="0B3D91" w:color="auto" w:val="clear"/>
-            <w:tcMar>
-              <w:top w:type="dxa" w:w="90"/>
-              <w:left w:type="dxa" w:w="130"/>
-              <w:bottom w:type="dxa" w:w="90"/>
-              <w:right w:type="dxa" w:w="130"/>
-            </w:tcMar>
-            <w:vAlign w:val="center"/>
-          </w:tcPr>
-          <w:p>
-            <w:pPr>
-              <w:spacing w:after="0" w:before="0"/>
-            </w:pPr>
-            <w:r>
-              <w:rPr>
-                <w:rFonts w:ascii="Plus Jakarta Sans" w:cs="Plus Jakarta Sans" w:eastAsia="Plus Jakarta Sans" w:hAnsi="Plus Jakarta Sans"/>
-                <w:b/>
-                <w:bCs/>
-                <w:color w:val="FFFFFF"/>
-                <w:sz w:val="20"/>
-                <w:szCs w:val="20"/>
-              </w:rPr>
-              <w:t xml:space="preserve">Aspek</w:t>
-            </w:r>
-          </w:p>
-        </w:tc>
-        <w:tc>
-          <w:tcPr>
-            <w:shd w:fill="0B3D91" w:color="auto" w:val="clear"/>
-            <w:tcMar>
-              <w:top w:type="dxa" w:w="90"/>
-              <w:left w:type="dxa" w:w="130"/>
-              <w:bottom w:type="dxa" w:w="90"/>
-              <w:right w:type="dxa" w:w="130"/>
-            </w:tcMar>
-            <w:vAlign w:val="center"/>
-          </w:tcPr>
-          <w:p>
-            <w:pPr>
-              <w:spacing w:after="0" w:before="0"/>
-            </w:pPr>
-            <w:r>
-              <w:rPr>
-                <w:rFonts w:ascii="Plus Jakarta Sans" w:cs="Plus Jakarta Sans" w:eastAsia="Plus Jakarta Sans" w:hAnsi="Plus Jakarta Sans"/>
-                <w:b/>
-                <w:bCs/>
-                <w:color w:val="FFFFFF"/>
-                <w:sz w:val="20"/>
-                <w:szCs w:val="20"/>
-              </w:rPr>
-              <w:t xml:space="preserve">Supabase Cloud</w:t>
-            </w:r>
-          </w:p>
-        </w:tc>
-        <w:tc>
-          <w:tcPr>
-            <w:shd w:fill="0B3D91" w:color="auto" w:val="clear"/>
-            <w:tcMar>
-              <w:top w:type="dxa" w:w="90"/>
-              <w:left w:type="dxa" w:w="130"/>
-              <w:bottom w:type="dxa" w:w="90"/>
-              <w:right w:type="dxa" w:w="130"/>
-            </w:tcMar>
-            <w:vAlign w:val="center"/>
-          </w:tcPr>
-          <w:p>
-            <w:pPr>
-              <w:spacing w:after="0" w:before="0"/>
-            </w:pPr>
-            <w:r>
-              <w:rPr>
-                <w:rFonts w:ascii="Plus Jakarta Sans" w:cs="Plus Jakarta Sans" w:eastAsia="Plus Jakarta Sans" w:hAnsi="Plus Jakarta Sans"/>
-                <w:b/>
-                <w:bCs/>
-                <w:color w:val="FFFFFF"/>
-                <w:sz w:val="20"/>
-                <w:szCs w:val="20"/>
-              </w:rPr>
-              <w:t xml:space="preserve">Helipod (Rekomendasi)</w:t>
-            </w:r>
-          </w:p>
-        </w:tc>
-        <w:tc>
-          <w:tcPr>
-            <w:shd w:fill="0B3D91" w:color="auto" w:val="clear"/>
-            <w:tcMar>
-              <w:top w:type="dxa" w:w="90"/>
-              <w:left w:type="dxa" w:w="130"/>
-              <w:bottom w:type="dxa" w:w="90"/>
-              <w:right w:type="dxa" w:w="130"/>
-            </w:tcMar>
-            <w:vAlign w:val="center"/>
-          </w:tcPr>
-          <w:p>
-            <w:pPr>
-              <w:spacing w:after="0" w:before="0"/>
-            </w:pPr>
-            <w:r>
-              <w:rPr>
-                <w:rFonts w:ascii="Plus Jakarta Sans" w:cs="Plus Jakarta Sans" w:eastAsia="Plus Jakarta Sans" w:hAnsi="Plus Jakarta Sans"/>
-                <w:b/>
-                <w:bCs/>
-                <w:color w:val="FFFFFF"/>
-                <w:sz w:val="20"/>
-                <w:szCs w:val="20"/>
-              </w:rPr>
-              <w:t xml:space="preserve">VPS Dedicated</w:t>
-            </w:r>
-          </w:p>
-        </w:tc>
-      </w:tr>
-      <w:tr>
-        <w:tc>
-          <w:tcPr>
-            <w:tcMar>
-              <w:top w:type="dxa" w:w="90"/>
-              <w:left w:type="dxa" w:w="130"/>
-              <w:bottom w:type="dxa" w:w="90"/>
-              <w:right w:type="dxa" w:w="130"/>
-            </w:tcMar>
-            <w:vAlign w:val="center"/>
-          </w:tcPr>
-          <w:tc>
-            <w:tcPr>
-              <w:tcMar>
-                <w:top w:type="dxa" w:w="90"/>
-                <w:left w:type="dxa" w:w="130"/>
-                <w:bottom w:type="dxa" w:w="90"/>
-                <w:right w:type="dxa" w:w="130"/>
-              </w:tcMar>
-              <w:vAlign w:val="center"/>
-            </w:tcPr>
-            <w:p>
-              <w:pPr>
-                <w:spacing w:after="0" w:before="0"/>
-              </w:pPr>
-              <w:r>
-                <w:rPr>
-                  <w:rFonts w:ascii="Plus Jakarta Sans" w:cs="Plus Jakarta Sans" w:eastAsia="Plus Jakarta Sans" w:hAnsi="Plus Jakarta Sans"/>
-                  <w:b/>
-                  <w:bCs/>
-                  <w:color w:val="1F2937"/>
-                  <w:sz w:val="20"/>
-                  <w:szCs w:val="20"/>
-                </w:rPr>
-                <w:t xml:space="preserve">Komponen</w:t>
-              </w:r>
-            </w:p>
-          </w:tc>
-          <w:p/>
-        </w:tc>
-        <w:tc>
-          <w:tcPr>
-            <w:tcMar>
-              <w:top w:type="dxa" w:w="90"/>
-              <w:left w:type="dxa" w:w="130"/>
-              <w:bottom w:type="dxa" w:w="90"/>
-              <w:right w:type="dxa" w:w="130"/>
-            </w:tcMar>
-            <w:vAlign w:val="center"/>
-          </w:tcPr>
-          <w:tc>
-            <w:tcPr>
-              <w:tcMar>
-                <w:top w:type="dxa" w:w="90"/>
-                <w:left w:type="dxa" w:w="130"/>
-                <w:bottom w:type="dxa" w:w="90"/>
-                <w:right w:type="dxa" w:w="130"/>
-              </w:tcMar>
-              <w:vAlign w:val="center"/>
-            </w:tcPr>
-            <w:p>
-              <w:pPr>
-                <w:spacing w:after="0" w:before="0"/>
-              </w:pPr>
-              <w:r>
-                <w:rPr>
-                  <w:rFonts w:ascii="Plus Jakarta Sans" w:cs="Plus Jakarta Sans" w:eastAsia="Plus Jakarta Sans" w:hAnsi="Plus Jakarta Sans"/>
-                  <w:color w:val="1F2937"/>
-                  <w:sz w:val="19"/>
-                  <w:szCs w:val="19"/>
-                </w:rPr>
-                <w:t xml:space="preserve">Vercel + Supabase + R2</w:t>
-              </w:r>
-            </w:p>
-          </w:tc>
-          <w:p/>
-        </w:tc>
-        <w:tc>
-          <w:tcPr>
-            <w:tcMar>
-              <w:top w:type="dxa" w:w="90"/>
-              <w:left w:type="dxa" w:w="130"/>
-              <w:bottom w:type="dxa" w:w="90"/>
-              <w:right w:type="dxa" w:w="130"/>
-            </w:tcMar>
-            <w:vAlign w:val="center"/>
-          </w:tcPr>
-          <w:tc>
-            <w:tcPr>
-              <w:tcMar>
-                <w:top w:type="dxa" w:w="90"/>
-                <w:left w:type="dxa" w:w="130"/>
-                <w:bottom w:type="dxa" w:w="90"/>
-                <w:right w:type="dxa" w:w="130"/>
-              </w:tcMar>
-              <w:vAlign w:val="center"/>
-            </w:tcPr>
-            <w:p>
-              <w:pPr>
-                <w:spacing w:after="0" w:before="0"/>
-              </w:pPr>
-              <w:r>
-                <w:rPr>
-                  <w:rFonts w:ascii="Plus Jakarta Sans" w:cs="Plus Jakarta Sans" w:eastAsia="Plus Jakarta Sans" w:hAnsi="Plus Jakarta Sans"/>
-                  <w:color w:val="1F2937"/>
-                  <w:sz w:val="19"/>
-                  <w:szCs w:val="19"/>
-                </w:rPr>
-                <w:t xml:space="preserve">1 server: Next.js + PostgreSQL + R2</w:t>
-              </w:r>
-            </w:p>
-          </w:tc>
-          <w:p/>
-        </w:tc>
-        <w:tc>
-          <w:tcPr>
-            <w:tcMar>
-              <w:top w:type="dxa" w:w="90"/>
-              <w:left w:type="dxa" w:w="130"/>
-              <w:bottom w:type="dxa" w:w="90"/>
-              <w:right w:type="dxa" w:w="130"/>
-            </w:tcMar>
-            <w:vAlign w:val="center"/>
-          </w:tcPr>
-          <w:tc>
-            <w:tcPr>
-              <w:tcMar>
-                <w:top w:type="dxa" w:w="90"/>
-                <w:left w:type="dxa" w:w="130"/>
-                <w:bottom w:type="dxa" w:w="90"/>
-                <w:right w:type="dxa" w:w="130"/>
-              </w:tcMar>
-              <w:vAlign w:val="center"/>
-            </w:tcPr>
-            <w:p>
-              <w:pPr>
-                <w:spacing w:after="0" w:before="0"/>
-              </w:pPr>
-              <w:r>
-                <w:rPr>
-                  <w:rFonts w:ascii="Plus Jakarta Sans" w:cs="Plus Jakarta Sans" w:eastAsia="Plus Jakarta Sans" w:hAnsi="Plus Jakarta Sans"/>
-                  <w:color w:val="1F2937"/>
-                  <w:sz w:val="19"/>
-                  <w:szCs w:val="19"/>
-                </w:rPr>
-                <w:t xml:space="preserve">2 vCPU, 8GB RAM, full kontrol</w:t>
-              </w:r>
-            </w:p>
-          </w:tc>
-          <w:p/>
-        </w:tc>
-      </w:tr>
-      <w:tr>
-        <w:tc>
-          <w:tcPr>
-            <w:tcMar>
-              <w:top w:type="dxa" w:w="90"/>
-              <w:left w:type="dxa" w:w="130"/>
-              <w:bottom w:type="dxa" w:w="90"/>
-              <w:right w:type="dxa" w:w="130"/>
-            </w:tcMar>
-            <w:vAlign w:val="center"/>
-          </w:tcPr>
-          <w:tc>
-            <w:tcPr>
-              <w:tcMar>
-                <w:top w:type="dxa" w:w="90"/>
-                <w:left w:type="dxa" w:w="130"/>
-                <w:bottom w:type="dxa" w:w="90"/>
-                <w:right w:type="dxa" w:w="130"/>
-              </w:tcMar>
-              <w:vAlign w:val="center"/>
-            </w:tcPr>
-            <w:p>
-              <w:pPr>
-                <w:spacing w:after="0" w:before="0"/>
-              </w:pPr>
-              <w:r>
-                <w:rPr>
-                  <w:rFonts w:ascii="Plus Jakarta Sans" w:cs="Plus Jakarta Sans" w:eastAsia="Plus Jakarta Sans" w:hAnsi="Plus Jakarta Sans"/>
-                  <w:b/>
-                  <w:bCs/>
-                  <w:color w:val="1F2937"/>
-                  <w:sz w:val="20"/>
-                  <w:szCs w:val="20"/>
-                </w:rPr>
-                <w:t xml:space="preserve">Biaya Bulanan</w:t>
-              </w:r>
-            </w:p>
-          </w:tc>
-          <w:p/>
-        </w:tc>
-        <w:tc>
-          <w:tcPr>
-            <w:tcMar>
-              <w:top w:type="dxa" w:w="90"/>
-              <w:left w:type="dxa" w:w="130"/>
-              <w:bottom w:type="dxa" w:w="90"/>
-              <w:right w:type="dxa" w:w="130"/>
-            </w:tcMar>
-            <w:vAlign w:val="center"/>
-          </w:tcPr>
-          <w:tc>
-            <w:tcPr>
-              <w:tcMar>
-                <w:top w:type="dxa" w:w="90"/>
-                <w:left w:type="dxa" w:w="130"/>
-                <w:bottom w:type="dxa" w:w="90"/>
-                <w:right w:type="dxa" w:w="130"/>
-              </w:tcMar>
-              <w:vAlign w:val="center"/>
-            </w:tcPr>
-            <w:p>
-              <w:pPr>
-                <w:spacing w:after="0" w:before="0"/>
-              </w:pPr>
-              <w:r>
-                <w:rPr>
-                  <w:rFonts w:ascii="Plus Jakarta Sans" w:cs="Plus Jakarta Sans" w:eastAsia="Plus Jakarta Sans" w:hAnsi="Plus Jakarta Sans"/>
-                  <w:b/>
-                  <w:bCs/>
-                  <w:color w:val="0B3D91"/>
-                  <w:sz w:val="19"/>
-                  <w:szCs w:val="19"/>
-                </w:rPr>
-                <w:t xml:space="preserve">Rp 75.000</w:t>
-              </w:r>
-            </w:p>
-          </w:tc>
-          <w:p/>
-        </w:tc>
-        <w:tc>
-          <w:tcPr>
-            <w:tcMar>
-              <w:top w:type="dxa" w:w="90"/>
-              <w:left w:type="dxa" w:w="130"/>
-              <w:bottom w:type="dxa" w:w="90"/>
-              <w:right w:type="dxa" w:w="130"/>
-            </w:tcMar>
-            <w:vAlign w:val="center"/>
-          </w:tcPr>
-          <w:tc>
-            <w:tcPr>
-              <w:tcMar>
-                <w:top w:type="dxa" w:w="90"/>
-                <w:left w:type="dxa" w:w="130"/>
-                <w:bottom w:type="dxa" w:w="90"/>
-                <w:right w:type="dxa" w:w="130"/>
-              </w:tcMar>
-              <w:vAlign w:val="center"/>
-            </w:tcPr>
-            <w:p>
-              <w:pPr>
-                <w:spacing w:after="0" w:before="0"/>
-              </w:pPr>
-              <w:r>
-                <w:rPr>
-                  <w:rFonts w:ascii="Plus Jakarta Sans" w:cs="Plus Jakarta Sans" w:eastAsia="Plus Jakarta Sans" w:hAnsi="Plus Jakarta Sans"/>
-                  <w:b/>
-                  <w:bCs/>
-                  <w:color w:val="0B3D91"/>
-                  <w:sz w:val="19"/>
-                  <w:szCs w:val="19"/>
-                </w:rPr>
-                <w:t xml:space="preserve">Rp 150.000</w:t>
-              </w:r>
-            </w:p>
-          </w:tc>
-          <w:p/>
-        </w:tc>
-        <w:tc>
-          <w:tcPr>
-            <w:tcMar>
-              <w:top w:type="dxa" w:w="90"/>
-              <w:left w:type="dxa" w:w="130"/>
-              <w:bottom w:type="dxa" w:w="90"/>
-              <w:right w:type="dxa" w:w="130"/>
-            </w:tcMar>
-            <w:vAlign w:val="center"/>
-          </w:tcPr>
-          <w:tc>
-            <w:tcPr>
-              <w:tcMar>
-                <w:top w:type="dxa" w:w="90"/>
-                <w:left w:type="dxa" w:w="130"/>
-                <w:bottom w:type="dxa" w:w="90"/>
-                <w:right w:type="dxa" w:w="130"/>
-              </w:tcMar>
-              <w:vAlign w:val="center"/>
-            </w:tcPr>
-            <w:p>
-              <w:pPr>
-                <w:spacing w:after="0" w:before="0"/>
-              </w:pPr>
-              <w:r>
-                <w:rPr>
-                  <w:rFonts w:ascii="Plus Jakarta Sans" w:cs="Plus Jakarta Sans" w:eastAsia="Plus Jakarta Sans" w:hAnsi="Plus Jakarta Sans"/>
-                  <w:b/>
-                  <w:bCs/>
-                  <w:color w:val="0B3D91"/>
-                  <w:sz w:val="19"/>
-                  <w:szCs w:val="19"/>
-                </w:rPr>
-                <w:t xml:space="preserve">Rp 350.000</w:t>
-              </w:r>
-            </w:p>
-          </w:tc>
-          <w:p/>
-        </w:tc>
-      </w:tr>
-      <w:tr>
-        <w:tc>
-          <w:tcPr>
-            <w:tcMar>
-              <w:top w:type="dxa" w:w="90"/>
-              <w:left w:type="dxa" w:w="130"/>
-              <w:bottom w:type="dxa" w:w="90"/>
-              <w:right w:type="dxa" w:w="130"/>
-            </w:tcMar>
-            <w:vAlign w:val="center"/>
-          </w:tcPr>
-          <w:tc>
-            <w:tcPr>
-              <w:tcMar>
-                <w:top w:type="dxa" w:w="90"/>
-                <w:left w:type="dxa" w:w="130"/>
-                <w:bottom w:type="dxa" w:w="90"/>
-                <w:right w:type="dxa" w:w="130"/>
-              </w:tcMar>
-              <w:vAlign w:val="center"/>
-            </w:tcPr>
-            <w:p>
-              <w:pPr>
-                <w:spacing w:after="0" w:before="0"/>
-              </w:pPr>
-              <w:r>
-                <w:rPr>
-                  <w:rFonts w:ascii="Plus Jakarta Sans" w:cs="Plus Jakarta Sans" w:eastAsia="Plus Jakarta Sans" w:hAnsi="Plus Jakarta Sans"/>
-                  <w:b/>
-                  <w:bCs/>
-                  <w:color w:val="1F2937"/>
-                  <w:sz w:val="20"/>
-                  <w:szCs w:val="20"/>
-                </w:rPr>
-                <w:t xml:space="preserve">Biaya Setup</w:t>
-              </w:r>
-            </w:p>
-          </w:tc>
-          <w:p/>
-        </w:tc>
-        <w:tc>
-          <w:tcPr>
-            <w:tcMar>
-              <w:top w:type="dxa" w:w="90"/>
-              <w:left w:type="dxa" w:w="130"/>
-              <w:bottom w:type="dxa" w:w="90"/>
-              <w:right w:type="dxa" w:w="130"/>
-            </w:tcMar>
-            <w:vAlign w:val="center"/>
-          </w:tcPr>
-          <w:tc>
-            <w:tcPr>
-              <w:tcMar>
-                <w:top w:type="dxa" w:w="90"/>
-                <w:left w:type="dxa" w:w="130"/>
-                <w:bottom w:type="dxa" w:w="90"/>
-                <w:right w:type="dxa" w:w="130"/>
-              </w:tcMar>
-              <w:vAlign w:val="center"/>
-            </w:tcPr>
-            <w:p>
-              <w:pPr>
-                <w:spacing w:after="0" w:before="0"/>
-              </w:pPr>
-              <w:r>
-                <w:rPr>
-                  <w:rFonts w:ascii="Plus Jakarta Sans" w:cs="Plus Jakarta Sans" w:eastAsia="Plus Jakarta Sans" w:hAnsi="Plus Jakarta Sans"/>
-                  <w:color w:val="1F2937"/>
-                  <w:sz w:val="19"/>
-                  <w:szCs w:val="19"/>
-                </w:rPr>
-                <w:t xml:space="preserve">Rp 0</w:t>
-              </w:r>
-            </w:p>
-          </w:tc>
-          <w:p/>
-        </w:tc>
-        <w:tc>
-          <w:tcPr>
-            <w:tcMar>
-              <w:top w:type="dxa" w:w="90"/>
-              <w:left w:type="dxa" w:w="130"/>
-              <w:bottom w:type="dxa" w:w="90"/>
-              <w:right w:type="dxa" w:w="130"/>
-            </w:tcMar>
-            <w:vAlign w:val="center"/>
-          </w:tcPr>
-          <w:tc>
-            <w:tcPr>
-              <w:tcMar>
-                <w:top w:type="dxa" w:w="90"/>
-                <w:left w:type="dxa" w:w="130"/>
-                <w:bottom w:type="dxa" w:w="90"/>
-                <w:right w:type="dxa" w:w="130"/>
-              </w:tcMar>
-              <w:vAlign w:val="center"/>
-            </w:tcPr>
-            <w:p>
-              <w:pPr>
-                <w:spacing w:after="0" w:before="0"/>
-              </w:pPr>
-              <w:r>
-                <w:rPr>
-                  <w:rFonts w:ascii="Plus Jakarta Sans" w:cs="Plus Jakarta Sans" w:eastAsia="Plus Jakarta Sans" w:hAnsi="Plus Jakarta Sans"/>
-                  <w:color w:val="1F2937"/>
-                  <w:sz w:val="19"/>
-                  <w:szCs w:val="19"/>
-                </w:rPr>
-                <w:t xml:space="preserve">Rp 500.000 sekali</w:t>
-              </w:r>
-            </w:p>
-          </w:tc>
-          <w:p/>
-        </w:tc>
-        <w:tc>
-          <w:tcPr>
-            <w:tcMar>
-              <w:top w:type="dxa" w:w="90"/>
-              <w:left w:type="dxa" w:w="130"/>
-              <w:bottom w:type="dxa" w:w="90"/>
-              <w:right w:type="dxa" w:w="130"/>
-            </w:tcMar>
-            <w:vAlign w:val="center"/>
-          </w:tcPr>
-          <w:tc>
-            <w:tcPr>
-              <w:tcMar>
-                <w:top w:type="dxa" w:w="90"/>
-                <w:left w:type="dxa" w:w="130"/>
-                <w:bottom w:type="dxa" w:w="90"/>
-                <w:right w:type="dxa" w:w="130"/>
-              </w:tcMar>
-              <w:vAlign w:val="center"/>
-            </w:tcPr>
-            <w:p>
-              <w:pPr>
-                <w:spacing w:after="0" w:before="0"/>
-              </w:pPr>
-              <w:r>
-                <w:rPr>
-                  <w:rFonts w:ascii="Plus Jakarta Sans" w:cs="Plus Jakarta Sans" w:eastAsia="Plus Jakarta Sans" w:hAnsi="Plus Jakarta Sans"/>
-                  <w:color w:val="1F2937"/>
-                  <w:sz w:val="19"/>
-                  <w:szCs w:val="19"/>
-                </w:rPr>
-                <w:t xml:space="preserve">Rp 1.500.000 sekali</w:t>
-              </w:r>
-            </w:p>
-          </w:tc>
-          <w:p/>
-        </w:tc>
-      </w:tr>
-      <w:tr>
-        <w:tc>
-          <w:tcPr>
-            <w:tcMar>
-              <w:top w:type="dxa" w:w="90"/>
-              <w:left w:type="dxa" w:w="130"/>
-              <w:bottom w:type="dxa" w:w="90"/>
-              <w:right w:type="dxa" w:w="130"/>
-            </w:tcMar>
-            <w:vAlign w:val="center"/>
-          </w:tcPr>
-          <w:tc>
-            <w:tcPr>
-              <w:tcMar>
-                <w:top w:type="dxa" w:w="90"/>
-                <w:left w:type="dxa" w:w="130"/>
-                <w:bottom w:type="dxa" w:w="90"/>
-                <w:right w:type="dxa" w:w="130"/>
-              </w:tcMar>
-              <w:vAlign w:val="center"/>
-            </w:tcPr>
-            <w:p>
-              <w:pPr>
-                <w:spacing w:after="0" w:before="0"/>
-              </w:pPr>
-              <w:r>
-                <w:rPr>
-                  <w:rFonts w:ascii="Plus Jakarta Sans" w:cs="Plus Jakarta Sans" w:eastAsia="Plus Jakarta Sans" w:hAnsi="Plus Jakarta Sans"/>
-                  <w:b/>
-                  <w:bCs/>
-                  <w:color w:val="1F2937"/>
-                  <w:sz w:val="20"/>
-                  <w:szCs w:val="20"/>
-                </w:rPr>
-                <w:t xml:space="preserve">Kelebihan</w:t>
-              </w:r>
-            </w:p>
-          </w:tc>
-          <w:p/>
-        </w:tc>
-        <w:tc>
-          <w:tcPr>
-            <w:tcMar>
-              <w:top w:type="dxa" w:w="90"/>
-              <w:left w:type="dxa" w:w="130"/>
-              <w:bottom w:type="dxa" w:w="90"/>
-              <w:right w:type="dxa" w:w="130"/>
-            </w:tcMar>
-            <w:vAlign w:val="center"/>
-          </w:tcPr>
-          <w:tc>
-            <w:tcPr>
-              <w:tcMar>
-                <w:top w:type="dxa" w:w="90"/>
-                <w:left w:type="dxa" w:w="130"/>
-                <w:bottom w:type="dxa" w:w="90"/>
-                <w:right w:type="dxa" w:w="130"/>
-              </w:tcMar>
-              <w:vAlign w:val="center"/>
-            </w:tcPr>
-            <w:p>
-              <w:pPr>
-                <w:spacing w:after="0" w:before="0"/>
-              </w:pPr>
-              <w:r>
-                <w:rPr>
-                  <w:rFonts w:ascii="Plus Jakarta Sans" w:cs="Plus Jakarta Sans" w:eastAsia="Plus Jakarta Sans" w:hAnsi="Plus Jakarta Sans"/>
-                  <w:color w:val="1F2937"/>
-                  <w:sz w:val="19"/>
-                  <w:szCs w:val="19"/>
-                </w:rPr>
-                <w:t xml:space="preserve">Paling simpel, auto scale, tanpa urus server</w:t>
-              </w:r>
-            </w:p>
-          </w:tc>
-          <w:p/>
-        </w:tc>
-        <w:tc>
-          <w:tcPr>
-            <w:tcMar>
-              <w:top w:type="dxa" w:w="90"/>
-              <w:left w:type="dxa" w:w="130"/>
-              <w:bottom w:type="dxa" w:w="90"/>
-              <w:right w:type="dxa" w:w="130"/>
-            </w:tcMar>
-            <w:vAlign w:val="center"/>
-          </w:tcPr>
-          <w:tc>
-            <w:tcPr>
-              <w:tcMar>
-                <w:top w:type="dxa" w:w="90"/>
-                <w:left w:type="dxa" w:w="130"/>
-                <w:bottom w:type="dxa" w:w="90"/>
-                <w:right w:type="dxa" w:w="130"/>
-              </w:tcMar>
-              <w:vAlign w:val="center"/>
-            </w:tcPr>
-            <w:p>
-              <w:pPr>
-                <w:spacing w:after="0" w:before="0"/>
-              </w:pPr>
-              <w:r>
-                <w:rPr>
-                  <w:rFonts w:ascii="Plus Jakarta Sans" w:cs="Plus Jakarta Sans" w:eastAsia="Plus Jakarta Sans" w:hAnsi="Plus Jakarta Sans"/>
-                  <w:color w:val="1F2937"/>
-                  <w:sz w:val="19"/>
-                  <w:szCs w:val="19"/>
-                </w:rPr>
-                <w:t xml:space="preserve">Murah, all-in-one, mudah di-maintain</w:t>
-              </w:r>
-            </w:p>
-          </w:tc>
-          <w:p/>
-        </w:tc>
-        <w:tc>
-          <w:tcPr>
-            <w:tcMar>
-              <w:top w:type="dxa" w:w="90"/>
-              <w:left w:type="dxa" w:w="130"/>
-              <w:bottom w:type="dxa" w:w="90"/>
-              <w:right w:type="dxa" w:w="130"/>
-            </w:tcMar>
-            <w:vAlign w:val="center"/>
-          </w:tcPr>
-          <w:tc>
-            <w:tcPr>
-              <w:tcMar>
-                <w:top w:type="dxa" w:w="90"/>
-                <w:left w:type="dxa" w:w="130"/>
-                <w:bottom w:type="dxa" w:w="90"/>
-                <w:right w:type="dxa" w:w="130"/>
-              </w:tcMar>
-              <w:vAlign w:val="center"/>
-            </w:tcPr>
-            <w:p>
-              <w:pPr>
-                <w:spacing w:after="0" w:before="0"/>
-              </w:pPr>
-              <w:r>
-                <w:rPr>
-                  <w:rFonts w:ascii="Plus Jakarta Sans" w:cs="Plus Jakarta Sans" w:eastAsia="Plus Jakarta Sans" w:hAnsi="Plus Jakarta Sans"/>
-                  <w:color w:val="1F2937"/>
-                  <w:sz w:val="19"/>
-                  <w:szCs w:val="19"/>
-                </w:rPr>
-                <w:t xml:space="preserve">Resource besar, email kustom, multi-aplikasi</w:t>
-              </w:r>
-            </w:p>
-          </w:tc>
-          <w:p/>
-        </w:tc>
-      </w:tr>
-      <w:tr>
-        <w:tc>
-          <w:tcPr>
-            <w:tcMar>
-              <w:top w:type="dxa" w:w="90"/>
-              <w:left w:type="dxa" w:w="130"/>
-              <w:bottom w:type="dxa" w:w="90"/>
-              <w:right w:type="dxa" w:w="130"/>
-            </w:tcMar>
-            <w:vAlign w:val="center"/>
-          </w:tcPr>
-          <w:tc>
-            <w:tcPr>
-              <w:tcMar>
-                <w:top w:type="dxa" w:w="90"/>
-                <w:left w:type="dxa" w:w="130"/>
-                <w:bottom w:type="dxa" w:w="90"/>
-                <w:right w:type="dxa" w:w="130"/>
-              </w:tcMar>
-              <w:vAlign w:val="center"/>
-            </w:tcPr>
-            <w:p>
-              <w:pPr>
-                <w:spacing w:after="0" w:before="0"/>
-              </w:pPr>
-              <w:r>
-                <w:rPr>
-                  <w:rFonts w:ascii="Plus Jakarta Sans" w:cs="Plus Jakarta Sans" w:eastAsia="Plus Jakarta Sans" w:hAnsi="Plus Jakarta Sans"/>
-                  <w:b/>
-                  <w:bCs/>
-                  <w:color w:val="1F2937"/>
-                  <w:sz w:val="20"/>
-                  <w:szCs w:val="20"/>
-                </w:rPr>
-                <w:t xml:space="preserve">Cocok Untuk</w:t>
-              </w:r>
-            </w:p>
-          </w:tc>
-          <w:p/>
-        </w:tc>
-        <w:tc>
-          <w:tcPr>
-            <w:tcMar>
-              <w:top w:type="dxa" w:w="90"/>
-              <w:left w:type="dxa" w:w="130"/>
-              <w:bottom w:type="dxa" w:w="90"/>
-              <w:right w:type="dxa" w:w="130"/>
-            </w:tcMar>
-            <w:vAlign w:val="center"/>
-          </w:tcPr>
-          <w:tc>
-            <w:tcPr>
-              <w:tcMar>
-                <w:top w:type="dxa" w:w="90"/>
-                <w:left w:type="dxa" w:w="130"/>
-                <w:bottom w:type="dxa" w:w="90"/>
-                <w:right w:type="dxa" w:w="130"/>
-              </w:tcMar>
-              <w:vAlign w:val="center"/>
-            </w:tcPr>
-            <w:p>
-              <w:pPr>
-                <w:spacing w:after="0" w:before="0"/>
-              </w:pPr>
-              <w:r>
-                <w:rPr>
-                  <w:rFonts w:ascii="Plus Jakarta Sans" w:cs="Plus Jakarta Sans" w:eastAsia="Plus Jakarta Sans" w:hAnsi="Plus Jakarta Sans"/>
-                  <w:color w:val="1F2937"/>
-                  <w:sz w:val="19"/>
-                  <w:szCs w:val="19"/>
-                </w:rPr>
-                <w:t xml:space="preserve">Profil &amp; PPDB reguler</w:t>
-              </w:r>
-            </w:p>
-          </w:tc>
-          <w:p/>
-        </w:tc>
-        <w:tc>
-          <w:tcPr>
-            <w:tcMar>
-              <w:top w:type="dxa" w:w="90"/>
-              <w:left w:type="dxa" w:w="130"/>
-              <w:bottom w:type="dxa" w:w="90"/>
-              <w:right w:type="dxa" w:w="130"/>
-            </w:tcMar>
-            <w:vAlign w:val="center"/>
-          </w:tcPr>
-          <w:tc>
-            <w:tcPr>
-              <w:tcMar>
-                <w:top w:type="dxa" w:w="90"/>
-                <w:left w:type="dxa" w:w="130"/>
-                <w:bottom w:type="dxa" w:w="90"/>
-                <w:right w:type="dxa" w:w="130"/>
-              </w:tcMar>
-              <w:vAlign w:val="center"/>
-            </w:tcPr>
-            <w:p>
-              <w:pPr>
-                <w:spacing w:after="0" w:before="0"/>
-              </w:pPr>
-              <w:r>
-                <w:rPr>
-                  <w:rFonts w:ascii="Plus Jakarta Sans" w:cs="Plus Jakarta Sans" w:eastAsia="Plus Jakarta Sans" w:hAnsi="Plus Jakarta Sans"/>
-                  <w:color w:val="1F2937"/>
-                  <w:sz w:val="19"/>
-                  <w:szCs w:val="19"/>
-                </w:rPr>
-                <w:t xml:space="preserve">Kebanyakan sekolah</w:t>
-              </w:r>
-            </w:p>
-          </w:tc>
-          <w:p/>
-        </w:tc>
-        <w:tc>
-          <w:tcPr>
-            <w:tcMar>
-              <w:top w:type="dxa" w:w="90"/>
-              <w:left w:type="dxa" w:w="130"/>
-              <w:bottom w:type="dxa" w:w="90"/>
-              <w:right w:type="dxa" w:w="130"/>
-            </w:tcMar>
-            <w:vAlign w:val="center"/>
-          </w:tcPr>
-          <w:tc>
-            <w:tcPr>
-              <w:tcMar>
-                <w:top w:type="dxa" w:w="90"/>
-                <w:left w:type="dxa" w:w="130"/>
-                <w:bottom w:type="dxa" w:w="90"/>
-                <w:right w:type="dxa" w:w="130"/>
-              </w:tcMar>
-              <w:vAlign w:val="center"/>
-            </w:tcPr>
-            <w:p>
-              <w:pPr>
-                <w:spacing w:after="0" w:before="0"/>
-              </w:pPr>
-              <w:r>
-                <w:rPr>
-                  <w:rFonts w:ascii="Plus Jakarta Sans" w:cs="Plus Jakarta Sans" w:eastAsia="Plus Jakarta Sans" w:hAnsi="Plus Jakarta Sans"/>
-                  <w:color w:val="1F2937"/>
-                  <w:sz w:val="19"/>
-                  <w:szCs w:val="19"/>
-                </w:rPr>
-                <w:t xml:space="preserve">PPDB volume besar, akademik</w:t>
-              </w:r>
-            </w:p>
-          </w:tc>
-          <w:p/>
-        </w:tc>
-      </w:tr>
-    </w:tbl>
-    <w:p>
-      <w:pPr>
-        <w:spacing w:after="0" w:before="0"/>
-      </w:pPr>
-      <w:r>
-        <w:rPr>
-          <w:rFonts w:ascii="Plus Jakarta Sans" w:cs="Plus Jakarta Sans" w:eastAsia="Plus Jakarta Sans" w:hAnsi="Plus Jakarta Sans"/>
-          <w:color w:val="1F2937"/>
-          <w:sz w:val="22"/>
-          <w:szCs w:val="22"/>
-        </w:rPr>
-        <w:t xml:space="preserve"> </w:t>
-      </w:r>
-    </w:p>
-    <w:p>
-      <w:pPr>
-        <w:spacing w:after="0" w:before="0"/>
+        <w:t xml:space="preserve">9. Mengapa Memilih Kami</w:t>
+      </w:r>
+    </w:p>
+    <w:p>
+      <w:pPr>
+        <w:spacing w:after="80"/>
+        <w:ind w:left="360"/>
       </w:pPr>
       <w:r>
         <w:rPr>
           <w:rFonts w:ascii="Plus Jakarta Sans" w:cs="Plus Jakarta Sans" w:eastAsia="Plus Jakarta Sans" w:hAnsi="Plus Jakarta Sans"/>
           <w:b/>
           <w:bCs/>
+          <w:color w:val="C9A227"/>
+          <w:sz w:val="22"/>
+          <w:szCs w:val="22"/>
+        </w:rPr>
+        <w:t xml:space="preserve">✓  </w:t>
+      </w:r>
+      <w:r>
+        <w:rPr>
+          <w:rFonts w:ascii="Plus Jakarta Sans" w:cs="Plus Jakarta Sans" w:eastAsia="Plus Jakarta Sans" w:hAnsi="Plus Jakarta Sans"/>
           <w:color w:val="1F2937"/>
           <w:sz w:val="22"/>
           <w:szCs w:val="22"/>
         </w:rPr>
-        <w:t xml:space="preserve">Catatan: </w:t>
+        <w:t xml:space="preserve">Berpengalaman membangun website profil sekolah &amp; instansi pendidikan</w:t>
+      </w:r>
+    </w:p>
+    <w:p>
+      <w:pPr>
+        <w:spacing w:after="80"/>
+        <w:ind w:left="360"/>
+      </w:pPr>
+      <w:r>
+        <w:rPr>
+          <w:rFonts w:ascii="Plus Jakarta Sans" w:cs="Plus Jakarta Sans" w:eastAsia="Plus Jakarta Sans" w:hAnsi="Plus Jakarta Sans"/>
+          <w:b/>
+          <w:bCs/>
+          <w:color w:val="C9A227"/>
+          <w:sz w:val="22"/>
+          <w:szCs w:val="22"/>
+        </w:rPr>
+        <w:t xml:space="preserve">✓  </w:t>
       </w:r>
       <w:r>
         <w:rPr>
@@ -7093,7 +6073,137 @@
           <w:sz w:val="22"/>
           <w:szCs w:val="22"/>
         </w:rPr>
-        <w:t xml:space="preserve">Dokumen pendaftar &amp; backup database selalu disimpan di Cloudflare R2 (private bucket, presigned URL). Harga bulanan sudah termasuk layanan monitoring, keamanan &amp; dukungan teknis.</w:t>
+        <w:t xml:space="preserve">Desain modern, mobile-first, dan sesuai identitas sekolah</w:t>
+      </w:r>
+    </w:p>
+    <w:p>
+      <w:pPr>
+        <w:spacing w:after="80"/>
+        <w:ind w:left="360"/>
+      </w:pPr>
+      <w:r>
+        <w:rPr>
+          <w:rFonts w:ascii="Plus Jakarta Sans" w:cs="Plus Jakarta Sans" w:eastAsia="Plus Jakarta Sans" w:hAnsi="Plus Jakarta Sans"/>
+          <w:b/>
+          <w:bCs/>
+          <w:color w:val="C9A227"/>
+          <w:sz w:val="22"/>
+          <w:szCs w:val="22"/>
+        </w:rPr>
+        <w:t xml:space="preserve">✓  </w:t>
+      </w:r>
+      <w:r>
+        <w:rPr>
+          <w:rFonts w:ascii="Plus Jakarta Sans" w:cs="Plus Jakarta Sans" w:eastAsia="Plus Jakarta Sans" w:hAnsi="Plus Jakarta Sans"/>
+          <w:color w:val="1F2937"/>
+          <w:sz w:val="22"/>
+          <w:szCs w:val="22"/>
+        </w:rPr>
+        <w:t xml:space="preserve">Panel admin mudah digunakan — staf sekolah bisa update sendiri</w:t>
+      </w:r>
+    </w:p>
+    <w:p>
+      <w:pPr>
+        <w:spacing w:after="80"/>
+        <w:ind w:left="360"/>
+      </w:pPr>
+      <w:r>
+        <w:rPr>
+          <w:rFonts w:ascii="Plus Jakarta Sans" w:cs="Plus Jakarta Sans" w:eastAsia="Plus Jakarta Sans" w:hAnsi="Plus Jakarta Sans"/>
+          <w:b/>
+          <w:bCs/>
+          <w:color w:val="C9A227"/>
+          <w:sz w:val="22"/>
+          <w:szCs w:val="22"/>
+        </w:rPr>
+        <w:t xml:space="preserve">✓  </w:t>
+      </w:r>
+      <w:r>
+        <w:rPr>
+          <w:rFonts w:ascii="Plus Jakarta Sans" w:cs="Plus Jakarta Sans" w:eastAsia="Plus Jakarta Sans" w:hAnsi="Plus Jakarta Sans"/>
+          <w:color w:val="1F2937"/>
+          <w:sz w:val="22"/>
+          <w:szCs w:val="22"/>
+        </w:rPr>
+        <w:t xml:space="preserve">Customizer tampilan: ganti warna &amp; teks tanpa perlu developer</w:t>
+      </w:r>
+    </w:p>
+    <w:p>
+      <w:pPr>
+        <w:spacing w:after="80"/>
+        <w:ind w:left="360"/>
+      </w:pPr>
+      <w:r>
+        <w:rPr>
+          <w:rFonts w:ascii="Plus Jakarta Sans" w:cs="Plus Jakarta Sans" w:eastAsia="Plus Jakarta Sans" w:hAnsi="Plus Jakarta Sans"/>
+          <w:b/>
+          <w:bCs/>
+          <w:color w:val="C9A227"/>
+          <w:sz w:val="22"/>
+          <w:szCs w:val="22"/>
+        </w:rPr>
+        <w:t xml:space="preserve">✓  </w:t>
+      </w:r>
+      <w:r>
+        <w:rPr>
+          <w:rFonts w:ascii="Plus Jakarta Sans" w:cs="Plus Jakarta Sans" w:eastAsia="Plus Jakarta Sans" w:hAnsi="Plus Jakarta Sans"/>
+          <w:color w:val="1F2937"/>
+          <w:sz w:val="22"/>
+          <w:szCs w:val="22"/>
+        </w:rPr>
+        <w:t xml:space="preserve">Harga transparan, tanpa biaya tersembunyi</w:t>
+      </w:r>
+    </w:p>
+    <w:p>
+      <w:pPr>
+        <w:spacing w:after="80"/>
+        <w:ind w:left="360"/>
+      </w:pPr>
+      <w:r>
+        <w:rPr>
+          <w:rFonts w:ascii="Plus Jakarta Sans" w:cs="Plus Jakarta Sans" w:eastAsia="Plus Jakarta Sans" w:hAnsi="Plus Jakarta Sans"/>
+          <w:b/>
+          <w:bCs/>
+          <w:color w:val="C9A227"/>
+          <w:sz w:val="22"/>
+          <w:szCs w:val="22"/>
+        </w:rPr>
+        <w:t xml:space="preserve">✓  </w:t>
+      </w:r>
+      <w:r>
+        <w:rPr>
+          <w:rFonts w:ascii="Plus Jakarta Sans" w:cs="Plus Jakarta Sans" w:eastAsia="Plus Jakarta Sans" w:hAnsi="Plus Jakarta Sans"/>
+          <w:color w:val="1F2937"/>
+          <w:sz w:val="22"/>
+          <w:szCs w:val="22"/>
+        </w:rPr>
+        <w:t xml:space="preserve">Dukungan responsif &amp; garansi 3 bulan</w:t>
+      </w:r>
+    </w:p>
+    <w:p>
+      <w:pPr>
+        <w:spacing w:after="80"/>
+        <w:ind w:left="360"/>
+      </w:pPr>
+      <w:r>
+        <w:rPr>
+          <w:rFonts w:ascii="Plus Jakarta Sans" w:cs="Plus Jakarta Sans" w:eastAsia="Plus Jakarta Sans" w:hAnsi="Plus Jakarta Sans"/>
+          <w:b/>
+          <w:bCs/>
+          <w:color w:val="C9A227"/>
+          <w:sz w:val="22"/>
+          <w:szCs w:val="22"/>
+        </w:rPr>
+        <w:t xml:space="preserve">✓  </w:t>
+      </w:r>
+      <w:r>
+        <w:rPr>
+          <w:rFonts w:ascii="Plus Jakarta Sans" w:cs="Plus Jakarta Sans" w:eastAsia="Plus Jakarta Sans" w:hAnsi="Plus Jakarta Sans"/>
+          <w:color w:val="1F2937"/>
+          <w:sz w:val="22"/>
+          <w:szCs w:val="22"/>
+        </w:rPr>
+        <w:t xml:space="preserve">Demo live dapat dilihat &amp; dicoba langsung sebelum memutuskan</w:t>
       </w:r>
     </w:p>
     <w:p>
@@ -7110,206 +6220,7 @@
           <w:sz w:val="30"/>
           <w:szCs w:val="30"/>
         </w:rPr>
-        <w:t xml:space="preserve">10. Mengapa Memilih Kami</w:t>
-      </w:r>
-    </w:p>
-    <w:p>
-      <w:pPr>
-        <w:spacing w:after="80"/>
-        <w:ind w:left="360"/>
-      </w:pPr>
-      <w:r>
-        <w:rPr>
-          <w:rFonts w:ascii="Plus Jakarta Sans" w:cs="Plus Jakarta Sans" w:eastAsia="Plus Jakarta Sans" w:hAnsi="Plus Jakarta Sans"/>
-          <w:b/>
-          <w:bCs/>
-          <w:color w:val="C9A227"/>
-          <w:sz w:val="22"/>
-          <w:szCs w:val="22"/>
-        </w:rPr>
-        <w:t xml:space="preserve">✓  </w:t>
-      </w:r>
-      <w:r>
-        <w:rPr>
-          <w:rFonts w:ascii="Plus Jakarta Sans" w:cs="Plus Jakarta Sans" w:eastAsia="Plus Jakarta Sans" w:hAnsi="Plus Jakarta Sans"/>
-          <w:color w:val="1F2937"/>
-          <w:sz w:val="22"/>
-          <w:szCs w:val="22"/>
-        </w:rPr>
-        <w:t xml:space="preserve">Berpengalaman membangun website profil sekolah &amp; instansi pendidikan</w:t>
-      </w:r>
-    </w:p>
-    <w:p>
-      <w:pPr>
-        <w:spacing w:after="80"/>
-        <w:ind w:left="360"/>
-      </w:pPr>
-      <w:r>
-        <w:rPr>
-          <w:rFonts w:ascii="Plus Jakarta Sans" w:cs="Plus Jakarta Sans" w:eastAsia="Plus Jakarta Sans" w:hAnsi="Plus Jakarta Sans"/>
-          <w:b/>
-          <w:bCs/>
-          <w:color w:val="C9A227"/>
-          <w:sz w:val="22"/>
-          <w:szCs w:val="22"/>
-        </w:rPr>
-        <w:t xml:space="preserve">✓  </w:t>
-      </w:r>
-      <w:r>
-        <w:rPr>
-          <w:rFonts w:ascii="Plus Jakarta Sans" w:cs="Plus Jakarta Sans" w:eastAsia="Plus Jakarta Sans" w:hAnsi="Plus Jakarta Sans"/>
-          <w:color w:val="1F2937"/>
-          <w:sz w:val="22"/>
-          <w:szCs w:val="22"/>
-        </w:rPr>
-        <w:t xml:space="preserve">Desain modern, mobile-first, dan sesuai identitas sekolah</w:t>
-      </w:r>
-    </w:p>
-    <w:p>
-      <w:pPr>
-        <w:spacing w:after="80"/>
-        <w:ind w:left="360"/>
-      </w:pPr>
-      <w:r>
-        <w:rPr>
-          <w:rFonts w:ascii="Plus Jakarta Sans" w:cs="Plus Jakarta Sans" w:eastAsia="Plus Jakarta Sans" w:hAnsi="Plus Jakarta Sans"/>
-          <w:b/>
-          <w:bCs/>
-          <w:color w:val="C9A227"/>
-          <w:sz w:val="22"/>
-          <w:szCs w:val="22"/>
-        </w:rPr>
-        <w:t xml:space="preserve">✓  </w:t>
-      </w:r>
-      <w:r>
-        <w:rPr>
-          <w:rFonts w:ascii="Plus Jakarta Sans" w:cs="Plus Jakarta Sans" w:eastAsia="Plus Jakarta Sans" w:hAnsi="Plus Jakarta Sans"/>
-          <w:color w:val="1F2937"/>
-          <w:sz w:val="22"/>
-          <w:szCs w:val="22"/>
-        </w:rPr>
-        <w:t xml:space="preserve">Panel admin mudah digunakan — staf sekolah bisa update sendiri</w:t>
-      </w:r>
-    </w:p>
-    <w:p>
-      <w:pPr>
-        <w:spacing w:after="80"/>
-        <w:ind w:left="360"/>
-      </w:pPr>
-      <w:r>
-        <w:rPr>
-          <w:rFonts w:ascii="Plus Jakarta Sans" w:cs="Plus Jakarta Sans" w:eastAsia="Plus Jakarta Sans" w:hAnsi="Plus Jakarta Sans"/>
-          <w:b/>
-          <w:bCs/>
-          <w:color w:val="C9A227"/>
-          <w:sz w:val="22"/>
-          <w:szCs w:val="22"/>
-        </w:rPr>
-        <w:t xml:space="preserve">✓  </w:t>
-      </w:r>
-      <w:r>
-        <w:rPr>
-          <w:rFonts w:ascii="Plus Jakarta Sans" w:cs="Plus Jakarta Sans" w:eastAsia="Plus Jakarta Sans" w:hAnsi="Plus Jakarta Sans"/>
-          <w:color w:val="1F2937"/>
-          <w:sz w:val="22"/>
-          <w:szCs w:val="22"/>
-        </w:rPr>
-        <w:t xml:space="preserve">Customizer tampilan: ganti warna &amp; teks tanpa perlu developer</w:t>
-      </w:r>
-    </w:p>
-    <w:p>
-      <w:pPr>
-        <w:spacing w:after="80"/>
-        <w:ind w:left="360"/>
-      </w:pPr>
-      <w:r>
-        <w:rPr>
-          <w:rFonts w:ascii="Plus Jakarta Sans" w:cs="Plus Jakarta Sans" w:eastAsia="Plus Jakarta Sans" w:hAnsi="Plus Jakarta Sans"/>
-          <w:b/>
-          <w:bCs/>
-          <w:color w:val="C9A227"/>
-          <w:sz w:val="22"/>
-          <w:szCs w:val="22"/>
-        </w:rPr>
-        <w:t xml:space="preserve">✓  </w:t>
-      </w:r>
-      <w:r>
-        <w:rPr>
-          <w:rFonts w:ascii="Plus Jakarta Sans" w:cs="Plus Jakarta Sans" w:eastAsia="Plus Jakarta Sans" w:hAnsi="Plus Jakarta Sans"/>
-          <w:color w:val="1F2937"/>
-          <w:sz w:val="22"/>
-          <w:szCs w:val="22"/>
-        </w:rPr>
-        <w:t xml:space="preserve">Harga transparan, tanpa biaya tersembunyi</w:t>
-      </w:r>
-    </w:p>
-    <w:p>
-      <w:pPr>
-        <w:spacing w:after="80"/>
-        <w:ind w:left="360"/>
-      </w:pPr>
-      <w:r>
-        <w:rPr>
-          <w:rFonts w:ascii="Plus Jakarta Sans" w:cs="Plus Jakarta Sans" w:eastAsia="Plus Jakarta Sans" w:hAnsi="Plus Jakarta Sans"/>
-          <w:b/>
-          <w:bCs/>
-          <w:color w:val="C9A227"/>
-          <w:sz w:val="22"/>
-          <w:szCs w:val="22"/>
-        </w:rPr>
-        <w:t xml:space="preserve">✓  </w:t>
-      </w:r>
-      <w:r>
-        <w:rPr>
-          <w:rFonts w:ascii="Plus Jakarta Sans" w:cs="Plus Jakarta Sans" w:eastAsia="Plus Jakarta Sans" w:hAnsi="Plus Jakarta Sans"/>
-          <w:color w:val="1F2937"/>
-          <w:sz w:val="22"/>
-          <w:szCs w:val="22"/>
-        </w:rPr>
-        <w:t xml:space="preserve">Dukungan responsif &amp; garansi 3 bulan</w:t>
-      </w:r>
-    </w:p>
-    <w:p>
-      <w:pPr>
-        <w:spacing w:after="80"/>
-        <w:ind w:left="360"/>
-      </w:pPr>
-      <w:r>
-        <w:rPr>
-          <w:rFonts w:ascii="Plus Jakarta Sans" w:cs="Plus Jakarta Sans" w:eastAsia="Plus Jakarta Sans" w:hAnsi="Plus Jakarta Sans"/>
-          <w:b/>
-          <w:bCs/>
-          <w:color w:val="C9A227"/>
-          <w:sz w:val="22"/>
-          <w:szCs w:val="22"/>
-        </w:rPr>
-        <w:t xml:space="preserve">✓  </w:t>
-      </w:r>
-      <w:r>
-        <w:rPr>
-          <w:rFonts w:ascii="Plus Jakarta Sans" w:cs="Plus Jakarta Sans" w:eastAsia="Plus Jakarta Sans" w:hAnsi="Plus Jakarta Sans"/>
-          <w:color w:val="1F2937"/>
-          <w:sz w:val="22"/>
-          <w:szCs w:val="22"/>
-        </w:rPr>
-        <w:t xml:space="preserve">Demo live dapat dilihat &amp; dicoba langsung sebelum memutuskan</w:t>
-      </w:r>
-    </w:p>
-    <w:p>
-      <w:pPr>
-        <w:pStyle w:val="Heading1"/>
-        <w:spacing w:after="160" w:before="400"/>
-      </w:pPr>
-      <w:r>
-        <w:rPr>
-          <w:rFonts w:ascii="Plus Jakarta Sans" w:cs="Plus Jakarta Sans" w:eastAsia="Plus Jakarta Sans" w:hAnsi="Plus Jakarta Sans"/>
-          <w:b/>
-          <w:bCs/>
-          <w:color w:val="082B66"/>
-          <w:sz w:val="30"/>
-          <w:szCs w:val="30"/>
-        </w:rPr>
-        <w:t xml:space="preserve">11. Penutup</w:t>
+        <w:t xml:space="preserve">10. Penutup</w:t>
       </w:r>
     </w:p>
     <w:p>
@@ -7423,7 +6334,7 @@
           <w:sz w:val="20"/>
           <w:szCs w:val="20"/>
         </w:rPr>
-        <w:t xml:space="preserve">WA/HP: 08xx-xxxx-xxxx · Email: novskidev@email.com</w:t>
+        <w:t xml:space="preserve">WA/HP: 0852-2615-5240 · Email: novskidev@email.com</w:t>
       </w:r>
     </w:p>
     <w:sectPr>

</xml_diff>

<commit_message>
fix: supabase pro 5 → 450rb
</commit_message>
<xml_diff>
--- a/proposal/Proposal_Website_SD_Muhammadiyah_Pakel.docx
+++ b/proposal/Proposal_Website_SD_Muhammadiyah_Pakel.docx
@@ -3097,7 +3097,7 @@
                   <w:sz w:val="20"/>
                   <w:szCs w:val="20"/>
                 </w:rPr>
-                <w:t xml:space="preserve">+Rp 1.200.000/bulan (~$75)</w:t>
+                <w:t xml:space="preserve">+Rp 450.000/bulan (~$25)</w:t>
               </w:r>
             </w:p>
           </w:tc>
@@ -3134,7 +3134,7 @@
                   <w:sz w:val="19"/>
                   <w:szCs w:val="19"/>
                 </w:rPr>
-                <w:t xml:space="preserve">Semua free + database 8GB, backup point-in-time (PITR), bandwidth 250GB, tanpa pause, dukungan prioritas. Cocok saat data &amp; trafik membesar.</w:t>
+                <w:t xml:space="preserve">Project pertama $25/bulan. 100.000 user aktif/bulan, 8GB disk, 250GB egress + 250GB cached, 100GB file storage, daily backup 7 hari (PITR), log retention 7 hari, email support, tanpa pause. Add-on: $10/project tambahan, $0,125/GB disk sisa, $0,09/GB egress.</w:t>
               </w:r>
             </w:p>
           </w:tc>

</xml_diff>

<commit_message>
fix: helipod 80k, vps 100k, tahun-1 gratis
</commit_message>
<xml_diff>
--- a/proposal/Proposal_Website_SD_Muhammadiyah_Pakel.docx
+++ b/proposal/Proposal_Website_SD_Muhammadiyah_Pakel.docx
@@ -3214,7 +3214,7 @@
                   <w:sz w:val="20"/>
                   <w:szCs w:val="20"/>
                 </w:rPr>
-                <w:t xml:space="preserve">Rp 61.875/bulan</w:t>
+                <w:t xml:space="preserve">Rp 80.000/bulan</w:t>
               </w:r>
             </w:p>
           </w:tc>
@@ -3331,7 +3331,7 @@
                   <w:sz w:val="20"/>
                   <w:szCs w:val="20"/>
                 </w:rPr>
-                <w:t xml:space="preserve">Rp 300.000/bulan</w:t>
+                <w:t xml:space="preserve">Rp 100.000/bulan</w:t>
               </w:r>
             </w:p>
           </w:tc>
@@ -3368,7 +3368,7 @@
                   <w:sz w:val="19"/>
                   <w:szCs w:val="19"/>
                 </w:rPr>
-                <w:t xml:space="preserve">Server lebih besar: 2 vCPU, 8GB RAM, 100GB NVMe. Full kontrol server, email kustom, multi-aplikasi. Frontend + backend + database dalam 1 server, tanpa batas kuota.</w:t>
+                <w:t xml:space="preserve">Server lebih besar: 2 vCPU, 2GB RAM, 30GB NVMe. Full kontrol server, bonus email kustom, multi-aplikasi. Frontend + backend + database dalam 1 server, tanpa batas kuota.</w:t>
               </w:r>
             </w:p>
           </w:tc>
@@ -3416,7 +3416,7 @@
           <w:sz w:val="19"/>
           <w:szCs w:val="19"/>
         </w:rPr>
-        <w:t xml:space="preserve">Semua opsi sudah termasuk monitoring, keamanan &amp; dukungan teknis. Dokumen pendaftar (±1 GB/tahun) dan backup database tersimpan aman di Cloudflare R2 (private bucket, presigned URL).</w:t>
+        <w:t xml:space="preserve">TAHUN PERTAMA GRATIS — biaya server mulai dibayar di bulan ke-13. Semua opsi sudah termasuk monitoring, keamanan &amp; dukungan teknis. Dokumen pendaftar (±1 GB/tahun) dan backup database tersimpan aman di Cloudflare R2 (private bucket, presigned URL).</w:t>
       </w:r>
     </w:p>
     <w:p>

</xml_diff>

<commit_message>
deploy: helipod 80k vps 100k
</commit_message>
<xml_diff>
--- a/proposal/Proposal_Website_SD_Muhammadiyah_Pakel.docx
+++ b/proposal/Proposal_Website_SD_Muhammadiyah_Pakel.docx
@@ -3214,7 +3214,7 @@
                   <w:sz w:val="20"/>
                   <w:szCs w:val="20"/>
                 </w:rPr>
-                <w:t xml:space="preserve">Rp 61.875/bulan</w:t>
+                <w:t xml:space="preserve">Rp 80.000/bulan</w:t>
               </w:r>
             </w:p>
           </w:tc>
@@ -3331,7 +3331,7 @@
                   <w:sz w:val="20"/>
                   <w:szCs w:val="20"/>
                 </w:rPr>
-                <w:t xml:space="preserve">Rp 300.000/bulan</w:t>
+                <w:t xml:space="preserve">Rp 100.000/bulan</w:t>
               </w:r>
             </w:p>
           </w:tc>
@@ -3368,7 +3368,7 @@
                   <w:sz w:val="19"/>
                   <w:szCs w:val="19"/>
                 </w:rPr>
-                <w:t xml:space="preserve">Server lebih besar: 2 vCPU, 8GB RAM, 100GB NVMe. Full kontrol server, email kustom, multi-aplikasi. Frontend + backend + database dalam 1 server, tanpa batas kuota.</w:t>
+                <w:t xml:space="preserve">Server lebih besar: 2 vCPU, 2GB RAM, 30GB NVMe. Full kontrol server, bonus email kustom, multi-aplikasi. Frontend + backend + database dalam 1 server, tanpa batas kuota.</w:t>
               </w:r>
             </w:p>
           </w:tc>
@@ -3416,7 +3416,7 @@
           <w:sz w:val="19"/>
           <w:szCs w:val="19"/>
         </w:rPr>
-        <w:t xml:space="preserve">Semua opsi sudah termasuk monitoring, keamanan &amp; dukungan teknis. Dokumen pendaftar (±1 GB/tahun) dan backup database tersimpan aman di Cloudflare R2 (private bucket, presigned URL).</w:t>
+        <w:t xml:space="preserve">TAHUN PERTAMA GRATIS — biaya server mulai dibayar di bulan ke-13. Semua opsi sudah termasuk monitoring, keamanan &amp; dukungan teknis. Dokumen pendaftar (±1 GB/tahun) dan backup database tersimpan aman di Cloudflare R2 (private bucket, presigned URL).</w:t>
       </w:r>
     </w:p>
     <w:p>

</xml_diff>